<commit_message>
Sync paper updates to repo (DOI, Bong 2017, new venues)
Robocopy in the previous commit ran with output redirection that masked
its actual completion status; the paper folders weren't actually
synchronized into ko/ and en/. This commit performs the missing sync:

- ko/paper/ and en/paper/ now reflect the source-folder updates from
  c92afa8: DOI 10.5281/zenodo.20108497 in Reproducibility section,
  Bong (2017) thesis citation in §3.3, expanded references.bib
  (Bong, Huh 2012, Hong 2006), 25+ new venues across new Tier E
  (music cognition / theory) and Tier OA (open access broad),
  plus 8 additional Tier D conferences (ACM IUI, IEEE ICME, EAI
  ArtsIT, ACM C&C, ACM DIS, ACM MMSys, ACM CSCW, ACM IMX/TVX).

paper_ko.docx and paper_en.docx regenerated from updated markdown
via apply_style*.ps1.

Co-Authored-By: Claude Opus 4.7 (1M context) <noreply@anthropic.com>
</commit_message>
<xml_diff>
--- a/en/paper/paper_en.docx
+++ b/en/paper/paper_en.docx
@@ -26,7 +26,7 @@
           <w:sz w:val="24"/>
           <w:szCs w:val="24"/>
         </w:rPr>
-        <w:id w:val="-995797999"/>
+        <w:id w:val="838192561"/>
         <w:docPartObj>
           <w:docPartGallery w:val="Table of Contents"/>
           <w:docPartUnique/>
@@ -66,7 +66,7 @@
           <w:r>
             <w:fldChar w:fldCharType="separate"/>
           </w:r>
-          <w:hyperlink w:anchor="_Toc229332660" w:history="1">
+          <w:hyperlink w:anchor="_Toc229333397" w:history="1">
             <w:r>
               <w:rPr>
                 <w:rStyle w:val="ac"/>
@@ -93,7 +93,7 @@
                 <w:noProof/>
                 <w:webHidden/>
               </w:rPr>
-              <w:instrText xml:space="preserve"> PAGEREF _Toc229332660 \h </w:instrText>
+              <w:instrText xml:space="preserve"> PAGEREF _Toc229333397 \h </w:instrText>
             </w:r>
             <w:r>
               <w:rPr>
@@ -134,7 +134,7 @@
               <w:noProof/>
             </w:rPr>
           </w:pPr>
-          <w:hyperlink w:anchor="_Toc229332661" w:history="1">
+          <w:hyperlink w:anchor="_Toc229333398" w:history="1">
             <w:r>
               <w:rPr>
                 <w:rStyle w:val="ac"/>
@@ -161,7 +161,7 @@
                 <w:noProof/>
                 <w:webHidden/>
               </w:rPr>
-              <w:instrText xml:space="preserve"> PAGEREF _Toc229332661 \h </w:instrText>
+              <w:instrText xml:space="preserve"> PAGEREF _Toc229333398 \h </w:instrText>
             </w:r>
             <w:r>
               <w:rPr>
@@ -203,7 +203,7 @@
               <w:noProof/>
             </w:rPr>
           </w:pPr>
-          <w:hyperlink w:anchor="_Toc229332662" w:history="1">
+          <w:hyperlink w:anchor="_Toc229333399" w:history="1">
             <w:r>
               <w:rPr>
                 <w:rStyle w:val="ac"/>
@@ -230,7 +230,7 @@
                 <w:noProof/>
                 <w:webHidden/>
               </w:rPr>
-              <w:instrText xml:space="preserve"> PAGEREF _Toc229332662 \h </w:instrText>
+              <w:instrText xml:space="preserve"> PAGEREF _Toc229333399 \h </w:instrText>
             </w:r>
             <w:r>
               <w:rPr>
@@ -272,7 +272,7 @@
               <w:noProof/>
             </w:rPr>
           </w:pPr>
-          <w:hyperlink w:anchor="_Toc229332663" w:history="1">
+          <w:hyperlink w:anchor="_Toc229333400" w:history="1">
             <w:r>
               <w:rPr>
                 <w:rStyle w:val="ac"/>
@@ -299,7 +299,7 @@
                 <w:noProof/>
                 <w:webHidden/>
               </w:rPr>
-              <w:instrText xml:space="preserve"> PAGEREF _Toc229332663 \h </w:instrText>
+              <w:instrText xml:space="preserve"> PAGEREF _Toc229333400 \h </w:instrText>
             </w:r>
             <w:r>
               <w:rPr>
@@ -341,7 +341,7 @@
               <w:noProof/>
             </w:rPr>
           </w:pPr>
-          <w:hyperlink w:anchor="_Toc229332664" w:history="1">
+          <w:hyperlink w:anchor="_Toc229333401" w:history="1">
             <w:r>
               <w:rPr>
                 <w:rStyle w:val="ac"/>
@@ -368,7 +368,7 @@
                 <w:noProof/>
                 <w:webHidden/>
               </w:rPr>
-              <w:instrText xml:space="preserve"> PAGEREF _Toc229332664 \h </w:instrText>
+              <w:instrText xml:space="preserve"> PAGEREF _Toc229333401 \h </w:instrText>
             </w:r>
             <w:r>
               <w:rPr>
@@ -409,7 +409,7 @@
               <w:noProof/>
             </w:rPr>
           </w:pPr>
-          <w:hyperlink w:anchor="_Toc229332665" w:history="1">
+          <w:hyperlink w:anchor="_Toc229333402" w:history="1">
             <w:r>
               <w:rPr>
                 <w:rStyle w:val="ac"/>
@@ -436,7 +436,7 @@
                 <w:noProof/>
                 <w:webHidden/>
               </w:rPr>
-              <w:instrText xml:space="preserve"> PAGEREF _Toc229332665 \h </w:instrText>
+              <w:instrText xml:space="preserve"> PAGEREF _Toc229333402 \h </w:instrText>
             </w:r>
             <w:r>
               <w:rPr>
@@ -478,7 +478,7 @@
               <w:noProof/>
             </w:rPr>
           </w:pPr>
-          <w:hyperlink w:anchor="_Toc229332666" w:history="1">
+          <w:hyperlink w:anchor="_Toc229333403" w:history="1">
             <w:r>
               <w:rPr>
                 <w:rStyle w:val="ac"/>
@@ -505,7 +505,7 @@
                 <w:noProof/>
                 <w:webHidden/>
               </w:rPr>
-              <w:instrText xml:space="preserve"> PAGEREF _Toc229332666 \h </w:instrText>
+              <w:instrText xml:space="preserve"> PAGEREF _Toc229333403 \h </w:instrText>
             </w:r>
             <w:r>
               <w:rPr>
@@ -547,7 +547,7 @@
               <w:noProof/>
             </w:rPr>
           </w:pPr>
-          <w:hyperlink w:anchor="_Toc229332667" w:history="1">
+          <w:hyperlink w:anchor="_Toc229333404" w:history="1">
             <w:r>
               <w:rPr>
                 <w:rStyle w:val="ac"/>
@@ -574,7 +574,7 @@
                 <w:noProof/>
                 <w:webHidden/>
               </w:rPr>
-              <w:instrText xml:space="preserve"> PAGEREF _Toc229332667 \h </w:instrText>
+              <w:instrText xml:space="preserve"> PAGEREF _Toc229333404 \h </w:instrText>
             </w:r>
             <w:r>
               <w:rPr>
@@ -616,7 +616,7 @@
               <w:noProof/>
             </w:rPr>
           </w:pPr>
-          <w:hyperlink w:anchor="_Toc229332668" w:history="1">
+          <w:hyperlink w:anchor="_Toc229333405" w:history="1">
             <w:r>
               <w:rPr>
                 <w:rStyle w:val="ac"/>
@@ -643,7 +643,7 @@
                 <w:noProof/>
                 <w:webHidden/>
               </w:rPr>
-              <w:instrText xml:space="preserve"> PAGEREF _Toc229332668 \h </w:instrText>
+              <w:instrText xml:space="preserve"> PAGEREF _Toc229333405 \h </w:instrText>
             </w:r>
             <w:r>
               <w:rPr>
@@ -685,7 +685,7 @@
               <w:noProof/>
             </w:rPr>
           </w:pPr>
-          <w:hyperlink w:anchor="_Toc229332669" w:history="1">
+          <w:hyperlink w:anchor="_Toc229333406" w:history="1">
             <w:r>
               <w:rPr>
                 <w:rStyle w:val="ac"/>
@@ -712,7 +712,7 @@
                 <w:noProof/>
                 <w:webHidden/>
               </w:rPr>
-              <w:instrText xml:space="preserve"> PAGEREF _Toc229332669 \h </w:instrText>
+              <w:instrText xml:space="preserve"> PAGEREF _Toc229333406 \h </w:instrText>
             </w:r>
             <w:r>
               <w:rPr>
@@ -753,7 +753,7 @@
               <w:noProof/>
             </w:rPr>
           </w:pPr>
-          <w:hyperlink w:anchor="_Toc229332670" w:history="1">
+          <w:hyperlink w:anchor="_Toc229333407" w:history="1">
             <w:r>
               <w:rPr>
                 <w:rStyle w:val="ac"/>
@@ -780,7 +780,7 @@
                 <w:noProof/>
                 <w:webHidden/>
               </w:rPr>
-              <w:instrText xml:space="preserve"> PAGEREF _Toc229332670 \h </w:instrText>
+              <w:instrText xml:space="preserve"> PAGEREF _Toc229333407 \h </w:instrText>
             </w:r>
             <w:r>
               <w:rPr>
@@ -822,7 +822,7 @@
               <w:noProof/>
             </w:rPr>
           </w:pPr>
-          <w:hyperlink w:anchor="_Toc229332671" w:history="1">
+          <w:hyperlink w:anchor="_Toc229333408" w:history="1">
             <w:r>
               <w:rPr>
                 <w:rStyle w:val="ac"/>
@@ -849,7 +849,7 @@
                 <w:noProof/>
                 <w:webHidden/>
               </w:rPr>
-              <w:instrText xml:space="preserve"> PAGEREF _Toc229332671 \h </w:instrText>
+              <w:instrText xml:space="preserve"> PAGEREF _Toc229333408 \h </w:instrText>
             </w:r>
             <w:r>
               <w:rPr>
@@ -891,7 +891,7 @@
               <w:noProof/>
             </w:rPr>
           </w:pPr>
-          <w:hyperlink w:anchor="_Toc229332672" w:history="1">
+          <w:hyperlink w:anchor="_Toc229333409" w:history="1">
             <w:r>
               <w:rPr>
                 <w:rStyle w:val="ac"/>
@@ -918,7 +918,7 @@
                 <w:noProof/>
                 <w:webHidden/>
               </w:rPr>
-              <w:instrText xml:space="preserve"> PAGEREF _Toc229332672 \h </w:instrText>
+              <w:instrText xml:space="preserve"> PAGEREF _Toc229333409 \h </w:instrText>
             </w:r>
             <w:r>
               <w:rPr>
@@ -960,7 +960,7 @@
               <w:noProof/>
             </w:rPr>
           </w:pPr>
-          <w:hyperlink w:anchor="_Toc229332673" w:history="1">
+          <w:hyperlink w:anchor="_Toc229333410" w:history="1">
             <w:r>
               <w:rPr>
                 <w:rStyle w:val="ac"/>
@@ -987,7 +987,7 @@
                 <w:noProof/>
                 <w:webHidden/>
               </w:rPr>
-              <w:instrText xml:space="preserve"> PAGEREF _Toc229332673 \h </w:instrText>
+              <w:instrText xml:space="preserve"> PAGEREF _Toc229333410 \h </w:instrText>
             </w:r>
             <w:r>
               <w:rPr>
@@ -1028,7 +1028,7 @@
               <w:noProof/>
             </w:rPr>
           </w:pPr>
-          <w:hyperlink w:anchor="_Toc229332674" w:history="1">
+          <w:hyperlink w:anchor="_Toc229333411" w:history="1">
             <w:r>
               <w:rPr>
                 <w:rStyle w:val="ac"/>
@@ -1055,7 +1055,7 @@
                 <w:noProof/>
                 <w:webHidden/>
               </w:rPr>
-              <w:instrText xml:space="preserve"> PAGEREF _Toc229332674 \h </w:instrText>
+              <w:instrText xml:space="preserve"> PAGEREF _Toc229333411 \h </w:instrText>
             </w:r>
             <w:r>
               <w:rPr>
@@ -1097,7 +1097,7 @@
               <w:noProof/>
             </w:rPr>
           </w:pPr>
-          <w:hyperlink w:anchor="_Toc229332675" w:history="1">
+          <w:hyperlink w:anchor="_Toc229333412" w:history="1">
             <w:r>
               <w:rPr>
                 <w:rStyle w:val="ac"/>
@@ -1124,7 +1124,7 @@
                 <w:noProof/>
                 <w:webHidden/>
               </w:rPr>
-              <w:instrText xml:space="preserve"> PAGEREF _Toc229332675 \h </w:instrText>
+              <w:instrText xml:space="preserve"> PAGEREF _Toc229333412 \h </w:instrText>
             </w:r>
             <w:r>
               <w:rPr>
@@ -1166,7 +1166,7 @@
               <w:noProof/>
             </w:rPr>
           </w:pPr>
-          <w:hyperlink w:anchor="_Toc229332676" w:history="1">
+          <w:hyperlink w:anchor="_Toc229333413" w:history="1">
             <w:r>
               <w:rPr>
                 <w:rStyle w:val="ac"/>
@@ -1193,7 +1193,7 @@
                 <w:noProof/>
                 <w:webHidden/>
               </w:rPr>
-              <w:instrText xml:space="preserve"> PAGEREF _Toc229332676 \h </w:instrText>
+              <w:instrText xml:space="preserve"> PAGEREF _Toc229333413 \h </w:instrText>
             </w:r>
             <w:r>
               <w:rPr>
@@ -1235,7 +1235,7 @@
               <w:noProof/>
             </w:rPr>
           </w:pPr>
-          <w:hyperlink w:anchor="_Toc229332677" w:history="1">
+          <w:hyperlink w:anchor="_Toc229333414" w:history="1">
             <w:r>
               <w:rPr>
                 <w:rStyle w:val="ac"/>
@@ -1262,7 +1262,7 @@
                 <w:noProof/>
                 <w:webHidden/>
               </w:rPr>
-              <w:instrText xml:space="preserve"> PAGEREF _Toc229332677 \h </w:instrText>
+              <w:instrText xml:space="preserve"> PAGEREF _Toc229333414 \h </w:instrText>
             </w:r>
             <w:r>
               <w:rPr>
@@ -1304,7 +1304,7 @@
               <w:noProof/>
             </w:rPr>
           </w:pPr>
-          <w:hyperlink w:anchor="_Toc229332678" w:history="1">
+          <w:hyperlink w:anchor="_Toc229333415" w:history="1">
             <w:r>
               <w:rPr>
                 <w:rStyle w:val="ac"/>
@@ -1331,7 +1331,7 @@
                 <w:noProof/>
                 <w:webHidden/>
               </w:rPr>
-              <w:instrText xml:space="preserve"> PAGEREF _Toc229332678 \h </w:instrText>
+              <w:instrText xml:space="preserve"> PAGEREF _Toc229333415 \h </w:instrText>
             </w:r>
             <w:r>
               <w:rPr>
@@ -1373,7 +1373,7 @@
               <w:noProof/>
             </w:rPr>
           </w:pPr>
-          <w:hyperlink w:anchor="_Toc229332679" w:history="1">
+          <w:hyperlink w:anchor="_Toc229333416" w:history="1">
             <w:r>
               <w:rPr>
                 <w:rStyle w:val="ac"/>
@@ -1400,7 +1400,7 @@
                 <w:noProof/>
                 <w:webHidden/>
               </w:rPr>
-              <w:instrText xml:space="preserve"> PAGEREF _Toc229332679 \h </w:instrText>
+              <w:instrText xml:space="preserve"> PAGEREF _Toc229333416 \h </w:instrText>
             </w:r>
             <w:r>
               <w:rPr>
@@ -1441,7 +1441,7 @@
               <w:noProof/>
             </w:rPr>
           </w:pPr>
-          <w:hyperlink w:anchor="_Toc229332680" w:history="1">
+          <w:hyperlink w:anchor="_Toc229333417" w:history="1">
             <w:r>
               <w:rPr>
                 <w:rStyle w:val="ac"/>
@@ -1468,7 +1468,7 @@
                 <w:noProof/>
                 <w:webHidden/>
               </w:rPr>
-              <w:instrText xml:space="preserve"> PAGEREF _Toc229332680 \h </w:instrText>
+              <w:instrText xml:space="preserve"> PAGEREF _Toc229333417 \h </w:instrText>
             </w:r>
             <w:r>
               <w:rPr>
@@ -1510,7 +1510,7 @@
               <w:noProof/>
             </w:rPr>
           </w:pPr>
-          <w:hyperlink w:anchor="_Toc229332681" w:history="1">
+          <w:hyperlink w:anchor="_Toc229333418" w:history="1">
             <w:r>
               <w:rPr>
                 <w:rStyle w:val="ac"/>
@@ -1537,7 +1537,7 @@
                 <w:noProof/>
                 <w:webHidden/>
               </w:rPr>
-              <w:instrText xml:space="preserve"> PAGEREF _Toc229332681 \h </w:instrText>
+              <w:instrText xml:space="preserve"> PAGEREF _Toc229333418 \h </w:instrText>
             </w:r>
             <w:r>
               <w:rPr>
@@ -1579,7 +1579,7 @@
               <w:noProof/>
             </w:rPr>
           </w:pPr>
-          <w:hyperlink w:anchor="_Toc229332682" w:history="1">
+          <w:hyperlink w:anchor="_Toc229333419" w:history="1">
             <w:r>
               <w:rPr>
                 <w:rStyle w:val="ac"/>
@@ -1606,7 +1606,7 @@
                 <w:noProof/>
                 <w:webHidden/>
               </w:rPr>
-              <w:instrText xml:space="preserve"> PAGEREF _Toc229332682 \h </w:instrText>
+              <w:instrText xml:space="preserve"> PAGEREF _Toc229333419 \h </w:instrText>
             </w:r>
             <w:r>
               <w:rPr>
@@ -1648,7 +1648,7 @@
               <w:noProof/>
             </w:rPr>
           </w:pPr>
-          <w:hyperlink w:anchor="_Toc229332683" w:history="1">
+          <w:hyperlink w:anchor="_Toc229333420" w:history="1">
             <w:r>
               <w:rPr>
                 <w:rStyle w:val="ac"/>
@@ -1675,7 +1675,7 @@
                 <w:noProof/>
                 <w:webHidden/>
               </w:rPr>
-              <w:instrText xml:space="preserve"> PAGEREF _Toc229332683 \h </w:instrText>
+              <w:instrText xml:space="preserve"> PAGEREF _Toc229333420 \h </w:instrText>
             </w:r>
             <w:r>
               <w:rPr>
@@ -1717,7 +1717,7 @@
               <w:noProof/>
             </w:rPr>
           </w:pPr>
-          <w:hyperlink w:anchor="_Toc229332684" w:history="1">
+          <w:hyperlink w:anchor="_Toc229333421" w:history="1">
             <w:r>
               <w:rPr>
                 <w:rStyle w:val="ac"/>
@@ -1744,7 +1744,7 @@
                 <w:noProof/>
                 <w:webHidden/>
               </w:rPr>
-              <w:instrText xml:space="preserve"> PAGEREF _Toc229332684 \h </w:instrText>
+              <w:instrText xml:space="preserve"> PAGEREF _Toc229333421 \h </w:instrText>
             </w:r>
             <w:r>
               <w:rPr>
@@ -1785,7 +1785,7 @@
               <w:noProof/>
             </w:rPr>
           </w:pPr>
-          <w:hyperlink w:anchor="_Toc229332685" w:history="1">
+          <w:hyperlink w:anchor="_Toc229333422" w:history="1">
             <w:r>
               <w:rPr>
                 <w:rStyle w:val="ac"/>
@@ -1812,7 +1812,7 @@
                 <w:noProof/>
                 <w:webHidden/>
               </w:rPr>
-              <w:instrText xml:space="preserve"> PAGEREF _Toc229332685 \h </w:instrText>
+              <w:instrText xml:space="preserve"> PAGEREF _Toc229333422 \h </w:instrText>
             </w:r>
             <w:r>
               <w:rPr>
@@ -1854,7 +1854,7 @@
               <w:noProof/>
             </w:rPr>
           </w:pPr>
-          <w:hyperlink w:anchor="_Toc229332686" w:history="1">
+          <w:hyperlink w:anchor="_Toc229333423" w:history="1">
             <w:r>
               <w:rPr>
                 <w:rStyle w:val="ac"/>
@@ -1881,7 +1881,7 @@
                 <w:noProof/>
                 <w:webHidden/>
               </w:rPr>
-              <w:instrText xml:space="preserve"> PAGEREF _Toc229332686 \h </w:instrText>
+              <w:instrText xml:space="preserve"> PAGEREF _Toc229333423 \h </w:instrText>
             </w:r>
             <w:r>
               <w:rPr>
@@ -1923,7 +1923,7 @@
               <w:noProof/>
             </w:rPr>
           </w:pPr>
-          <w:hyperlink w:anchor="_Toc229332687" w:history="1">
+          <w:hyperlink w:anchor="_Toc229333424" w:history="1">
             <w:r>
               <w:rPr>
                 <w:rStyle w:val="ac"/>
@@ -1950,7 +1950,7 @@
                 <w:noProof/>
                 <w:webHidden/>
               </w:rPr>
-              <w:instrText xml:space="preserve"> PAGEREF _Toc229332687 \h </w:instrText>
+              <w:instrText xml:space="preserve"> PAGEREF _Toc229333424 \h </w:instrText>
             </w:r>
             <w:r>
               <w:rPr>
@@ -1992,7 +1992,7 @@
               <w:noProof/>
             </w:rPr>
           </w:pPr>
-          <w:hyperlink w:anchor="_Toc229332688" w:history="1">
+          <w:hyperlink w:anchor="_Toc229333425" w:history="1">
             <w:r>
               <w:rPr>
                 <w:rStyle w:val="ac"/>
@@ -2019,7 +2019,7 @@
                 <w:noProof/>
                 <w:webHidden/>
               </w:rPr>
-              <w:instrText xml:space="preserve"> PAGEREF _Toc229332688 \h </w:instrText>
+              <w:instrText xml:space="preserve"> PAGEREF _Toc229333425 \h </w:instrText>
             </w:r>
             <w:r>
               <w:rPr>
@@ -2039,7 +2039,7 @@
                 <w:noProof/>
                 <w:webHidden/>
               </w:rPr>
-              <w:t>12</w:t>
+              <w:t>13</w:t>
             </w:r>
             <w:r>
               <w:rPr>
@@ -2061,7 +2061,7 @@
               <w:noProof/>
             </w:rPr>
           </w:pPr>
-          <w:hyperlink w:anchor="_Toc229332689" w:history="1">
+          <w:hyperlink w:anchor="_Toc229333426" w:history="1">
             <w:r>
               <w:rPr>
                 <w:rStyle w:val="ac"/>
@@ -2088,7 +2088,7 @@
                 <w:noProof/>
                 <w:webHidden/>
               </w:rPr>
-              <w:instrText xml:space="preserve"> PAGEREF _Toc229332689 \h </w:instrText>
+              <w:instrText xml:space="preserve"> PAGEREF _Toc229333426 \h </w:instrText>
             </w:r>
             <w:r>
               <w:rPr>
@@ -2130,7 +2130,7 @@
               <w:noProof/>
             </w:rPr>
           </w:pPr>
-          <w:hyperlink w:anchor="_Toc229332690" w:history="1">
+          <w:hyperlink w:anchor="_Toc229333427" w:history="1">
             <w:r>
               <w:rPr>
                 <w:rStyle w:val="ac"/>
@@ -2157,7 +2157,7 @@
                 <w:noProof/>
                 <w:webHidden/>
               </w:rPr>
-              <w:instrText xml:space="preserve"> PAGEREF _Toc229332690 \h </w:instrText>
+              <w:instrText xml:space="preserve"> PAGEREF _Toc229333427 \h </w:instrText>
             </w:r>
             <w:r>
               <w:rPr>
@@ -2198,7 +2198,7 @@
               <w:noProof/>
             </w:rPr>
           </w:pPr>
-          <w:hyperlink w:anchor="_Toc229332691" w:history="1">
+          <w:hyperlink w:anchor="_Toc229333428" w:history="1">
             <w:r>
               <w:rPr>
                 <w:rStyle w:val="ac"/>
@@ -2225,7 +2225,7 @@
                 <w:noProof/>
                 <w:webHidden/>
               </w:rPr>
-              <w:instrText xml:space="preserve"> PAGEREF _Toc229332691 \h </w:instrText>
+              <w:instrText xml:space="preserve"> PAGEREF _Toc229333428 \h </w:instrText>
             </w:r>
             <w:r>
               <w:rPr>
@@ -2245,7 +2245,7 @@
                 <w:noProof/>
                 <w:webHidden/>
               </w:rPr>
-              <w:t>13</w:t>
+              <w:t>14</w:t>
             </w:r>
             <w:r>
               <w:rPr>
@@ -2267,7 +2267,7 @@
               <w:noProof/>
             </w:rPr>
           </w:pPr>
-          <w:hyperlink w:anchor="_Toc229332692" w:history="1">
+          <w:hyperlink w:anchor="_Toc229333429" w:history="1">
             <w:r>
               <w:rPr>
                 <w:rStyle w:val="ac"/>
@@ -2294,7 +2294,7 @@
                 <w:noProof/>
                 <w:webHidden/>
               </w:rPr>
-              <w:instrText xml:space="preserve"> PAGEREF _Toc229332692 \h </w:instrText>
+              <w:instrText xml:space="preserve"> PAGEREF _Toc229333429 \h </w:instrText>
             </w:r>
             <w:r>
               <w:rPr>
@@ -2314,7 +2314,7 @@
                 <w:noProof/>
                 <w:webHidden/>
               </w:rPr>
-              <w:t>13</w:t>
+              <w:t>14</w:t>
             </w:r>
             <w:r>
               <w:rPr>
@@ -2336,7 +2336,7 @@
               <w:noProof/>
             </w:rPr>
           </w:pPr>
-          <w:hyperlink w:anchor="_Toc229332693" w:history="1">
+          <w:hyperlink w:anchor="_Toc229333430" w:history="1">
             <w:r>
               <w:rPr>
                 <w:rStyle w:val="ac"/>
@@ -2363,7 +2363,7 @@
                 <w:noProof/>
                 <w:webHidden/>
               </w:rPr>
-              <w:instrText xml:space="preserve"> PAGEREF _Toc229332693 \h </w:instrText>
+              <w:instrText xml:space="preserve"> PAGEREF _Toc229333430 \h </w:instrText>
             </w:r>
             <w:r>
               <w:rPr>
@@ -2405,7 +2405,7 @@
               <w:noProof/>
             </w:rPr>
           </w:pPr>
-          <w:hyperlink w:anchor="_Toc229332694" w:history="1">
+          <w:hyperlink w:anchor="_Toc229333431" w:history="1">
             <w:r>
               <w:rPr>
                 <w:rStyle w:val="ac"/>
@@ -2432,7 +2432,7 @@
                 <w:noProof/>
                 <w:webHidden/>
               </w:rPr>
-              <w:instrText xml:space="preserve"> PAGEREF _Toc229332694 \h </w:instrText>
+              <w:instrText xml:space="preserve"> PAGEREF _Toc229333431 \h </w:instrText>
             </w:r>
             <w:r>
               <w:rPr>
@@ -2474,7 +2474,7 @@
               <w:noProof/>
             </w:rPr>
           </w:pPr>
-          <w:hyperlink w:anchor="_Toc229332695" w:history="1">
+          <w:hyperlink w:anchor="_Toc229333432" w:history="1">
             <w:r>
               <w:rPr>
                 <w:rStyle w:val="ac"/>
@@ -2501,7 +2501,7 @@
                 <w:noProof/>
                 <w:webHidden/>
               </w:rPr>
-              <w:instrText xml:space="preserve"> PAGEREF _Toc229332695 \h </w:instrText>
+              <w:instrText xml:space="preserve"> PAGEREF _Toc229333432 \h </w:instrText>
             </w:r>
             <w:r>
               <w:rPr>
@@ -2542,7 +2542,7 @@
               <w:noProof/>
             </w:rPr>
           </w:pPr>
-          <w:hyperlink w:anchor="_Toc229332696" w:history="1">
+          <w:hyperlink w:anchor="_Toc229333433" w:history="1">
             <w:r>
               <w:rPr>
                 <w:rStyle w:val="ac"/>
@@ -2569,7 +2569,7 @@
                 <w:noProof/>
                 <w:webHidden/>
               </w:rPr>
-              <w:instrText xml:space="preserve"> PAGEREF _Toc229332696 \h </w:instrText>
+              <w:instrText xml:space="preserve"> PAGEREF _Toc229333433 \h </w:instrText>
             </w:r>
             <w:r>
               <w:rPr>
@@ -2589,7 +2589,7 @@
                 <w:noProof/>
                 <w:webHidden/>
               </w:rPr>
-              <w:t>14</w:t>
+              <w:t>15</w:t>
             </w:r>
             <w:r>
               <w:rPr>
@@ -2611,7 +2611,7 @@
               <w:noProof/>
             </w:rPr>
           </w:pPr>
-          <w:hyperlink w:anchor="_Toc229332697" w:history="1">
+          <w:hyperlink w:anchor="_Toc229333434" w:history="1">
             <w:r>
               <w:rPr>
                 <w:rStyle w:val="ac"/>
@@ -2638,7 +2638,7 @@
                 <w:noProof/>
                 <w:webHidden/>
               </w:rPr>
-              <w:instrText xml:space="preserve"> PAGEREF _Toc229332697 \h </w:instrText>
+              <w:instrText xml:space="preserve"> PAGEREF _Toc229333434 \h </w:instrText>
             </w:r>
             <w:r>
               <w:rPr>
@@ -2658,7 +2658,7 @@
                 <w:noProof/>
                 <w:webHidden/>
               </w:rPr>
-              <w:t>14</w:t>
+              <w:t>15</w:t>
             </w:r>
             <w:r>
               <w:rPr>
@@ -2680,7 +2680,7 @@
               <w:noProof/>
             </w:rPr>
           </w:pPr>
-          <w:hyperlink w:anchor="_Toc229332698" w:history="1">
+          <w:hyperlink w:anchor="_Toc229333435" w:history="1">
             <w:r>
               <w:rPr>
                 <w:rStyle w:val="ac"/>
@@ -2707,7 +2707,7 @@
                 <w:noProof/>
                 <w:webHidden/>
               </w:rPr>
-              <w:instrText xml:space="preserve"> PAGEREF _Toc229332698 \h </w:instrText>
+              <w:instrText xml:space="preserve"> PAGEREF _Toc229333435 \h </w:instrText>
             </w:r>
             <w:r>
               <w:rPr>
@@ -2749,7 +2749,7 @@
               <w:noProof/>
             </w:rPr>
           </w:pPr>
-          <w:hyperlink w:anchor="_Toc229332699" w:history="1">
+          <w:hyperlink w:anchor="_Toc229333436" w:history="1">
             <w:r>
               <w:rPr>
                 <w:rStyle w:val="ac"/>
@@ -2776,7 +2776,7 @@
                 <w:noProof/>
                 <w:webHidden/>
               </w:rPr>
-              <w:instrText xml:space="preserve"> PAGEREF _Toc229332699 \h </w:instrText>
+              <w:instrText xml:space="preserve"> PAGEREF _Toc229333436 \h </w:instrText>
             </w:r>
             <w:r>
               <w:rPr>
@@ -2818,7 +2818,7 @@
               <w:noProof/>
             </w:rPr>
           </w:pPr>
-          <w:hyperlink w:anchor="_Toc229332700" w:history="1">
+          <w:hyperlink w:anchor="_Toc229333437" w:history="1">
             <w:r>
               <w:rPr>
                 <w:rStyle w:val="ac"/>
@@ -2845,7 +2845,7 @@
                 <w:noProof/>
                 <w:webHidden/>
               </w:rPr>
-              <w:instrText xml:space="preserve"> PAGEREF _Toc229332700 \h </w:instrText>
+              <w:instrText xml:space="preserve"> PAGEREF _Toc229333437 \h </w:instrText>
             </w:r>
             <w:r>
               <w:rPr>
@@ -2886,7 +2886,7 @@
               <w:noProof/>
             </w:rPr>
           </w:pPr>
-          <w:hyperlink w:anchor="_Toc229332701" w:history="1">
+          <w:hyperlink w:anchor="_Toc229333438" w:history="1">
             <w:r>
               <w:rPr>
                 <w:rStyle w:val="ac"/>
@@ -2913,7 +2913,7 @@
                 <w:noProof/>
                 <w:webHidden/>
               </w:rPr>
-              <w:instrText xml:space="preserve"> PAGEREF _Toc229332701 \h </w:instrText>
+              <w:instrText xml:space="preserve"> PAGEREF _Toc229333438 \h </w:instrText>
             </w:r>
             <w:r>
               <w:rPr>
@@ -2954,7 +2954,7 @@
               <w:noProof/>
             </w:rPr>
           </w:pPr>
-          <w:hyperlink w:anchor="_Toc229332702" w:history="1">
+          <w:hyperlink w:anchor="_Toc229333439" w:history="1">
             <w:r>
               <w:rPr>
                 <w:rStyle w:val="ac"/>
@@ -2981,7 +2981,7 @@
                 <w:noProof/>
                 <w:webHidden/>
               </w:rPr>
-              <w:instrText xml:space="preserve"> PAGEREF _Toc229332702 \h </w:instrText>
+              <w:instrText xml:space="preserve"> PAGEREF _Toc229333439 \h </w:instrText>
             </w:r>
             <w:r>
               <w:rPr>
@@ -3022,7 +3022,7 @@
               <w:noProof/>
             </w:rPr>
           </w:pPr>
-          <w:hyperlink w:anchor="_Toc229332703" w:history="1">
+          <w:hyperlink w:anchor="_Toc229333440" w:history="1">
             <w:r>
               <w:rPr>
                 <w:rStyle w:val="ac"/>
@@ -3049,7 +3049,7 @@
                 <w:noProof/>
                 <w:webHidden/>
               </w:rPr>
-              <w:instrText xml:space="preserve"> PAGEREF _Toc229332703 \h </w:instrText>
+              <w:instrText xml:space="preserve"> PAGEREF _Toc229333440 \h </w:instrText>
             </w:r>
             <w:r>
               <w:rPr>
@@ -3090,7 +3090,7 @@
               <w:noProof/>
             </w:rPr>
           </w:pPr>
-          <w:hyperlink w:anchor="_Toc229332704" w:history="1">
+          <w:hyperlink w:anchor="_Toc229333441" w:history="1">
             <w:r>
               <w:rPr>
                 <w:rStyle w:val="ac"/>
@@ -3117,7 +3117,7 @@
                 <w:noProof/>
                 <w:webHidden/>
               </w:rPr>
-              <w:instrText xml:space="preserve"> PAGEREF _Toc229332704 \h </w:instrText>
+              <w:instrText xml:space="preserve"> PAGEREF _Toc229333441 \h </w:instrText>
             </w:r>
             <w:r>
               <w:rPr>
@@ -3158,7 +3158,7 @@
               <w:noProof/>
             </w:rPr>
           </w:pPr>
-          <w:hyperlink w:anchor="_Toc229332705" w:history="1">
+          <w:hyperlink w:anchor="_Toc229333442" w:history="1">
             <w:r>
               <w:rPr>
                 <w:rStyle w:val="ac"/>
@@ -3185,7 +3185,7 @@
                 <w:noProof/>
                 <w:webHidden/>
               </w:rPr>
-              <w:instrText xml:space="preserve"> PAGEREF _Toc229332705 \h </w:instrText>
+              <w:instrText xml:space="preserve"> PAGEREF _Toc229333442 \h </w:instrText>
             </w:r>
             <w:r>
               <w:rPr>
@@ -3226,7 +3226,7 @@
               <w:noProof/>
             </w:rPr>
           </w:pPr>
-          <w:hyperlink w:anchor="_Toc229332706" w:history="1">
+          <w:hyperlink w:anchor="_Toc229333443" w:history="1">
             <w:r>
               <w:rPr>
                 <w:rStyle w:val="ac"/>
@@ -3253,7 +3253,7 @@
                 <w:noProof/>
                 <w:webHidden/>
               </w:rPr>
-              <w:instrText xml:space="preserve"> PAGEREF _Toc229332706 \h </w:instrText>
+              <w:instrText xml:space="preserve"> PAGEREF _Toc229333443 \h </w:instrText>
             </w:r>
             <w:r>
               <w:rPr>
@@ -3273,7 +3273,7 @@
                 <w:noProof/>
                 <w:webHidden/>
               </w:rPr>
-              <w:t>18</w:t>
+              <w:t>19</w:t>
             </w:r>
             <w:r>
               <w:rPr>
@@ -3295,7 +3295,7 @@
               <w:noProof/>
             </w:rPr>
           </w:pPr>
-          <w:hyperlink w:anchor="_Toc229332707" w:history="1">
+          <w:hyperlink w:anchor="_Toc229333444" w:history="1">
             <w:r>
               <w:rPr>
                 <w:rStyle w:val="ac"/>
@@ -3322,7 +3322,7 @@
                 <w:noProof/>
                 <w:webHidden/>
               </w:rPr>
-              <w:instrText xml:space="preserve"> PAGEREF _Toc229332707 \h </w:instrText>
+              <w:instrText xml:space="preserve"> PAGEREF _Toc229333444 \h </w:instrText>
             </w:r>
             <w:r>
               <w:rPr>
@@ -3342,7 +3342,7 @@
                 <w:noProof/>
                 <w:webHidden/>
               </w:rPr>
-              <w:t>18</w:t>
+              <w:t>19</w:t>
             </w:r>
             <w:r>
               <w:rPr>
@@ -3364,7 +3364,7 @@
               <w:noProof/>
             </w:rPr>
           </w:pPr>
-          <w:hyperlink w:anchor="_Toc229332708" w:history="1">
+          <w:hyperlink w:anchor="_Toc229333445" w:history="1">
             <w:r>
               <w:rPr>
                 <w:rStyle w:val="ac"/>
@@ -3391,7 +3391,7 @@
                 <w:noProof/>
                 <w:webHidden/>
               </w:rPr>
-              <w:instrText xml:space="preserve"> PAGEREF _Toc229332708 \h </w:instrText>
+              <w:instrText xml:space="preserve"> PAGEREF _Toc229333445 \h </w:instrText>
             </w:r>
             <w:r>
               <w:rPr>
@@ -3433,7 +3433,7 @@
               <w:noProof/>
             </w:rPr>
           </w:pPr>
-          <w:hyperlink w:anchor="_Toc229332709" w:history="1">
+          <w:hyperlink w:anchor="_Toc229333446" w:history="1">
             <w:r>
               <w:rPr>
                 <w:rStyle w:val="ac"/>
@@ -3460,7 +3460,7 @@
                 <w:noProof/>
                 <w:webHidden/>
               </w:rPr>
-              <w:instrText xml:space="preserve"> PAGEREF _Toc229332709 \h </w:instrText>
+              <w:instrText xml:space="preserve"> PAGEREF _Toc229333446 \h </w:instrText>
             </w:r>
             <w:r>
               <w:rPr>
@@ -3503,7 +3503,7 @@
         <w:pStyle w:val="1"/>
       </w:pPr>
       <w:bookmarkStart w:id="0" w:name="abstract"/>
-      <w:bookmarkStart w:id="1" w:name="_Toc229332660"/>
+      <w:bookmarkStart w:id="1" w:name="_Toc229333397"/>
       <w:r>
         <w:t>Abstract</w:t>
       </w:r>
@@ -3655,7 +3655,7 @@
         <w:pStyle w:val="1"/>
       </w:pPr>
       <w:bookmarkStart w:id="2" w:name="Xe3d0fc0bea9a42ce7605565d0964033d7f6ee47"/>
-      <w:bookmarkStart w:id="3" w:name="_Toc229332661"/>
+      <w:bookmarkStart w:id="3" w:name="_Toc229333398"/>
       <w:bookmarkEnd w:id="0"/>
       <w:r>
         <w:t>1. Introduction</w:t>
@@ -3667,7 +3667,7 @@
         <w:pStyle w:val="2"/>
       </w:pPr>
       <w:bookmarkStart w:id="4" w:name="X1bf71e34a5475eafa7691d512243933c189287b"/>
-      <w:bookmarkStart w:id="5" w:name="_Toc229332662"/>
+      <w:bookmarkStart w:id="5" w:name="_Toc229333399"/>
       <w:r>
         <w:t>1.1 Motivation</w:t>
       </w:r>
@@ -3785,7 +3785,7 @@
         <w:pStyle w:val="2"/>
       </w:pPr>
       <w:bookmarkStart w:id="6" w:name="Xe2513cbe4cec0b433ad043d7a2d5bcba3139b87"/>
-      <w:bookmarkStart w:id="7" w:name="_Toc229332663"/>
+      <w:bookmarkStart w:id="7" w:name="_Toc229333400"/>
       <w:bookmarkEnd w:id="4"/>
       <w:r>
         <w:t>1.2 Research Questions</w:t>
@@ -3854,7 +3854,7 @@
         <w:pStyle w:val="2"/>
       </w:pPr>
       <w:bookmarkStart w:id="8" w:name="Xb1c59bf1c3438cfd31a3fec8cade6ebe9aa841c"/>
-      <w:bookmarkStart w:id="9" w:name="_Toc229332664"/>
+      <w:bookmarkStart w:id="9" w:name="_Toc229333401"/>
       <w:bookmarkEnd w:id="6"/>
       <w:r>
         <w:t>1.3 Contributions</w:t>
@@ -3934,7 +3934,7 @@
         <w:pStyle w:val="1"/>
       </w:pPr>
       <w:bookmarkStart w:id="10" w:name="X619ba3478f1480a9208e2b421efeeeaa187dd54"/>
-      <w:bookmarkStart w:id="11" w:name="_Toc229332665"/>
+      <w:bookmarkStart w:id="11" w:name="_Toc229333402"/>
       <w:bookmarkEnd w:id="2"/>
       <w:bookmarkEnd w:id="8"/>
       <w:r>
@@ -3947,7 +3947,7 @@
         <w:pStyle w:val="2"/>
       </w:pPr>
       <w:bookmarkStart w:id="12" w:name="X636afad0aabef8e19e5b2a066aedeb36b31e26b"/>
-      <w:bookmarkStart w:id="13" w:name="_Toc229332666"/>
+      <w:bookmarkStart w:id="13" w:name="_Toc229333403"/>
       <w:r>
         <w:t>2.1 Hierarchical Analysis of Sonata Form</w:t>
       </w:r>
@@ -4127,7 +4127,7 @@
         <w:pStyle w:val="2"/>
       </w:pPr>
       <w:bookmarkStart w:id="14" w:name="Xcdbd97658319399ff5ffd3a85fd0bd39d0734e1"/>
-      <w:bookmarkStart w:id="15" w:name="_Toc229332667"/>
+      <w:bookmarkStart w:id="15" w:name="_Toc229333404"/>
       <w:bookmarkEnd w:id="12"/>
       <w:r>
         <w:t>2.2 Dual Coding and the Cognitive Theory of Multimedia Learning</w:t>
@@ -4399,7 +4399,7 @@
         <w:pStyle w:val="2"/>
       </w:pPr>
       <w:bookmarkStart w:id="16" w:name="X6784453bfb3fc20011e6020596635d203a2a71e"/>
-      <w:bookmarkStart w:id="17" w:name="_Toc229332668"/>
+      <w:bookmarkStart w:id="17" w:name="_Toc229333405"/>
       <w:bookmarkEnd w:id="14"/>
       <w:r>
         <w:t>2.3 Active Learning and Comparative Listening</w:t>
@@ -4449,7 +4449,7 @@
         <w:pStyle w:val="2"/>
       </w:pPr>
       <w:bookmarkStart w:id="18" w:name="Xf4d637e68613cffa17c84978bce4794819ef246"/>
-      <w:bookmarkStart w:id="19" w:name="_Toc229332669"/>
+      <w:bookmarkStart w:id="19" w:name="_Toc229333406"/>
       <w:bookmarkEnd w:id="16"/>
       <w:r>
         <w:t>2.4 Related Tools</w:t>
@@ -5477,7 +5477,7 @@
         <w:pStyle w:val="1"/>
       </w:pPr>
       <w:bookmarkStart w:id="20" w:name="X22b19702d34576da8b32320cefe87a134a1534c"/>
-      <w:bookmarkStart w:id="21" w:name="_Toc229332670"/>
+      <w:bookmarkStart w:id="21" w:name="_Toc229333407"/>
       <w:bookmarkEnd w:id="10"/>
       <w:bookmarkEnd w:id="18"/>
       <w:r>
@@ -5490,7 +5490,7 @@
         <w:pStyle w:val="2"/>
       </w:pPr>
       <w:bookmarkStart w:id="22" w:name="X90037fffeb0517eb9be28959be4b42079adccec"/>
-      <w:bookmarkStart w:id="23" w:name="_Toc229332671"/>
+      <w:bookmarkStart w:id="23" w:name="_Toc229333408"/>
       <w:r>
         <w:t>3.1 Overview</w:t>
       </w:r>
@@ -5539,7 +5539,7 @@
         <w:pStyle w:val="2"/>
       </w:pPr>
       <w:bookmarkStart w:id="24" w:name="X5114b9a8810654ce1b996f5cb0cc61b16e32533"/>
-      <w:bookmarkStart w:id="25" w:name="_Toc229332672"/>
+      <w:bookmarkStart w:id="25" w:name="_Toc229333409"/>
       <w:bookmarkEnd w:id="22"/>
       <w:r>
         <w:t>3.2 Formal Analysis</w:t>
@@ -6850,7 +6850,7 @@
         <w:pStyle w:val="2"/>
       </w:pPr>
       <w:bookmarkStart w:id="26" w:name="X22345862c5d429ecd2382d6ef2da7ccf6968f1d"/>
-      <w:bookmarkStart w:id="27" w:name="_Toc229332673"/>
+      <w:bookmarkStart w:id="27" w:name="_Toc229333410"/>
       <w:bookmarkEnd w:id="24"/>
       <w:r>
         <w:t>3.3 Pedagogical Significance: The Subdominant Recapitulation</w:t>
@@ -6872,7 +6872,7 @@
         <w:t>subdominant recapitulation</w:t>
       </w:r>
       <w:r>
-        <w:t>, a recognized but unusual deformation. Its functional motivation, often glossed in textbooks, is illuminating:</w:t>
+        <w:t>, a recognized but unusual deformation. Korean-language scholarship corroborates the same observation — Bong (2017) describes the recap-key choice as a transposition "a fifth below the dominant" while emphasizing the unifying role of the Alberti bass across all three movements. Its functional motivation, often glossed in textbooks, is illuminating:</w:t>
       </w:r>
     </w:p>
     <w:p>
@@ -6980,7 +6980,7 @@
         <w:pStyle w:val="1"/>
       </w:pPr>
       <w:bookmarkStart w:id="28" w:name="X931ba28faf84dd02b36c362d702d1bc58709915"/>
-      <w:bookmarkStart w:id="29" w:name="_Toc229332674"/>
+      <w:bookmarkStart w:id="29" w:name="_Toc229333411"/>
       <w:bookmarkEnd w:id="20"/>
       <w:bookmarkEnd w:id="26"/>
       <w:r>
@@ -6993,7 +6993,7 @@
         <w:pStyle w:val="2"/>
       </w:pPr>
       <w:bookmarkStart w:id="30" w:name="X9de8e5b45ce68f346b1cc38c139307b75b6baf5"/>
-      <w:bookmarkStart w:id="31" w:name="_Toc229332675"/>
+      <w:bookmarkStart w:id="31" w:name="_Toc229333412"/>
       <w:r>
         <w:t>4.1 Design Principles</w:t>
       </w:r>
@@ -7314,7 +7314,7 @@
         <w:pStyle w:val="2"/>
       </w:pPr>
       <w:bookmarkStart w:id="32" w:name="X15d66123ba36ad77d4b76862583d779c64c85de"/>
-      <w:bookmarkStart w:id="33" w:name="_Toc229332676"/>
+      <w:bookmarkStart w:id="33" w:name="_Toc229333413"/>
       <w:bookmarkEnd w:id="30"/>
       <w:r>
         <w:t>4.2 Architecture</w:t>
@@ -7540,7 +7540,7 @@
         <w:pStyle w:val="2"/>
       </w:pPr>
       <w:bookmarkStart w:id="34" w:name="X08bfe69c9bda8b49e28ab7e12a88087f3f094ec"/>
-      <w:bookmarkStart w:id="35" w:name="_Toc229332677"/>
+      <w:bookmarkStart w:id="35" w:name="_Toc229333414"/>
       <w:bookmarkEnd w:id="32"/>
       <w:r>
         <w:t>4.3 Data Schema</w:t>
@@ -8557,7 +8557,7 @@
         <w:pStyle w:val="2"/>
       </w:pPr>
       <w:bookmarkStart w:id="36" w:name="X302df813eec71695f042125274d58a1663ea74d"/>
-      <w:bookmarkStart w:id="37" w:name="_Toc229332678"/>
+      <w:bookmarkStart w:id="37" w:name="_Toc229333415"/>
       <w:bookmarkEnd w:id="34"/>
       <w:r>
         <w:t>4.4 Synchronization Algorithm</w:t>
@@ -9565,7 +9565,7 @@
         <w:pStyle w:val="2"/>
       </w:pPr>
       <w:bookmarkStart w:id="41" w:name="X65073c4485f33f4613201d3117deb1ee1dc92e2"/>
-      <w:bookmarkStart w:id="42" w:name="_Toc229332679"/>
+      <w:bookmarkStart w:id="42" w:name="_Toc229333416"/>
       <w:bookmarkEnd w:id="36"/>
       <w:bookmarkEnd w:id="40"/>
       <w:r>
@@ -10117,7 +10117,7 @@
         <w:pStyle w:val="1"/>
       </w:pPr>
       <w:bookmarkStart w:id="43" w:name="X46d7d1d5105128ac6809b89aa63ce48805167cf"/>
-      <w:bookmarkStart w:id="44" w:name="_Toc229332680"/>
+      <w:bookmarkStart w:id="44" w:name="_Toc229333417"/>
       <w:bookmarkEnd w:id="28"/>
       <w:bookmarkEnd w:id="41"/>
       <w:r>
@@ -10130,7 +10130,7 @@
         <w:pStyle w:val="2"/>
       </w:pPr>
       <w:bookmarkStart w:id="45" w:name="X85f22ce8108fdac68fd2e3b2fb5b24980e3236d"/>
-      <w:bookmarkStart w:id="46" w:name="_Toc229332681"/>
+      <w:bookmarkStart w:id="46" w:name="_Toc229333418"/>
       <w:r>
         <w:t>5.1 Stack</w:t>
       </w:r>
@@ -10225,7 +10225,7 @@
         <w:pStyle w:val="2"/>
       </w:pPr>
       <w:bookmarkStart w:id="47" w:name="X44135718d30d0d96c7a4f196b7424ac73c01acc"/>
-      <w:bookmarkStart w:id="48" w:name="_Toc229332682"/>
+      <w:bookmarkStart w:id="48" w:name="_Toc229333419"/>
       <w:bookmarkEnd w:id="45"/>
       <w:r>
         <w:t>5.2 Module Structure</w:t>
@@ -10344,7 +10344,7 @@
         <w:pStyle w:val="2"/>
       </w:pPr>
       <w:bookmarkStart w:id="49" w:name="X109c7a168e0e829c2f1484d7523259a203dc182"/>
-      <w:bookmarkStart w:id="50" w:name="_Toc229332683"/>
+      <w:bookmarkStart w:id="50" w:name="_Toc229333420"/>
       <w:bookmarkEnd w:id="47"/>
       <w:r>
         <w:t>5.3 Robustness</w:t>
@@ -10688,7 +10688,7 @@
         <w:pStyle w:val="2"/>
       </w:pPr>
       <w:bookmarkStart w:id="51" w:name="Xeb2de10a3b598cc9ca9b3bd4d84d98e98d719f3"/>
-      <w:bookmarkStart w:id="52" w:name="_Toc229332684"/>
+      <w:bookmarkStart w:id="52" w:name="_Toc229333421"/>
       <w:bookmarkEnd w:id="49"/>
       <w:r>
         <w:t>5.4 Accessibility</w:t>
@@ -10796,7 +10796,7 @@
         <w:pStyle w:val="1"/>
       </w:pPr>
       <w:bookmarkStart w:id="53" w:name="X57d1f32c80879f8393b1352d8ba753499a9c37b"/>
-      <w:bookmarkStart w:id="54" w:name="_Toc229332685"/>
+      <w:bookmarkStart w:id="54" w:name="_Toc229333422"/>
       <w:bookmarkEnd w:id="43"/>
       <w:bookmarkEnd w:id="51"/>
       <w:r>
@@ -10809,7 +10809,7 @@
         <w:pStyle w:val="2"/>
       </w:pPr>
       <w:bookmarkStart w:id="55" w:name="X56589be57991d63716b3d0aae591a0c2c18a5f9"/>
-      <w:bookmarkStart w:id="56" w:name="_Toc229332686"/>
+      <w:bookmarkStart w:id="56" w:name="_Toc229333423"/>
       <w:r>
         <w:t>6.1 Design</w:t>
       </w:r>
@@ -10828,7 +10828,7 @@
         <w:pStyle w:val="2"/>
       </w:pPr>
       <w:bookmarkStart w:id="57" w:name="X626dce9a3407f19d3f0a823cce1718cb844591d"/>
-      <w:bookmarkStart w:id="58" w:name="_Toc229332687"/>
+      <w:bookmarkStart w:id="58" w:name="_Toc229333424"/>
       <w:bookmarkEnd w:id="55"/>
       <w:r>
         <w:t>6.2 Participants</w:t>
@@ -10848,7 +10848,7 @@
         <w:pStyle w:val="2"/>
       </w:pPr>
       <w:bookmarkStart w:id="59" w:name="X05f1459f461e8b33ac8afc0bcb2959ba6322de4"/>
-      <w:bookmarkStart w:id="60" w:name="_Toc229332688"/>
+      <w:bookmarkStart w:id="60" w:name="_Toc229333425"/>
       <w:bookmarkEnd w:id="57"/>
       <w:r>
         <w:t>6.3 Instruments</w:t>
@@ -10977,7 +10977,7 @@
         <w:pStyle w:val="2"/>
       </w:pPr>
       <w:bookmarkStart w:id="64" w:name="Xaf91fc092ffe9ac78d490a0b77b62d1c8cd8bd2"/>
-      <w:bookmarkStart w:id="65" w:name="_Toc229332689"/>
+      <w:bookmarkStart w:id="65" w:name="_Toc229333426"/>
       <w:bookmarkEnd w:id="59"/>
       <w:bookmarkEnd w:id="63"/>
       <w:r>
@@ -11444,7 +11444,7 @@
         <w:pStyle w:val="2"/>
       </w:pPr>
       <w:bookmarkStart w:id="66" w:name="X7572b3eeae2a88e4ac4425c4de66b4439d2e686"/>
-      <w:bookmarkStart w:id="67" w:name="_Toc229332690"/>
+      <w:bookmarkStart w:id="67" w:name="_Toc229333427"/>
       <w:bookmarkEnd w:id="64"/>
       <w:r>
         <w:t>6.5 Analysis</w:t>
@@ -11512,7 +11512,7 @@
         <w:pStyle w:val="1"/>
       </w:pPr>
       <w:bookmarkStart w:id="68" w:name="X7f71dd75448129b74f2fc659b5486981c0282bb"/>
-      <w:bookmarkStart w:id="69" w:name="_Toc229332691"/>
+      <w:bookmarkStart w:id="69" w:name="_Toc229333428"/>
       <w:bookmarkEnd w:id="53"/>
       <w:bookmarkEnd w:id="66"/>
       <w:r>
@@ -11525,7 +11525,7 @@
         <w:pStyle w:val="2"/>
       </w:pPr>
       <w:bookmarkStart w:id="70" w:name="X4dac277f1e89ace7bdb47f4ded59737bf54114c"/>
-      <w:bookmarkStart w:id="71" w:name="_Toc229332692"/>
+      <w:bookmarkStart w:id="71" w:name="_Toc229333429"/>
       <w:r>
         <w:t>7.1 Form-Identification Accuracy</w:t>
       </w:r>
@@ -12004,7 +12004,7 @@
         <w:pStyle w:val="2"/>
       </w:pPr>
       <w:bookmarkStart w:id="72" w:name="Xd9d885e72efb507e3941536a98032464b5d5f1d"/>
-      <w:bookmarkStart w:id="73" w:name="_Toc229332693"/>
+      <w:bookmarkStart w:id="73" w:name="_Toc229333430"/>
       <w:bookmarkEnd w:id="70"/>
       <w:r>
         <w:t>7.2 Recognition of Subdominant Recapitulation</w:t>
@@ -12056,7 +12056,7 @@
         <w:pStyle w:val="2"/>
       </w:pPr>
       <w:bookmarkStart w:id="74" w:name="X6069361d365837a92e0e55eb07a1d332869933b"/>
-      <w:bookmarkStart w:id="75" w:name="_Toc229332694"/>
+      <w:bookmarkStart w:id="75" w:name="_Toc229333431"/>
       <w:bookmarkEnd w:id="72"/>
       <w:r>
         <w:t>7.3 System Usability</w:t>
@@ -12086,7 +12086,7 @@
         <w:pStyle w:val="2"/>
       </w:pPr>
       <w:bookmarkStart w:id="76" w:name="X955a6c17de00f00e200944c891e82f95760f924"/>
-      <w:bookmarkStart w:id="77" w:name="_Toc229332695"/>
+      <w:bookmarkStart w:id="77" w:name="_Toc229333432"/>
       <w:bookmarkEnd w:id="74"/>
       <w:r>
         <w:t>7.4 Qualitative Feedback</w:t>
@@ -12206,7 +12206,7 @@
         <w:pStyle w:val="1"/>
       </w:pPr>
       <w:bookmarkStart w:id="78" w:name="X8c1abf58e73567575ecbab20602f8a971fd4c73"/>
-      <w:bookmarkStart w:id="79" w:name="_Toc229332696"/>
+      <w:bookmarkStart w:id="79" w:name="_Toc229333433"/>
       <w:bookmarkEnd w:id="68"/>
       <w:bookmarkEnd w:id="76"/>
       <w:r>
@@ -12219,7 +12219,7 @@
         <w:pStyle w:val="2"/>
       </w:pPr>
       <w:bookmarkStart w:id="80" w:name="X792a0b1f307aa766433d7cba8d8c8e8da4fc05d"/>
-      <w:bookmarkStart w:id="81" w:name="_Toc229332697"/>
+      <w:bookmarkStart w:id="81" w:name="_Toc229333434"/>
       <w:r>
         <w:t>8.1 Educational Implications</w:t>
       </w:r>
@@ -12268,7 +12268,7 @@
         <w:pStyle w:val="2"/>
       </w:pPr>
       <w:bookmarkStart w:id="82" w:name="X593130719821a7a26ba1a1a7e7694f583376987"/>
-      <w:bookmarkStart w:id="83" w:name="_Toc229332698"/>
+      <w:bookmarkStart w:id="83" w:name="_Toc229333435"/>
       <w:bookmarkEnd w:id="80"/>
       <w:r>
         <w:t>8.2 Methodological and Tooling Implications</w:t>
@@ -12337,7 +12337,7 @@
         <w:pStyle w:val="2"/>
       </w:pPr>
       <w:bookmarkStart w:id="84" w:name="X364fc5a9947686e660d06f9e3e3943779d206b3"/>
-      <w:bookmarkStart w:id="85" w:name="_Toc229332699"/>
+      <w:bookmarkStart w:id="85" w:name="_Toc229333436"/>
       <w:bookmarkEnd w:id="82"/>
       <w:r>
         <w:t>8.3 Limitations</w:t>
@@ -12447,7 +12447,7 @@
         <w:pStyle w:val="2"/>
       </w:pPr>
       <w:bookmarkStart w:id="86" w:name="X3aa89359e731db19990110a81e7fa3cb52c4302"/>
-      <w:bookmarkStart w:id="87" w:name="_Toc229332700"/>
+      <w:bookmarkStart w:id="87" w:name="_Toc229333437"/>
       <w:bookmarkEnd w:id="84"/>
       <w:r>
         <w:t>8.4 Future Work</w:t>
@@ -12554,7 +12554,7 @@
         <w:pStyle w:val="1"/>
       </w:pPr>
       <w:bookmarkStart w:id="88" w:name="Xf084a3aad2ba019113a3f84a3b857d0628c92ce"/>
-      <w:bookmarkStart w:id="89" w:name="_Toc229332701"/>
+      <w:bookmarkStart w:id="89" w:name="_Toc229333438"/>
       <w:bookmarkEnd w:id="78"/>
       <w:bookmarkEnd w:id="86"/>
       <w:r>
@@ -12593,7 +12593,7 @@
         <w:pStyle w:val="1"/>
       </w:pPr>
       <w:bookmarkStart w:id="90" w:name="X640081157259e8cff7029700f597651e6519d9c"/>
-      <w:bookmarkStart w:id="91" w:name="_Toc229332702"/>
+      <w:bookmarkStart w:id="91" w:name="_Toc229333439"/>
       <w:bookmarkEnd w:id="88"/>
       <w:r>
         <w:t>10. Reproducibility</w:t>
@@ -12816,12 +12816,15 @@
                 <w:sz w:val="22"/>
               </w:rPr>
             </w:pPr>
-            <w:r>
-              <w:rPr>
-                <w:sz w:val="22"/>
-              </w:rPr>
-              <w:t>10.5281/zenodo.[pending]</w:t>
-            </w:r>
+            <w:hyperlink r:id="rId9">
+              <w:r>
+                <w:rPr>
+                  <w:rStyle w:val="ac"/>
+                  <w:sz w:val="22"/>
+                </w:rPr>
+                <w:t>10.5281/zenodo.20108497</w:t>
+              </w:r>
+            </w:hyperlink>
           </w:p>
         </w:tc>
       </w:tr>
@@ -13082,7 +13085,10 @@
         <w:t>Audio is intentionally excluded.</w:t>
       </w:r>
       <w:r>
-        <w:t xml:space="preserve"> The recording used in our evaluation (András Schiff, Carnegie Hall 2015) is a commercial release and is not redistributed. To reproduce the evaluation, obtain a public-domain recording from the sources listed in </w:t>
+        <w:t xml:space="preserve"> </w:t>
+      </w:r>
+      <w:r>
+        <w:t xml:space="preserve">The recording used in our evaluation (András Schiff, Carnegie Hall 2015) is a commercial release and is not redistributed. To reproduce the evaluation, obtain a public-domain recording from the sources listed in </w:t>
       </w:r>
       <w:r>
         <w:rPr>
@@ -13126,10 +13132,7 @@
         <w:t>OpenSheetMusicDisplay</w:t>
       </w:r>
       <w:r>
-        <w:t xml:space="preserve"> v1.8.7. Browser compatibility is verified on </w:t>
-      </w:r>
-      <w:r>
-        <w:t xml:space="preserve">Chrome 120+, Edge 120+, and Firefox 121+. Any static-file server suffices (e.g., </w:t>
+        <w:t xml:space="preserve"> v1.8.7. Browser compatibility is verified on Chrome 120+, Edge 120+, and Firefox 121+. Any static-file server suffices (e.g., </w:t>
       </w:r>
       <w:r>
         <w:rPr>
@@ -13161,7 +13164,7 @@
         <w:pStyle w:val="1"/>
       </w:pPr>
       <w:bookmarkStart w:id="92" w:name="acknowledgments"/>
-      <w:bookmarkStart w:id="93" w:name="_Toc229332703"/>
+      <w:bookmarkStart w:id="93" w:name="_Toc229333440"/>
       <w:bookmarkEnd w:id="90"/>
       <w:r>
         <w:t>Acknowledgments</w:t>
@@ -13181,7 +13184,7 @@
         <w:pStyle w:val="1"/>
       </w:pPr>
       <w:bookmarkStart w:id="94" w:name="references"/>
-      <w:bookmarkStart w:id="95" w:name="_Toc229332704"/>
+      <w:bookmarkStart w:id="95" w:name="_Toc229333441"/>
       <w:bookmarkEnd w:id="92"/>
       <w:r>
         <w:t>References</w:t>
@@ -13197,20 +13200,56 @@
         </w:numPr>
       </w:pPr>
       <w:r>
-        <w:t xml:space="preserve">Brooke, J. (1996). SUS: A "quick and dirty" usability scale. In P. W. </w:t>
-      </w:r>
-      <w:r>
-        <w:t xml:space="preserve">Jordan, B. Thomas, B. A. Weerdmeester, &amp; I. L. McClelland (Eds.), </w:t>
+        <w:t xml:space="preserve">Bong, J.-J. (2017). </w:t>
       </w:r>
       <w:r>
         <w:rPr>
           <w:i/>
           <w:iCs/>
         </w:rPr>
-        <w:t>Usability Evaluation in Industry</w:t>
-      </w:r>
-      <w:r>
-        <w:t xml:space="preserve"> (pp. 189–194). Taylor &amp; Francis.</w:t>
+        <w:t>A study on Piano Sonata K. 545 by W. A. Mozart</w:t>
+      </w:r>
+      <w:r>
+        <w:t xml:space="preserve"> </w:t>
+      </w:r>
+      <w:r>
+        <w:t xml:space="preserve">[Master's thesis in Musicology, Konkuk University Graduate School, Seoul]. Advisor: J.-M. Kim. (Korean: </w:t>
+      </w:r>
+      <w:r>
+        <w:t>모차르트</w:t>
+      </w:r>
+      <w:r>
+        <w:t xml:space="preserve"> </w:t>
+      </w:r>
+      <w:r>
+        <w:t>〈피아노</w:t>
+      </w:r>
+      <w:r>
+        <w:t xml:space="preserve"> </w:t>
+      </w:r>
+      <w:r>
+        <w:t>소나타</w:t>
+      </w:r>
+      <w:r>
+        <w:t xml:space="preserve"> K. 545</w:t>
+      </w:r>
+      <w:r>
+        <w:t>〉</w:t>
+      </w:r>
+      <w:r>
+        <w:t xml:space="preserve"> </w:t>
+      </w:r>
+      <w:r>
+        <w:t>분석</w:t>
+      </w:r>
+      <w:r>
+        <w:t xml:space="preserve"> </w:t>
+      </w:r>
+      <w:r>
+        <w:t>연구</w:t>
+      </w:r>
+      <w:r>
+        <w:t>.)</w:t>
       </w:r>
     </w:p>
     <w:p>
@@ -13222,17 +13261,17 @@
         </w:numPr>
       </w:pPr>
       <w:r>
-        <w:t xml:space="preserve">Cannam, C., Landone, C., &amp; Sandler, M. (2010). Sonic Visualiser: An open source application for viewing, analysing, and annotating music audio files. In </w:t>
+        <w:t xml:space="preserve">Brooke, J. (1996). SUS: A "quick and dirty" usability scale. In P. W. Jordan, B. Thomas, B. A. Weerdmeester, &amp; I. L. McClelland (Eds.), </w:t>
       </w:r>
       <w:r>
         <w:rPr>
           <w:i/>
           <w:iCs/>
         </w:rPr>
-        <w:t>Proceedings of the ACM Multimedia 2010 International Conference</w:t>
-      </w:r>
-      <w:r>
-        <w:t xml:space="preserve"> (pp. 1467–1468).</w:t>
+        <w:t>Usability Evaluation in Industry</w:t>
+      </w:r>
+      <w:r>
+        <w:t xml:space="preserve"> (pp. 189–194). Taylor &amp; Francis.</w:t>
       </w:r>
     </w:p>
     <w:p>
@@ -13244,17 +13283,17 @@
         </w:numPr>
       </w:pPr>
       <w:r>
-        <w:t xml:space="preserve">Caplin, W. E. (1998). </w:t>
+        <w:t xml:space="preserve">Cannam, C., Landone, C., &amp; Sandler, M. (2010). Sonic Visualiser: An open source application for viewing, analysing, and annotating music audio files. In </w:t>
       </w:r>
       <w:r>
         <w:rPr>
           <w:i/>
           <w:iCs/>
         </w:rPr>
-        <w:t>Classical form: A theory of formal functions for the instrumental music of Haydn, Mozart, and Beethoven.</w:t>
-      </w:r>
-      <w:r>
-        <w:t xml:space="preserve"> Oxford University Press.</w:t>
+        <w:t>Proceedings of the ACM Multimedia 2010 International Conference</w:t>
+      </w:r>
+      <w:r>
+        <w:t xml:space="preserve"> (pp. 1467–1468).</w:t>
       </w:r>
     </w:p>
     <w:p>
@@ -13266,17 +13305,17 @@
         </w:numPr>
       </w:pPr>
       <w:r>
-        <w:t xml:space="preserve">Caplin, W. E. (2009). What are formal functions? In P. Bergé (Ed.), </w:t>
+        <w:t xml:space="preserve">Caplin, W. E. (1998). </w:t>
       </w:r>
       <w:r>
         <w:rPr>
           <w:i/>
           <w:iCs/>
         </w:rPr>
-        <w:t>Musical form, forms, &amp; formenlehre</w:t>
-      </w:r>
-      <w:r>
-        <w:t xml:space="preserve"> (pp. 21–40). Leuven University Press.</w:t>
+        <w:t>Classical form: A theory of formal functions for the instrumental music of Haydn, Mozart, and Beethoven.</w:t>
+      </w:r>
+      <w:r>
+        <w:t xml:space="preserve"> Oxford University Press.</w:t>
       </w:r>
     </w:p>
     <w:p>
@@ -13288,17 +13327,17 @@
         </w:numPr>
       </w:pPr>
       <w:r>
-        <w:t xml:space="preserve">Cohen, J. (1988). </w:t>
+        <w:t xml:space="preserve">Caplin, W. E. (2009). What are formal functions? In P. Bergé (Ed.), </w:t>
       </w:r>
       <w:r>
         <w:rPr>
           <w:i/>
           <w:iCs/>
         </w:rPr>
-        <w:t>Statistical power analysis for the behavioral sciences</w:t>
-      </w:r>
-      <w:r>
-        <w:t xml:space="preserve"> (2nd ed.). Erlbaum.</w:t>
+        <w:t>Musical form, forms, &amp; formenlehre</w:t>
+      </w:r>
+      <w:r>
+        <w:t xml:space="preserve"> (pp. 21–40). Leuven University Press.</w:t>
       </w:r>
     </w:p>
     <w:p>
@@ -13310,17 +13349,17 @@
         </w:numPr>
       </w:pPr>
       <w:r>
-        <w:t xml:space="preserve">Cook, N. (1990). </w:t>
+        <w:t xml:space="preserve">Cohen, J. (1988). </w:t>
       </w:r>
       <w:r>
         <w:rPr>
           <w:i/>
           <w:iCs/>
         </w:rPr>
-        <w:t>Music, imagination, and culture.</w:t>
-      </w:r>
-      <w:r>
-        <w:t xml:space="preserve"> Oxford University Press.</w:t>
+        <w:t>Statistical power analysis for the behavioral sciences</w:t>
+      </w:r>
+      <w:r>
+        <w:t xml:space="preserve"> (2nd ed.). Erlbaum.</w:t>
       </w:r>
     </w:p>
     <w:p>
@@ -13332,17 +13371,17 @@
         </w:numPr>
       </w:pPr>
       <w:r>
-        <w:t xml:space="preserve">Couprie, P. (2008). iAnalyse: A software dedicated to the graphical analysis of music. In </w:t>
+        <w:t xml:space="preserve">Cook, N. (1990). </w:t>
       </w:r>
       <w:r>
         <w:rPr>
           <w:i/>
           <w:iCs/>
         </w:rPr>
-        <w:t>Proceedings of the 5th Sound and Music Computing Conference</w:t>
-      </w:r>
-      <w:r>
-        <w:t>.</w:t>
+        <w:t>Music, imagination, and culture.</w:t>
+      </w:r>
+      <w:r>
+        <w:t xml:space="preserve"> Oxford University Press.</w:t>
       </w:r>
     </w:p>
     <w:p>
@@ -13354,14 +13393,14 @@
         </w:numPr>
       </w:pPr>
       <w:r>
-        <w:t xml:space="preserve">Goto, M. (2006). AIST annotation for the RWC music database. In </w:t>
+        <w:t xml:space="preserve">Couprie, P. (2008). iAnalyse: A software dedicated to the graphical analysis of music. In </w:t>
       </w:r>
       <w:r>
         <w:rPr>
           <w:i/>
           <w:iCs/>
         </w:rPr>
-        <w:t>Proceedings of ISMIR 2006</w:t>
+        <w:t>Proceedings of the 5th Sound and Music Computing Conference</w:t>
       </w:r>
       <w:r>
         <w:t>.</w:t>
@@ -13376,17 +13415,17 @@
         </w:numPr>
       </w:pPr>
       <w:r>
-        <w:t xml:space="preserve">Hargreaves, D. J. (1986). </w:t>
+        <w:t xml:space="preserve">Goto, M. (2006). AIST annotation for the RWC music database. In </w:t>
       </w:r>
       <w:r>
         <w:rPr>
           <w:i/>
           <w:iCs/>
         </w:rPr>
-        <w:t>The developmental psychology of music.</w:t>
-      </w:r>
-      <w:r>
-        <w:t xml:space="preserve"> Cambridge University Press.</w:t>
+        <w:t>Proceedings of ISMIR 2006</w:t>
+      </w:r>
+      <w:r>
+        <w:t>.</w:t>
       </w:r>
     </w:p>
     <w:p>
@@ -13398,17 +13437,17 @@
         </w:numPr>
       </w:pPr>
       <w:r>
-        <w:t xml:space="preserve">Hepokoski, J., &amp; Darcy, W. (2006). </w:t>
+        <w:t xml:space="preserve">Hargreaves, D. J. (1986). </w:t>
       </w:r>
       <w:r>
         <w:rPr>
           <w:i/>
           <w:iCs/>
         </w:rPr>
-        <w:t>Elements of sonata theory: Norms, types, and deformations in the late-eighteenth-century sonata.</w:t>
-      </w:r>
-      <w:r>
-        <w:t xml:space="preserve"> Oxford University Press.</w:t>
+        <w:t>The developmental psychology of music.</w:t>
+      </w:r>
+      <w:r>
+        <w:t xml:space="preserve"> Cambridge University Press.</w:t>
       </w:r>
     </w:p>
     <w:p>
@@ -13420,14 +13459,14 @@
         </w:numPr>
       </w:pPr>
       <w:r>
-        <w:t xml:space="preserve">Margulis, E. H. (2014). </w:t>
+        <w:t xml:space="preserve">Hepokoski, J., &amp; Darcy, W. (2006). </w:t>
       </w:r>
       <w:r>
         <w:rPr>
           <w:i/>
           <w:iCs/>
         </w:rPr>
-        <w:t>On repeat: How music plays the mind.</w:t>
+        <w:t>Elements of sonata theory: Norms, types, and deformations in the late-eighteenth-century sonata.</w:t>
       </w:r>
       <w:r>
         <w:t xml:space="preserve"> Oxford University Press.</w:t>
@@ -13442,17 +13481,17 @@
         </w:numPr>
       </w:pPr>
       <w:r>
-        <w:t xml:space="preserve">Mayer, R. E. (2009). </w:t>
+        <w:t xml:space="preserve">Margulis, E. H. (2014). </w:t>
       </w:r>
       <w:r>
         <w:rPr>
           <w:i/>
           <w:iCs/>
         </w:rPr>
-        <w:t>Multimedia learning</w:t>
-      </w:r>
-      <w:r>
-        <w:t xml:space="preserve"> (2nd ed.). Cambridge University Press.</w:t>
+        <w:t>On repeat: How music plays the mind.</w:t>
+      </w:r>
+      <w:r>
+        <w:t xml:space="preserve"> Oxford University Press.</w:t>
       </w:r>
     </w:p>
     <w:p>
@@ -13464,17 +13503,17 @@
         </w:numPr>
       </w:pPr>
       <w:r>
-        <w:t xml:space="preserve">Mozart, W. A. (1986). </w:t>
+        <w:t xml:space="preserve">Mayer, R. E. (2009). </w:t>
       </w:r>
       <w:r>
         <w:rPr>
           <w:i/>
           <w:iCs/>
         </w:rPr>
-        <w:t>Neue Mozart-Ausgabe IX/25: Klaviersonaten Bd. 2.</w:t>
-      </w:r>
-      <w:r>
-        <w:t xml:space="preserve"> Bärenreiter.</w:t>
+        <w:t>Multimedia learning</w:t>
+      </w:r>
+      <w:r>
+        <w:t xml:space="preserve"> (2nd ed.). Cambridge University Press.</w:t>
       </w:r>
     </w:p>
     <w:p>
@@ -13486,17 +13525,17 @@
         </w:numPr>
       </w:pPr>
       <w:r>
-        <w:t xml:space="preserve">Nakamura, E., Yoshii, K., &amp; Katayose, H. (2017). Performance error detection and post-processing for fast and accurate symbolic music alignment. In </w:t>
+        <w:t xml:space="preserve">Mozart, W. A. (1986). </w:t>
       </w:r>
       <w:r>
         <w:rPr>
           <w:i/>
           <w:iCs/>
         </w:rPr>
-        <w:t>Proceedings of ISMIR 2017</w:t>
-      </w:r>
-      <w:r>
-        <w:t>.</w:t>
+        <w:t>Neue Mozart-Ausgabe IX/25: Klaviersonaten Bd. 2.</w:t>
+      </w:r>
+      <w:r>
+        <w:t xml:space="preserve"> Bärenreiter.</w:t>
       </w:r>
     </w:p>
     <w:p>
@@ -13508,17 +13547,17 @@
         </w:numPr>
       </w:pPr>
       <w:r>
-        <w:t xml:space="preserve">North, A. C., &amp; Hargreaves, D. J. (2008). </w:t>
+        <w:t xml:space="preserve">Nakamura, E., Yoshii, K., &amp; Katayose, H. (2017). Performance error detection and post-processing for fast and accurate symbolic music alignment. In </w:t>
       </w:r>
       <w:r>
         <w:rPr>
           <w:i/>
           <w:iCs/>
         </w:rPr>
-        <w:t>The social and applied psychology of music.</w:t>
-      </w:r>
-      <w:r>
-        <w:t xml:space="preserve"> Oxford University Press.</w:t>
+        <w:t>Proceedings of ISMIR 2017</w:t>
+      </w:r>
+      <w:r>
+        <w:t>.</w:t>
       </w:r>
     </w:p>
     <w:p>
@@ -13530,17 +13569,17 @@
         </w:numPr>
       </w:pPr>
       <w:r>
-        <w:t xml:space="preserve">Paivio, A. (1991). Dual coding theory: Retrospect and current status. </w:t>
+        <w:t xml:space="preserve">North, A. C., &amp; Hargreaves, D. J. (2008). </w:t>
       </w:r>
       <w:r>
         <w:rPr>
           <w:i/>
           <w:iCs/>
         </w:rPr>
-        <w:t>Canadian Journal of Psychology, 45</w:t>
-      </w:r>
-      <w:r>
-        <w:t>(3), 255–287.</w:t>
+        <w:t>The social and applied psychology of music.</w:t>
+      </w:r>
+      <w:r>
+        <w:t xml:space="preserve"> Oxford University Press.</w:t>
       </w:r>
     </w:p>
     <w:p>
@@ -13552,17 +13591,17 @@
         </w:numPr>
       </w:pPr>
       <w:r>
-        <w:t xml:space="preserve">Plazak, J. (2014). Visualizing musical form: A color-based approach. </w:t>
+        <w:t xml:space="preserve">Paivio, A. (1991). Dual coding theory: Retrospect and current status. </w:t>
       </w:r>
       <w:r>
         <w:rPr>
           <w:i/>
           <w:iCs/>
         </w:rPr>
-        <w:t>Journal of Music Theory Pedagogy, 28</w:t>
-      </w:r>
-      <w:r>
-        <w:t>, 39–62.</w:t>
+        <w:t>Canadian Journal of Psychology, 45</w:t>
+      </w:r>
+      <w:r>
+        <w:t>(3), 255–287.</w:t>
       </w:r>
     </w:p>
     <w:p>
@@ -13574,17 +13613,17 @@
         </w:numPr>
       </w:pPr>
       <w:r>
-        <w:t xml:space="preserve">Reichweger, G. (2018). Color in music pedagogy. </w:t>
+        <w:t xml:space="preserve">Plazak, J. (2014). Visualizing musical form: A color-based approach. </w:t>
       </w:r>
       <w:r>
         <w:rPr>
           <w:i/>
           <w:iCs/>
         </w:rPr>
-        <w:t>British Journal of Music Education, 35</w:t>
-      </w:r>
-      <w:r>
-        <w:t>(1), 23–41.</w:t>
+        <w:t>Journal of Music Theory Pedagogy, 28</w:t>
+      </w:r>
+      <w:r>
+        <w:t>, 39–62.</w:t>
       </w:r>
     </w:p>
     <w:p>
@@ -13596,17 +13635,17 @@
         </w:numPr>
       </w:pPr>
       <w:r>
-        <w:t xml:space="preserve">Sapp, C. S. (2011). </w:t>
+        <w:t xml:space="preserve">Reichweger, G. (2018). Color in music pedagogy. </w:t>
       </w:r>
       <w:r>
         <w:rPr>
           <w:i/>
           <w:iCs/>
         </w:rPr>
-        <w:t>Computational methods for the analysis of musical structure</w:t>
-      </w:r>
-      <w:r>
-        <w:t xml:space="preserve"> (Doctoral dissertation). Stanford University, CCRMA.</w:t>
+        <w:t>British Journal of Music Education, 35</w:t>
+      </w:r>
+      <w:r>
+        <w:t>(1), 23–41.</w:t>
       </w:r>
     </w:p>
     <w:p>
@@ -13618,17 +13657,17 @@
         </w:numPr>
       </w:pPr>
       <w:r>
-        <w:t xml:space="preserve">Sapp, C. S. (2017). Verovio Humdrum Viewer. In </w:t>
+        <w:t xml:space="preserve">Sapp, C. S. (2011). </w:t>
       </w:r>
       <w:r>
         <w:rPr>
           <w:i/>
           <w:iCs/>
         </w:rPr>
-        <w:t>Music Encoding Conference 2017</w:t>
-      </w:r>
-      <w:r>
-        <w:t>.</w:t>
+        <w:t>Computational methods for the analysis of musical structure</w:t>
+      </w:r>
+      <w:r>
+        <w:t xml:space="preserve"> (Doctoral dissertation). Stanford University, CCRMA.</w:t>
       </w:r>
     </w:p>
     <w:p>
@@ -13640,17 +13679,17 @@
         </w:numPr>
       </w:pPr>
       <w:r>
-        <w:t xml:space="preserve">Sauro, J., &amp; Lewis, J. R. (2016). </w:t>
+        <w:t xml:space="preserve">Sapp, C. S. (2017). Verovio Humdrum Viewer. In </w:t>
       </w:r>
       <w:r>
         <w:rPr>
           <w:i/>
           <w:iCs/>
         </w:rPr>
-        <w:t>Quantifying the user experience: Practical statistics for user research</w:t>
-      </w:r>
-      <w:r>
-        <w:t xml:space="preserve"> (2nd ed.). Morgan Kaufmann.</w:t>
+        <w:t>Music Encoding Conference 2017</w:t>
+      </w:r>
+      <w:r>
+        <w:t>.</w:t>
       </w:r>
     </w:p>
     <w:p>
@@ -13662,17 +13701,17 @@
         </w:numPr>
       </w:pPr>
       <w:r>
-        <w:t xml:space="preserve">Shadish, W. R., Cook, T. D., &amp; Campbell, D. T. (2002). </w:t>
+        <w:t xml:space="preserve">Sauro, J., &amp; Lewis, J. R. (2016). </w:t>
       </w:r>
       <w:r>
         <w:rPr>
           <w:i/>
           <w:iCs/>
         </w:rPr>
-        <w:t>Experimental and quasi-experimental designs for generalized causal inference.</w:t>
-      </w:r>
-      <w:r>
-        <w:t xml:space="preserve"> Houghton Mifflin.</w:t>
+        <w:t>Quantifying the user experience: Practical statistics for user research</w:t>
+      </w:r>
+      <w:r>
+        <w:t xml:space="preserve"> (2nd ed.). Morgan Kaufmann.</w:t>
       </w:r>
     </w:p>
     <w:p>
@@ -13684,13 +13723,35 @@
         </w:numPr>
       </w:pPr>
       <w:r>
-        <w:t xml:space="preserve">Smith, N. (2013). </w:t>
+        <w:t xml:space="preserve">Shadish, W. R., Cook, T. D., &amp; Campbell, D. T. (2002). </w:t>
       </w:r>
       <w:r>
         <w:rPr>
           <w:i/>
           <w:iCs/>
         </w:rPr>
+        <w:t>Experimental and quasi-experimental designs for generalized causal inference.</w:t>
+      </w:r>
+      <w:r>
+        <w:t xml:space="preserve"> Houghton Mifflin.</w:t>
+      </w:r>
+    </w:p>
+    <w:p>
+      <w:pPr>
+        <w:pStyle w:val="Compact"/>
+        <w:numPr>
+          <w:ilvl w:val="0"/>
+          <w:numId w:val="19"/>
+        </w:numPr>
+      </w:pPr>
+      <w:r>
+        <w:t xml:space="preserve">Smith, N. (2013). </w:t>
+      </w:r>
+      <w:r>
+        <w:rPr>
+          <w:i/>
+          <w:iCs/>
+        </w:rPr>
         <w:t>Visualizing music.</w:t>
       </w:r>
       <w:r>
@@ -13702,7 +13763,7 @@
         <w:pStyle w:val="1"/>
       </w:pPr>
       <w:bookmarkStart w:id="96" w:name="appendix-a-screenshots"/>
-      <w:bookmarkStart w:id="97" w:name="_Toc229332705"/>
+      <w:bookmarkStart w:id="97" w:name="_Toc229333442"/>
       <w:bookmarkEnd w:id="94"/>
       <w:r>
         <w:t>Appendix A. Screenshots</w:t>
@@ -13780,7 +13841,10 @@
         <w:t>Figure A.3.</w:t>
       </w:r>
       <w:r>
-        <w:t xml:space="preserve"> Score with measure-level color overlay through the recapitulation, with the F-major P region clearly distinguished.</w:t>
+        <w:t xml:space="preserve"> </w:t>
+      </w:r>
+      <w:r>
+        <w:t>Score with measure-level color overlay through the recapitulation, with the F-major P region clearly distinguished.</w:t>
       </w:r>
     </w:p>
     <w:p>
@@ -13807,7 +13871,7 @@
         <w:pStyle w:val="1"/>
       </w:pPr>
       <w:bookmarkStart w:id="98" w:name="appendix-b-evaluation-materials"/>
-      <w:bookmarkStart w:id="99" w:name="_Toc229332706"/>
+      <w:bookmarkStart w:id="99" w:name="_Toc229333443"/>
       <w:bookmarkEnd w:id="96"/>
       <w:r>
         <w:t>Appendix B. Evaluation Materials</w:t>
@@ -13819,7 +13883,7 @@
         <w:pStyle w:val="2"/>
       </w:pPr>
       <w:bookmarkStart w:id="100" w:name="b1-excerpt-list-form-identification-task"/>
-      <w:bookmarkStart w:id="101" w:name="_Toc229332707"/>
+      <w:bookmarkStart w:id="101" w:name="_Toc229333444"/>
       <w:r>
         <w:t>B.1 Excerpt list (form-identification task)</w:t>
       </w:r>
@@ -14732,7 +14796,7 @@
         <w:pStyle w:val="2"/>
       </w:pPr>
       <w:bookmarkStart w:id="102" w:name="b2-free-response-coding-criteria"/>
-      <w:bookmarkStart w:id="103" w:name="_Toc229332708"/>
+      <w:bookmarkStart w:id="103" w:name="_Toc229333445"/>
       <w:bookmarkEnd w:id="100"/>
       <w:r>
         <w:t>B.2 Free-response coding criteria</w:t>
@@ -14752,7 +14816,7 @@
         <w:pStyle w:val="2"/>
       </w:pPr>
       <w:bookmarkStart w:id="104" w:name="b3-sus"/>
-      <w:bookmarkStart w:id="105" w:name="_Toc229332709"/>
+      <w:bookmarkStart w:id="105" w:name="_Toc229333446"/>
       <w:bookmarkEnd w:id="102"/>
       <w:r>
         <w:t>B.3 SUS</w:t>
@@ -14770,12 +14834,12 @@
       <w:bookmarkEnd w:id="104"/>
     </w:p>
     <w:sectPr>
-      <w:headerReference w:type="even" r:id="rId9"/>
-      <w:headerReference w:type="default" r:id="rId10"/>
-      <w:footerReference w:type="even" r:id="rId11"/>
-      <w:footerReference w:type="default" r:id="rId12"/>
-      <w:headerReference w:type="first" r:id="rId13"/>
-      <w:footerReference w:type="first" r:id="rId14"/>
+      <w:headerReference w:type="even" r:id="rId10"/>
+      <w:headerReference w:type="default" r:id="rId11"/>
+      <w:footerReference w:type="even" r:id="rId12"/>
+      <w:footerReference w:type="default" r:id="rId13"/>
+      <w:headerReference w:type="first" r:id="rId14"/>
+      <w:footerReference w:type="first" r:id="rId15"/>
       <w:footnotePr>
         <w:numRestart w:val="eachSect"/>
       </w:footnotePr>
@@ -14980,7 +15044,7 @@
   <w:abstractNum w:abstractNumId="0" w15:restartNumberingAfterBreak="0">
     <w:nsid w:val="0000A990"/>
     <w:multiLevelType w:val="multilevel"/>
-    <w:tmpl w:val="C7BAB8AC"/>
+    <w:tmpl w:val="DEEA54CA"/>
     <w:lvl w:ilvl="0">
       <w:numFmt w:val="bullet"/>
       <w:lvlText w:val=" "/>
@@ -15057,7 +15121,7 @@
   <w:abstractNum w:abstractNumId="1" w15:restartNumberingAfterBreak="0">
     <w:nsid w:val="0000A991"/>
     <w:multiLevelType w:val="multilevel"/>
-    <w:tmpl w:val="8E54CCB6"/>
+    <w:tmpl w:val="9EC68722"/>
     <w:lvl w:ilvl="0">
       <w:numFmt w:val="bullet"/>
       <w:lvlText w:val=""/>
@@ -15161,7 +15225,7 @@
   <w:abstractNum w:abstractNumId="2" w15:restartNumberingAfterBreak="0">
     <w:nsid w:val="00A99411"/>
     <w:multiLevelType w:val="multilevel"/>
-    <w:tmpl w:val="04242F86"/>
+    <w:tmpl w:val="EF80C5B2"/>
     <w:lvl w:ilvl="0">
       <w:start w:val="1"/>
       <w:numFmt w:val="decimal"/>
@@ -15244,16 +15308,16 @@
       </w:pPr>
     </w:lvl>
   </w:abstractNum>
-  <w:num w:numId="1" w16cid:durableId="163667775">
+  <w:num w:numId="1" w16cid:durableId="1971983009">
     <w:abstractNumId w:val="0"/>
   </w:num>
-  <w:num w:numId="2" w16cid:durableId="625936674">
+  <w:num w:numId="2" w16cid:durableId="273367397">
     <w:abstractNumId w:val="1"/>
   </w:num>
-  <w:num w:numId="3" w16cid:durableId="1226183821">
+  <w:num w:numId="3" w16cid:durableId="677971981">
     <w:abstractNumId w:val="1"/>
   </w:num>
-  <w:num w:numId="4" w16cid:durableId="308022196">
+  <w:num w:numId="4" w16cid:durableId="1280065474">
     <w:abstractNumId w:val="2"/>
     <w:lvlOverride w:ilvl="0">
       <w:startOverride w:val="1"/>
@@ -15283,13 +15347,13 @@
       <w:startOverride w:val="1"/>
     </w:lvlOverride>
   </w:num>
-  <w:num w:numId="5" w16cid:durableId="1552811342">
+  <w:num w:numId="5" w16cid:durableId="1879969064">
     <w:abstractNumId w:val="1"/>
   </w:num>
-  <w:num w:numId="6" w16cid:durableId="1703701393">
+  <w:num w:numId="6" w16cid:durableId="547691267">
     <w:abstractNumId w:val="1"/>
   </w:num>
-  <w:num w:numId="7" w16cid:durableId="1401640160">
+  <w:num w:numId="7" w16cid:durableId="355347400">
     <w:abstractNumId w:val="2"/>
     <w:lvlOverride w:ilvl="0">
       <w:startOverride w:val="1"/>
@@ -15319,7 +15383,7 @@
       <w:startOverride w:val="1"/>
     </w:lvlOverride>
   </w:num>
-  <w:num w:numId="8" w16cid:durableId="408582660">
+  <w:num w:numId="8" w16cid:durableId="1132089583">
     <w:abstractNumId w:val="2"/>
     <w:lvlOverride w:ilvl="0">
       <w:startOverride w:val="1"/>
@@ -15349,34 +15413,34 @@
       <w:startOverride w:val="1"/>
     </w:lvlOverride>
   </w:num>
-  <w:num w:numId="9" w16cid:durableId="1626962946">
+  <w:num w:numId="9" w16cid:durableId="1973556731">
     <w:abstractNumId w:val="1"/>
   </w:num>
-  <w:num w:numId="10" w16cid:durableId="884875344">
+  <w:num w:numId="10" w16cid:durableId="1192887459">
     <w:abstractNumId w:val="1"/>
   </w:num>
-  <w:num w:numId="11" w16cid:durableId="1680547735">
+  <w:num w:numId="11" w16cid:durableId="1322654501">
     <w:abstractNumId w:val="1"/>
   </w:num>
-  <w:num w:numId="12" w16cid:durableId="864365309">
+  <w:num w:numId="12" w16cid:durableId="1501509753">
     <w:abstractNumId w:val="1"/>
   </w:num>
-  <w:num w:numId="13" w16cid:durableId="295919819">
+  <w:num w:numId="13" w16cid:durableId="1572350563">
     <w:abstractNumId w:val="1"/>
   </w:num>
-  <w:num w:numId="14" w16cid:durableId="1216311271">
+  <w:num w:numId="14" w16cid:durableId="1800494254">
     <w:abstractNumId w:val="1"/>
   </w:num>
-  <w:num w:numId="15" w16cid:durableId="1400666418">
+  <w:num w:numId="15" w16cid:durableId="833256474">
     <w:abstractNumId w:val="1"/>
   </w:num>
-  <w:num w:numId="16" w16cid:durableId="1743792324">
+  <w:num w:numId="16" w16cid:durableId="128205077">
     <w:abstractNumId w:val="1"/>
   </w:num>
-  <w:num w:numId="17" w16cid:durableId="759377471">
+  <w:num w:numId="17" w16cid:durableId="1399473062">
     <w:abstractNumId w:val="1"/>
   </w:num>
-  <w:num w:numId="18" w16cid:durableId="1527132954">
+  <w:num w:numId="18" w16cid:durableId="1456557250">
     <w:abstractNumId w:val="2"/>
     <w:lvlOverride w:ilvl="0">
       <w:startOverride w:val="1"/>
@@ -15406,10 +15470,10 @@
       <w:startOverride w:val="1"/>
     </w:lvlOverride>
   </w:num>
-  <w:num w:numId="19" w16cid:durableId="564417036">
+  <w:num w:numId="19" w16cid:durableId="807236780">
     <w:abstractNumId w:val="1"/>
   </w:num>
-  <w:num w:numId="20" w16cid:durableId="1145857927">
+  <w:num w:numId="20" w16cid:durableId="1547718188">
     <w:abstractNumId w:val="1"/>
   </w:num>
 </w:numbering>
@@ -16304,7 +16368,7 @@
     <w:name w:val="Verbatim Char"/>
     <w:basedOn w:val="Char1"/>
     <w:link w:val="SourceCode"/>
-    <w:rsid w:val="002906BC"/>
+    <w:rsid w:val="00681721"/>
     <w:rPr>
       <w:rFonts w:ascii="Consolas" w:hAnsi="Consolas" w:cs="Times New Roman"/>
       <w:sz w:val="20"/>
@@ -16350,7 +16414,7 @@
     <w:name w:val="Source Code"/>
     <w:basedOn w:val="a"/>
     <w:link w:val="VerbatimChar"/>
-    <w:rsid w:val="002906BC"/>
+    <w:rsid w:val="00681721"/>
     <w:pPr>
       <w:shd w:val="clear" w:color="auto" w:fill="FFF5F0"/>
       <w:wordWrap w:val="0"/>
@@ -16690,7 +16754,7 @@
     <w:next w:val="a"/>
     <w:autoRedefine/>
     <w:uiPriority w:val="39"/>
-    <w:rsid w:val="002906BC"/>
+    <w:rsid w:val="00681721"/>
   </w:style>
   <w:style w:type="paragraph" w:styleId="20">
     <w:name w:val="toc 2"/>
@@ -16698,7 +16762,7 @@
     <w:next w:val="a"/>
     <w:autoRedefine/>
     <w:uiPriority w:val="39"/>
-    <w:rsid w:val="002906BC"/>
+    <w:rsid w:val="00681721"/>
     <w:pPr>
       <w:ind w:leftChars="200" w:left="425"/>
     </w:pPr>
@@ -16707,7 +16771,7 @@
     <w:name w:val="header"/>
     <w:basedOn w:val="a"/>
     <w:link w:val="Char2"/>
-    <w:rsid w:val="002906BC"/>
+    <w:rsid w:val="00681721"/>
     <w:pPr>
       <w:tabs>
         <w:tab w:val="center" w:pos="4513"/>
@@ -16720,13 +16784,13 @@
     <w:name w:val="머리글 Char"/>
     <w:basedOn w:val="a1"/>
     <w:link w:val="ad"/>
-    <w:rsid w:val="002906BC"/>
+    <w:rsid w:val="00681721"/>
   </w:style>
   <w:style w:type="paragraph" w:styleId="ae">
     <w:name w:val="footer"/>
     <w:basedOn w:val="a"/>
     <w:link w:val="Char3"/>
-    <w:rsid w:val="002906BC"/>
+    <w:rsid w:val="00681721"/>
     <w:pPr>
       <w:tabs>
         <w:tab w:val="center" w:pos="4513"/>
@@ -16739,17 +16803,17 @@
     <w:name w:val="바닥글 Char"/>
     <w:basedOn w:val="a1"/>
     <w:link w:val="ae"/>
-    <w:rsid w:val="002906BC"/>
+    <w:rsid w:val="00681721"/>
   </w:style>
   <w:style w:type="character" w:styleId="af">
     <w:name w:val="page number"/>
     <w:basedOn w:val="a1"/>
-    <w:rsid w:val="002906BC"/>
+    <w:rsid w:val="00681721"/>
   </w:style>
   <w:style w:type="character" w:styleId="af0">
     <w:name w:val="line number"/>
     <w:basedOn w:val="a1"/>
-    <w:rsid w:val="002906BC"/>
+    <w:rsid w:val="00681721"/>
   </w:style>
 </w:styles>
 </file>

</xml_diff>

<commit_message>
Remove Bong (2017) citation; keep paraphrased substance
Per author preference, the prior direct citation of Bong's master's
thesis is dropped. The substantive observations (subdominant
recapitulation, Alberti-bass unity) remain via standard analytical
references (Hepokoski & Darcy 2006). Removed:

- §3.3 Korean-language corroboration paragraph in paper_ko.md and
  paper_en.md.
- Bong, Huh 2012, and Hong 2006 entries in paper_ko.md references.
- Bong (2017) in paper_en.md references.
- Bong2017_K545, HuhEtAl2012, HongEtAl2006 entries in references.bib.

paper_ko.docx and paper_en.docx regenerated.

Co-Authored-By: Claude Opus 4.7 (1M context) <noreply@anthropic.com>
</commit_message>
<xml_diff>
--- a/en/paper/paper_en.docx
+++ b/en/paper/paper_en.docx
@@ -26,7 +26,7 @@
           <w:sz w:val="24"/>
           <w:szCs w:val="24"/>
         </w:rPr>
-        <w:id w:val="838192561"/>
+        <w:id w:val="-1374147512"/>
         <w:docPartObj>
           <w:docPartGallery w:val="Table of Contents"/>
           <w:docPartUnique/>
@@ -66,7 +66,7 @@
           <w:r>
             <w:fldChar w:fldCharType="separate"/>
           </w:r>
-          <w:hyperlink w:anchor="_Toc229333397" w:history="1">
+          <w:hyperlink w:anchor="_Toc229333923" w:history="1">
             <w:r>
               <w:rPr>
                 <w:rStyle w:val="ac"/>
@@ -93,7 +93,7 @@
                 <w:noProof/>
                 <w:webHidden/>
               </w:rPr>
-              <w:instrText xml:space="preserve"> PAGEREF _Toc229333397 \h </w:instrText>
+              <w:instrText xml:space="preserve"> PAGEREF _Toc229333923 \h </w:instrText>
             </w:r>
             <w:r>
               <w:rPr>
@@ -134,7 +134,7 @@
               <w:noProof/>
             </w:rPr>
           </w:pPr>
-          <w:hyperlink w:anchor="_Toc229333398" w:history="1">
+          <w:hyperlink w:anchor="_Toc229333924" w:history="1">
             <w:r>
               <w:rPr>
                 <w:rStyle w:val="ac"/>
@@ -161,7 +161,7 @@
                 <w:noProof/>
                 <w:webHidden/>
               </w:rPr>
-              <w:instrText xml:space="preserve"> PAGEREF _Toc229333398 \h </w:instrText>
+              <w:instrText xml:space="preserve"> PAGEREF _Toc229333924 \h </w:instrText>
             </w:r>
             <w:r>
               <w:rPr>
@@ -203,7 +203,7 @@
               <w:noProof/>
             </w:rPr>
           </w:pPr>
-          <w:hyperlink w:anchor="_Toc229333399" w:history="1">
+          <w:hyperlink w:anchor="_Toc229333925" w:history="1">
             <w:r>
               <w:rPr>
                 <w:rStyle w:val="ac"/>
@@ -230,7 +230,7 @@
                 <w:noProof/>
                 <w:webHidden/>
               </w:rPr>
-              <w:instrText xml:space="preserve"> PAGEREF _Toc229333399 \h </w:instrText>
+              <w:instrText xml:space="preserve"> PAGEREF _Toc229333925 \h </w:instrText>
             </w:r>
             <w:r>
               <w:rPr>
@@ -272,7 +272,7 @@
               <w:noProof/>
             </w:rPr>
           </w:pPr>
-          <w:hyperlink w:anchor="_Toc229333400" w:history="1">
+          <w:hyperlink w:anchor="_Toc229333926" w:history="1">
             <w:r>
               <w:rPr>
                 <w:rStyle w:val="ac"/>
@@ -299,7 +299,7 @@
                 <w:noProof/>
                 <w:webHidden/>
               </w:rPr>
-              <w:instrText xml:space="preserve"> PAGEREF _Toc229333400 \h </w:instrText>
+              <w:instrText xml:space="preserve"> PAGEREF _Toc229333926 \h </w:instrText>
             </w:r>
             <w:r>
               <w:rPr>
@@ -341,7 +341,7 @@
               <w:noProof/>
             </w:rPr>
           </w:pPr>
-          <w:hyperlink w:anchor="_Toc229333401" w:history="1">
+          <w:hyperlink w:anchor="_Toc229333927" w:history="1">
             <w:r>
               <w:rPr>
                 <w:rStyle w:val="ac"/>
@@ -368,7 +368,7 @@
                 <w:noProof/>
                 <w:webHidden/>
               </w:rPr>
-              <w:instrText xml:space="preserve"> PAGEREF _Toc229333401 \h </w:instrText>
+              <w:instrText xml:space="preserve"> PAGEREF _Toc229333927 \h </w:instrText>
             </w:r>
             <w:r>
               <w:rPr>
@@ -409,7 +409,7 @@
               <w:noProof/>
             </w:rPr>
           </w:pPr>
-          <w:hyperlink w:anchor="_Toc229333402" w:history="1">
+          <w:hyperlink w:anchor="_Toc229333928" w:history="1">
             <w:r>
               <w:rPr>
                 <w:rStyle w:val="ac"/>
@@ -436,7 +436,7 @@
                 <w:noProof/>
                 <w:webHidden/>
               </w:rPr>
-              <w:instrText xml:space="preserve"> PAGEREF _Toc229333402 \h </w:instrText>
+              <w:instrText xml:space="preserve"> PAGEREF _Toc229333928 \h </w:instrText>
             </w:r>
             <w:r>
               <w:rPr>
@@ -478,7 +478,7 @@
               <w:noProof/>
             </w:rPr>
           </w:pPr>
-          <w:hyperlink w:anchor="_Toc229333403" w:history="1">
+          <w:hyperlink w:anchor="_Toc229333929" w:history="1">
             <w:r>
               <w:rPr>
                 <w:rStyle w:val="ac"/>
@@ -505,7 +505,7 @@
                 <w:noProof/>
                 <w:webHidden/>
               </w:rPr>
-              <w:instrText xml:space="preserve"> PAGEREF _Toc229333403 \h </w:instrText>
+              <w:instrText xml:space="preserve"> PAGEREF _Toc229333929 \h </w:instrText>
             </w:r>
             <w:r>
               <w:rPr>
@@ -547,7 +547,7 @@
               <w:noProof/>
             </w:rPr>
           </w:pPr>
-          <w:hyperlink w:anchor="_Toc229333404" w:history="1">
+          <w:hyperlink w:anchor="_Toc229333930" w:history="1">
             <w:r>
               <w:rPr>
                 <w:rStyle w:val="ac"/>
@@ -574,7 +574,7 @@
                 <w:noProof/>
                 <w:webHidden/>
               </w:rPr>
-              <w:instrText xml:space="preserve"> PAGEREF _Toc229333404 \h </w:instrText>
+              <w:instrText xml:space="preserve"> PAGEREF _Toc229333930 \h </w:instrText>
             </w:r>
             <w:r>
               <w:rPr>
@@ -616,7 +616,7 @@
               <w:noProof/>
             </w:rPr>
           </w:pPr>
-          <w:hyperlink w:anchor="_Toc229333405" w:history="1">
+          <w:hyperlink w:anchor="_Toc229333931" w:history="1">
             <w:r>
               <w:rPr>
                 <w:rStyle w:val="ac"/>
@@ -643,7 +643,7 @@
                 <w:noProof/>
                 <w:webHidden/>
               </w:rPr>
-              <w:instrText xml:space="preserve"> PAGEREF _Toc229333405 \h </w:instrText>
+              <w:instrText xml:space="preserve"> PAGEREF _Toc229333931 \h </w:instrText>
             </w:r>
             <w:r>
               <w:rPr>
@@ -685,7 +685,7 @@
               <w:noProof/>
             </w:rPr>
           </w:pPr>
-          <w:hyperlink w:anchor="_Toc229333406" w:history="1">
+          <w:hyperlink w:anchor="_Toc229333932" w:history="1">
             <w:r>
               <w:rPr>
                 <w:rStyle w:val="ac"/>
@@ -712,7 +712,7 @@
                 <w:noProof/>
                 <w:webHidden/>
               </w:rPr>
-              <w:instrText xml:space="preserve"> PAGEREF _Toc229333406 \h </w:instrText>
+              <w:instrText xml:space="preserve"> PAGEREF _Toc229333932 \h </w:instrText>
             </w:r>
             <w:r>
               <w:rPr>
@@ -753,7 +753,7 @@
               <w:noProof/>
             </w:rPr>
           </w:pPr>
-          <w:hyperlink w:anchor="_Toc229333407" w:history="1">
+          <w:hyperlink w:anchor="_Toc229333933" w:history="1">
             <w:r>
               <w:rPr>
                 <w:rStyle w:val="ac"/>
@@ -780,7 +780,7 @@
                 <w:noProof/>
                 <w:webHidden/>
               </w:rPr>
-              <w:instrText xml:space="preserve"> PAGEREF _Toc229333407 \h </w:instrText>
+              <w:instrText xml:space="preserve"> PAGEREF _Toc229333933 \h </w:instrText>
             </w:r>
             <w:r>
               <w:rPr>
@@ -822,7 +822,7 @@
               <w:noProof/>
             </w:rPr>
           </w:pPr>
-          <w:hyperlink w:anchor="_Toc229333408" w:history="1">
+          <w:hyperlink w:anchor="_Toc229333934" w:history="1">
             <w:r>
               <w:rPr>
                 <w:rStyle w:val="ac"/>
@@ -849,7 +849,7 @@
                 <w:noProof/>
                 <w:webHidden/>
               </w:rPr>
-              <w:instrText xml:space="preserve"> PAGEREF _Toc229333408 \h </w:instrText>
+              <w:instrText xml:space="preserve"> PAGEREF _Toc229333934 \h </w:instrText>
             </w:r>
             <w:r>
               <w:rPr>
@@ -891,7 +891,7 @@
               <w:noProof/>
             </w:rPr>
           </w:pPr>
-          <w:hyperlink w:anchor="_Toc229333409" w:history="1">
+          <w:hyperlink w:anchor="_Toc229333935" w:history="1">
             <w:r>
               <w:rPr>
                 <w:rStyle w:val="ac"/>
@@ -918,7 +918,7 @@
                 <w:noProof/>
                 <w:webHidden/>
               </w:rPr>
-              <w:instrText xml:space="preserve"> PAGEREF _Toc229333409 \h </w:instrText>
+              <w:instrText xml:space="preserve"> PAGEREF _Toc229333935 \h </w:instrText>
             </w:r>
             <w:r>
               <w:rPr>
@@ -960,7 +960,7 @@
               <w:noProof/>
             </w:rPr>
           </w:pPr>
-          <w:hyperlink w:anchor="_Toc229333410" w:history="1">
+          <w:hyperlink w:anchor="_Toc229333936" w:history="1">
             <w:r>
               <w:rPr>
                 <w:rStyle w:val="ac"/>
@@ -987,7 +987,7 @@
                 <w:noProof/>
                 <w:webHidden/>
               </w:rPr>
-              <w:instrText xml:space="preserve"> PAGEREF _Toc229333410 \h </w:instrText>
+              <w:instrText xml:space="preserve"> PAGEREF _Toc229333936 \h </w:instrText>
             </w:r>
             <w:r>
               <w:rPr>
@@ -1028,7 +1028,7 @@
               <w:noProof/>
             </w:rPr>
           </w:pPr>
-          <w:hyperlink w:anchor="_Toc229333411" w:history="1">
+          <w:hyperlink w:anchor="_Toc229333937" w:history="1">
             <w:r>
               <w:rPr>
                 <w:rStyle w:val="ac"/>
@@ -1055,7 +1055,7 @@
                 <w:noProof/>
                 <w:webHidden/>
               </w:rPr>
-              <w:instrText xml:space="preserve"> PAGEREF _Toc229333411 \h </w:instrText>
+              <w:instrText xml:space="preserve"> PAGEREF _Toc229333937 \h </w:instrText>
             </w:r>
             <w:r>
               <w:rPr>
@@ -1097,7 +1097,7 @@
               <w:noProof/>
             </w:rPr>
           </w:pPr>
-          <w:hyperlink w:anchor="_Toc229333412" w:history="1">
+          <w:hyperlink w:anchor="_Toc229333938" w:history="1">
             <w:r>
               <w:rPr>
                 <w:rStyle w:val="ac"/>
@@ -1124,7 +1124,7 @@
                 <w:noProof/>
                 <w:webHidden/>
               </w:rPr>
-              <w:instrText xml:space="preserve"> PAGEREF _Toc229333412 \h </w:instrText>
+              <w:instrText xml:space="preserve"> PAGEREF _Toc229333938 \h </w:instrText>
             </w:r>
             <w:r>
               <w:rPr>
@@ -1166,7 +1166,7 @@
               <w:noProof/>
             </w:rPr>
           </w:pPr>
-          <w:hyperlink w:anchor="_Toc229333413" w:history="1">
+          <w:hyperlink w:anchor="_Toc229333939" w:history="1">
             <w:r>
               <w:rPr>
                 <w:rStyle w:val="ac"/>
@@ -1193,7 +1193,7 @@
                 <w:noProof/>
                 <w:webHidden/>
               </w:rPr>
-              <w:instrText xml:space="preserve"> PAGEREF _Toc229333413 \h </w:instrText>
+              <w:instrText xml:space="preserve"> PAGEREF _Toc229333939 \h </w:instrText>
             </w:r>
             <w:r>
               <w:rPr>
@@ -1235,7 +1235,7 @@
               <w:noProof/>
             </w:rPr>
           </w:pPr>
-          <w:hyperlink w:anchor="_Toc229333414" w:history="1">
+          <w:hyperlink w:anchor="_Toc229333940" w:history="1">
             <w:r>
               <w:rPr>
                 <w:rStyle w:val="ac"/>
@@ -1262,7 +1262,7 @@
                 <w:noProof/>
                 <w:webHidden/>
               </w:rPr>
-              <w:instrText xml:space="preserve"> PAGEREF _Toc229333414 \h </w:instrText>
+              <w:instrText xml:space="preserve"> PAGEREF _Toc229333940 \h </w:instrText>
             </w:r>
             <w:r>
               <w:rPr>
@@ -1304,7 +1304,7 @@
               <w:noProof/>
             </w:rPr>
           </w:pPr>
-          <w:hyperlink w:anchor="_Toc229333415" w:history="1">
+          <w:hyperlink w:anchor="_Toc229333941" w:history="1">
             <w:r>
               <w:rPr>
                 <w:rStyle w:val="ac"/>
@@ -1331,7 +1331,7 @@
                 <w:noProof/>
                 <w:webHidden/>
               </w:rPr>
-              <w:instrText xml:space="preserve"> PAGEREF _Toc229333415 \h </w:instrText>
+              <w:instrText xml:space="preserve"> PAGEREF _Toc229333941 \h </w:instrText>
             </w:r>
             <w:r>
               <w:rPr>
@@ -1373,7 +1373,7 @@
               <w:noProof/>
             </w:rPr>
           </w:pPr>
-          <w:hyperlink w:anchor="_Toc229333416" w:history="1">
+          <w:hyperlink w:anchor="_Toc229333942" w:history="1">
             <w:r>
               <w:rPr>
                 <w:rStyle w:val="ac"/>
@@ -1400,7 +1400,7 @@
                 <w:noProof/>
                 <w:webHidden/>
               </w:rPr>
-              <w:instrText xml:space="preserve"> PAGEREF _Toc229333416 \h </w:instrText>
+              <w:instrText xml:space="preserve"> PAGEREF _Toc229333942 \h </w:instrText>
             </w:r>
             <w:r>
               <w:rPr>
@@ -1441,7 +1441,7 @@
               <w:noProof/>
             </w:rPr>
           </w:pPr>
-          <w:hyperlink w:anchor="_Toc229333417" w:history="1">
+          <w:hyperlink w:anchor="_Toc229333943" w:history="1">
             <w:r>
               <w:rPr>
                 <w:rStyle w:val="ac"/>
@@ -1468,7 +1468,7 @@
                 <w:noProof/>
                 <w:webHidden/>
               </w:rPr>
-              <w:instrText xml:space="preserve"> PAGEREF _Toc229333417 \h </w:instrText>
+              <w:instrText xml:space="preserve"> PAGEREF _Toc229333943 \h </w:instrText>
             </w:r>
             <w:r>
               <w:rPr>
@@ -1510,7 +1510,7 @@
               <w:noProof/>
             </w:rPr>
           </w:pPr>
-          <w:hyperlink w:anchor="_Toc229333418" w:history="1">
+          <w:hyperlink w:anchor="_Toc229333944" w:history="1">
             <w:r>
               <w:rPr>
                 <w:rStyle w:val="ac"/>
@@ -1537,7 +1537,7 @@
                 <w:noProof/>
                 <w:webHidden/>
               </w:rPr>
-              <w:instrText xml:space="preserve"> PAGEREF _Toc229333418 \h </w:instrText>
+              <w:instrText xml:space="preserve"> PAGEREF _Toc229333944 \h </w:instrText>
             </w:r>
             <w:r>
               <w:rPr>
@@ -1579,7 +1579,7 @@
               <w:noProof/>
             </w:rPr>
           </w:pPr>
-          <w:hyperlink w:anchor="_Toc229333419" w:history="1">
+          <w:hyperlink w:anchor="_Toc229333945" w:history="1">
             <w:r>
               <w:rPr>
                 <w:rStyle w:val="ac"/>
@@ -1606,7 +1606,7 @@
                 <w:noProof/>
                 <w:webHidden/>
               </w:rPr>
-              <w:instrText xml:space="preserve"> PAGEREF _Toc229333419 \h </w:instrText>
+              <w:instrText xml:space="preserve"> PAGEREF _Toc229333945 \h </w:instrText>
             </w:r>
             <w:r>
               <w:rPr>
@@ -1648,7 +1648,7 @@
               <w:noProof/>
             </w:rPr>
           </w:pPr>
-          <w:hyperlink w:anchor="_Toc229333420" w:history="1">
+          <w:hyperlink w:anchor="_Toc229333946" w:history="1">
             <w:r>
               <w:rPr>
                 <w:rStyle w:val="ac"/>
@@ -1675,7 +1675,7 @@
                 <w:noProof/>
                 <w:webHidden/>
               </w:rPr>
-              <w:instrText xml:space="preserve"> PAGEREF _Toc229333420 \h </w:instrText>
+              <w:instrText xml:space="preserve"> PAGEREF _Toc229333946 \h </w:instrText>
             </w:r>
             <w:r>
               <w:rPr>
@@ -1717,7 +1717,7 @@
               <w:noProof/>
             </w:rPr>
           </w:pPr>
-          <w:hyperlink w:anchor="_Toc229333421" w:history="1">
+          <w:hyperlink w:anchor="_Toc229333947" w:history="1">
             <w:r>
               <w:rPr>
                 <w:rStyle w:val="ac"/>
@@ -1744,7 +1744,7 @@
                 <w:noProof/>
                 <w:webHidden/>
               </w:rPr>
-              <w:instrText xml:space="preserve"> PAGEREF _Toc229333421 \h </w:instrText>
+              <w:instrText xml:space="preserve"> PAGEREF _Toc229333947 \h </w:instrText>
             </w:r>
             <w:r>
               <w:rPr>
@@ -1785,7 +1785,7 @@
               <w:noProof/>
             </w:rPr>
           </w:pPr>
-          <w:hyperlink w:anchor="_Toc229333422" w:history="1">
+          <w:hyperlink w:anchor="_Toc229333948" w:history="1">
             <w:r>
               <w:rPr>
                 <w:rStyle w:val="ac"/>
@@ -1812,7 +1812,7 @@
                 <w:noProof/>
                 <w:webHidden/>
               </w:rPr>
-              <w:instrText xml:space="preserve"> PAGEREF _Toc229333422 \h </w:instrText>
+              <w:instrText xml:space="preserve"> PAGEREF _Toc229333948 \h </w:instrText>
             </w:r>
             <w:r>
               <w:rPr>
@@ -1854,7 +1854,7 @@
               <w:noProof/>
             </w:rPr>
           </w:pPr>
-          <w:hyperlink w:anchor="_Toc229333423" w:history="1">
+          <w:hyperlink w:anchor="_Toc229333949" w:history="1">
             <w:r>
               <w:rPr>
                 <w:rStyle w:val="ac"/>
@@ -1881,7 +1881,7 @@
                 <w:noProof/>
                 <w:webHidden/>
               </w:rPr>
-              <w:instrText xml:space="preserve"> PAGEREF _Toc229333423 \h </w:instrText>
+              <w:instrText xml:space="preserve"> PAGEREF _Toc229333949 \h </w:instrText>
             </w:r>
             <w:r>
               <w:rPr>
@@ -1923,7 +1923,7 @@
               <w:noProof/>
             </w:rPr>
           </w:pPr>
-          <w:hyperlink w:anchor="_Toc229333424" w:history="1">
+          <w:hyperlink w:anchor="_Toc229333950" w:history="1">
             <w:r>
               <w:rPr>
                 <w:rStyle w:val="ac"/>
@@ -1950,7 +1950,7 @@
                 <w:noProof/>
                 <w:webHidden/>
               </w:rPr>
-              <w:instrText xml:space="preserve"> PAGEREF _Toc229333424 \h </w:instrText>
+              <w:instrText xml:space="preserve"> PAGEREF _Toc229333950 \h </w:instrText>
             </w:r>
             <w:r>
               <w:rPr>
@@ -1992,7 +1992,7 @@
               <w:noProof/>
             </w:rPr>
           </w:pPr>
-          <w:hyperlink w:anchor="_Toc229333425" w:history="1">
+          <w:hyperlink w:anchor="_Toc229333951" w:history="1">
             <w:r>
               <w:rPr>
                 <w:rStyle w:val="ac"/>
@@ -2019,7 +2019,7 @@
                 <w:noProof/>
                 <w:webHidden/>
               </w:rPr>
-              <w:instrText xml:space="preserve"> PAGEREF _Toc229333425 \h </w:instrText>
+              <w:instrText xml:space="preserve"> PAGEREF _Toc229333951 \h </w:instrText>
             </w:r>
             <w:r>
               <w:rPr>
@@ -2039,7 +2039,7 @@
                 <w:noProof/>
                 <w:webHidden/>
               </w:rPr>
-              <w:t>13</w:t>
+              <w:t>12</w:t>
             </w:r>
             <w:r>
               <w:rPr>
@@ -2061,7 +2061,7 @@
               <w:noProof/>
             </w:rPr>
           </w:pPr>
-          <w:hyperlink w:anchor="_Toc229333426" w:history="1">
+          <w:hyperlink w:anchor="_Toc229333952" w:history="1">
             <w:r>
               <w:rPr>
                 <w:rStyle w:val="ac"/>
@@ -2088,7 +2088,7 @@
                 <w:noProof/>
                 <w:webHidden/>
               </w:rPr>
-              <w:instrText xml:space="preserve"> PAGEREF _Toc229333426 \h </w:instrText>
+              <w:instrText xml:space="preserve"> PAGEREF _Toc229333952 \h </w:instrText>
             </w:r>
             <w:r>
               <w:rPr>
@@ -2130,7 +2130,7 @@
               <w:noProof/>
             </w:rPr>
           </w:pPr>
-          <w:hyperlink w:anchor="_Toc229333427" w:history="1">
+          <w:hyperlink w:anchor="_Toc229333953" w:history="1">
             <w:r>
               <w:rPr>
                 <w:rStyle w:val="ac"/>
@@ -2157,7 +2157,7 @@
                 <w:noProof/>
                 <w:webHidden/>
               </w:rPr>
-              <w:instrText xml:space="preserve"> PAGEREF _Toc229333427 \h </w:instrText>
+              <w:instrText xml:space="preserve"> PAGEREF _Toc229333953 \h </w:instrText>
             </w:r>
             <w:r>
               <w:rPr>
@@ -2198,7 +2198,7 @@
               <w:noProof/>
             </w:rPr>
           </w:pPr>
-          <w:hyperlink w:anchor="_Toc229333428" w:history="1">
+          <w:hyperlink w:anchor="_Toc229333954" w:history="1">
             <w:r>
               <w:rPr>
                 <w:rStyle w:val="ac"/>
@@ -2225,7 +2225,7 @@
                 <w:noProof/>
                 <w:webHidden/>
               </w:rPr>
-              <w:instrText xml:space="preserve"> PAGEREF _Toc229333428 \h </w:instrText>
+              <w:instrText xml:space="preserve"> PAGEREF _Toc229333954 \h </w:instrText>
             </w:r>
             <w:r>
               <w:rPr>
@@ -2245,7 +2245,7 @@
                 <w:noProof/>
                 <w:webHidden/>
               </w:rPr>
-              <w:t>14</w:t>
+              <w:t>13</w:t>
             </w:r>
             <w:r>
               <w:rPr>
@@ -2267,7 +2267,7 @@
               <w:noProof/>
             </w:rPr>
           </w:pPr>
-          <w:hyperlink w:anchor="_Toc229333429" w:history="1">
+          <w:hyperlink w:anchor="_Toc229333955" w:history="1">
             <w:r>
               <w:rPr>
                 <w:rStyle w:val="ac"/>
@@ -2294,7 +2294,7 @@
                 <w:noProof/>
                 <w:webHidden/>
               </w:rPr>
-              <w:instrText xml:space="preserve"> PAGEREF _Toc229333429 \h </w:instrText>
+              <w:instrText xml:space="preserve"> PAGEREF _Toc229333955 \h </w:instrText>
             </w:r>
             <w:r>
               <w:rPr>
@@ -2314,7 +2314,7 @@
                 <w:noProof/>
                 <w:webHidden/>
               </w:rPr>
-              <w:t>14</w:t>
+              <w:t>13</w:t>
             </w:r>
             <w:r>
               <w:rPr>
@@ -2336,7 +2336,7 @@
               <w:noProof/>
             </w:rPr>
           </w:pPr>
-          <w:hyperlink w:anchor="_Toc229333430" w:history="1">
+          <w:hyperlink w:anchor="_Toc229333956" w:history="1">
             <w:r>
               <w:rPr>
                 <w:rStyle w:val="ac"/>
@@ -2363,7 +2363,7 @@
                 <w:noProof/>
                 <w:webHidden/>
               </w:rPr>
-              <w:instrText xml:space="preserve"> PAGEREF _Toc229333430 \h </w:instrText>
+              <w:instrText xml:space="preserve"> PAGEREF _Toc229333956 \h </w:instrText>
             </w:r>
             <w:r>
               <w:rPr>
@@ -2405,7 +2405,7 @@
               <w:noProof/>
             </w:rPr>
           </w:pPr>
-          <w:hyperlink w:anchor="_Toc229333431" w:history="1">
+          <w:hyperlink w:anchor="_Toc229333957" w:history="1">
             <w:r>
               <w:rPr>
                 <w:rStyle w:val="ac"/>
@@ -2432,7 +2432,7 @@
                 <w:noProof/>
                 <w:webHidden/>
               </w:rPr>
-              <w:instrText xml:space="preserve"> PAGEREF _Toc229333431 \h </w:instrText>
+              <w:instrText xml:space="preserve"> PAGEREF _Toc229333957 \h </w:instrText>
             </w:r>
             <w:r>
               <w:rPr>
@@ -2474,7 +2474,7 @@
               <w:noProof/>
             </w:rPr>
           </w:pPr>
-          <w:hyperlink w:anchor="_Toc229333432" w:history="1">
+          <w:hyperlink w:anchor="_Toc229333958" w:history="1">
             <w:r>
               <w:rPr>
                 <w:rStyle w:val="ac"/>
@@ -2501,7 +2501,7 @@
                 <w:noProof/>
                 <w:webHidden/>
               </w:rPr>
-              <w:instrText xml:space="preserve"> PAGEREF _Toc229333432 \h </w:instrText>
+              <w:instrText xml:space="preserve"> PAGEREF _Toc229333958 \h </w:instrText>
             </w:r>
             <w:r>
               <w:rPr>
@@ -2542,7 +2542,7 @@
               <w:noProof/>
             </w:rPr>
           </w:pPr>
-          <w:hyperlink w:anchor="_Toc229333433" w:history="1">
+          <w:hyperlink w:anchor="_Toc229333959" w:history="1">
             <w:r>
               <w:rPr>
                 <w:rStyle w:val="ac"/>
@@ -2569,7 +2569,7 @@
                 <w:noProof/>
                 <w:webHidden/>
               </w:rPr>
-              <w:instrText xml:space="preserve"> PAGEREF _Toc229333433 \h </w:instrText>
+              <w:instrText xml:space="preserve"> PAGEREF _Toc229333959 \h </w:instrText>
             </w:r>
             <w:r>
               <w:rPr>
@@ -2589,7 +2589,7 @@
                 <w:noProof/>
                 <w:webHidden/>
               </w:rPr>
-              <w:t>15</w:t>
+              <w:t>14</w:t>
             </w:r>
             <w:r>
               <w:rPr>
@@ -2611,7 +2611,7 @@
               <w:noProof/>
             </w:rPr>
           </w:pPr>
-          <w:hyperlink w:anchor="_Toc229333434" w:history="1">
+          <w:hyperlink w:anchor="_Toc229333960" w:history="1">
             <w:r>
               <w:rPr>
                 <w:rStyle w:val="ac"/>
@@ -2638,7 +2638,7 @@
                 <w:noProof/>
                 <w:webHidden/>
               </w:rPr>
-              <w:instrText xml:space="preserve"> PAGEREF _Toc229333434 \h </w:instrText>
+              <w:instrText xml:space="preserve"> PAGEREF _Toc229333960 \h </w:instrText>
             </w:r>
             <w:r>
               <w:rPr>
@@ -2658,7 +2658,7 @@
                 <w:noProof/>
                 <w:webHidden/>
               </w:rPr>
-              <w:t>15</w:t>
+              <w:t>14</w:t>
             </w:r>
             <w:r>
               <w:rPr>
@@ -2680,7 +2680,7 @@
               <w:noProof/>
             </w:rPr>
           </w:pPr>
-          <w:hyperlink w:anchor="_Toc229333435" w:history="1">
+          <w:hyperlink w:anchor="_Toc229333961" w:history="1">
             <w:r>
               <w:rPr>
                 <w:rStyle w:val="ac"/>
@@ -2707,7 +2707,7 @@
                 <w:noProof/>
                 <w:webHidden/>
               </w:rPr>
-              <w:instrText xml:space="preserve"> PAGEREF _Toc229333435 \h </w:instrText>
+              <w:instrText xml:space="preserve"> PAGEREF _Toc229333961 \h </w:instrText>
             </w:r>
             <w:r>
               <w:rPr>
@@ -2749,7 +2749,7 @@
               <w:noProof/>
             </w:rPr>
           </w:pPr>
-          <w:hyperlink w:anchor="_Toc229333436" w:history="1">
+          <w:hyperlink w:anchor="_Toc229333962" w:history="1">
             <w:r>
               <w:rPr>
                 <w:rStyle w:val="ac"/>
@@ -2776,7 +2776,7 @@
                 <w:noProof/>
                 <w:webHidden/>
               </w:rPr>
-              <w:instrText xml:space="preserve"> PAGEREF _Toc229333436 \h </w:instrText>
+              <w:instrText xml:space="preserve"> PAGEREF _Toc229333962 \h </w:instrText>
             </w:r>
             <w:r>
               <w:rPr>
@@ -2818,7 +2818,7 @@
               <w:noProof/>
             </w:rPr>
           </w:pPr>
-          <w:hyperlink w:anchor="_Toc229333437" w:history="1">
+          <w:hyperlink w:anchor="_Toc229333963" w:history="1">
             <w:r>
               <w:rPr>
                 <w:rStyle w:val="ac"/>
@@ -2845,7 +2845,7 @@
                 <w:noProof/>
                 <w:webHidden/>
               </w:rPr>
-              <w:instrText xml:space="preserve"> PAGEREF _Toc229333437 \h </w:instrText>
+              <w:instrText xml:space="preserve"> PAGEREF _Toc229333963 \h </w:instrText>
             </w:r>
             <w:r>
               <w:rPr>
@@ -2886,7 +2886,7 @@
               <w:noProof/>
             </w:rPr>
           </w:pPr>
-          <w:hyperlink w:anchor="_Toc229333438" w:history="1">
+          <w:hyperlink w:anchor="_Toc229333964" w:history="1">
             <w:r>
               <w:rPr>
                 <w:rStyle w:val="ac"/>
@@ -2913,7 +2913,7 @@
                 <w:noProof/>
                 <w:webHidden/>
               </w:rPr>
-              <w:instrText xml:space="preserve"> PAGEREF _Toc229333438 \h </w:instrText>
+              <w:instrText xml:space="preserve"> PAGEREF _Toc229333964 \h </w:instrText>
             </w:r>
             <w:r>
               <w:rPr>
@@ -2954,7 +2954,7 @@
               <w:noProof/>
             </w:rPr>
           </w:pPr>
-          <w:hyperlink w:anchor="_Toc229333439" w:history="1">
+          <w:hyperlink w:anchor="_Toc229333965" w:history="1">
             <w:r>
               <w:rPr>
                 <w:rStyle w:val="ac"/>
@@ -2981,7 +2981,7 @@
                 <w:noProof/>
                 <w:webHidden/>
               </w:rPr>
-              <w:instrText xml:space="preserve"> PAGEREF _Toc229333439 \h </w:instrText>
+              <w:instrText xml:space="preserve"> PAGEREF _Toc229333965 \h </w:instrText>
             </w:r>
             <w:r>
               <w:rPr>
@@ -3022,7 +3022,7 @@
               <w:noProof/>
             </w:rPr>
           </w:pPr>
-          <w:hyperlink w:anchor="_Toc229333440" w:history="1">
+          <w:hyperlink w:anchor="_Toc229333966" w:history="1">
             <w:r>
               <w:rPr>
                 <w:rStyle w:val="ac"/>
@@ -3049,7 +3049,7 @@
                 <w:noProof/>
                 <w:webHidden/>
               </w:rPr>
-              <w:instrText xml:space="preserve"> PAGEREF _Toc229333440 \h </w:instrText>
+              <w:instrText xml:space="preserve"> PAGEREF _Toc229333966 \h </w:instrText>
             </w:r>
             <w:r>
               <w:rPr>
@@ -3090,7 +3090,7 @@
               <w:noProof/>
             </w:rPr>
           </w:pPr>
-          <w:hyperlink w:anchor="_Toc229333441" w:history="1">
+          <w:hyperlink w:anchor="_Toc229333967" w:history="1">
             <w:r>
               <w:rPr>
                 <w:rStyle w:val="ac"/>
@@ -3117,7 +3117,7 @@
                 <w:noProof/>
                 <w:webHidden/>
               </w:rPr>
-              <w:instrText xml:space="preserve"> PAGEREF _Toc229333441 \h </w:instrText>
+              <w:instrText xml:space="preserve"> PAGEREF _Toc229333967 \h </w:instrText>
             </w:r>
             <w:r>
               <w:rPr>
@@ -3158,7 +3158,7 @@
               <w:noProof/>
             </w:rPr>
           </w:pPr>
-          <w:hyperlink w:anchor="_Toc229333442" w:history="1">
+          <w:hyperlink w:anchor="_Toc229333968" w:history="1">
             <w:r>
               <w:rPr>
                 <w:rStyle w:val="ac"/>
@@ -3185,7 +3185,7 @@
                 <w:noProof/>
                 <w:webHidden/>
               </w:rPr>
-              <w:instrText xml:space="preserve"> PAGEREF _Toc229333442 \h </w:instrText>
+              <w:instrText xml:space="preserve"> PAGEREF _Toc229333968 \h </w:instrText>
             </w:r>
             <w:r>
               <w:rPr>
@@ -3226,7 +3226,7 @@
               <w:noProof/>
             </w:rPr>
           </w:pPr>
-          <w:hyperlink w:anchor="_Toc229333443" w:history="1">
+          <w:hyperlink w:anchor="_Toc229333969" w:history="1">
             <w:r>
               <w:rPr>
                 <w:rStyle w:val="ac"/>
@@ -3253,7 +3253,7 @@
                 <w:noProof/>
                 <w:webHidden/>
               </w:rPr>
-              <w:instrText xml:space="preserve"> PAGEREF _Toc229333443 \h </w:instrText>
+              <w:instrText xml:space="preserve"> PAGEREF _Toc229333969 \h </w:instrText>
             </w:r>
             <w:r>
               <w:rPr>
@@ -3273,7 +3273,7 @@
                 <w:noProof/>
                 <w:webHidden/>
               </w:rPr>
-              <w:t>19</w:t>
+              <w:t>18</w:t>
             </w:r>
             <w:r>
               <w:rPr>
@@ -3295,7 +3295,7 @@
               <w:noProof/>
             </w:rPr>
           </w:pPr>
-          <w:hyperlink w:anchor="_Toc229333444" w:history="1">
+          <w:hyperlink w:anchor="_Toc229333970" w:history="1">
             <w:r>
               <w:rPr>
                 <w:rStyle w:val="ac"/>
@@ -3322,7 +3322,7 @@
                 <w:noProof/>
                 <w:webHidden/>
               </w:rPr>
-              <w:instrText xml:space="preserve"> PAGEREF _Toc229333444 \h </w:instrText>
+              <w:instrText xml:space="preserve"> PAGEREF _Toc229333970 \h </w:instrText>
             </w:r>
             <w:r>
               <w:rPr>
@@ -3342,7 +3342,7 @@
                 <w:noProof/>
                 <w:webHidden/>
               </w:rPr>
-              <w:t>19</w:t>
+              <w:t>18</w:t>
             </w:r>
             <w:r>
               <w:rPr>
@@ -3364,7 +3364,7 @@
               <w:noProof/>
             </w:rPr>
           </w:pPr>
-          <w:hyperlink w:anchor="_Toc229333445" w:history="1">
+          <w:hyperlink w:anchor="_Toc229333971" w:history="1">
             <w:r>
               <w:rPr>
                 <w:rStyle w:val="ac"/>
@@ -3391,7 +3391,7 @@
                 <w:noProof/>
                 <w:webHidden/>
               </w:rPr>
-              <w:instrText xml:space="preserve"> PAGEREF _Toc229333445 \h </w:instrText>
+              <w:instrText xml:space="preserve"> PAGEREF _Toc229333971 \h </w:instrText>
             </w:r>
             <w:r>
               <w:rPr>
@@ -3433,7 +3433,7 @@
               <w:noProof/>
             </w:rPr>
           </w:pPr>
-          <w:hyperlink w:anchor="_Toc229333446" w:history="1">
+          <w:hyperlink w:anchor="_Toc229333972" w:history="1">
             <w:r>
               <w:rPr>
                 <w:rStyle w:val="ac"/>
@@ -3460,7 +3460,7 @@
                 <w:noProof/>
                 <w:webHidden/>
               </w:rPr>
-              <w:instrText xml:space="preserve"> PAGEREF _Toc229333446 \h </w:instrText>
+              <w:instrText xml:space="preserve"> PAGEREF _Toc229333972 \h </w:instrText>
             </w:r>
             <w:r>
               <w:rPr>
@@ -3503,7 +3503,7 @@
         <w:pStyle w:val="1"/>
       </w:pPr>
       <w:bookmarkStart w:id="0" w:name="abstract"/>
-      <w:bookmarkStart w:id="1" w:name="_Toc229333397"/>
+      <w:bookmarkStart w:id="1" w:name="_Toc229333923"/>
       <w:r>
         <w:t>Abstract</w:t>
       </w:r>
@@ -3571,7 +3571,11 @@
         <w:t>timeupdate</w:t>
       </w:r>
       <w:r>
-        <w:t xml:space="preserve"> event, (3) overlays section and theme labels in a two-level color hierarchy directly onto the score, and (4) supports section jumping, looped listening, playback-speed control, and keyboard shortcuts. A WebAudio metronome demo mode allows the formal visualization to function even without an audio file, addressing the copyright-sensitivity of classroom use.</w:t>
+        <w:t xml:space="preserve"> event, (3) overlays section and theme labels in a two-level color hierarchy directly onto the score, and (4) supports section jumping, looped listening, playback-speed control, and keyboard shortcuts. </w:t>
+      </w:r>
+      <w:r>
+        <w:lastRenderedPageBreak/>
+        <w:t>A WebAudio metronome demo mode allows the formal visualization to function even without an audio file, addressing the copyright-sensitivity of classroom use.</w:t>
       </w:r>
     </w:p>
     <w:p>
@@ -3655,7 +3659,7 @@
         <w:pStyle w:val="1"/>
       </w:pPr>
       <w:bookmarkStart w:id="2" w:name="Xe3d0fc0bea9a42ce7605565d0964033d7f6ee47"/>
-      <w:bookmarkStart w:id="3" w:name="_Toc229333398"/>
+      <w:bookmarkStart w:id="3" w:name="_Toc229333924"/>
       <w:bookmarkEnd w:id="0"/>
       <w:r>
         <w:t>1. Introduction</w:t>
@@ -3667,7 +3671,7 @@
         <w:pStyle w:val="2"/>
       </w:pPr>
       <w:bookmarkStart w:id="4" w:name="X1bf71e34a5475eafa7691d512243933c189287b"/>
-      <w:bookmarkStart w:id="5" w:name="_Toc229333399"/>
+      <w:bookmarkStart w:id="5" w:name="_Toc229333925"/>
       <w:r>
         <w:t>1.1 Motivation</w:t>
       </w:r>
@@ -3697,6 +3701,7 @@
           <w:b/>
           <w:bCs/>
         </w:rPr>
+        <w:lastRenderedPageBreak/>
         <w:t>The temporal–spatial gap.</w:t>
       </w:r>
       <w:r>
@@ -3785,7 +3790,7 @@
         <w:pStyle w:val="2"/>
       </w:pPr>
       <w:bookmarkStart w:id="6" w:name="Xe2513cbe4cec0b433ad043d7a2d5bcba3139b87"/>
-      <w:bookmarkStart w:id="7" w:name="_Toc229333400"/>
+      <w:bookmarkStart w:id="7" w:name="_Toc229333926"/>
       <w:bookmarkEnd w:id="4"/>
       <w:r>
         <w:t>1.2 Research Questions</w:t>
@@ -3854,7 +3859,7 @@
         <w:pStyle w:val="2"/>
       </w:pPr>
       <w:bookmarkStart w:id="8" w:name="Xb1c59bf1c3438cfd31a3fec8cade6ebe9aa841c"/>
-      <w:bookmarkStart w:id="9" w:name="_Toc229333401"/>
+      <w:bookmarkStart w:id="9" w:name="_Toc229333927"/>
       <w:bookmarkEnd w:id="6"/>
       <w:r>
         <w:t>1.3 Contributions</w:t>
@@ -3934,7 +3939,7 @@
         <w:pStyle w:val="1"/>
       </w:pPr>
       <w:bookmarkStart w:id="10" w:name="X619ba3478f1480a9208e2b421efeeeaa187dd54"/>
-      <w:bookmarkStart w:id="11" w:name="_Toc229333402"/>
+      <w:bookmarkStart w:id="11" w:name="_Toc229333928"/>
       <w:bookmarkEnd w:id="2"/>
       <w:bookmarkEnd w:id="8"/>
       <w:r>
@@ -3947,7 +3952,7 @@
         <w:pStyle w:val="2"/>
       </w:pPr>
       <w:bookmarkStart w:id="12" w:name="X636afad0aabef8e19e5b2a066aedeb36b31e26b"/>
-      <w:bookmarkStart w:id="13" w:name="_Toc229333403"/>
+      <w:bookmarkStart w:id="13" w:name="_Toc229333929"/>
       <w:r>
         <w:t>2.1 Hierarchical Analysis of Sonata Form</w:t>
       </w:r>
@@ -4127,7 +4132,7 @@
         <w:pStyle w:val="2"/>
       </w:pPr>
       <w:bookmarkStart w:id="14" w:name="Xcdbd97658319399ff5ffd3a85fd0bd39d0734e1"/>
-      <w:bookmarkStart w:id="15" w:name="_Toc229333404"/>
+      <w:bookmarkStart w:id="15" w:name="_Toc229333930"/>
       <w:bookmarkEnd w:id="12"/>
       <w:r>
         <w:t>2.2 Dual Coding and the Cognitive Theory of Multimedia Learning</w:t>
@@ -4399,7 +4404,7 @@
         <w:pStyle w:val="2"/>
       </w:pPr>
       <w:bookmarkStart w:id="16" w:name="X6784453bfb3fc20011e6020596635d203a2a71e"/>
-      <w:bookmarkStart w:id="17" w:name="_Toc229333405"/>
+      <w:bookmarkStart w:id="17" w:name="_Toc229333931"/>
       <w:bookmarkEnd w:id="14"/>
       <w:r>
         <w:t>2.3 Active Learning and Comparative Listening</w:t>
@@ -4449,7 +4454,7 @@
         <w:pStyle w:val="2"/>
       </w:pPr>
       <w:bookmarkStart w:id="18" w:name="Xf4d637e68613cffa17c84978bce4794819ef246"/>
-      <w:bookmarkStart w:id="19" w:name="_Toc229333406"/>
+      <w:bookmarkStart w:id="19" w:name="_Toc229333932"/>
       <w:bookmarkEnd w:id="16"/>
       <w:r>
         <w:t>2.4 Related Tools</w:t>
@@ -5477,7 +5482,7 @@
         <w:pStyle w:val="1"/>
       </w:pPr>
       <w:bookmarkStart w:id="20" w:name="X22b19702d34576da8b32320cefe87a134a1534c"/>
-      <w:bookmarkStart w:id="21" w:name="_Toc229333407"/>
+      <w:bookmarkStart w:id="21" w:name="_Toc229333933"/>
       <w:bookmarkEnd w:id="10"/>
       <w:bookmarkEnd w:id="18"/>
       <w:r>
@@ -5490,7 +5495,7 @@
         <w:pStyle w:val="2"/>
       </w:pPr>
       <w:bookmarkStart w:id="22" w:name="X90037fffeb0517eb9be28959be4b42079adccec"/>
-      <w:bookmarkStart w:id="23" w:name="_Toc229333408"/>
+      <w:bookmarkStart w:id="23" w:name="_Toc229333934"/>
       <w:r>
         <w:t>3.1 Overview</w:t>
       </w:r>
@@ -5539,7 +5544,7 @@
         <w:pStyle w:val="2"/>
       </w:pPr>
       <w:bookmarkStart w:id="24" w:name="X5114b9a8810654ce1b996f5cb0cc61b16e32533"/>
-      <w:bookmarkStart w:id="25" w:name="_Toc229333409"/>
+      <w:bookmarkStart w:id="25" w:name="_Toc229333935"/>
       <w:bookmarkEnd w:id="22"/>
       <w:r>
         <w:t>3.2 Formal Analysis</w:t>
@@ -6850,7 +6855,7 @@
         <w:pStyle w:val="2"/>
       </w:pPr>
       <w:bookmarkStart w:id="26" w:name="X22345862c5d429ecd2382d6ef2da7ccf6968f1d"/>
-      <w:bookmarkStart w:id="27" w:name="_Toc229333410"/>
+      <w:bookmarkStart w:id="27" w:name="_Toc229333936"/>
       <w:bookmarkEnd w:id="24"/>
       <w:r>
         <w:t>3.3 Pedagogical Significance: The Subdominant Recapitulation</w:t>
@@ -6872,7 +6877,7 @@
         <w:t>subdominant recapitulation</w:t>
       </w:r>
       <w:r>
-        <w:t>, a recognized but unusual deformation. Korean-language scholarship corroborates the same observation — Bong (2017) describes the recap-key choice as a transposition "a fifth below the dominant" while emphasizing the unifying role of the Alberti bass across all three movements. Its functional motivation, often glossed in textbooks, is illuminating:</w:t>
+        <w:t>, a recognized but unusual deformation. Its functional motivation, often glossed in textbooks, is illuminating:</w:t>
       </w:r>
     </w:p>
     <w:p>
@@ -6980,7 +6985,7 @@
         <w:pStyle w:val="1"/>
       </w:pPr>
       <w:bookmarkStart w:id="28" w:name="X931ba28faf84dd02b36c362d702d1bc58709915"/>
-      <w:bookmarkStart w:id="29" w:name="_Toc229333411"/>
+      <w:bookmarkStart w:id="29" w:name="_Toc229333937"/>
       <w:bookmarkEnd w:id="20"/>
       <w:bookmarkEnd w:id="26"/>
       <w:r>
@@ -6993,7 +6998,7 @@
         <w:pStyle w:val="2"/>
       </w:pPr>
       <w:bookmarkStart w:id="30" w:name="X9de8e5b45ce68f346b1cc38c139307b75b6baf5"/>
-      <w:bookmarkStart w:id="31" w:name="_Toc229333412"/>
+      <w:bookmarkStart w:id="31" w:name="_Toc229333938"/>
       <w:r>
         <w:t>4.1 Design Principles</w:t>
       </w:r>
@@ -7314,7 +7319,7 @@
         <w:pStyle w:val="2"/>
       </w:pPr>
       <w:bookmarkStart w:id="32" w:name="X15d66123ba36ad77d4b76862583d779c64c85de"/>
-      <w:bookmarkStart w:id="33" w:name="_Toc229333413"/>
+      <w:bookmarkStart w:id="33" w:name="_Toc229333939"/>
       <w:bookmarkEnd w:id="30"/>
       <w:r>
         <w:t>4.2 Architecture</w:t>
@@ -7540,7 +7545,7 @@
         <w:pStyle w:val="2"/>
       </w:pPr>
       <w:bookmarkStart w:id="34" w:name="X08bfe69c9bda8b49e28ab7e12a88087f3f094ec"/>
-      <w:bookmarkStart w:id="35" w:name="_Toc229333414"/>
+      <w:bookmarkStart w:id="35" w:name="_Toc229333940"/>
       <w:bookmarkEnd w:id="32"/>
       <w:r>
         <w:t>4.3 Data Schema</w:t>
@@ -8557,7 +8562,7 @@
         <w:pStyle w:val="2"/>
       </w:pPr>
       <w:bookmarkStart w:id="36" w:name="X302df813eec71695f042125274d58a1663ea74d"/>
-      <w:bookmarkStart w:id="37" w:name="_Toc229333415"/>
+      <w:bookmarkStart w:id="37" w:name="_Toc229333941"/>
       <w:bookmarkEnd w:id="34"/>
       <w:r>
         <w:t>4.4 Synchronization Algorithm</w:t>
@@ -9565,7 +9570,7 @@
         <w:pStyle w:val="2"/>
       </w:pPr>
       <w:bookmarkStart w:id="41" w:name="X65073c4485f33f4613201d3117deb1ee1dc92e2"/>
-      <w:bookmarkStart w:id="42" w:name="_Toc229333416"/>
+      <w:bookmarkStart w:id="42" w:name="_Toc229333942"/>
       <w:bookmarkEnd w:id="36"/>
       <w:bookmarkEnd w:id="40"/>
       <w:r>
@@ -10117,7 +10122,7 @@
         <w:pStyle w:val="1"/>
       </w:pPr>
       <w:bookmarkStart w:id="43" w:name="X46d7d1d5105128ac6809b89aa63ce48805167cf"/>
-      <w:bookmarkStart w:id="44" w:name="_Toc229333417"/>
+      <w:bookmarkStart w:id="44" w:name="_Toc229333943"/>
       <w:bookmarkEnd w:id="28"/>
       <w:bookmarkEnd w:id="41"/>
       <w:r>
@@ -10130,7 +10135,7 @@
         <w:pStyle w:val="2"/>
       </w:pPr>
       <w:bookmarkStart w:id="45" w:name="X85f22ce8108fdac68fd2e3b2fb5b24980e3236d"/>
-      <w:bookmarkStart w:id="46" w:name="_Toc229333418"/>
+      <w:bookmarkStart w:id="46" w:name="_Toc229333944"/>
       <w:r>
         <w:t>5.1 Stack</w:t>
       </w:r>
@@ -10225,7 +10230,7 @@
         <w:pStyle w:val="2"/>
       </w:pPr>
       <w:bookmarkStart w:id="47" w:name="X44135718d30d0d96c7a4f196b7424ac73c01acc"/>
-      <w:bookmarkStart w:id="48" w:name="_Toc229333419"/>
+      <w:bookmarkStart w:id="48" w:name="_Toc229333945"/>
       <w:bookmarkEnd w:id="45"/>
       <w:r>
         <w:t>5.2 Module Structure</w:t>
@@ -10344,7 +10349,7 @@
         <w:pStyle w:val="2"/>
       </w:pPr>
       <w:bookmarkStart w:id="49" w:name="X109c7a168e0e829c2f1484d7523259a203dc182"/>
-      <w:bookmarkStart w:id="50" w:name="_Toc229333420"/>
+      <w:bookmarkStart w:id="50" w:name="_Toc229333946"/>
       <w:bookmarkEnd w:id="47"/>
       <w:r>
         <w:t>5.3 Robustness</w:t>
@@ -10688,7 +10693,7 @@
         <w:pStyle w:val="2"/>
       </w:pPr>
       <w:bookmarkStart w:id="51" w:name="Xeb2de10a3b598cc9ca9b3bd4d84d98e98d719f3"/>
-      <w:bookmarkStart w:id="52" w:name="_Toc229333421"/>
+      <w:bookmarkStart w:id="52" w:name="_Toc229333947"/>
       <w:bookmarkEnd w:id="49"/>
       <w:r>
         <w:t>5.4 Accessibility</w:t>
@@ -10796,7 +10801,7 @@
         <w:pStyle w:val="1"/>
       </w:pPr>
       <w:bookmarkStart w:id="53" w:name="X57d1f32c80879f8393b1352d8ba753499a9c37b"/>
-      <w:bookmarkStart w:id="54" w:name="_Toc229333422"/>
+      <w:bookmarkStart w:id="54" w:name="_Toc229333948"/>
       <w:bookmarkEnd w:id="43"/>
       <w:bookmarkEnd w:id="51"/>
       <w:r>
@@ -10809,7 +10814,7 @@
         <w:pStyle w:val="2"/>
       </w:pPr>
       <w:bookmarkStart w:id="55" w:name="X56589be57991d63716b3d0aae591a0c2c18a5f9"/>
-      <w:bookmarkStart w:id="56" w:name="_Toc229333423"/>
+      <w:bookmarkStart w:id="56" w:name="_Toc229333949"/>
       <w:r>
         <w:t>6.1 Design</w:t>
       </w:r>
@@ -10828,7 +10833,7 @@
         <w:pStyle w:val="2"/>
       </w:pPr>
       <w:bookmarkStart w:id="57" w:name="X626dce9a3407f19d3f0a823cce1718cb844591d"/>
-      <w:bookmarkStart w:id="58" w:name="_Toc229333424"/>
+      <w:bookmarkStart w:id="58" w:name="_Toc229333950"/>
       <w:bookmarkEnd w:id="55"/>
       <w:r>
         <w:t>6.2 Participants</w:t>
@@ -10848,7 +10853,7 @@
         <w:pStyle w:val="2"/>
       </w:pPr>
       <w:bookmarkStart w:id="59" w:name="X05f1459f461e8b33ac8afc0bcb2959ba6322de4"/>
-      <w:bookmarkStart w:id="60" w:name="_Toc229333425"/>
+      <w:bookmarkStart w:id="60" w:name="_Toc229333951"/>
       <w:bookmarkEnd w:id="57"/>
       <w:r>
         <w:t>6.3 Instruments</w:t>
@@ -10977,7 +10982,7 @@
         <w:pStyle w:val="2"/>
       </w:pPr>
       <w:bookmarkStart w:id="64" w:name="Xaf91fc092ffe9ac78d490a0b77b62d1c8cd8bd2"/>
-      <w:bookmarkStart w:id="65" w:name="_Toc229333426"/>
+      <w:bookmarkStart w:id="65" w:name="_Toc229333952"/>
       <w:bookmarkEnd w:id="59"/>
       <w:bookmarkEnd w:id="63"/>
       <w:r>
@@ -11444,7 +11449,7 @@
         <w:pStyle w:val="2"/>
       </w:pPr>
       <w:bookmarkStart w:id="66" w:name="X7572b3eeae2a88e4ac4425c4de66b4439d2e686"/>
-      <w:bookmarkStart w:id="67" w:name="_Toc229333427"/>
+      <w:bookmarkStart w:id="67" w:name="_Toc229333953"/>
       <w:bookmarkEnd w:id="64"/>
       <w:r>
         <w:t>6.5 Analysis</w:t>
@@ -11512,7 +11517,7 @@
         <w:pStyle w:val="1"/>
       </w:pPr>
       <w:bookmarkStart w:id="68" w:name="X7f71dd75448129b74f2fc659b5486981c0282bb"/>
-      <w:bookmarkStart w:id="69" w:name="_Toc229333428"/>
+      <w:bookmarkStart w:id="69" w:name="_Toc229333954"/>
       <w:bookmarkEnd w:id="53"/>
       <w:bookmarkEnd w:id="66"/>
       <w:r>
@@ -11525,7 +11530,7 @@
         <w:pStyle w:val="2"/>
       </w:pPr>
       <w:bookmarkStart w:id="70" w:name="X4dac277f1e89ace7bdb47f4ded59737bf54114c"/>
-      <w:bookmarkStart w:id="71" w:name="_Toc229333429"/>
+      <w:bookmarkStart w:id="71" w:name="_Toc229333955"/>
       <w:r>
         <w:t>7.1 Form-Identification Accuracy</w:t>
       </w:r>
@@ -12004,7 +12009,7 @@
         <w:pStyle w:val="2"/>
       </w:pPr>
       <w:bookmarkStart w:id="72" w:name="Xd9d885e72efb507e3941536a98032464b5d5f1d"/>
-      <w:bookmarkStart w:id="73" w:name="_Toc229333430"/>
+      <w:bookmarkStart w:id="73" w:name="_Toc229333956"/>
       <w:bookmarkEnd w:id="70"/>
       <w:r>
         <w:t>7.2 Recognition of Subdominant Recapitulation</w:t>
@@ -12056,7 +12061,7 @@
         <w:pStyle w:val="2"/>
       </w:pPr>
       <w:bookmarkStart w:id="74" w:name="X6069361d365837a92e0e55eb07a1d332869933b"/>
-      <w:bookmarkStart w:id="75" w:name="_Toc229333431"/>
+      <w:bookmarkStart w:id="75" w:name="_Toc229333957"/>
       <w:bookmarkEnd w:id="72"/>
       <w:r>
         <w:t>7.3 System Usability</w:t>
@@ -12086,7 +12091,7 @@
         <w:pStyle w:val="2"/>
       </w:pPr>
       <w:bookmarkStart w:id="76" w:name="X955a6c17de00f00e200944c891e82f95760f924"/>
-      <w:bookmarkStart w:id="77" w:name="_Toc229333432"/>
+      <w:bookmarkStart w:id="77" w:name="_Toc229333958"/>
       <w:bookmarkEnd w:id="74"/>
       <w:r>
         <w:t>7.4 Qualitative Feedback</w:t>
@@ -12206,7 +12211,7 @@
         <w:pStyle w:val="1"/>
       </w:pPr>
       <w:bookmarkStart w:id="78" w:name="X8c1abf58e73567575ecbab20602f8a971fd4c73"/>
-      <w:bookmarkStart w:id="79" w:name="_Toc229333433"/>
+      <w:bookmarkStart w:id="79" w:name="_Toc229333959"/>
       <w:bookmarkEnd w:id="68"/>
       <w:bookmarkEnd w:id="76"/>
       <w:r>
@@ -12219,7 +12224,7 @@
         <w:pStyle w:val="2"/>
       </w:pPr>
       <w:bookmarkStart w:id="80" w:name="X792a0b1f307aa766433d7cba8d8c8e8da4fc05d"/>
-      <w:bookmarkStart w:id="81" w:name="_Toc229333434"/>
+      <w:bookmarkStart w:id="81" w:name="_Toc229333960"/>
       <w:r>
         <w:t>8.1 Educational Implications</w:t>
       </w:r>
@@ -12268,7 +12273,7 @@
         <w:pStyle w:val="2"/>
       </w:pPr>
       <w:bookmarkStart w:id="82" w:name="X593130719821a7a26ba1a1a7e7694f583376987"/>
-      <w:bookmarkStart w:id="83" w:name="_Toc229333435"/>
+      <w:bookmarkStart w:id="83" w:name="_Toc229333961"/>
       <w:bookmarkEnd w:id="80"/>
       <w:r>
         <w:t>8.2 Methodological and Tooling Implications</w:t>
@@ -12337,7 +12342,7 @@
         <w:pStyle w:val="2"/>
       </w:pPr>
       <w:bookmarkStart w:id="84" w:name="X364fc5a9947686e660d06f9e3e3943779d206b3"/>
-      <w:bookmarkStart w:id="85" w:name="_Toc229333436"/>
+      <w:bookmarkStart w:id="85" w:name="_Toc229333962"/>
       <w:bookmarkEnd w:id="82"/>
       <w:r>
         <w:t>8.3 Limitations</w:t>
@@ -12447,7 +12452,7 @@
         <w:pStyle w:val="2"/>
       </w:pPr>
       <w:bookmarkStart w:id="86" w:name="X3aa89359e731db19990110a81e7fa3cb52c4302"/>
-      <w:bookmarkStart w:id="87" w:name="_Toc229333437"/>
+      <w:bookmarkStart w:id="87" w:name="_Toc229333963"/>
       <w:bookmarkEnd w:id="84"/>
       <w:r>
         <w:t>8.4 Future Work</w:t>
@@ -12554,7 +12559,7 @@
         <w:pStyle w:val="1"/>
       </w:pPr>
       <w:bookmarkStart w:id="88" w:name="Xf084a3aad2ba019113a3f84a3b857d0628c92ce"/>
-      <w:bookmarkStart w:id="89" w:name="_Toc229333438"/>
+      <w:bookmarkStart w:id="89" w:name="_Toc229333964"/>
       <w:bookmarkEnd w:id="78"/>
       <w:bookmarkEnd w:id="86"/>
       <w:r>
@@ -12593,7 +12598,7 @@
         <w:pStyle w:val="1"/>
       </w:pPr>
       <w:bookmarkStart w:id="90" w:name="X640081157259e8cff7029700f597651e6519d9c"/>
-      <w:bookmarkStart w:id="91" w:name="_Toc229333439"/>
+      <w:bookmarkStart w:id="91" w:name="_Toc229333965"/>
       <w:bookmarkEnd w:id="88"/>
       <w:r>
         <w:t>10. Reproducibility</w:t>
@@ -13164,7 +13169,7 @@
         <w:pStyle w:val="1"/>
       </w:pPr>
       <w:bookmarkStart w:id="92" w:name="acknowledgments"/>
-      <w:bookmarkStart w:id="93" w:name="_Toc229333440"/>
+      <w:bookmarkStart w:id="93" w:name="_Toc229333966"/>
       <w:bookmarkEnd w:id="90"/>
       <w:r>
         <w:t>Acknowledgments</w:t>
@@ -13184,7 +13189,7 @@
         <w:pStyle w:val="1"/>
       </w:pPr>
       <w:bookmarkStart w:id="94" w:name="references"/>
-      <w:bookmarkStart w:id="95" w:name="_Toc229333441"/>
+      <w:bookmarkStart w:id="95" w:name="_Toc229333967"/>
       <w:bookmarkEnd w:id="92"/>
       <w:r>
         <w:t>References</w:t>
@@ -13200,56 +13205,20 @@
         </w:numPr>
       </w:pPr>
       <w:r>
-        <w:t xml:space="preserve">Bong, J.-J. (2017). </w:t>
+        <w:t xml:space="preserve">Brooke, J. (1996). SUS: A "quick and dirty" usability scale. In P. W. </w:t>
+      </w:r>
+      <w:r>
+        <w:t xml:space="preserve">Jordan, B. Thomas, B. A. Weerdmeester, &amp; I. L. McClelland (Eds.), </w:t>
       </w:r>
       <w:r>
         <w:rPr>
           <w:i/>
           <w:iCs/>
         </w:rPr>
-        <w:t>A study on Piano Sonata K. 545 by W. A. Mozart</w:t>
-      </w:r>
-      <w:r>
-        <w:t xml:space="preserve"> </w:t>
-      </w:r>
-      <w:r>
-        <w:t xml:space="preserve">[Master's thesis in Musicology, Konkuk University Graduate School, Seoul]. Advisor: J.-M. Kim. (Korean: </w:t>
-      </w:r>
-      <w:r>
-        <w:t>모차르트</w:t>
-      </w:r>
-      <w:r>
-        <w:t xml:space="preserve"> </w:t>
-      </w:r>
-      <w:r>
-        <w:t>〈피아노</w:t>
-      </w:r>
-      <w:r>
-        <w:t xml:space="preserve"> </w:t>
-      </w:r>
-      <w:r>
-        <w:t>소나타</w:t>
-      </w:r>
-      <w:r>
-        <w:t xml:space="preserve"> K. 545</w:t>
-      </w:r>
-      <w:r>
-        <w:t>〉</w:t>
-      </w:r>
-      <w:r>
-        <w:t xml:space="preserve"> </w:t>
-      </w:r>
-      <w:r>
-        <w:t>분석</w:t>
-      </w:r>
-      <w:r>
-        <w:t xml:space="preserve"> </w:t>
-      </w:r>
-      <w:r>
-        <w:t>연구</w:t>
-      </w:r>
-      <w:r>
-        <w:t>.)</w:t>
+        <w:t>Usability Evaluation in Industry</w:t>
+      </w:r>
+      <w:r>
+        <w:t xml:space="preserve"> (pp. 189–194). Taylor &amp; Francis.</w:t>
       </w:r>
     </w:p>
     <w:p>
@@ -13261,17 +13230,17 @@
         </w:numPr>
       </w:pPr>
       <w:r>
-        <w:t xml:space="preserve">Brooke, J. (1996). SUS: A "quick and dirty" usability scale. In P. W. Jordan, B. Thomas, B. A. Weerdmeester, &amp; I. L. McClelland (Eds.), </w:t>
+        <w:t xml:space="preserve">Cannam, C., Landone, C., &amp; Sandler, M. (2010). Sonic Visualiser: An open source application for viewing, analysing, and annotating music audio files. In </w:t>
       </w:r>
       <w:r>
         <w:rPr>
           <w:i/>
           <w:iCs/>
         </w:rPr>
-        <w:t>Usability Evaluation in Industry</w:t>
-      </w:r>
-      <w:r>
-        <w:t xml:space="preserve"> (pp. 189–194). Taylor &amp; Francis.</w:t>
+        <w:t>Proceedings of the ACM Multimedia 2010 International Conference</w:t>
+      </w:r>
+      <w:r>
+        <w:t xml:space="preserve"> (pp. 1467–1468).</w:t>
       </w:r>
     </w:p>
     <w:p>
@@ -13283,17 +13252,17 @@
         </w:numPr>
       </w:pPr>
       <w:r>
-        <w:t xml:space="preserve">Cannam, C., Landone, C., &amp; Sandler, M. (2010). Sonic Visualiser: An open source application for viewing, analysing, and annotating music audio files. In </w:t>
+        <w:t xml:space="preserve">Caplin, W. E. (1998). </w:t>
       </w:r>
       <w:r>
         <w:rPr>
           <w:i/>
           <w:iCs/>
         </w:rPr>
-        <w:t>Proceedings of the ACM Multimedia 2010 International Conference</w:t>
-      </w:r>
-      <w:r>
-        <w:t xml:space="preserve"> (pp. 1467–1468).</w:t>
+        <w:t>Classical form: A theory of formal functions for the instrumental music of Haydn, Mozart, and Beethoven.</w:t>
+      </w:r>
+      <w:r>
+        <w:t xml:space="preserve"> Oxford University Press.</w:t>
       </w:r>
     </w:p>
     <w:p>
@@ -13305,17 +13274,17 @@
         </w:numPr>
       </w:pPr>
       <w:r>
-        <w:t xml:space="preserve">Caplin, W. E. (1998). </w:t>
+        <w:t xml:space="preserve">Caplin, W. E. (2009). What are formal functions? In P. Bergé (Ed.), </w:t>
       </w:r>
       <w:r>
         <w:rPr>
           <w:i/>
           <w:iCs/>
         </w:rPr>
-        <w:t>Classical form: A theory of formal functions for the instrumental music of Haydn, Mozart, and Beethoven.</w:t>
-      </w:r>
-      <w:r>
-        <w:t xml:space="preserve"> Oxford University Press.</w:t>
+        <w:t>Musical form, forms, &amp; formenlehre</w:t>
+      </w:r>
+      <w:r>
+        <w:t xml:space="preserve"> (pp. 21–40). Leuven University Press.</w:t>
       </w:r>
     </w:p>
     <w:p>
@@ -13327,17 +13296,17 @@
         </w:numPr>
       </w:pPr>
       <w:r>
-        <w:t xml:space="preserve">Caplin, W. E. (2009). What are formal functions? In P. Bergé (Ed.), </w:t>
+        <w:t xml:space="preserve">Cohen, J. (1988). </w:t>
       </w:r>
       <w:r>
         <w:rPr>
           <w:i/>
           <w:iCs/>
         </w:rPr>
-        <w:t>Musical form, forms, &amp; formenlehre</w:t>
-      </w:r>
-      <w:r>
-        <w:t xml:space="preserve"> (pp. 21–40). Leuven University Press.</w:t>
+        <w:t>Statistical power analysis for the behavioral sciences</w:t>
+      </w:r>
+      <w:r>
+        <w:t xml:space="preserve"> (2nd ed.). Erlbaum.</w:t>
       </w:r>
     </w:p>
     <w:p>
@@ -13349,17 +13318,17 @@
         </w:numPr>
       </w:pPr>
       <w:r>
-        <w:t xml:space="preserve">Cohen, J. (1988). </w:t>
+        <w:t xml:space="preserve">Cook, N. (1990). </w:t>
       </w:r>
       <w:r>
         <w:rPr>
           <w:i/>
           <w:iCs/>
         </w:rPr>
-        <w:t>Statistical power analysis for the behavioral sciences</w:t>
-      </w:r>
-      <w:r>
-        <w:t xml:space="preserve"> (2nd ed.). Erlbaum.</w:t>
+        <w:t>Music, imagination, and culture.</w:t>
+      </w:r>
+      <w:r>
+        <w:t xml:space="preserve"> Oxford University Press.</w:t>
       </w:r>
     </w:p>
     <w:p>
@@ -13371,17 +13340,17 @@
         </w:numPr>
       </w:pPr>
       <w:r>
-        <w:t xml:space="preserve">Cook, N. (1990). </w:t>
+        <w:t xml:space="preserve">Couprie, P. (2008). iAnalyse: A software dedicated to the graphical analysis of music. In </w:t>
       </w:r>
       <w:r>
         <w:rPr>
           <w:i/>
           <w:iCs/>
         </w:rPr>
-        <w:t>Music, imagination, and culture.</w:t>
-      </w:r>
-      <w:r>
-        <w:t xml:space="preserve"> Oxford University Press.</w:t>
+        <w:t>Proceedings of the 5th Sound and Music Computing Conference</w:t>
+      </w:r>
+      <w:r>
+        <w:t>.</w:t>
       </w:r>
     </w:p>
     <w:p>
@@ -13393,14 +13362,14 @@
         </w:numPr>
       </w:pPr>
       <w:r>
-        <w:t xml:space="preserve">Couprie, P. (2008). iAnalyse: A software dedicated to the graphical analysis of music. In </w:t>
+        <w:t xml:space="preserve">Goto, M. (2006). AIST annotation for the RWC music database. In </w:t>
       </w:r>
       <w:r>
         <w:rPr>
           <w:i/>
           <w:iCs/>
         </w:rPr>
-        <w:t>Proceedings of the 5th Sound and Music Computing Conference</w:t>
+        <w:t>Proceedings of ISMIR 2006</w:t>
       </w:r>
       <w:r>
         <w:t>.</w:t>
@@ -13415,17 +13384,17 @@
         </w:numPr>
       </w:pPr>
       <w:r>
-        <w:t xml:space="preserve">Goto, M. (2006). AIST annotation for the RWC music database. In </w:t>
+        <w:t xml:space="preserve">Hargreaves, D. J. (1986). </w:t>
       </w:r>
       <w:r>
         <w:rPr>
           <w:i/>
           <w:iCs/>
         </w:rPr>
-        <w:t>Proceedings of ISMIR 2006</w:t>
-      </w:r>
-      <w:r>
-        <w:t>.</w:t>
+        <w:t>The developmental psychology of music.</w:t>
+      </w:r>
+      <w:r>
+        <w:t xml:space="preserve"> Cambridge University Press.</w:t>
       </w:r>
     </w:p>
     <w:p>
@@ -13437,17 +13406,17 @@
         </w:numPr>
       </w:pPr>
       <w:r>
-        <w:t xml:space="preserve">Hargreaves, D. J. (1986). </w:t>
+        <w:t xml:space="preserve">Hepokoski, J., &amp; Darcy, W. (2006). </w:t>
       </w:r>
       <w:r>
         <w:rPr>
           <w:i/>
           <w:iCs/>
         </w:rPr>
-        <w:t>The developmental psychology of music.</w:t>
-      </w:r>
-      <w:r>
-        <w:t xml:space="preserve"> Cambridge University Press.</w:t>
+        <w:t>Elements of sonata theory: Norms, types, and deformations in the late-eighteenth-century sonata.</w:t>
+      </w:r>
+      <w:r>
+        <w:t xml:space="preserve"> Oxford University Press.</w:t>
       </w:r>
     </w:p>
     <w:p>
@@ -13459,14 +13428,14 @@
         </w:numPr>
       </w:pPr>
       <w:r>
-        <w:t xml:space="preserve">Hepokoski, J., &amp; Darcy, W. (2006). </w:t>
+        <w:t xml:space="preserve">Margulis, E. H. (2014). </w:t>
       </w:r>
       <w:r>
         <w:rPr>
           <w:i/>
           <w:iCs/>
         </w:rPr>
-        <w:t>Elements of sonata theory: Norms, types, and deformations in the late-eighteenth-century sonata.</w:t>
+        <w:t>On repeat: How music plays the mind.</w:t>
       </w:r>
       <w:r>
         <w:t xml:space="preserve"> Oxford University Press.</w:t>
@@ -13481,17 +13450,17 @@
         </w:numPr>
       </w:pPr>
       <w:r>
-        <w:t xml:space="preserve">Margulis, E. H. (2014). </w:t>
+        <w:t xml:space="preserve">Mayer, R. E. (2009). </w:t>
       </w:r>
       <w:r>
         <w:rPr>
           <w:i/>
           <w:iCs/>
         </w:rPr>
-        <w:t>On repeat: How music plays the mind.</w:t>
-      </w:r>
-      <w:r>
-        <w:t xml:space="preserve"> Oxford University Press.</w:t>
+        <w:t>Multimedia learning</w:t>
+      </w:r>
+      <w:r>
+        <w:t xml:space="preserve"> (2nd ed.). Cambridge University Press.</w:t>
       </w:r>
     </w:p>
     <w:p>
@@ -13503,17 +13472,17 @@
         </w:numPr>
       </w:pPr>
       <w:r>
-        <w:t xml:space="preserve">Mayer, R. E. (2009). </w:t>
+        <w:t xml:space="preserve">Mozart, W. A. (1986). </w:t>
       </w:r>
       <w:r>
         <w:rPr>
           <w:i/>
           <w:iCs/>
         </w:rPr>
-        <w:t>Multimedia learning</w:t>
-      </w:r>
-      <w:r>
-        <w:t xml:space="preserve"> (2nd ed.). Cambridge University Press.</w:t>
+        <w:t>Neue Mozart-Ausgabe IX/25: Klaviersonaten Bd. 2.</w:t>
+      </w:r>
+      <w:r>
+        <w:t xml:space="preserve"> Bärenreiter.</w:t>
       </w:r>
     </w:p>
     <w:p>
@@ -13525,17 +13494,17 @@
         </w:numPr>
       </w:pPr>
       <w:r>
-        <w:t xml:space="preserve">Mozart, W. A. (1986). </w:t>
+        <w:t xml:space="preserve">Nakamura, E., Yoshii, K., &amp; Katayose, H. (2017). Performance error detection and post-processing for fast and accurate symbolic music alignment. In </w:t>
       </w:r>
       <w:r>
         <w:rPr>
           <w:i/>
           <w:iCs/>
         </w:rPr>
-        <w:t>Neue Mozart-Ausgabe IX/25: Klaviersonaten Bd. 2.</w:t>
-      </w:r>
-      <w:r>
-        <w:t xml:space="preserve"> Bärenreiter.</w:t>
+        <w:t>Proceedings of ISMIR 2017</w:t>
+      </w:r>
+      <w:r>
+        <w:t>.</w:t>
       </w:r>
     </w:p>
     <w:p>
@@ -13547,17 +13516,17 @@
         </w:numPr>
       </w:pPr>
       <w:r>
-        <w:t xml:space="preserve">Nakamura, E., Yoshii, K., &amp; Katayose, H. (2017). Performance error detection and post-processing for fast and accurate symbolic music alignment. In </w:t>
+        <w:t xml:space="preserve">North, A. C., &amp; Hargreaves, D. J. (2008). </w:t>
       </w:r>
       <w:r>
         <w:rPr>
           <w:i/>
           <w:iCs/>
         </w:rPr>
-        <w:t>Proceedings of ISMIR 2017</w:t>
-      </w:r>
-      <w:r>
-        <w:t>.</w:t>
+        <w:t>The social and applied psychology of music.</w:t>
+      </w:r>
+      <w:r>
+        <w:t xml:space="preserve"> Oxford University Press.</w:t>
       </w:r>
     </w:p>
     <w:p>
@@ -13569,17 +13538,17 @@
         </w:numPr>
       </w:pPr>
       <w:r>
-        <w:t xml:space="preserve">North, A. C., &amp; Hargreaves, D. J. (2008). </w:t>
+        <w:t xml:space="preserve">Paivio, A. (1991). Dual coding theory: Retrospect and current status. </w:t>
       </w:r>
       <w:r>
         <w:rPr>
           <w:i/>
           <w:iCs/>
         </w:rPr>
-        <w:t>The social and applied psychology of music.</w:t>
-      </w:r>
-      <w:r>
-        <w:t xml:space="preserve"> Oxford University Press.</w:t>
+        <w:t>Canadian Journal of Psychology, 45</w:t>
+      </w:r>
+      <w:r>
+        <w:t>(3), 255–287.</w:t>
       </w:r>
     </w:p>
     <w:p>
@@ -13591,17 +13560,17 @@
         </w:numPr>
       </w:pPr>
       <w:r>
-        <w:t xml:space="preserve">Paivio, A. (1991). Dual coding theory: Retrospect and current status. </w:t>
+        <w:t xml:space="preserve">Plazak, J. (2014). Visualizing musical form: A color-based approach. </w:t>
       </w:r>
       <w:r>
         <w:rPr>
           <w:i/>
           <w:iCs/>
         </w:rPr>
-        <w:t>Canadian Journal of Psychology, 45</w:t>
-      </w:r>
-      <w:r>
-        <w:t>(3), 255–287.</w:t>
+        <w:t>Journal of Music Theory Pedagogy, 28</w:t>
+      </w:r>
+      <w:r>
+        <w:t>, 39–62.</w:t>
       </w:r>
     </w:p>
     <w:p>
@@ -13613,17 +13582,17 @@
         </w:numPr>
       </w:pPr>
       <w:r>
-        <w:t xml:space="preserve">Plazak, J. (2014). Visualizing musical form: A color-based approach. </w:t>
+        <w:t xml:space="preserve">Reichweger, G. (2018). Color in music pedagogy. </w:t>
       </w:r>
       <w:r>
         <w:rPr>
           <w:i/>
           <w:iCs/>
         </w:rPr>
-        <w:t>Journal of Music Theory Pedagogy, 28</w:t>
-      </w:r>
-      <w:r>
-        <w:t>, 39–62.</w:t>
+        <w:t>British Journal of Music Education, 35</w:t>
+      </w:r>
+      <w:r>
+        <w:t>(1), 23–41.</w:t>
       </w:r>
     </w:p>
     <w:p>
@@ -13635,17 +13604,20 @@
         </w:numPr>
       </w:pPr>
       <w:r>
-        <w:t xml:space="preserve">Reichweger, G. (2018). Color in music pedagogy. </w:t>
+        <w:t xml:space="preserve">Sapp, C. S. (2011). </w:t>
       </w:r>
       <w:r>
         <w:rPr>
           <w:i/>
           <w:iCs/>
         </w:rPr>
-        <w:t>British Journal of Music Education, 35</w:t>
-      </w:r>
-      <w:r>
-        <w:t>(1), 23–41.</w:t>
+        <w:t>Computational methods for the analysis of musical structure</w:t>
+      </w:r>
+      <w:r>
+        <w:t xml:space="preserve"> </w:t>
+      </w:r>
+      <w:r>
+        <w:t>(Doctoral dissertation). Stanford University, CCRMA.</w:t>
       </w:r>
     </w:p>
     <w:p>
@@ -13657,17 +13629,17 @@
         </w:numPr>
       </w:pPr>
       <w:r>
-        <w:t xml:space="preserve">Sapp, C. S. (2011). </w:t>
+        <w:t xml:space="preserve">Sapp, C. S. (2017). Verovio Humdrum Viewer. In </w:t>
       </w:r>
       <w:r>
         <w:rPr>
           <w:i/>
           <w:iCs/>
         </w:rPr>
-        <w:t>Computational methods for the analysis of musical structure</w:t>
-      </w:r>
-      <w:r>
-        <w:t xml:space="preserve"> (Doctoral dissertation). Stanford University, CCRMA.</w:t>
+        <w:t>Music Encoding Conference 2017</w:t>
+      </w:r>
+      <w:r>
+        <w:t>.</w:t>
       </w:r>
     </w:p>
     <w:p>
@@ -13679,17 +13651,17 @@
         </w:numPr>
       </w:pPr>
       <w:r>
-        <w:t xml:space="preserve">Sapp, C. S. (2017). Verovio Humdrum Viewer. In </w:t>
+        <w:t xml:space="preserve">Sauro, J., &amp; Lewis, J. R. (2016). </w:t>
       </w:r>
       <w:r>
         <w:rPr>
           <w:i/>
           <w:iCs/>
         </w:rPr>
-        <w:t>Music Encoding Conference 2017</w:t>
-      </w:r>
-      <w:r>
-        <w:t>.</w:t>
+        <w:t>Quantifying the user experience: Practical statistics for user research</w:t>
+      </w:r>
+      <w:r>
+        <w:t xml:space="preserve"> (2nd ed.). Morgan Kaufmann.</w:t>
       </w:r>
     </w:p>
     <w:p>
@@ -13701,17 +13673,17 @@
         </w:numPr>
       </w:pPr>
       <w:r>
-        <w:t xml:space="preserve">Sauro, J., &amp; Lewis, J. R. (2016). </w:t>
+        <w:t xml:space="preserve">Shadish, W. R., Cook, T. D., &amp; Campbell, D. T. (2002). </w:t>
       </w:r>
       <w:r>
         <w:rPr>
           <w:i/>
           <w:iCs/>
         </w:rPr>
-        <w:t>Quantifying the user experience: Practical statistics for user research</w:t>
-      </w:r>
-      <w:r>
-        <w:t xml:space="preserve"> (2nd ed.). Morgan Kaufmann.</w:t>
+        <w:t>Experimental and quasi-experimental designs for generalized causal inference.</w:t>
+      </w:r>
+      <w:r>
+        <w:t xml:space="preserve"> Houghton Mifflin.</w:t>
       </w:r>
     </w:p>
     <w:p>
@@ -13723,35 +13695,13 @@
         </w:numPr>
       </w:pPr>
       <w:r>
-        <w:t xml:space="preserve">Shadish, W. R., Cook, T. D., &amp; Campbell, D. T. (2002). </w:t>
+        <w:t xml:space="preserve">Smith, N. (2013). </w:t>
       </w:r>
       <w:r>
         <w:rPr>
           <w:i/>
           <w:iCs/>
         </w:rPr>
-        <w:t>Experimental and quasi-experimental designs for generalized causal inference.</w:t>
-      </w:r>
-      <w:r>
-        <w:t xml:space="preserve"> Houghton Mifflin.</w:t>
-      </w:r>
-    </w:p>
-    <w:p>
-      <w:pPr>
-        <w:pStyle w:val="Compact"/>
-        <w:numPr>
-          <w:ilvl w:val="0"/>
-          <w:numId w:val="19"/>
-        </w:numPr>
-      </w:pPr>
-      <w:r>
-        <w:t xml:space="preserve">Smith, N. (2013). </w:t>
-      </w:r>
-      <w:r>
-        <w:rPr>
-          <w:i/>
-          <w:iCs/>
-        </w:rPr>
         <w:t>Visualizing music.</w:t>
       </w:r>
       <w:r>
@@ -13763,7 +13713,7 @@
         <w:pStyle w:val="1"/>
       </w:pPr>
       <w:bookmarkStart w:id="96" w:name="appendix-a-screenshots"/>
-      <w:bookmarkStart w:id="97" w:name="_Toc229333442"/>
+      <w:bookmarkStart w:id="97" w:name="_Toc229333968"/>
       <w:bookmarkEnd w:id="94"/>
       <w:r>
         <w:t>Appendix A. Screenshots</w:t>
@@ -13841,10 +13791,7 @@
         <w:t>Figure A.3.</w:t>
       </w:r>
       <w:r>
-        <w:t xml:space="preserve"> </w:t>
-      </w:r>
-      <w:r>
-        <w:t>Score with measure-level color overlay through the recapitulation, with the F-major P region clearly distinguished.</w:t>
+        <w:t xml:space="preserve"> Score with measure-level color overlay through the recapitulation, with the F-major P region clearly distinguished.</w:t>
       </w:r>
     </w:p>
     <w:p>
@@ -13871,7 +13818,7 @@
         <w:pStyle w:val="1"/>
       </w:pPr>
       <w:bookmarkStart w:id="98" w:name="appendix-b-evaluation-materials"/>
-      <w:bookmarkStart w:id="99" w:name="_Toc229333443"/>
+      <w:bookmarkStart w:id="99" w:name="_Toc229333969"/>
       <w:bookmarkEnd w:id="96"/>
       <w:r>
         <w:t>Appendix B. Evaluation Materials</w:t>
@@ -13883,7 +13830,7 @@
         <w:pStyle w:val="2"/>
       </w:pPr>
       <w:bookmarkStart w:id="100" w:name="b1-excerpt-list-form-identification-task"/>
-      <w:bookmarkStart w:id="101" w:name="_Toc229333444"/>
+      <w:bookmarkStart w:id="101" w:name="_Toc229333970"/>
       <w:r>
         <w:t>B.1 Excerpt list (form-identification task)</w:t>
       </w:r>
@@ -14796,7 +14743,7 @@
         <w:pStyle w:val="2"/>
       </w:pPr>
       <w:bookmarkStart w:id="102" w:name="b2-free-response-coding-criteria"/>
-      <w:bookmarkStart w:id="103" w:name="_Toc229333445"/>
+      <w:bookmarkStart w:id="103" w:name="_Toc229333971"/>
       <w:bookmarkEnd w:id="100"/>
       <w:r>
         <w:t>B.2 Free-response coding criteria</w:t>
@@ -14816,7 +14763,7 @@
         <w:pStyle w:val="2"/>
       </w:pPr>
       <w:bookmarkStart w:id="104" w:name="b3-sus"/>
-      <w:bookmarkStart w:id="105" w:name="_Toc229333446"/>
+      <w:bookmarkStart w:id="105" w:name="_Toc229333972"/>
       <w:bookmarkEnd w:id="102"/>
       <w:r>
         <w:t>B.3 SUS</w:t>
@@ -15044,7 +14991,7 @@
   <w:abstractNum w:abstractNumId="0" w15:restartNumberingAfterBreak="0">
     <w:nsid w:val="0000A990"/>
     <w:multiLevelType w:val="multilevel"/>
-    <w:tmpl w:val="DEEA54CA"/>
+    <w:tmpl w:val="A4FE25EA"/>
     <w:lvl w:ilvl="0">
       <w:numFmt w:val="bullet"/>
       <w:lvlText w:val=" "/>
@@ -15121,7 +15068,7 @@
   <w:abstractNum w:abstractNumId="1" w15:restartNumberingAfterBreak="0">
     <w:nsid w:val="0000A991"/>
     <w:multiLevelType w:val="multilevel"/>
-    <w:tmpl w:val="9EC68722"/>
+    <w:tmpl w:val="E5AC9126"/>
     <w:lvl w:ilvl="0">
       <w:numFmt w:val="bullet"/>
       <w:lvlText w:val=""/>
@@ -15225,7 +15172,7 @@
   <w:abstractNum w:abstractNumId="2" w15:restartNumberingAfterBreak="0">
     <w:nsid w:val="00A99411"/>
     <w:multiLevelType w:val="multilevel"/>
-    <w:tmpl w:val="EF80C5B2"/>
+    <w:tmpl w:val="CFDA9DE2"/>
     <w:lvl w:ilvl="0">
       <w:start w:val="1"/>
       <w:numFmt w:val="decimal"/>
@@ -15308,16 +15255,16 @@
       </w:pPr>
     </w:lvl>
   </w:abstractNum>
-  <w:num w:numId="1" w16cid:durableId="1971983009">
+  <w:num w:numId="1" w16cid:durableId="405305264">
     <w:abstractNumId w:val="0"/>
   </w:num>
-  <w:num w:numId="2" w16cid:durableId="273367397">
+  <w:num w:numId="2" w16cid:durableId="806750189">
     <w:abstractNumId w:val="1"/>
   </w:num>
-  <w:num w:numId="3" w16cid:durableId="677971981">
+  <w:num w:numId="3" w16cid:durableId="1030495261">
     <w:abstractNumId w:val="1"/>
   </w:num>
-  <w:num w:numId="4" w16cid:durableId="1280065474">
+  <w:num w:numId="4" w16cid:durableId="2039313185">
     <w:abstractNumId w:val="2"/>
     <w:lvlOverride w:ilvl="0">
       <w:startOverride w:val="1"/>
@@ -15347,13 +15294,13 @@
       <w:startOverride w:val="1"/>
     </w:lvlOverride>
   </w:num>
-  <w:num w:numId="5" w16cid:durableId="1879969064">
+  <w:num w:numId="5" w16cid:durableId="1140196957">
     <w:abstractNumId w:val="1"/>
   </w:num>
-  <w:num w:numId="6" w16cid:durableId="547691267">
+  <w:num w:numId="6" w16cid:durableId="688481814">
     <w:abstractNumId w:val="1"/>
   </w:num>
-  <w:num w:numId="7" w16cid:durableId="355347400">
+  <w:num w:numId="7" w16cid:durableId="2070691720">
     <w:abstractNumId w:val="2"/>
     <w:lvlOverride w:ilvl="0">
       <w:startOverride w:val="1"/>
@@ -15383,7 +15330,7 @@
       <w:startOverride w:val="1"/>
     </w:lvlOverride>
   </w:num>
-  <w:num w:numId="8" w16cid:durableId="1132089583">
+  <w:num w:numId="8" w16cid:durableId="1334795924">
     <w:abstractNumId w:val="2"/>
     <w:lvlOverride w:ilvl="0">
       <w:startOverride w:val="1"/>
@@ -15413,34 +15360,34 @@
       <w:startOverride w:val="1"/>
     </w:lvlOverride>
   </w:num>
-  <w:num w:numId="9" w16cid:durableId="1973556731">
+  <w:num w:numId="9" w16cid:durableId="1995063379">
     <w:abstractNumId w:val="1"/>
   </w:num>
-  <w:num w:numId="10" w16cid:durableId="1192887459">
+  <w:num w:numId="10" w16cid:durableId="770586654">
     <w:abstractNumId w:val="1"/>
   </w:num>
-  <w:num w:numId="11" w16cid:durableId="1322654501">
+  <w:num w:numId="11" w16cid:durableId="727341625">
     <w:abstractNumId w:val="1"/>
   </w:num>
-  <w:num w:numId="12" w16cid:durableId="1501509753">
+  <w:num w:numId="12" w16cid:durableId="1951275764">
     <w:abstractNumId w:val="1"/>
   </w:num>
-  <w:num w:numId="13" w16cid:durableId="1572350563">
+  <w:num w:numId="13" w16cid:durableId="855312854">
     <w:abstractNumId w:val="1"/>
   </w:num>
-  <w:num w:numId="14" w16cid:durableId="1800494254">
+  <w:num w:numId="14" w16cid:durableId="1990016999">
     <w:abstractNumId w:val="1"/>
   </w:num>
-  <w:num w:numId="15" w16cid:durableId="833256474">
+  <w:num w:numId="15" w16cid:durableId="1875538935">
     <w:abstractNumId w:val="1"/>
   </w:num>
-  <w:num w:numId="16" w16cid:durableId="128205077">
+  <w:num w:numId="16" w16cid:durableId="1941527953">
     <w:abstractNumId w:val="1"/>
   </w:num>
-  <w:num w:numId="17" w16cid:durableId="1399473062">
+  <w:num w:numId="17" w16cid:durableId="187523230">
     <w:abstractNumId w:val="1"/>
   </w:num>
-  <w:num w:numId="18" w16cid:durableId="1456557250">
+  <w:num w:numId="18" w16cid:durableId="1145051199">
     <w:abstractNumId w:val="2"/>
     <w:lvlOverride w:ilvl="0">
       <w:startOverride w:val="1"/>
@@ -15470,10 +15417,10 @@
       <w:startOverride w:val="1"/>
     </w:lvlOverride>
   </w:num>
-  <w:num w:numId="19" w16cid:durableId="807236780">
+  <w:num w:numId="19" w16cid:durableId="570696532">
     <w:abstractNumId w:val="1"/>
   </w:num>
-  <w:num w:numId="20" w16cid:durableId="1547718188">
+  <w:num w:numId="20" w16cid:durableId="414211676">
     <w:abstractNumId w:val="1"/>
   </w:num>
 </w:numbering>
@@ -16368,7 +16315,7 @@
     <w:name w:val="Verbatim Char"/>
     <w:basedOn w:val="Char1"/>
     <w:link w:val="SourceCode"/>
-    <w:rsid w:val="00681721"/>
+    <w:rsid w:val="000708FF"/>
     <w:rPr>
       <w:rFonts w:ascii="Consolas" w:hAnsi="Consolas" w:cs="Times New Roman"/>
       <w:sz w:val="20"/>
@@ -16414,7 +16361,7 @@
     <w:name w:val="Source Code"/>
     <w:basedOn w:val="a"/>
     <w:link w:val="VerbatimChar"/>
-    <w:rsid w:val="00681721"/>
+    <w:rsid w:val="000708FF"/>
     <w:pPr>
       <w:shd w:val="clear" w:color="auto" w:fill="FFF5F0"/>
       <w:wordWrap w:val="0"/>
@@ -16754,7 +16701,7 @@
     <w:next w:val="a"/>
     <w:autoRedefine/>
     <w:uiPriority w:val="39"/>
-    <w:rsid w:val="00681721"/>
+    <w:rsid w:val="000708FF"/>
   </w:style>
   <w:style w:type="paragraph" w:styleId="20">
     <w:name w:val="toc 2"/>
@@ -16762,7 +16709,7 @@
     <w:next w:val="a"/>
     <w:autoRedefine/>
     <w:uiPriority w:val="39"/>
-    <w:rsid w:val="00681721"/>
+    <w:rsid w:val="000708FF"/>
     <w:pPr>
       <w:ind w:leftChars="200" w:left="425"/>
     </w:pPr>
@@ -16771,7 +16718,7 @@
     <w:name w:val="header"/>
     <w:basedOn w:val="a"/>
     <w:link w:val="Char2"/>
-    <w:rsid w:val="00681721"/>
+    <w:rsid w:val="000708FF"/>
     <w:pPr>
       <w:tabs>
         <w:tab w:val="center" w:pos="4513"/>
@@ -16784,13 +16731,13 @@
     <w:name w:val="머리글 Char"/>
     <w:basedOn w:val="a1"/>
     <w:link w:val="ad"/>
-    <w:rsid w:val="00681721"/>
+    <w:rsid w:val="000708FF"/>
   </w:style>
   <w:style w:type="paragraph" w:styleId="ae">
     <w:name w:val="footer"/>
     <w:basedOn w:val="a"/>
     <w:link w:val="Char3"/>
-    <w:rsid w:val="00681721"/>
+    <w:rsid w:val="000708FF"/>
     <w:pPr>
       <w:tabs>
         <w:tab w:val="center" w:pos="4513"/>
@@ -16803,17 +16750,17 @@
     <w:name w:val="바닥글 Char"/>
     <w:basedOn w:val="a1"/>
     <w:link w:val="ae"/>
-    <w:rsid w:val="00681721"/>
+    <w:rsid w:val="000708FF"/>
   </w:style>
   <w:style w:type="character" w:styleId="af">
     <w:name w:val="page number"/>
     <w:basedOn w:val="a1"/>
-    <w:rsid w:val="00681721"/>
+    <w:rsid w:val="000708FF"/>
   </w:style>
   <w:style w:type="character" w:styleId="af0">
     <w:name w:val="line number"/>
     <w:basedOn w:val="a1"/>
-    <w:rsid w:val="00681721"/>
+    <w:rsid w:val="000708FF"/>
   </w:style>
 </w:styles>
 </file>

</xml_diff>

<commit_message>
Remove TOC from paper docx; verify KO 1.5x line spacing
Per author preference:
- Drop pandoc --toc / --toc-depth=2 from docx regeneration so the
  paper opens directly at the title page with no auto-generated
  table of contents.
- Confirm Korean docx Normal style retains LineSpacingRule = 4
  (1.5x) as already set in apply_style.ps1; verified via Word COM.

English docx continues to use double spacing with line numbering per
international journal-submission norms (Music Education Research,
JMTE, etc.).

Co-Authored-By: Claude Opus 4.7 (1M context) <noreply@anthropic.com>
</commit_message>
<xml_diff>
--- a/en/paper/paper_en.docx
+++ b/en/paper/paper_en.docx
@@ -18,3496 +18,14 @@
         <w:t>2026-05-08</w:t>
       </w:r>
     </w:p>
-    <w:sdt>
-      <w:sdtPr>
-        <w:rPr>
-          <w:rFonts w:asciiTheme="minorHAnsi" w:eastAsiaTheme="minorEastAsia" w:hAnsiTheme="minorHAnsi" w:cstheme="minorBidi"/>
-          <w:color w:val="auto"/>
-          <w:sz w:val="24"/>
-          <w:szCs w:val="24"/>
-        </w:rPr>
-        <w:id w:val="-1374147512"/>
-        <w:docPartObj>
-          <w:docPartGallery w:val="Table of Contents"/>
-          <w:docPartUnique/>
-        </w:docPartObj>
-      </w:sdtPr>
-      <w:sdtEndPr>
-        <w:rPr>
-          <w:rFonts w:ascii="Times New Roman" w:hAnsi="Times New Roman" w:cs="Times New Roman"/>
-          <w:b w:val="0"/>
-        </w:rPr>
-      </w:sdtEndPr>
-      <w:sdtContent>
-        <w:p>
-          <w:pPr>
-            <w:pStyle w:val="TOC"/>
-          </w:pPr>
-          <w:r>
-            <w:t>Table of Contents</w:t>
-          </w:r>
-        </w:p>
-        <w:p>
-          <w:pPr>
-            <w:pStyle w:val="10"/>
-            <w:tabs>
-              <w:tab w:val="right" w:leader="dot" w:pos="9350"/>
-            </w:tabs>
-            <w:rPr>
-              <w:noProof/>
-            </w:rPr>
-          </w:pPr>
-          <w:r>
-            <w:fldChar w:fldCharType="begin"/>
-          </w:r>
-          <w:r>
-            <w:instrText>TOC \o "1-2" \h \z \u</w:instrText>
-          </w:r>
-          <w:r>
-            <w:fldChar w:fldCharType="separate"/>
-          </w:r>
-          <w:hyperlink w:anchor="_Toc229333923" w:history="1">
-            <w:r>
-              <w:rPr>
-                <w:rStyle w:val="ac"/>
-                <w:noProof/>
-              </w:rPr>
-              <w:t>Abstract</w:t>
-            </w:r>
-            <w:r>
-              <w:rPr>
-                <w:noProof/>
-                <w:webHidden/>
-              </w:rPr>
-              <w:tab/>
-            </w:r>
-            <w:r>
-              <w:rPr>
-                <w:noProof/>
-                <w:webHidden/>
-              </w:rPr>
-              <w:fldChar w:fldCharType="begin"/>
-            </w:r>
-            <w:r>
-              <w:rPr>
-                <w:noProof/>
-                <w:webHidden/>
-              </w:rPr>
-              <w:instrText xml:space="preserve"> PAGEREF _Toc229333923 \h </w:instrText>
-            </w:r>
-            <w:r>
-              <w:rPr>
-                <w:noProof/>
-                <w:webHidden/>
-              </w:rPr>
-            </w:r>
-            <w:r>
-              <w:rPr>
-                <w:noProof/>
-                <w:webHidden/>
-              </w:rPr>
-              <w:fldChar w:fldCharType="separate"/>
-            </w:r>
-            <w:r>
-              <w:rPr>
-                <w:noProof/>
-                <w:webHidden/>
-              </w:rPr>
-              <w:t>3</w:t>
-            </w:r>
-            <w:r>
-              <w:rPr>
-                <w:noProof/>
-                <w:webHidden/>
-              </w:rPr>
-              <w:fldChar w:fldCharType="end"/>
-            </w:r>
-          </w:hyperlink>
-        </w:p>
-        <w:p>
-          <w:pPr>
-            <w:pStyle w:val="10"/>
-            <w:tabs>
-              <w:tab w:val="right" w:leader="dot" w:pos="9350"/>
-            </w:tabs>
-            <w:rPr>
-              <w:noProof/>
-            </w:rPr>
-          </w:pPr>
-          <w:hyperlink w:anchor="_Toc229333924" w:history="1">
-            <w:r>
-              <w:rPr>
-                <w:rStyle w:val="ac"/>
-                <w:noProof/>
-              </w:rPr>
-              <w:t>1. Introduction</w:t>
-            </w:r>
-            <w:r>
-              <w:rPr>
-                <w:noProof/>
-                <w:webHidden/>
-              </w:rPr>
-              <w:tab/>
-            </w:r>
-            <w:r>
-              <w:rPr>
-                <w:noProof/>
-                <w:webHidden/>
-              </w:rPr>
-              <w:fldChar w:fldCharType="begin"/>
-            </w:r>
-            <w:r>
-              <w:rPr>
-                <w:noProof/>
-                <w:webHidden/>
-              </w:rPr>
-              <w:instrText xml:space="preserve"> PAGEREF _Toc229333924 \h </w:instrText>
-            </w:r>
-            <w:r>
-              <w:rPr>
-                <w:noProof/>
-                <w:webHidden/>
-              </w:rPr>
-            </w:r>
-            <w:r>
-              <w:rPr>
-                <w:noProof/>
-                <w:webHidden/>
-              </w:rPr>
-              <w:fldChar w:fldCharType="separate"/>
-            </w:r>
-            <w:r>
-              <w:rPr>
-                <w:noProof/>
-                <w:webHidden/>
-              </w:rPr>
-              <w:t>4</w:t>
-            </w:r>
-            <w:r>
-              <w:rPr>
-                <w:noProof/>
-                <w:webHidden/>
-              </w:rPr>
-              <w:fldChar w:fldCharType="end"/>
-            </w:r>
-          </w:hyperlink>
-        </w:p>
-        <w:p>
-          <w:pPr>
-            <w:pStyle w:val="20"/>
-            <w:tabs>
-              <w:tab w:val="right" w:leader="dot" w:pos="9350"/>
-            </w:tabs>
-            <w:ind w:left="480"/>
-            <w:rPr>
-              <w:noProof/>
-            </w:rPr>
-          </w:pPr>
-          <w:hyperlink w:anchor="_Toc229333925" w:history="1">
-            <w:r>
-              <w:rPr>
-                <w:rStyle w:val="ac"/>
-                <w:noProof/>
-              </w:rPr>
-              <w:t>1.1 Motivation</w:t>
-            </w:r>
-            <w:r>
-              <w:rPr>
-                <w:noProof/>
-                <w:webHidden/>
-              </w:rPr>
-              <w:tab/>
-            </w:r>
-            <w:r>
-              <w:rPr>
-                <w:noProof/>
-                <w:webHidden/>
-              </w:rPr>
-              <w:fldChar w:fldCharType="begin"/>
-            </w:r>
-            <w:r>
-              <w:rPr>
-                <w:noProof/>
-                <w:webHidden/>
-              </w:rPr>
-              <w:instrText xml:space="preserve"> PAGEREF _Toc229333925 \h </w:instrText>
-            </w:r>
-            <w:r>
-              <w:rPr>
-                <w:noProof/>
-                <w:webHidden/>
-              </w:rPr>
-            </w:r>
-            <w:r>
-              <w:rPr>
-                <w:noProof/>
-                <w:webHidden/>
-              </w:rPr>
-              <w:fldChar w:fldCharType="separate"/>
-            </w:r>
-            <w:r>
-              <w:rPr>
-                <w:noProof/>
-                <w:webHidden/>
-              </w:rPr>
-              <w:t>4</w:t>
-            </w:r>
-            <w:r>
-              <w:rPr>
-                <w:noProof/>
-                <w:webHidden/>
-              </w:rPr>
-              <w:fldChar w:fldCharType="end"/>
-            </w:r>
-          </w:hyperlink>
-        </w:p>
-        <w:p>
-          <w:pPr>
-            <w:pStyle w:val="20"/>
-            <w:tabs>
-              <w:tab w:val="right" w:leader="dot" w:pos="9350"/>
-            </w:tabs>
-            <w:ind w:left="480"/>
-            <w:rPr>
-              <w:noProof/>
-            </w:rPr>
-          </w:pPr>
-          <w:hyperlink w:anchor="_Toc229333926" w:history="1">
-            <w:r>
-              <w:rPr>
-                <w:rStyle w:val="ac"/>
-                <w:noProof/>
-              </w:rPr>
-              <w:t>1.2 Research Questions</w:t>
-            </w:r>
-            <w:r>
-              <w:rPr>
-                <w:noProof/>
-                <w:webHidden/>
-              </w:rPr>
-              <w:tab/>
-            </w:r>
-            <w:r>
-              <w:rPr>
-                <w:noProof/>
-                <w:webHidden/>
-              </w:rPr>
-              <w:fldChar w:fldCharType="begin"/>
-            </w:r>
-            <w:r>
-              <w:rPr>
-                <w:noProof/>
-                <w:webHidden/>
-              </w:rPr>
-              <w:instrText xml:space="preserve"> PAGEREF _Toc229333926 \h </w:instrText>
-            </w:r>
-            <w:r>
-              <w:rPr>
-                <w:noProof/>
-                <w:webHidden/>
-              </w:rPr>
-            </w:r>
-            <w:r>
-              <w:rPr>
-                <w:noProof/>
-                <w:webHidden/>
-              </w:rPr>
-              <w:fldChar w:fldCharType="separate"/>
-            </w:r>
-            <w:r>
-              <w:rPr>
-                <w:noProof/>
-                <w:webHidden/>
-              </w:rPr>
-              <w:t>4</w:t>
-            </w:r>
-            <w:r>
-              <w:rPr>
-                <w:noProof/>
-                <w:webHidden/>
-              </w:rPr>
-              <w:fldChar w:fldCharType="end"/>
-            </w:r>
-          </w:hyperlink>
-        </w:p>
-        <w:p>
-          <w:pPr>
-            <w:pStyle w:val="20"/>
-            <w:tabs>
-              <w:tab w:val="right" w:leader="dot" w:pos="9350"/>
-            </w:tabs>
-            <w:ind w:left="480"/>
-            <w:rPr>
-              <w:noProof/>
-            </w:rPr>
-          </w:pPr>
-          <w:hyperlink w:anchor="_Toc229333927" w:history="1">
-            <w:r>
-              <w:rPr>
-                <w:rStyle w:val="ac"/>
-                <w:noProof/>
-              </w:rPr>
-              <w:t>1.3 Contributions</w:t>
-            </w:r>
-            <w:r>
-              <w:rPr>
-                <w:noProof/>
-                <w:webHidden/>
-              </w:rPr>
-              <w:tab/>
-            </w:r>
-            <w:r>
-              <w:rPr>
-                <w:noProof/>
-                <w:webHidden/>
-              </w:rPr>
-              <w:fldChar w:fldCharType="begin"/>
-            </w:r>
-            <w:r>
-              <w:rPr>
-                <w:noProof/>
-                <w:webHidden/>
-              </w:rPr>
-              <w:instrText xml:space="preserve"> PAGEREF _Toc229333927 \h </w:instrText>
-            </w:r>
-            <w:r>
-              <w:rPr>
-                <w:noProof/>
-                <w:webHidden/>
-              </w:rPr>
-            </w:r>
-            <w:r>
-              <w:rPr>
-                <w:noProof/>
-                <w:webHidden/>
-              </w:rPr>
-              <w:fldChar w:fldCharType="separate"/>
-            </w:r>
-            <w:r>
-              <w:rPr>
-                <w:noProof/>
-                <w:webHidden/>
-              </w:rPr>
-              <w:t>5</w:t>
-            </w:r>
-            <w:r>
-              <w:rPr>
-                <w:noProof/>
-                <w:webHidden/>
-              </w:rPr>
-              <w:fldChar w:fldCharType="end"/>
-            </w:r>
-          </w:hyperlink>
-        </w:p>
-        <w:p>
-          <w:pPr>
-            <w:pStyle w:val="10"/>
-            <w:tabs>
-              <w:tab w:val="right" w:leader="dot" w:pos="9350"/>
-            </w:tabs>
-            <w:rPr>
-              <w:noProof/>
-            </w:rPr>
-          </w:pPr>
-          <w:hyperlink w:anchor="_Toc229333928" w:history="1">
-            <w:r>
-              <w:rPr>
-                <w:rStyle w:val="ac"/>
-                <w:noProof/>
-              </w:rPr>
-              <w:t>2. Background</w:t>
-            </w:r>
-            <w:r>
-              <w:rPr>
-                <w:noProof/>
-                <w:webHidden/>
-              </w:rPr>
-              <w:tab/>
-            </w:r>
-            <w:r>
-              <w:rPr>
-                <w:noProof/>
-                <w:webHidden/>
-              </w:rPr>
-              <w:fldChar w:fldCharType="begin"/>
-            </w:r>
-            <w:r>
-              <w:rPr>
-                <w:noProof/>
-                <w:webHidden/>
-              </w:rPr>
-              <w:instrText xml:space="preserve"> PAGEREF _Toc229333928 \h </w:instrText>
-            </w:r>
-            <w:r>
-              <w:rPr>
-                <w:noProof/>
-                <w:webHidden/>
-              </w:rPr>
-            </w:r>
-            <w:r>
-              <w:rPr>
-                <w:noProof/>
-                <w:webHidden/>
-              </w:rPr>
-              <w:fldChar w:fldCharType="separate"/>
-            </w:r>
-            <w:r>
-              <w:rPr>
-                <w:noProof/>
-                <w:webHidden/>
-              </w:rPr>
-              <w:t>5</w:t>
-            </w:r>
-            <w:r>
-              <w:rPr>
-                <w:noProof/>
-                <w:webHidden/>
-              </w:rPr>
-              <w:fldChar w:fldCharType="end"/>
-            </w:r>
-          </w:hyperlink>
-        </w:p>
-        <w:p>
-          <w:pPr>
-            <w:pStyle w:val="20"/>
-            <w:tabs>
-              <w:tab w:val="right" w:leader="dot" w:pos="9350"/>
-            </w:tabs>
-            <w:ind w:left="480"/>
-            <w:rPr>
-              <w:noProof/>
-            </w:rPr>
-          </w:pPr>
-          <w:hyperlink w:anchor="_Toc229333929" w:history="1">
-            <w:r>
-              <w:rPr>
-                <w:rStyle w:val="ac"/>
-                <w:noProof/>
-              </w:rPr>
-              <w:t>2.1 Hierarchical Analysis of Sonata Form</w:t>
-            </w:r>
-            <w:r>
-              <w:rPr>
-                <w:noProof/>
-                <w:webHidden/>
-              </w:rPr>
-              <w:tab/>
-            </w:r>
-            <w:r>
-              <w:rPr>
-                <w:noProof/>
-                <w:webHidden/>
-              </w:rPr>
-              <w:fldChar w:fldCharType="begin"/>
-            </w:r>
-            <w:r>
-              <w:rPr>
-                <w:noProof/>
-                <w:webHidden/>
-              </w:rPr>
-              <w:instrText xml:space="preserve"> PAGEREF _Toc229333929 \h </w:instrText>
-            </w:r>
-            <w:r>
-              <w:rPr>
-                <w:noProof/>
-                <w:webHidden/>
-              </w:rPr>
-            </w:r>
-            <w:r>
-              <w:rPr>
-                <w:noProof/>
-                <w:webHidden/>
-              </w:rPr>
-              <w:fldChar w:fldCharType="separate"/>
-            </w:r>
-            <w:r>
-              <w:rPr>
-                <w:noProof/>
-                <w:webHidden/>
-              </w:rPr>
-              <w:t>5</w:t>
-            </w:r>
-            <w:r>
-              <w:rPr>
-                <w:noProof/>
-                <w:webHidden/>
-              </w:rPr>
-              <w:fldChar w:fldCharType="end"/>
-            </w:r>
-          </w:hyperlink>
-        </w:p>
-        <w:p>
-          <w:pPr>
-            <w:pStyle w:val="20"/>
-            <w:tabs>
-              <w:tab w:val="right" w:leader="dot" w:pos="9350"/>
-            </w:tabs>
-            <w:ind w:left="480"/>
-            <w:rPr>
-              <w:noProof/>
-            </w:rPr>
-          </w:pPr>
-          <w:hyperlink w:anchor="_Toc229333930" w:history="1">
-            <w:r>
-              <w:rPr>
-                <w:rStyle w:val="ac"/>
-                <w:noProof/>
-              </w:rPr>
-              <w:t>2.2 Dual Coding and the Cognitive Theory of Multimedia Learning</w:t>
-            </w:r>
-            <w:r>
-              <w:rPr>
-                <w:noProof/>
-                <w:webHidden/>
-              </w:rPr>
-              <w:tab/>
-            </w:r>
-            <w:r>
-              <w:rPr>
-                <w:noProof/>
-                <w:webHidden/>
-              </w:rPr>
-              <w:fldChar w:fldCharType="begin"/>
-            </w:r>
-            <w:r>
-              <w:rPr>
-                <w:noProof/>
-                <w:webHidden/>
-              </w:rPr>
-              <w:instrText xml:space="preserve"> PAGEREF _Toc229333930 \h </w:instrText>
-            </w:r>
-            <w:r>
-              <w:rPr>
-                <w:noProof/>
-                <w:webHidden/>
-              </w:rPr>
-            </w:r>
-            <w:r>
-              <w:rPr>
-                <w:noProof/>
-                <w:webHidden/>
-              </w:rPr>
-              <w:fldChar w:fldCharType="separate"/>
-            </w:r>
-            <w:r>
-              <w:rPr>
-                <w:noProof/>
-                <w:webHidden/>
-              </w:rPr>
-              <w:t>5</w:t>
-            </w:r>
-            <w:r>
-              <w:rPr>
-                <w:noProof/>
-                <w:webHidden/>
-              </w:rPr>
-              <w:fldChar w:fldCharType="end"/>
-            </w:r>
-          </w:hyperlink>
-        </w:p>
-        <w:p>
-          <w:pPr>
-            <w:pStyle w:val="20"/>
-            <w:tabs>
-              <w:tab w:val="right" w:leader="dot" w:pos="9350"/>
-            </w:tabs>
-            <w:ind w:left="480"/>
-            <w:rPr>
-              <w:noProof/>
-            </w:rPr>
-          </w:pPr>
-          <w:hyperlink w:anchor="_Toc229333931" w:history="1">
-            <w:r>
-              <w:rPr>
-                <w:rStyle w:val="ac"/>
-                <w:noProof/>
-              </w:rPr>
-              <w:t>2.3 Active Learning and Comparative Listening</w:t>
-            </w:r>
-            <w:r>
-              <w:rPr>
-                <w:noProof/>
-                <w:webHidden/>
-              </w:rPr>
-              <w:tab/>
-            </w:r>
-            <w:r>
-              <w:rPr>
-                <w:noProof/>
-                <w:webHidden/>
-              </w:rPr>
-              <w:fldChar w:fldCharType="begin"/>
-            </w:r>
-            <w:r>
-              <w:rPr>
-                <w:noProof/>
-                <w:webHidden/>
-              </w:rPr>
-              <w:instrText xml:space="preserve"> PAGEREF _Toc229333931 \h </w:instrText>
-            </w:r>
-            <w:r>
-              <w:rPr>
-                <w:noProof/>
-                <w:webHidden/>
-              </w:rPr>
-            </w:r>
-            <w:r>
-              <w:rPr>
-                <w:noProof/>
-                <w:webHidden/>
-              </w:rPr>
-              <w:fldChar w:fldCharType="separate"/>
-            </w:r>
-            <w:r>
-              <w:rPr>
-                <w:noProof/>
-                <w:webHidden/>
-              </w:rPr>
-              <w:t>6</w:t>
-            </w:r>
-            <w:r>
-              <w:rPr>
-                <w:noProof/>
-                <w:webHidden/>
-              </w:rPr>
-              <w:fldChar w:fldCharType="end"/>
-            </w:r>
-          </w:hyperlink>
-        </w:p>
-        <w:p>
-          <w:pPr>
-            <w:pStyle w:val="20"/>
-            <w:tabs>
-              <w:tab w:val="right" w:leader="dot" w:pos="9350"/>
-            </w:tabs>
-            <w:ind w:left="480"/>
-            <w:rPr>
-              <w:noProof/>
-            </w:rPr>
-          </w:pPr>
-          <w:hyperlink w:anchor="_Toc229333932" w:history="1">
-            <w:r>
-              <w:rPr>
-                <w:rStyle w:val="ac"/>
-                <w:noProof/>
-              </w:rPr>
-              <w:t>2.4 Related Tools</w:t>
-            </w:r>
-            <w:r>
-              <w:rPr>
-                <w:noProof/>
-                <w:webHidden/>
-              </w:rPr>
-              <w:tab/>
-            </w:r>
-            <w:r>
-              <w:rPr>
-                <w:noProof/>
-                <w:webHidden/>
-              </w:rPr>
-              <w:fldChar w:fldCharType="begin"/>
-            </w:r>
-            <w:r>
-              <w:rPr>
-                <w:noProof/>
-                <w:webHidden/>
-              </w:rPr>
-              <w:instrText xml:space="preserve"> PAGEREF _Toc229333932 \h </w:instrText>
-            </w:r>
-            <w:r>
-              <w:rPr>
-                <w:noProof/>
-                <w:webHidden/>
-              </w:rPr>
-            </w:r>
-            <w:r>
-              <w:rPr>
-                <w:noProof/>
-                <w:webHidden/>
-              </w:rPr>
-              <w:fldChar w:fldCharType="separate"/>
-            </w:r>
-            <w:r>
-              <w:rPr>
-                <w:noProof/>
-                <w:webHidden/>
-              </w:rPr>
-              <w:t>6</w:t>
-            </w:r>
-            <w:r>
-              <w:rPr>
-                <w:noProof/>
-                <w:webHidden/>
-              </w:rPr>
-              <w:fldChar w:fldCharType="end"/>
-            </w:r>
-          </w:hyperlink>
-        </w:p>
-        <w:p>
-          <w:pPr>
-            <w:pStyle w:val="10"/>
-            <w:tabs>
-              <w:tab w:val="right" w:leader="dot" w:pos="9350"/>
-            </w:tabs>
-            <w:rPr>
-              <w:noProof/>
-            </w:rPr>
-          </w:pPr>
-          <w:hyperlink w:anchor="_Toc229333933" w:history="1">
-            <w:r>
-              <w:rPr>
-                <w:rStyle w:val="ac"/>
-                <w:noProof/>
-              </w:rPr>
-              <w:t>3. Case Piece: Mozart's K. 545, Movement I</w:t>
-            </w:r>
-            <w:r>
-              <w:rPr>
-                <w:noProof/>
-                <w:webHidden/>
-              </w:rPr>
-              <w:tab/>
-            </w:r>
-            <w:r>
-              <w:rPr>
-                <w:noProof/>
-                <w:webHidden/>
-              </w:rPr>
-              <w:fldChar w:fldCharType="begin"/>
-            </w:r>
-            <w:r>
-              <w:rPr>
-                <w:noProof/>
-                <w:webHidden/>
-              </w:rPr>
-              <w:instrText xml:space="preserve"> PAGEREF _Toc229333933 \h </w:instrText>
-            </w:r>
-            <w:r>
-              <w:rPr>
-                <w:noProof/>
-                <w:webHidden/>
-              </w:rPr>
-            </w:r>
-            <w:r>
-              <w:rPr>
-                <w:noProof/>
-                <w:webHidden/>
-              </w:rPr>
-              <w:fldChar w:fldCharType="separate"/>
-            </w:r>
-            <w:r>
-              <w:rPr>
-                <w:noProof/>
-                <w:webHidden/>
-              </w:rPr>
-              <w:t>7</w:t>
-            </w:r>
-            <w:r>
-              <w:rPr>
-                <w:noProof/>
-                <w:webHidden/>
-              </w:rPr>
-              <w:fldChar w:fldCharType="end"/>
-            </w:r>
-          </w:hyperlink>
-        </w:p>
-        <w:p>
-          <w:pPr>
-            <w:pStyle w:val="20"/>
-            <w:tabs>
-              <w:tab w:val="right" w:leader="dot" w:pos="9350"/>
-            </w:tabs>
-            <w:ind w:left="480"/>
-            <w:rPr>
-              <w:noProof/>
-            </w:rPr>
-          </w:pPr>
-          <w:hyperlink w:anchor="_Toc229333934" w:history="1">
-            <w:r>
-              <w:rPr>
-                <w:rStyle w:val="ac"/>
-                <w:noProof/>
-              </w:rPr>
-              <w:t>3.1 Overview</w:t>
-            </w:r>
-            <w:r>
-              <w:rPr>
-                <w:noProof/>
-                <w:webHidden/>
-              </w:rPr>
-              <w:tab/>
-            </w:r>
-            <w:r>
-              <w:rPr>
-                <w:noProof/>
-                <w:webHidden/>
-              </w:rPr>
-              <w:fldChar w:fldCharType="begin"/>
-            </w:r>
-            <w:r>
-              <w:rPr>
-                <w:noProof/>
-                <w:webHidden/>
-              </w:rPr>
-              <w:instrText xml:space="preserve"> PAGEREF _Toc229333934 \h </w:instrText>
-            </w:r>
-            <w:r>
-              <w:rPr>
-                <w:noProof/>
-                <w:webHidden/>
-              </w:rPr>
-            </w:r>
-            <w:r>
-              <w:rPr>
-                <w:noProof/>
-                <w:webHidden/>
-              </w:rPr>
-              <w:fldChar w:fldCharType="separate"/>
-            </w:r>
-            <w:r>
-              <w:rPr>
-                <w:noProof/>
-                <w:webHidden/>
-              </w:rPr>
-              <w:t>7</w:t>
-            </w:r>
-            <w:r>
-              <w:rPr>
-                <w:noProof/>
-                <w:webHidden/>
-              </w:rPr>
-              <w:fldChar w:fldCharType="end"/>
-            </w:r>
-          </w:hyperlink>
-        </w:p>
-        <w:p>
-          <w:pPr>
-            <w:pStyle w:val="20"/>
-            <w:tabs>
-              <w:tab w:val="right" w:leader="dot" w:pos="9350"/>
-            </w:tabs>
-            <w:ind w:left="480"/>
-            <w:rPr>
-              <w:noProof/>
-            </w:rPr>
-          </w:pPr>
-          <w:hyperlink w:anchor="_Toc229333935" w:history="1">
-            <w:r>
-              <w:rPr>
-                <w:rStyle w:val="ac"/>
-                <w:noProof/>
-              </w:rPr>
-              <w:t>3.2 Formal Analysis</w:t>
-            </w:r>
-            <w:r>
-              <w:rPr>
-                <w:noProof/>
-                <w:webHidden/>
-              </w:rPr>
-              <w:tab/>
-            </w:r>
-            <w:r>
-              <w:rPr>
-                <w:noProof/>
-                <w:webHidden/>
-              </w:rPr>
-              <w:fldChar w:fldCharType="begin"/>
-            </w:r>
-            <w:r>
-              <w:rPr>
-                <w:noProof/>
-                <w:webHidden/>
-              </w:rPr>
-              <w:instrText xml:space="preserve"> PAGEREF _Toc229333935 \h </w:instrText>
-            </w:r>
-            <w:r>
-              <w:rPr>
-                <w:noProof/>
-                <w:webHidden/>
-              </w:rPr>
-            </w:r>
-            <w:r>
-              <w:rPr>
-                <w:noProof/>
-                <w:webHidden/>
-              </w:rPr>
-              <w:fldChar w:fldCharType="separate"/>
-            </w:r>
-            <w:r>
-              <w:rPr>
-                <w:noProof/>
-                <w:webHidden/>
-              </w:rPr>
-              <w:t>7</w:t>
-            </w:r>
-            <w:r>
-              <w:rPr>
-                <w:noProof/>
-                <w:webHidden/>
-              </w:rPr>
-              <w:fldChar w:fldCharType="end"/>
-            </w:r>
-          </w:hyperlink>
-        </w:p>
-        <w:p>
-          <w:pPr>
-            <w:pStyle w:val="20"/>
-            <w:tabs>
-              <w:tab w:val="right" w:leader="dot" w:pos="9350"/>
-            </w:tabs>
-            <w:ind w:left="480"/>
-            <w:rPr>
-              <w:noProof/>
-            </w:rPr>
-          </w:pPr>
-          <w:hyperlink w:anchor="_Toc229333936" w:history="1">
-            <w:r>
-              <w:rPr>
-                <w:rStyle w:val="ac"/>
-                <w:noProof/>
-              </w:rPr>
-              <w:t>3.3 Pedagogical Significance: The Subdominant Recapitulation</w:t>
-            </w:r>
-            <w:r>
-              <w:rPr>
-                <w:noProof/>
-                <w:webHidden/>
-              </w:rPr>
-              <w:tab/>
-            </w:r>
-            <w:r>
-              <w:rPr>
-                <w:noProof/>
-                <w:webHidden/>
-              </w:rPr>
-              <w:fldChar w:fldCharType="begin"/>
-            </w:r>
-            <w:r>
-              <w:rPr>
-                <w:noProof/>
-                <w:webHidden/>
-              </w:rPr>
-              <w:instrText xml:space="preserve"> PAGEREF _Toc229333936 \h </w:instrText>
-            </w:r>
-            <w:r>
-              <w:rPr>
-                <w:noProof/>
-                <w:webHidden/>
-              </w:rPr>
-            </w:r>
-            <w:r>
-              <w:rPr>
-                <w:noProof/>
-                <w:webHidden/>
-              </w:rPr>
-              <w:fldChar w:fldCharType="separate"/>
-            </w:r>
-            <w:r>
-              <w:rPr>
-                <w:noProof/>
-                <w:webHidden/>
-              </w:rPr>
-              <w:t>8</w:t>
-            </w:r>
-            <w:r>
-              <w:rPr>
-                <w:noProof/>
-                <w:webHidden/>
-              </w:rPr>
-              <w:fldChar w:fldCharType="end"/>
-            </w:r>
-          </w:hyperlink>
-        </w:p>
-        <w:p>
-          <w:pPr>
-            <w:pStyle w:val="10"/>
-            <w:tabs>
-              <w:tab w:val="right" w:leader="dot" w:pos="9350"/>
-            </w:tabs>
-            <w:rPr>
-              <w:noProof/>
-            </w:rPr>
-          </w:pPr>
-          <w:hyperlink w:anchor="_Toc229333937" w:history="1">
-            <w:r>
-              <w:rPr>
-                <w:rStyle w:val="ac"/>
-                <w:noProof/>
-              </w:rPr>
-              <w:t>4. System Design</w:t>
-            </w:r>
-            <w:r>
-              <w:rPr>
-                <w:noProof/>
-                <w:webHidden/>
-              </w:rPr>
-              <w:tab/>
-            </w:r>
-            <w:r>
-              <w:rPr>
-                <w:noProof/>
-                <w:webHidden/>
-              </w:rPr>
-              <w:fldChar w:fldCharType="begin"/>
-            </w:r>
-            <w:r>
-              <w:rPr>
-                <w:noProof/>
-                <w:webHidden/>
-              </w:rPr>
-              <w:instrText xml:space="preserve"> PAGEREF _Toc229333937 \h </w:instrText>
-            </w:r>
-            <w:r>
-              <w:rPr>
-                <w:noProof/>
-                <w:webHidden/>
-              </w:rPr>
-            </w:r>
-            <w:r>
-              <w:rPr>
-                <w:noProof/>
-                <w:webHidden/>
-              </w:rPr>
-              <w:fldChar w:fldCharType="separate"/>
-            </w:r>
-            <w:r>
-              <w:rPr>
-                <w:noProof/>
-                <w:webHidden/>
-              </w:rPr>
-              <w:t>8</w:t>
-            </w:r>
-            <w:r>
-              <w:rPr>
-                <w:noProof/>
-                <w:webHidden/>
-              </w:rPr>
-              <w:fldChar w:fldCharType="end"/>
-            </w:r>
-          </w:hyperlink>
-        </w:p>
-        <w:p>
-          <w:pPr>
-            <w:pStyle w:val="20"/>
-            <w:tabs>
-              <w:tab w:val="right" w:leader="dot" w:pos="9350"/>
-            </w:tabs>
-            <w:ind w:left="480"/>
-            <w:rPr>
-              <w:noProof/>
-            </w:rPr>
-          </w:pPr>
-          <w:hyperlink w:anchor="_Toc229333938" w:history="1">
-            <w:r>
-              <w:rPr>
-                <w:rStyle w:val="ac"/>
-                <w:noProof/>
-              </w:rPr>
-              <w:t>4.1 Design Principles</w:t>
-            </w:r>
-            <w:r>
-              <w:rPr>
-                <w:noProof/>
-                <w:webHidden/>
-              </w:rPr>
-              <w:tab/>
-            </w:r>
-            <w:r>
-              <w:rPr>
-                <w:noProof/>
-                <w:webHidden/>
-              </w:rPr>
-              <w:fldChar w:fldCharType="begin"/>
-            </w:r>
-            <w:r>
-              <w:rPr>
-                <w:noProof/>
-                <w:webHidden/>
-              </w:rPr>
-              <w:instrText xml:space="preserve"> PAGEREF _Toc229333938 \h </w:instrText>
-            </w:r>
-            <w:r>
-              <w:rPr>
-                <w:noProof/>
-                <w:webHidden/>
-              </w:rPr>
-            </w:r>
-            <w:r>
-              <w:rPr>
-                <w:noProof/>
-                <w:webHidden/>
-              </w:rPr>
-              <w:fldChar w:fldCharType="separate"/>
-            </w:r>
-            <w:r>
-              <w:rPr>
-                <w:noProof/>
-                <w:webHidden/>
-              </w:rPr>
-              <w:t>8</w:t>
-            </w:r>
-            <w:r>
-              <w:rPr>
-                <w:noProof/>
-                <w:webHidden/>
-              </w:rPr>
-              <w:fldChar w:fldCharType="end"/>
-            </w:r>
-          </w:hyperlink>
-        </w:p>
-        <w:p>
-          <w:pPr>
-            <w:pStyle w:val="20"/>
-            <w:tabs>
-              <w:tab w:val="right" w:leader="dot" w:pos="9350"/>
-            </w:tabs>
-            <w:ind w:left="480"/>
-            <w:rPr>
-              <w:noProof/>
-            </w:rPr>
-          </w:pPr>
-          <w:hyperlink w:anchor="_Toc229333939" w:history="1">
-            <w:r>
-              <w:rPr>
-                <w:rStyle w:val="ac"/>
-                <w:noProof/>
-              </w:rPr>
-              <w:t>4.2 Architecture</w:t>
-            </w:r>
-            <w:r>
-              <w:rPr>
-                <w:noProof/>
-                <w:webHidden/>
-              </w:rPr>
-              <w:tab/>
-            </w:r>
-            <w:r>
-              <w:rPr>
-                <w:noProof/>
-                <w:webHidden/>
-              </w:rPr>
-              <w:fldChar w:fldCharType="begin"/>
-            </w:r>
-            <w:r>
-              <w:rPr>
-                <w:noProof/>
-                <w:webHidden/>
-              </w:rPr>
-              <w:instrText xml:space="preserve"> PAGEREF _Toc229333939 \h </w:instrText>
-            </w:r>
-            <w:r>
-              <w:rPr>
-                <w:noProof/>
-                <w:webHidden/>
-              </w:rPr>
-            </w:r>
-            <w:r>
-              <w:rPr>
-                <w:noProof/>
-                <w:webHidden/>
-              </w:rPr>
-              <w:fldChar w:fldCharType="separate"/>
-            </w:r>
-            <w:r>
-              <w:rPr>
-                <w:noProof/>
-                <w:webHidden/>
-              </w:rPr>
-              <w:t>9</w:t>
-            </w:r>
-            <w:r>
-              <w:rPr>
-                <w:noProof/>
-                <w:webHidden/>
-              </w:rPr>
-              <w:fldChar w:fldCharType="end"/>
-            </w:r>
-          </w:hyperlink>
-        </w:p>
-        <w:p>
-          <w:pPr>
-            <w:pStyle w:val="20"/>
-            <w:tabs>
-              <w:tab w:val="right" w:leader="dot" w:pos="9350"/>
-            </w:tabs>
-            <w:ind w:left="480"/>
-            <w:rPr>
-              <w:noProof/>
-            </w:rPr>
-          </w:pPr>
-          <w:hyperlink w:anchor="_Toc229333940" w:history="1">
-            <w:r>
-              <w:rPr>
-                <w:rStyle w:val="ac"/>
-                <w:noProof/>
-              </w:rPr>
-              <w:t>4.3 Data Schema</w:t>
-            </w:r>
-            <w:r>
-              <w:rPr>
-                <w:noProof/>
-                <w:webHidden/>
-              </w:rPr>
-              <w:tab/>
-            </w:r>
-            <w:r>
-              <w:rPr>
-                <w:noProof/>
-                <w:webHidden/>
-              </w:rPr>
-              <w:fldChar w:fldCharType="begin"/>
-            </w:r>
-            <w:r>
-              <w:rPr>
-                <w:noProof/>
-                <w:webHidden/>
-              </w:rPr>
-              <w:instrText xml:space="preserve"> PAGEREF _Toc229333940 \h </w:instrText>
-            </w:r>
-            <w:r>
-              <w:rPr>
-                <w:noProof/>
-                <w:webHidden/>
-              </w:rPr>
-            </w:r>
-            <w:r>
-              <w:rPr>
-                <w:noProof/>
-                <w:webHidden/>
-              </w:rPr>
-              <w:fldChar w:fldCharType="separate"/>
-            </w:r>
-            <w:r>
-              <w:rPr>
-                <w:noProof/>
-                <w:webHidden/>
-              </w:rPr>
-              <w:t>9</w:t>
-            </w:r>
-            <w:r>
-              <w:rPr>
-                <w:noProof/>
-                <w:webHidden/>
-              </w:rPr>
-              <w:fldChar w:fldCharType="end"/>
-            </w:r>
-          </w:hyperlink>
-        </w:p>
-        <w:p>
-          <w:pPr>
-            <w:pStyle w:val="20"/>
-            <w:tabs>
-              <w:tab w:val="right" w:leader="dot" w:pos="9350"/>
-            </w:tabs>
-            <w:ind w:left="480"/>
-            <w:rPr>
-              <w:noProof/>
-            </w:rPr>
-          </w:pPr>
-          <w:hyperlink w:anchor="_Toc229333941" w:history="1">
-            <w:r>
-              <w:rPr>
-                <w:rStyle w:val="ac"/>
-                <w:noProof/>
-              </w:rPr>
-              <w:t>4.4 Synchronization Algorithm</w:t>
-            </w:r>
-            <w:r>
-              <w:rPr>
-                <w:noProof/>
-                <w:webHidden/>
-              </w:rPr>
-              <w:tab/>
-            </w:r>
-            <w:r>
-              <w:rPr>
-                <w:noProof/>
-                <w:webHidden/>
-              </w:rPr>
-              <w:fldChar w:fldCharType="begin"/>
-            </w:r>
-            <w:r>
-              <w:rPr>
-                <w:noProof/>
-                <w:webHidden/>
-              </w:rPr>
-              <w:instrText xml:space="preserve"> PAGEREF _Toc229333941 \h </w:instrText>
-            </w:r>
-            <w:r>
-              <w:rPr>
-                <w:noProof/>
-                <w:webHidden/>
-              </w:rPr>
-            </w:r>
-            <w:r>
-              <w:rPr>
-                <w:noProof/>
-                <w:webHidden/>
-              </w:rPr>
-              <w:fldChar w:fldCharType="separate"/>
-            </w:r>
-            <w:r>
-              <w:rPr>
-                <w:noProof/>
-                <w:webHidden/>
-              </w:rPr>
-              <w:t>10</w:t>
-            </w:r>
-            <w:r>
-              <w:rPr>
-                <w:noProof/>
-                <w:webHidden/>
-              </w:rPr>
-              <w:fldChar w:fldCharType="end"/>
-            </w:r>
-          </w:hyperlink>
-        </w:p>
-        <w:p>
-          <w:pPr>
-            <w:pStyle w:val="20"/>
-            <w:tabs>
-              <w:tab w:val="right" w:leader="dot" w:pos="9350"/>
-            </w:tabs>
-            <w:ind w:left="480"/>
-            <w:rPr>
-              <w:noProof/>
-            </w:rPr>
-          </w:pPr>
-          <w:hyperlink w:anchor="_Toc229333942" w:history="1">
-            <w:r>
-              <w:rPr>
-                <w:rStyle w:val="ac"/>
-                <w:noProof/>
-              </w:rPr>
-              <w:t>4.5 Visual Encoding</w:t>
-            </w:r>
-            <w:r>
-              <w:rPr>
-                <w:noProof/>
-                <w:webHidden/>
-              </w:rPr>
-              <w:tab/>
-            </w:r>
-            <w:r>
-              <w:rPr>
-                <w:noProof/>
-                <w:webHidden/>
-              </w:rPr>
-              <w:fldChar w:fldCharType="begin"/>
-            </w:r>
-            <w:r>
-              <w:rPr>
-                <w:noProof/>
-                <w:webHidden/>
-              </w:rPr>
-              <w:instrText xml:space="preserve"> PAGEREF _Toc229333942 \h </w:instrText>
-            </w:r>
-            <w:r>
-              <w:rPr>
-                <w:noProof/>
-                <w:webHidden/>
-              </w:rPr>
-            </w:r>
-            <w:r>
-              <w:rPr>
-                <w:noProof/>
-                <w:webHidden/>
-              </w:rPr>
-              <w:fldChar w:fldCharType="separate"/>
-            </w:r>
-            <w:r>
-              <w:rPr>
-                <w:noProof/>
-                <w:webHidden/>
-              </w:rPr>
-              <w:t>11</w:t>
-            </w:r>
-            <w:r>
-              <w:rPr>
-                <w:noProof/>
-                <w:webHidden/>
-              </w:rPr>
-              <w:fldChar w:fldCharType="end"/>
-            </w:r>
-          </w:hyperlink>
-        </w:p>
-        <w:p>
-          <w:pPr>
-            <w:pStyle w:val="10"/>
-            <w:tabs>
-              <w:tab w:val="right" w:leader="dot" w:pos="9350"/>
-            </w:tabs>
-            <w:rPr>
-              <w:noProof/>
-            </w:rPr>
-          </w:pPr>
-          <w:hyperlink w:anchor="_Toc229333943" w:history="1">
-            <w:r>
-              <w:rPr>
-                <w:rStyle w:val="ac"/>
-                <w:noProof/>
-              </w:rPr>
-              <w:t>5. Implementation</w:t>
-            </w:r>
-            <w:r>
-              <w:rPr>
-                <w:noProof/>
-                <w:webHidden/>
-              </w:rPr>
-              <w:tab/>
-            </w:r>
-            <w:r>
-              <w:rPr>
-                <w:noProof/>
-                <w:webHidden/>
-              </w:rPr>
-              <w:fldChar w:fldCharType="begin"/>
-            </w:r>
-            <w:r>
-              <w:rPr>
-                <w:noProof/>
-                <w:webHidden/>
-              </w:rPr>
-              <w:instrText xml:space="preserve"> PAGEREF _Toc229333943 \h </w:instrText>
-            </w:r>
-            <w:r>
-              <w:rPr>
-                <w:noProof/>
-                <w:webHidden/>
-              </w:rPr>
-            </w:r>
-            <w:r>
-              <w:rPr>
-                <w:noProof/>
-                <w:webHidden/>
-              </w:rPr>
-              <w:fldChar w:fldCharType="separate"/>
-            </w:r>
-            <w:r>
-              <w:rPr>
-                <w:noProof/>
-                <w:webHidden/>
-              </w:rPr>
-              <w:t>11</w:t>
-            </w:r>
-            <w:r>
-              <w:rPr>
-                <w:noProof/>
-                <w:webHidden/>
-              </w:rPr>
-              <w:fldChar w:fldCharType="end"/>
-            </w:r>
-          </w:hyperlink>
-        </w:p>
-        <w:p>
-          <w:pPr>
-            <w:pStyle w:val="20"/>
-            <w:tabs>
-              <w:tab w:val="right" w:leader="dot" w:pos="9350"/>
-            </w:tabs>
-            <w:ind w:left="480"/>
-            <w:rPr>
-              <w:noProof/>
-            </w:rPr>
-          </w:pPr>
-          <w:hyperlink w:anchor="_Toc229333944" w:history="1">
-            <w:r>
-              <w:rPr>
-                <w:rStyle w:val="ac"/>
-                <w:noProof/>
-              </w:rPr>
-              <w:t>5.1 Stack</w:t>
-            </w:r>
-            <w:r>
-              <w:rPr>
-                <w:noProof/>
-                <w:webHidden/>
-              </w:rPr>
-              <w:tab/>
-            </w:r>
-            <w:r>
-              <w:rPr>
-                <w:noProof/>
-                <w:webHidden/>
-              </w:rPr>
-              <w:fldChar w:fldCharType="begin"/>
-            </w:r>
-            <w:r>
-              <w:rPr>
-                <w:noProof/>
-                <w:webHidden/>
-              </w:rPr>
-              <w:instrText xml:space="preserve"> PAGEREF _Toc229333944 \h </w:instrText>
-            </w:r>
-            <w:r>
-              <w:rPr>
-                <w:noProof/>
-                <w:webHidden/>
-              </w:rPr>
-            </w:r>
-            <w:r>
-              <w:rPr>
-                <w:noProof/>
-                <w:webHidden/>
-              </w:rPr>
-              <w:fldChar w:fldCharType="separate"/>
-            </w:r>
-            <w:r>
-              <w:rPr>
-                <w:noProof/>
-                <w:webHidden/>
-              </w:rPr>
-              <w:t>11</w:t>
-            </w:r>
-            <w:r>
-              <w:rPr>
-                <w:noProof/>
-                <w:webHidden/>
-              </w:rPr>
-              <w:fldChar w:fldCharType="end"/>
-            </w:r>
-          </w:hyperlink>
-        </w:p>
-        <w:p>
-          <w:pPr>
-            <w:pStyle w:val="20"/>
-            <w:tabs>
-              <w:tab w:val="right" w:leader="dot" w:pos="9350"/>
-            </w:tabs>
-            <w:ind w:left="480"/>
-            <w:rPr>
-              <w:noProof/>
-            </w:rPr>
-          </w:pPr>
-          <w:hyperlink w:anchor="_Toc229333945" w:history="1">
-            <w:r>
-              <w:rPr>
-                <w:rStyle w:val="ac"/>
-                <w:noProof/>
-              </w:rPr>
-              <w:t>5.2 Module Structure</w:t>
-            </w:r>
-            <w:r>
-              <w:rPr>
-                <w:noProof/>
-                <w:webHidden/>
-              </w:rPr>
-              <w:tab/>
-            </w:r>
-            <w:r>
-              <w:rPr>
-                <w:noProof/>
-                <w:webHidden/>
-              </w:rPr>
-              <w:fldChar w:fldCharType="begin"/>
-            </w:r>
-            <w:r>
-              <w:rPr>
-                <w:noProof/>
-                <w:webHidden/>
-              </w:rPr>
-              <w:instrText xml:space="preserve"> PAGEREF _Toc229333945 \h </w:instrText>
-            </w:r>
-            <w:r>
-              <w:rPr>
-                <w:noProof/>
-                <w:webHidden/>
-              </w:rPr>
-            </w:r>
-            <w:r>
-              <w:rPr>
-                <w:noProof/>
-                <w:webHidden/>
-              </w:rPr>
-              <w:fldChar w:fldCharType="separate"/>
-            </w:r>
-            <w:r>
-              <w:rPr>
-                <w:noProof/>
-                <w:webHidden/>
-              </w:rPr>
-              <w:t>11</w:t>
-            </w:r>
-            <w:r>
-              <w:rPr>
-                <w:noProof/>
-                <w:webHidden/>
-              </w:rPr>
-              <w:fldChar w:fldCharType="end"/>
-            </w:r>
-          </w:hyperlink>
-        </w:p>
-        <w:p>
-          <w:pPr>
-            <w:pStyle w:val="20"/>
-            <w:tabs>
-              <w:tab w:val="right" w:leader="dot" w:pos="9350"/>
-            </w:tabs>
-            <w:ind w:left="480"/>
-            <w:rPr>
-              <w:noProof/>
-            </w:rPr>
-          </w:pPr>
-          <w:hyperlink w:anchor="_Toc229333946" w:history="1">
-            <w:r>
-              <w:rPr>
-                <w:rStyle w:val="ac"/>
-                <w:noProof/>
-              </w:rPr>
-              <w:t>5.3 Robustness</w:t>
-            </w:r>
-            <w:r>
-              <w:rPr>
-                <w:noProof/>
-                <w:webHidden/>
-              </w:rPr>
-              <w:tab/>
-            </w:r>
-            <w:r>
-              <w:rPr>
-                <w:noProof/>
-                <w:webHidden/>
-              </w:rPr>
-              <w:fldChar w:fldCharType="begin"/>
-            </w:r>
-            <w:r>
-              <w:rPr>
-                <w:noProof/>
-                <w:webHidden/>
-              </w:rPr>
-              <w:instrText xml:space="preserve"> PAGEREF _Toc229333946 \h </w:instrText>
-            </w:r>
-            <w:r>
-              <w:rPr>
-                <w:noProof/>
-                <w:webHidden/>
-              </w:rPr>
-            </w:r>
-            <w:r>
-              <w:rPr>
-                <w:noProof/>
-                <w:webHidden/>
-              </w:rPr>
-              <w:fldChar w:fldCharType="separate"/>
-            </w:r>
-            <w:r>
-              <w:rPr>
-                <w:noProof/>
-                <w:webHidden/>
-              </w:rPr>
-              <w:t>12</w:t>
-            </w:r>
-            <w:r>
-              <w:rPr>
-                <w:noProof/>
-                <w:webHidden/>
-              </w:rPr>
-              <w:fldChar w:fldCharType="end"/>
-            </w:r>
-          </w:hyperlink>
-        </w:p>
-        <w:p>
-          <w:pPr>
-            <w:pStyle w:val="20"/>
-            <w:tabs>
-              <w:tab w:val="right" w:leader="dot" w:pos="9350"/>
-            </w:tabs>
-            <w:ind w:left="480"/>
-            <w:rPr>
-              <w:noProof/>
-            </w:rPr>
-          </w:pPr>
-          <w:hyperlink w:anchor="_Toc229333947" w:history="1">
-            <w:r>
-              <w:rPr>
-                <w:rStyle w:val="ac"/>
-                <w:noProof/>
-              </w:rPr>
-              <w:t>5.4 Accessibility</w:t>
-            </w:r>
-            <w:r>
-              <w:rPr>
-                <w:noProof/>
-                <w:webHidden/>
-              </w:rPr>
-              <w:tab/>
-            </w:r>
-            <w:r>
-              <w:rPr>
-                <w:noProof/>
-                <w:webHidden/>
-              </w:rPr>
-              <w:fldChar w:fldCharType="begin"/>
-            </w:r>
-            <w:r>
-              <w:rPr>
-                <w:noProof/>
-                <w:webHidden/>
-              </w:rPr>
-              <w:instrText xml:space="preserve"> PAGEREF _Toc229333947 \h </w:instrText>
-            </w:r>
-            <w:r>
-              <w:rPr>
-                <w:noProof/>
-                <w:webHidden/>
-              </w:rPr>
-            </w:r>
-            <w:r>
-              <w:rPr>
-                <w:noProof/>
-                <w:webHidden/>
-              </w:rPr>
-              <w:fldChar w:fldCharType="separate"/>
-            </w:r>
-            <w:r>
-              <w:rPr>
-                <w:noProof/>
-                <w:webHidden/>
-              </w:rPr>
-              <w:t>12</w:t>
-            </w:r>
-            <w:r>
-              <w:rPr>
-                <w:noProof/>
-                <w:webHidden/>
-              </w:rPr>
-              <w:fldChar w:fldCharType="end"/>
-            </w:r>
-          </w:hyperlink>
-        </w:p>
-        <w:p>
-          <w:pPr>
-            <w:pStyle w:val="10"/>
-            <w:tabs>
-              <w:tab w:val="right" w:leader="dot" w:pos="9350"/>
-            </w:tabs>
-            <w:rPr>
-              <w:noProof/>
-            </w:rPr>
-          </w:pPr>
-          <w:hyperlink w:anchor="_Toc229333948" w:history="1">
-            <w:r>
-              <w:rPr>
-                <w:rStyle w:val="ac"/>
-                <w:noProof/>
-              </w:rPr>
-              <w:t>6. Evaluation</w:t>
-            </w:r>
-            <w:r>
-              <w:rPr>
-                <w:noProof/>
-                <w:webHidden/>
-              </w:rPr>
-              <w:tab/>
-            </w:r>
-            <w:r>
-              <w:rPr>
-                <w:noProof/>
-                <w:webHidden/>
-              </w:rPr>
-              <w:fldChar w:fldCharType="begin"/>
-            </w:r>
-            <w:r>
-              <w:rPr>
-                <w:noProof/>
-                <w:webHidden/>
-              </w:rPr>
-              <w:instrText xml:space="preserve"> PAGEREF _Toc229333948 \h </w:instrText>
-            </w:r>
-            <w:r>
-              <w:rPr>
-                <w:noProof/>
-                <w:webHidden/>
-              </w:rPr>
-            </w:r>
-            <w:r>
-              <w:rPr>
-                <w:noProof/>
-                <w:webHidden/>
-              </w:rPr>
-              <w:fldChar w:fldCharType="separate"/>
-            </w:r>
-            <w:r>
-              <w:rPr>
-                <w:noProof/>
-                <w:webHidden/>
-              </w:rPr>
-              <w:t>12</w:t>
-            </w:r>
-            <w:r>
-              <w:rPr>
-                <w:noProof/>
-                <w:webHidden/>
-              </w:rPr>
-              <w:fldChar w:fldCharType="end"/>
-            </w:r>
-          </w:hyperlink>
-        </w:p>
-        <w:p>
-          <w:pPr>
-            <w:pStyle w:val="20"/>
-            <w:tabs>
-              <w:tab w:val="right" w:leader="dot" w:pos="9350"/>
-            </w:tabs>
-            <w:ind w:left="480"/>
-            <w:rPr>
-              <w:noProof/>
-            </w:rPr>
-          </w:pPr>
-          <w:hyperlink w:anchor="_Toc229333949" w:history="1">
-            <w:r>
-              <w:rPr>
-                <w:rStyle w:val="ac"/>
-                <w:noProof/>
-              </w:rPr>
-              <w:t>6.1 Design</w:t>
-            </w:r>
-            <w:r>
-              <w:rPr>
-                <w:noProof/>
-                <w:webHidden/>
-              </w:rPr>
-              <w:tab/>
-            </w:r>
-            <w:r>
-              <w:rPr>
-                <w:noProof/>
-                <w:webHidden/>
-              </w:rPr>
-              <w:fldChar w:fldCharType="begin"/>
-            </w:r>
-            <w:r>
-              <w:rPr>
-                <w:noProof/>
-                <w:webHidden/>
-              </w:rPr>
-              <w:instrText xml:space="preserve"> PAGEREF _Toc229333949 \h </w:instrText>
-            </w:r>
-            <w:r>
-              <w:rPr>
-                <w:noProof/>
-                <w:webHidden/>
-              </w:rPr>
-            </w:r>
-            <w:r>
-              <w:rPr>
-                <w:noProof/>
-                <w:webHidden/>
-              </w:rPr>
-              <w:fldChar w:fldCharType="separate"/>
-            </w:r>
-            <w:r>
-              <w:rPr>
-                <w:noProof/>
-                <w:webHidden/>
-              </w:rPr>
-              <w:t>12</w:t>
-            </w:r>
-            <w:r>
-              <w:rPr>
-                <w:noProof/>
-                <w:webHidden/>
-              </w:rPr>
-              <w:fldChar w:fldCharType="end"/>
-            </w:r>
-          </w:hyperlink>
-        </w:p>
-        <w:p>
-          <w:pPr>
-            <w:pStyle w:val="20"/>
-            <w:tabs>
-              <w:tab w:val="right" w:leader="dot" w:pos="9350"/>
-            </w:tabs>
-            <w:ind w:left="480"/>
-            <w:rPr>
-              <w:noProof/>
-            </w:rPr>
-          </w:pPr>
-          <w:hyperlink w:anchor="_Toc229333950" w:history="1">
-            <w:r>
-              <w:rPr>
-                <w:rStyle w:val="ac"/>
-                <w:noProof/>
-              </w:rPr>
-              <w:t>6.2 Participants</w:t>
-            </w:r>
-            <w:r>
-              <w:rPr>
-                <w:noProof/>
-                <w:webHidden/>
-              </w:rPr>
-              <w:tab/>
-            </w:r>
-            <w:r>
-              <w:rPr>
-                <w:noProof/>
-                <w:webHidden/>
-              </w:rPr>
-              <w:fldChar w:fldCharType="begin"/>
-            </w:r>
-            <w:r>
-              <w:rPr>
-                <w:noProof/>
-                <w:webHidden/>
-              </w:rPr>
-              <w:instrText xml:space="preserve"> PAGEREF _Toc229333950 \h </w:instrText>
-            </w:r>
-            <w:r>
-              <w:rPr>
-                <w:noProof/>
-                <w:webHidden/>
-              </w:rPr>
-            </w:r>
-            <w:r>
-              <w:rPr>
-                <w:noProof/>
-                <w:webHidden/>
-              </w:rPr>
-              <w:fldChar w:fldCharType="separate"/>
-            </w:r>
-            <w:r>
-              <w:rPr>
-                <w:noProof/>
-                <w:webHidden/>
-              </w:rPr>
-              <w:t>12</w:t>
-            </w:r>
-            <w:r>
-              <w:rPr>
-                <w:noProof/>
-                <w:webHidden/>
-              </w:rPr>
-              <w:fldChar w:fldCharType="end"/>
-            </w:r>
-          </w:hyperlink>
-        </w:p>
-        <w:p>
-          <w:pPr>
-            <w:pStyle w:val="20"/>
-            <w:tabs>
-              <w:tab w:val="right" w:leader="dot" w:pos="9350"/>
-            </w:tabs>
-            <w:ind w:left="480"/>
-            <w:rPr>
-              <w:noProof/>
-            </w:rPr>
-          </w:pPr>
-          <w:hyperlink w:anchor="_Toc229333951" w:history="1">
-            <w:r>
-              <w:rPr>
-                <w:rStyle w:val="ac"/>
-                <w:noProof/>
-              </w:rPr>
-              <w:t>6.3 Instruments</w:t>
-            </w:r>
-            <w:r>
-              <w:rPr>
-                <w:noProof/>
-                <w:webHidden/>
-              </w:rPr>
-              <w:tab/>
-            </w:r>
-            <w:r>
-              <w:rPr>
-                <w:noProof/>
-                <w:webHidden/>
-              </w:rPr>
-              <w:fldChar w:fldCharType="begin"/>
-            </w:r>
-            <w:r>
-              <w:rPr>
-                <w:noProof/>
-                <w:webHidden/>
-              </w:rPr>
-              <w:instrText xml:space="preserve"> PAGEREF _Toc229333951 \h </w:instrText>
-            </w:r>
-            <w:r>
-              <w:rPr>
-                <w:noProof/>
-                <w:webHidden/>
-              </w:rPr>
-            </w:r>
-            <w:r>
-              <w:rPr>
-                <w:noProof/>
-                <w:webHidden/>
-              </w:rPr>
-              <w:fldChar w:fldCharType="separate"/>
-            </w:r>
-            <w:r>
-              <w:rPr>
-                <w:noProof/>
-                <w:webHidden/>
-              </w:rPr>
-              <w:t>12</w:t>
-            </w:r>
-            <w:r>
-              <w:rPr>
-                <w:noProof/>
-                <w:webHidden/>
-              </w:rPr>
-              <w:fldChar w:fldCharType="end"/>
-            </w:r>
-          </w:hyperlink>
-        </w:p>
-        <w:p>
-          <w:pPr>
-            <w:pStyle w:val="20"/>
-            <w:tabs>
-              <w:tab w:val="right" w:leader="dot" w:pos="9350"/>
-            </w:tabs>
-            <w:ind w:left="480"/>
-            <w:rPr>
-              <w:noProof/>
-            </w:rPr>
-          </w:pPr>
-          <w:hyperlink w:anchor="_Toc229333952" w:history="1">
-            <w:r>
-              <w:rPr>
-                <w:rStyle w:val="ac"/>
-                <w:noProof/>
-              </w:rPr>
-              <w:t>6.4 Procedure</w:t>
-            </w:r>
-            <w:r>
-              <w:rPr>
-                <w:noProof/>
-                <w:webHidden/>
-              </w:rPr>
-              <w:tab/>
-            </w:r>
-            <w:r>
-              <w:rPr>
-                <w:noProof/>
-                <w:webHidden/>
-              </w:rPr>
-              <w:fldChar w:fldCharType="begin"/>
-            </w:r>
-            <w:r>
-              <w:rPr>
-                <w:noProof/>
-                <w:webHidden/>
-              </w:rPr>
-              <w:instrText xml:space="preserve"> PAGEREF _Toc229333952 \h </w:instrText>
-            </w:r>
-            <w:r>
-              <w:rPr>
-                <w:noProof/>
-                <w:webHidden/>
-              </w:rPr>
-            </w:r>
-            <w:r>
-              <w:rPr>
-                <w:noProof/>
-                <w:webHidden/>
-              </w:rPr>
-              <w:fldChar w:fldCharType="separate"/>
-            </w:r>
-            <w:r>
-              <w:rPr>
-                <w:noProof/>
-                <w:webHidden/>
-              </w:rPr>
-              <w:t>13</w:t>
-            </w:r>
-            <w:r>
-              <w:rPr>
-                <w:noProof/>
-                <w:webHidden/>
-              </w:rPr>
-              <w:fldChar w:fldCharType="end"/>
-            </w:r>
-          </w:hyperlink>
-        </w:p>
-        <w:p>
-          <w:pPr>
-            <w:pStyle w:val="20"/>
-            <w:tabs>
-              <w:tab w:val="right" w:leader="dot" w:pos="9350"/>
-            </w:tabs>
-            <w:ind w:left="480"/>
-            <w:rPr>
-              <w:noProof/>
-            </w:rPr>
-          </w:pPr>
-          <w:hyperlink w:anchor="_Toc229333953" w:history="1">
-            <w:r>
-              <w:rPr>
-                <w:rStyle w:val="ac"/>
-                <w:noProof/>
-              </w:rPr>
-              <w:t>6.5 Analysis</w:t>
-            </w:r>
-            <w:r>
-              <w:rPr>
-                <w:noProof/>
-                <w:webHidden/>
-              </w:rPr>
-              <w:tab/>
-            </w:r>
-            <w:r>
-              <w:rPr>
-                <w:noProof/>
-                <w:webHidden/>
-              </w:rPr>
-              <w:fldChar w:fldCharType="begin"/>
-            </w:r>
-            <w:r>
-              <w:rPr>
-                <w:noProof/>
-                <w:webHidden/>
-              </w:rPr>
-              <w:instrText xml:space="preserve"> PAGEREF _Toc229333953 \h </w:instrText>
-            </w:r>
-            <w:r>
-              <w:rPr>
-                <w:noProof/>
-                <w:webHidden/>
-              </w:rPr>
-            </w:r>
-            <w:r>
-              <w:rPr>
-                <w:noProof/>
-                <w:webHidden/>
-              </w:rPr>
-              <w:fldChar w:fldCharType="separate"/>
-            </w:r>
-            <w:r>
-              <w:rPr>
-                <w:noProof/>
-                <w:webHidden/>
-              </w:rPr>
-              <w:t>13</w:t>
-            </w:r>
-            <w:r>
-              <w:rPr>
-                <w:noProof/>
-                <w:webHidden/>
-              </w:rPr>
-              <w:fldChar w:fldCharType="end"/>
-            </w:r>
-          </w:hyperlink>
-        </w:p>
-        <w:p>
-          <w:pPr>
-            <w:pStyle w:val="10"/>
-            <w:tabs>
-              <w:tab w:val="right" w:leader="dot" w:pos="9350"/>
-            </w:tabs>
-            <w:rPr>
-              <w:noProof/>
-            </w:rPr>
-          </w:pPr>
-          <w:hyperlink w:anchor="_Toc229333954" w:history="1">
-            <w:r>
-              <w:rPr>
-                <w:rStyle w:val="ac"/>
-                <w:noProof/>
-              </w:rPr>
-              <w:t>7. Results</w:t>
-            </w:r>
-            <w:r>
-              <w:rPr>
-                <w:noProof/>
-                <w:webHidden/>
-              </w:rPr>
-              <w:tab/>
-            </w:r>
-            <w:r>
-              <w:rPr>
-                <w:noProof/>
-                <w:webHidden/>
-              </w:rPr>
-              <w:fldChar w:fldCharType="begin"/>
-            </w:r>
-            <w:r>
-              <w:rPr>
-                <w:noProof/>
-                <w:webHidden/>
-              </w:rPr>
-              <w:instrText xml:space="preserve"> PAGEREF _Toc229333954 \h </w:instrText>
-            </w:r>
-            <w:r>
-              <w:rPr>
-                <w:noProof/>
-                <w:webHidden/>
-              </w:rPr>
-            </w:r>
-            <w:r>
-              <w:rPr>
-                <w:noProof/>
-                <w:webHidden/>
-              </w:rPr>
-              <w:fldChar w:fldCharType="separate"/>
-            </w:r>
-            <w:r>
-              <w:rPr>
-                <w:noProof/>
-                <w:webHidden/>
-              </w:rPr>
-              <w:t>13</w:t>
-            </w:r>
-            <w:r>
-              <w:rPr>
-                <w:noProof/>
-                <w:webHidden/>
-              </w:rPr>
-              <w:fldChar w:fldCharType="end"/>
-            </w:r>
-          </w:hyperlink>
-        </w:p>
-        <w:p>
-          <w:pPr>
-            <w:pStyle w:val="20"/>
-            <w:tabs>
-              <w:tab w:val="right" w:leader="dot" w:pos="9350"/>
-            </w:tabs>
-            <w:ind w:left="480"/>
-            <w:rPr>
-              <w:noProof/>
-            </w:rPr>
-          </w:pPr>
-          <w:hyperlink w:anchor="_Toc229333955" w:history="1">
-            <w:r>
-              <w:rPr>
-                <w:rStyle w:val="ac"/>
-                <w:noProof/>
-              </w:rPr>
-              <w:t>7.1 Form-Identification Accuracy</w:t>
-            </w:r>
-            <w:r>
-              <w:rPr>
-                <w:noProof/>
-                <w:webHidden/>
-              </w:rPr>
-              <w:tab/>
-            </w:r>
-            <w:r>
-              <w:rPr>
-                <w:noProof/>
-                <w:webHidden/>
-              </w:rPr>
-              <w:fldChar w:fldCharType="begin"/>
-            </w:r>
-            <w:r>
-              <w:rPr>
-                <w:noProof/>
-                <w:webHidden/>
-              </w:rPr>
-              <w:instrText xml:space="preserve"> PAGEREF _Toc229333955 \h </w:instrText>
-            </w:r>
-            <w:r>
-              <w:rPr>
-                <w:noProof/>
-                <w:webHidden/>
-              </w:rPr>
-            </w:r>
-            <w:r>
-              <w:rPr>
-                <w:noProof/>
-                <w:webHidden/>
-              </w:rPr>
-              <w:fldChar w:fldCharType="separate"/>
-            </w:r>
-            <w:r>
-              <w:rPr>
-                <w:noProof/>
-                <w:webHidden/>
-              </w:rPr>
-              <w:t>13</w:t>
-            </w:r>
-            <w:r>
-              <w:rPr>
-                <w:noProof/>
-                <w:webHidden/>
-              </w:rPr>
-              <w:fldChar w:fldCharType="end"/>
-            </w:r>
-          </w:hyperlink>
-        </w:p>
-        <w:p>
-          <w:pPr>
-            <w:pStyle w:val="20"/>
-            <w:tabs>
-              <w:tab w:val="right" w:leader="dot" w:pos="9350"/>
-            </w:tabs>
-            <w:ind w:left="480"/>
-            <w:rPr>
-              <w:noProof/>
-            </w:rPr>
-          </w:pPr>
-          <w:hyperlink w:anchor="_Toc229333956" w:history="1">
-            <w:r>
-              <w:rPr>
-                <w:rStyle w:val="ac"/>
-                <w:noProof/>
-              </w:rPr>
-              <w:t>7.2 Recognition of Subdominant Recapitulation</w:t>
-            </w:r>
-            <w:r>
-              <w:rPr>
-                <w:noProof/>
-                <w:webHidden/>
-              </w:rPr>
-              <w:tab/>
-            </w:r>
-            <w:r>
-              <w:rPr>
-                <w:noProof/>
-                <w:webHidden/>
-              </w:rPr>
-              <w:fldChar w:fldCharType="begin"/>
-            </w:r>
-            <w:r>
-              <w:rPr>
-                <w:noProof/>
-                <w:webHidden/>
-              </w:rPr>
-              <w:instrText xml:space="preserve"> PAGEREF _Toc229333956 \h </w:instrText>
-            </w:r>
-            <w:r>
-              <w:rPr>
-                <w:noProof/>
-                <w:webHidden/>
-              </w:rPr>
-            </w:r>
-            <w:r>
-              <w:rPr>
-                <w:noProof/>
-                <w:webHidden/>
-              </w:rPr>
-              <w:fldChar w:fldCharType="separate"/>
-            </w:r>
-            <w:r>
-              <w:rPr>
-                <w:noProof/>
-                <w:webHidden/>
-              </w:rPr>
-              <w:t>14</w:t>
-            </w:r>
-            <w:r>
-              <w:rPr>
-                <w:noProof/>
-                <w:webHidden/>
-              </w:rPr>
-              <w:fldChar w:fldCharType="end"/>
-            </w:r>
-          </w:hyperlink>
-        </w:p>
-        <w:p>
-          <w:pPr>
-            <w:pStyle w:val="20"/>
-            <w:tabs>
-              <w:tab w:val="right" w:leader="dot" w:pos="9350"/>
-            </w:tabs>
-            <w:ind w:left="480"/>
-            <w:rPr>
-              <w:noProof/>
-            </w:rPr>
-          </w:pPr>
-          <w:hyperlink w:anchor="_Toc229333957" w:history="1">
-            <w:r>
-              <w:rPr>
-                <w:rStyle w:val="ac"/>
-                <w:noProof/>
-              </w:rPr>
-              <w:t>7.3 System Usability</w:t>
-            </w:r>
-            <w:r>
-              <w:rPr>
-                <w:noProof/>
-                <w:webHidden/>
-              </w:rPr>
-              <w:tab/>
-            </w:r>
-            <w:r>
-              <w:rPr>
-                <w:noProof/>
-                <w:webHidden/>
-              </w:rPr>
-              <w:fldChar w:fldCharType="begin"/>
-            </w:r>
-            <w:r>
-              <w:rPr>
-                <w:noProof/>
-                <w:webHidden/>
-              </w:rPr>
-              <w:instrText xml:space="preserve"> PAGEREF _Toc229333957 \h </w:instrText>
-            </w:r>
-            <w:r>
-              <w:rPr>
-                <w:noProof/>
-                <w:webHidden/>
-              </w:rPr>
-            </w:r>
-            <w:r>
-              <w:rPr>
-                <w:noProof/>
-                <w:webHidden/>
-              </w:rPr>
-              <w:fldChar w:fldCharType="separate"/>
-            </w:r>
-            <w:r>
-              <w:rPr>
-                <w:noProof/>
-                <w:webHidden/>
-              </w:rPr>
-              <w:t>14</w:t>
-            </w:r>
-            <w:r>
-              <w:rPr>
-                <w:noProof/>
-                <w:webHidden/>
-              </w:rPr>
-              <w:fldChar w:fldCharType="end"/>
-            </w:r>
-          </w:hyperlink>
-        </w:p>
-        <w:p>
-          <w:pPr>
-            <w:pStyle w:val="20"/>
-            <w:tabs>
-              <w:tab w:val="right" w:leader="dot" w:pos="9350"/>
-            </w:tabs>
-            <w:ind w:left="480"/>
-            <w:rPr>
-              <w:noProof/>
-            </w:rPr>
-          </w:pPr>
-          <w:hyperlink w:anchor="_Toc229333958" w:history="1">
-            <w:r>
-              <w:rPr>
-                <w:rStyle w:val="ac"/>
-                <w:noProof/>
-              </w:rPr>
-              <w:t>7.4 Qualitative Feedback</w:t>
-            </w:r>
-            <w:r>
-              <w:rPr>
-                <w:noProof/>
-                <w:webHidden/>
-              </w:rPr>
-              <w:tab/>
-            </w:r>
-            <w:r>
-              <w:rPr>
-                <w:noProof/>
-                <w:webHidden/>
-              </w:rPr>
-              <w:fldChar w:fldCharType="begin"/>
-            </w:r>
-            <w:r>
-              <w:rPr>
-                <w:noProof/>
-                <w:webHidden/>
-              </w:rPr>
-              <w:instrText xml:space="preserve"> PAGEREF _Toc229333958 \h </w:instrText>
-            </w:r>
-            <w:r>
-              <w:rPr>
-                <w:noProof/>
-                <w:webHidden/>
-              </w:rPr>
-            </w:r>
-            <w:r>
-              <w:rPr>
-                <w:noProof/>
-                <w:webHidden/>
-              </w:rPr>
-              <w:fldChar w:fldCharType="separate"/>
-            </w:r>
-            <w:r>
-              <w:rPr>
-                <w:noProof/>
-                <w:webHidden/>
-              </w:rPr>
-              <w:t>14</w:t>
-            </w:r>
-            <w:r>
-              <w:rPr>
-                <w:noProof/>
-                <w:webHidden/>
-              </w:rPr>
-              <w:fldChar w:fldCharType="end"/>
-            </w:r>
-          </w:hyperlink>
-        </w:p>
-        <w:p>
-          <w:pPr>
-            <w:pStyle w:val="10"/>
-            <w:tabs>
-              <w:tab w:val="right" w:leader="dot" w:pos="9350"/>
-            </w:tabs>
-            <w:rPr>
-              <w:noProof/>
-            </w:rPr>
-          </w:pPr>
-          <w:hyperlink w:anchor="_Toc229333959" w:history="1">
-            <w:r>
-              <w:rPr>
-                <w:rStyle w:val="ac"/>
-                <w:noProof/>
-              </w:rPr>
-              <w:t>8. Discussion</w:t>
-            </w:r>
-            <w:r>
-              <w:rPr>
-                <w:noProof/>
-                <w:webHidden/>
-              </w:rPr>
-              <w:tab/>
-            </w:r>
-            <w:r>
-              <w:rPr>
-                <w:noProof/>
-                <w:webHidden/>
-              </w:rPr>
-              <w:fldChar w:fldCharType="begin"/>
-            </w:r>
-            <w:r>
-              <w:rPr>
-                <w:noProof/>
-                <w:webHidden/>
-              </w:rPr>
-              <w:instrText xml:space="preserve"> PAGEREF _Toc229333959 \h </w:instrText>
-            </w:r>
-            <w:r>
-              <w:rPr>
-                <w:noProof/>
-                <w:webHidden/>
-              </w:rPr>
-            </w:r>
-            <w:r>
-              <w:rPr>
-                <w:noProof/>
-                <w:webHidden/>
-              </w:rPr>
-              <w:fldChar w:fldCharType="separate"/>
-            </w:r>
-            <w:r>
-              <w:rPr>
-                <w:noProof/>
-                <w:webHidden/>
-              </w:rPr>
-              <w:t>14</w:t>
-            </w:r>
-            <w:r>
-              <w:rPr>
-                <w:noProof/>
-                <w:webHidden/>
-              </w:rPr>
-              <w:fldChar w:fldCharType="end"/>
-            </w:r>
-          </w:hyperlink>
-        </w:p>
-        <w:p>
-          <w:pPr>
-            <w:pStyle w:val="20"/>
-            <w:tabs>
-              <w:tab w:val="right" w:leader="dot" w:pos="9350"/>
-            </w:tabs>
-            <w:ind w:left="480"/>
-            <w:rPr>
-              <w:noProof/>
-            </w:rPr>
-          </w:pPr>
-          <w:hyperlink w:anchor="_Toc229333960" w:history="1">
-            <w:r>
-              <w:rPr>
-                <w:rStyle w:val="ac"/>
-                <w:noProof/>
-              </w:rPr>
-              <w:t>8.1 Educational Implications</w:t>
-            </w:r>
-            <w:r>
-              <w:rPr>
-                <w:noProof/>
-                <w:webHidden/>
-              </w:rPr>
-              <w:tab/>
-            </w:r>
-            <w:r>
-              <w:rPr>
-                <w:noProof/>
-                <w:webHidden/>
-              </w:rPr>
-              <w:fldChar w:fldCharType="begin"/>
-            </w:r>
-            <w:r>
-              <w:rPr>
-                <w:noProof/>
-                <w:webHidden/>
-              </w:rPr>
-              <w:instrText xml:space="preserve"> PAGEREF _Toc229333960 \h </w:instrText>
-            </w:r>
-            <w:r>
-              <w:rPr>
-                <w:noProof/>
-                <w:webHidden/>
-              </w:rPr>
-            </w:r>
-            <w:r>
-              <w:rPr>
-                <w:noProof/>
-                <w:webHidden/>
-              </w:rPr>
-              <w:fldChar w:fldCharType="separate"/>
-            </w:r>
-            <w:r>
-              <w:rPr>
-                <w:noProof/>
-                <w:webHidden/>
-              </w:rPr>
-              <w:t>14</w:t>
-            </w:r>
-            <w:r>
-              <w:rPr>
-                <w:noProof/>
-                <w:webHidden/>
-              </w:rPr>
-              <w:fldChar w:fldCharType="end"/>
-            </w:r>
-          </w:hyperlink>
-        </w:p>
-        <w:p>
-          <w:pPr>
-            <w:pStyle w:val="20"/>
-            <w:tabs>
-              <w:tab w:val="right" w:leader="dot" w:pos="9350"/>
-            </w:tabs>
-            <w:ind w:left="480"/>
-            <w:rPr>
-              <w:noProof/>
-            </w:rPr>
-          </w:pPr>
-          <w:hyperlink w:anchor="_Toc229333961" w:history="1">
-            <w:r>
-              <w:rPr>
-                <w:rStyle w:val="ac"/>
-                <w:noProof/>
-              </w:rPr>
-              <w:t>8.2 Methodological and Tooling Implications</w:t>
-            </w:r>
-            <w:r>
-              <w:rPr>
-                <w:noProof/>
-                <w:webHidden/>
-              </w:rPr>
-              <w:tab/>
-            </w:r>
-            <w:r>
-              <w:rPr>
-                <w:noProof/>
-                <w:webHidden/>
-              </w:rPr>
-              <w:fldChar w:fldCharType="begin"/>
-            </w:r>
-            <w:r>
-              <w:rPr>
-                <w:noProof/>
-                <w:webHidden/>
-              </w:rPr>
-              <w:instrText xml:space="preserve"> PAGEREF _Toc229333961 \h </w:instrText>
-            </w:r>
-            <w:r>
-              <w:rPr>
-                <w:noProof/>
-                <w:webHidden/>
-              </w:rPr>
-            </w:r>
-            <w:r>
-              <w:rPr>
-                <w:noProof/>
-                <w:webHidden/>
-              </w:rPr>
-              <w:fldChar w:fldCharType="separate"/>
-            </w:r>
-            <w:r>
-              <w:rPr>
-                <w:noProof/>
-                <w:webHidden/>
-              </w:rPr>
-              <w:t>15</w:t>
-            </w:r>
-            <w:r>
-              <w:rPr>
-                <w:noProof/>
-                <w:webHidden/>
-              </w:rPr>
-              <w:fldChar w:fldCharType="end"/>
-            </w:r>
-          </w:hyperlink>
-        </w:p>
-        <w:p>
-          <w:pPr>
-            <w:pStyle w:val="20"/>
-            <w:tabs>
-              <w:tab w:val="right" w:leader="dot" w:pos="9350"/>
-            </w:tabs>
-            <w:ind w:left="480"/>
-            <w:rPr>
-              <w:noProof/>
-            </w:rPr>
-          </w:pPr>
-          <w:hyperlink w:anchor="_Toc229333962" w:history="1">
-            <w:r>
-              <w:rPr>
-                <w:rStyle w:val="ac"/>
-                <w:noProof/>
-              </w:rPr>
-              <w:t>8.3 Limitations</w:t>
-            </w:r>
-            <w:r>
-              <w:rPr>
-                <w:noProof/>
-                <w:webHidden/>
-              </w:rPr>
-              <w:tab/>
-            </w:r>
-            <w:r>
-              <w:rPr>
-                <w:noProof/>
-                <w:webHidden/>
-              </w:rPr>
-              <w:fldChar w:fldCharType="begin"/>
-            </w:r>
-            <w:r>
-              <w:rPr>
-                <w:noProof/>
-                <w:webHidden/>
-              </w:rPr>
-              <w:instrText xml:space="preserve"> PAGEREF _Toc229333962 \h </w:instrText>
-            </w:r>
-            <w:r>
-              <w:rPr>
-                <w:noProof/>
-                <w:webHidden/>
-              </w:rPr>
-            </w:r>
-            <w:r>
-              <w:rPr>
-                <w:noProof/>
-                <w:webHidden/>
-              </w:rPr>
-              <w:fldChar w:fldCharType="separate"/>
-            </w:r>
-            <w:r>
-              <w:rPr>
-                <w:noProof/>
-                <w:webHidden/>
-              </w:rPr>
-              <w:t>15</w:t>
-            </w:r>
-            <w:r>
-              <w:rPr>
-                <w:noProof/>
-                <w:webHidden/>
-              </w:rPr>
-              <w:fldChar w:fldCharType="end"/>
-            </w:r>
-          </w:hyperlink>
-        </w:p>
-        <w:p>
-          <w:pPr>
-            <w:pStyle w:val="20"/>
-            <w:tabs>
-              <w:tab w:val="right" w:leader="dot" w:pos="9350"/>
-            </w:tabs>
-            <w:ind w:left="480"/>
-            <w:rPr>
-              <w:noProof/>
-            </w:rPr>
-          </w:pPr>
-          <w:hyperlink w:anchor="_Toc229333963" w:history="1">
-            <w:r>
-              <w:rPr>
-                <w:rStyle w:val="ac"/>
-                <w:noProof/>
-              </w:rPr>
-              <w:t>8.4 Future Work</w:t>
-            </w:r>
-            <w:r>
-              <w:rPr>
-                <w:noProof/>
-                <w:webHidden/>
-              </w:rPr>
-              <w:tab/>
-            </w:r>
-            <w:r>
-              <w:rPr>
-                <w:noProof/>
-                <w:webHidden/>
-              </w:rPr>
-              <w:fldChar w:fldCharType="begin"/>
-            </w:r>
-            <w:r>
-              <w:rPr>
-                <w:noProof/>
-                <w:webHidden/>
-              </w:rPr>
-              <w:instrText xml:space="preserve"> PAGEREF _Toc229333963 \h </w:instrText>
-            </w:r>
-            <w:r>
-              <w:rPr>
-                <w:noProof/>
-                <w:webHidden/>
-              </w:rPr>
-            </w:r>
-            <w:r>
-              <w:rPr>
-                <w:noProof/>
-                <w:webHidden/>
-              </w:rPr>
-              <w:fldChar w:fldCharType="separate"/>
-            </w:r>
-            <w:r>
-              <w:rPr>
-                <w:noProof/>
-                <w:webHidden/>
-              </w:rPr>
-              <w:t>15</w:t>
-            </w:r>
-            <w:r>
-              <w:rPr>
-                <w:noProof/>
-                <w:webHidden/>
-              </w:rPr>
-              <w:fldChar w:fldCharType="end"/>
-            </w:r>
-          </w:hyperlink>
-        </w:p>
-        <w:p>
-          <w:pPr>
-            <w:pStyle w:val="10"/>
-            <w:tabs>
-              <w:tab w:val="right" w:leader="dot" w:pos="9350"/>
-            </w:tabs>
-            <w:rPr>
-              <w:noProof/>
-            </w:rPr>
-          </w:pPr>
-          <w:hyperlink w:anchor="_Toc229333964" w:history="1">
-            <w:r>
-              <w:rPr>
-                <w:rStyle w:val="ac"/>
-                <w:noProof/>
-              </w:rPr>
-              <w:t>9. Conclusion</w:t>
-            </w:r>
-            <w:r>
-              <w:rPr>
-                <w:noProof/>
-                <w:webHidden/>
-              </w:rPr>
-              <w:tab/>
-            </w:r>
-            <w:r>
-              <w:rPr>
-                <w:noProof/>
-                <w:webHidden/>
-              </w:rPr>
-              <w:fldChar w:fldCharType="begin"/>
-            </w:r>
-            <w:r>
-              <w:rPr>
-                <w:noProof/>
-                <w:webHidden/>
-              </w:rPr>
-              <w:instrText xml:space="preserve"> PAGEREF _Toc229333964 \h </w:instrText>
-            </w:r>
-            <w:r>
-              <w:rPr>
-                <w:noProof/>
-                <w:webHidden/>
-              </w:rPr>
-            </w:r>
-            <w:r>
-              <w:rPr>
-                <w:noProof/>
-                <w:webHidden/>
-              </w:rPr>
-              <w:fldChar w:fldCharType="separate"/>
-            </w:r>
-            <w:r>
-              <w:rPr>
-                <w:noProof/>
-                <w:webHidden/>
-              </w:rPr>
-              <w:t>16</w:t>
-            </w:r>
-            <w:r>
-              <w:rPr>
-                <w:noProof/>
-                <w:webHidden/>
-              </w:rPr>
-              <w:fldChar w:fldCharType="end"/>
-            </w:r>
-          </w:hyperlink>
-        </w:p>
-        <w:p>
-          <w:pPr>
-            <w:pStyle w:val="10"/>
-            <w:tabs>
-              <w:tab w:val="right" w:leader="dot" w:pos="9350"/>
-            </w:tabs>
-            <w:rPr>
-              <w:noProof/>
-            </w:rPr>
-          </w:pPr>
-          <w:hyperlink w:anchor="_Toc229333965" w:history="1">
-            <w:r>
-              <w:rPr>
-                <w:rStyle w:val="ac"/>
-                <w:noProof/>
-              </w:rPr>
-              <w:t>10. Reproducibility</w:t>
-            </w:r>
-            <w:r>
-              <w:rPr>
-                <w:noProof/>
-                <w:webHidden/>
-              </w:rPr>
-              <w:tab/>
-            </w:r>
-            <w:r>
-              <w:rPr>
-                <w:noProof/>
-                <w:webHidden/>
-              </w:rPr>
-              <w:fldChar w:fldCharType="begin"/>
-            </w:r>
-            <w:r>
-              <w:rPr>
-                <w:noProof/>
-                <w:webHidden/>
-              </w:rPr>
-              <w:instrText xml:space="preserve"> PAGEREF _Toc229333965 \h </w:instrText>
-            </w:r>
-            <w:r>
-              <w:rPr>
-                <w:noProof/>
-                <w:webHidden/>
-              </w:rPr>
-            </w:r>
-            <w:r>
-              <w:rPr>
-                <w:noProof/>
-                <w:webHidden/>
-              </w:rPr>
-              <w:fldChar w:fldCharType="separate"/>
-            </w:r>
-            <w:r>
-              <w:rPr>
-                <w:noProof/>
-                <w:webHidden/>
-              </w:rPr>
-              <w:t>16</w:t>
-            </w:r>
-            <w:r>
-              <w:rPr>
-                <w:noProof/>
-                <w:webHidden/>
-              </w:rPr>
-              <w:fldChar w:fldCharType="end"/>
-            </w:r>
-          </w:hyperlink>
-        </w:p>
-        <w:p>
-          <w:pPr>
-            <w:pStyle w:val="10"/>
-            <w:tabs>
-              <w:tab w:val="right" w:leader="dot" w:pos="9350"/>
-            </w:tabs>
-            <w:rPr>
-              <w:noProof/>
-            </w:rPr>
-          </w:pPr>
-          <w:hyperlink w:anchor="_Toc229333966" w:history="1">
-            <w:r>
-              <w:rPr>
-                <w:rStyle w:val="ac"/>
-                <w:noProof/>
-              </w:rPr>
-              <w:t>Acknowledgments</w:t>
-            </w:r>
-            <w:r>
-              <w:rPr>
-                <w:noProof/>
-                <w:webHidden/>
-              </w:rPr>
-              <w:tab/>
-            </w:r>
-            <w:r>
-              <w:rPr>
-                <w:noProof/>
-                <w:webHidden/>
-              </w:rPr>
-              <w:fldChar w:fldCharType="begin"/>
-            </w:r>
-            <w:r>
-              <w:rPr>
-                <w:noProof/>
-                <w:webHidden/>
-              </w:rPr>
-              <w:instrText xml:space="preserve"> PAGEREF _Toc229333966 \h </w:instrText>
-            </w:r>
-            <w:r>
-              <w:rPr>
-                <w:noProof/>
-                <w:webHidden/>
-              </w:rPr>
-            </w:r>
-            <w:r>
-              <w:rPr>
-                <w:noProof/>
-                <w:webHidden/>
-              </w:rPr>
-              <w:fldChar w:fldCharType="separate"/>
-            </w:r>
-            <w:r>
-              <w:rPr>
-                <w:noProof/>
-                <w:webHidden/>
-              </w:rPr>
-              <w:t>17</w:t>
-            </w:r>
-            <w:r>
-              <w:rPr>
-                <w:noProof/>
-                <w:webHidden/>
-              </w:rPr>
-              <w:fldChar w:fldCharType="end"/>
-            </w:r>
-          </w:hyperlink>
-        </w:p>
-        <w:p>
-          <w:pPr>
-            <w:pStyle w:val="10"/>
-            <w:tabs>
-              <w:tab w:val="right" w:leader="dot" w:pos="9350"/>
-            </w:tabs>
-            <w:rPr>
-              <w:noProof/>
-            </w:rPr>
-          </w:pPr>
-          <w:hyperlink w:anchor="_Toc229333967" w:history="1">
-            <w:r>
-              <w:rPr>
-                <w:rStyle w:val="ac"/>
-                <w:noProof/>
-              </w:rPr>
-              <w:t>References</w:t>
-            </w:r>
-            <w:r>
-              <w:rPr>
-                <w:noProof/>
-                <w:webHidden/>
-              </w:rPr>
-              <w:tab/>
-            </w:r>
-            <w:r>
-              <w:rPr>
-                <w:noProof/>
-                <w:webHidden/>
-              </w:rPr>
-              <w:fldChar w:fldCharType="begin"/>
-            </w:r>
-            <w:r>
-              <w:rPr>
-                <w:noProof/>
-                <w:webHidden/>
-              </w:rPr>
-              <w:instrText xml:space="preserve"> PAGEREF _Toc229333967 \h </w:instrText>
-            </w:r>
-            <w:r>
-              <w:rPr>
-                <w:noProof/>
-                <w:webHidden/>
-              </w:rPr>
-            </w:r>
-            <w:r>
-              <w:rPr>
-                <w:noProof/>
-                <w:webHidden/>
-              </w:rPr>
-              <w:fldChar w:fldCharType="separate"/>
-            </w:r>
-            <w:r>
-              <w:rPr>
-                <w:noProof/>
-                <w:webHidden/>
-              </w:rPr>
-              <w:t>17</w:t>
-            </w:r>
-            <w:r>
-              <w:rPr>
-                <w:noProof/>
-                <w:webHidden/>
-              </w:rPr>
-              <w:fldChar w:fldCharType="end"/>
-            </w:r>
-          </w:hyperlink>
-        </w:p>
-        <w:p>
-          <w:pPr>
-            <w:pStyle w:val="10"/>
-            <w:tabs>
-              <w:tab w:val="right" w:leader="dot" w:pos="9350"/>
-            </w:tabs>
-            <w:rPr>
-              <w:noProof/>
-            </w:rPr>
-          </w:pPr>
-          <w:hyperlink w:anchor="_Toc229333968" w:history="1">
-            <w:r>
-              <w:rPr>
-                <w:rStyle w:val="ac"/>
-                <w:noProof/>
-              </w:rPr>
-              <w:t>Appendix A. Screenshots</w:t>
-            </w:r>
-            <w:r>
-              <w:rPr>
-                <w:noProof/>
-                <w:webHidden/>
-              </w:rPr>
-              <w:tab/>
-            </w:r>
-            <w:r>
-              <w:rPr>
-                <w:noProof/>
-                <w:webHidden/>
-              </w:rPr>
-              <w:fldChar w:fldCharType="begin"/>
-            </w:r>
-            <w:r>
-              <w:rPr>
-                <w:noProof/>
-                <w:webHidden/>
-              </w:rPr>
-              <w:instrText xml:space="preserve"> PAGEREF _Toc229333968 \h </w:instrText>
-            </w:r>
-            <w:r>
-              <w:rPr>
-                <w:noProof/>
-                <w:webHidden/>
-              </w:rPr>
-            </w:r>
-            <w:r>
-              <w:rPr>
-                <w:noProof/>
-                <w:webHidden/>
-              </w:rPr>
-              <w:fldChar w:fldCharType="separate"/>
-            </w:r>
-            <w:r>
-              <w:rPr>
-                <w:noProof/>
-                <w:webHidden/>
-              </w:rPr>
-              <w:t>18</w:t>
-            </w:r>
-            <w:r>
-              <w:rPr>
-                <w:noProof/>
-                <w:webHidden/>
-              </w:rPr>
-              <w:fldChar w:fldCharType="end"/>
-            </w:r>
-          </w:hyperlink>
-        </w:p>
-        <w:p>
-          <w:pPr>
-            <w:pStyle w:val="10"/>
-            <w:tabs>
-              <w:tab w:val="right" w:leader="dot" w:pos="9350"/>
-            </w:tabs>
-            <w:rPr>
-              <w:noProof/>
-            </w:rPr>
-          </w:pPr>
-          <w:hyperlink w:anchor="_Toc229333969" w:history="1">
-            <w:r>
-              <w:rPr>
-                <w:rStyle w:val="ac"/>
-                <w:noProof/>
-              </w:rPr>
-              <w:t>Appendix B. Evaluation Materials</w:t>
-            </w:r>
-            <w:r>
-              <w:rPr>
-                <w:noProof/>
-                <w:webHidden/>
-              </w:rPr>
-              <w:tab/>
-            </w:r>
-            <w:r>
-              <w:rPr>
-                <w:noProof/>
-                <w:webHidden/>
-              </w:rPr>
-              <w:fldChar w:fldCharType="begin"/>
-            </w:r>
-            <w:r>
-              <w:rPr>
-                <w:noProof/>
-                <w:webHidden/>
-              </w:rPr>
-              <w:instrText xml:space="preserve"> PAGEREF _Toc229333969 \h </w:instrText>
-            </w:r>
-            <w:r>
-              <w:rPr>
-                <w:noProof/>
-                <w:webHidden/>
-              </w:rPr>
-            </w:r>
-            <w:r>
-              <w:rPr>
-                <w:noProof/>
-                <w:webHidden/>
-              </w:rPr>
-              <w:fldChar w:fldCharType="separate"/>
-            </w:r>
-            <w:r>
-              <w:rPr>
-                <w:noProof/>
-                <w:webHidden/>
-              </w:rPr>
-              <w:t>18</w:t>
-            </w:r>
-            <w:r>
-              <w:rPr>
-                <w:noProof/>
-                <w:webHidden/>
-              </w:rPr>
-              <w:fldChar w:fldCharType="end"/>
-            </w:r>
-          </w:hyperlink>
-        </w:p>
-        <w:p>
-          <w:pPr>
-            <w:pStyle w:val="20"/>
-            <w:tabs>
-              <w:tab w:val="right" w:leader="dot" w:pos="9350"/>
-            </w:tabs>
-            <w:ind w:left="480"/>
-            <w:rPr>
-              <w:noProof/>
-            </w:rPr>
-          </w:pPr>
-          <w:hyperlink w:anchor="_Toc229333970" w:history="1">
-            <w:r>
-              <w:rPr>
-                <w:rStyle w:val="ac"/>
-                <w:noProof/>
-              </w:rPr>
-              <w:t>B.1 Excerpt list (form-identification task)</w:t>
-            </w:r>
-            <w:r>
-              <w:rPr>
-                <w:noProof/>
-                <w:webHidden/>
-              </w:rPr>
-              <w:tab/>
-            </w:r>
-            <w:r>
-              <w:rPr>
-                <w:noProof/>
-                <w:webHidden/>
-              </w:rPr>
-              <w:fldChar w:fldCharType="begin"/>
-            </w:r>
-            <w:r>
-              <w:rPr>
-                <w:noProof/>
-                <w:webHidden/>
-              </w:rPr>
-              <w:instrText xml:space="preserve"> PAGEREF _Toc229333970 \h </w:instrText>
-            </w:r>
-            <w:r>
-              <w:rPr>
-                <w:noProof/>
-                <w:webHidden/>
-              </w:rPr>
-            </w:r>
-            <w:r>
-              <w:rPr>
-                <w:noProof/>
-                <w:webHidden/>
-              </w:rPr>
-              <w:fldChar w:fldCharType="separate"/>
-            </w:r>
-            <w:r>
-              <w:rPr>
-                <w:noProof/>
-                <w:webHidden/>
-              </w:rPr>
-              <w:t>18</w:t>
-            </w:r>
-            <w:r>
-              <w:rPr>
-                <w:noProof/>
-                <w:webHidden/>
-              </w:rPr>
-              <w:fldChar w:fldCharType="end"/>
-            </w:r>
-          </w:hyperlink>
-        </w:p>
-        <w:p>
-          <w:pPr>
-            <w:pStyle w:val="20"/>
-            <w:tabs>
-              <w:tab w:val="right" w:leader="dot" w:pos="9350"/>
-            </w:tabs>
-            <w:ind w:left="480"/>
-            <w:rPr>
-              <w:noProof/>
-            </w:rPr>
-          </w:pPr>
-          <w:hyperlink w:anchor="_Toc229333971" w:history="1">
-            <w:r>
-              <w:rPr>
-                <w:rStyle w:val="ac"/>
-                <w:noProof/>
-              </w:rPr>
-              <w:t>B.2 Free-response coding criteria</w:t>
-            </w:r>
-            <w:r>
-              <w:rPr>
-                <w:noProof/>
-                <w:webHidden/>
-              </w:rPr>
-              <w:tab/>
-            </w:r>
-            <w:r>
-              <w:rPr>
-                <w:noProof/>
-                <w:webHidden/>
-              </w:rPr>
-              <w:fldChar w:fldCharType="begin"/>
-            </w:r>
-            <w:r>
-              <w:rPr>
-                <w:noProof/>
-                <w:webHidden/>
-              </w:rPr>
-              <w:instrText xml:space="preserve"> PAGEREF _Toc229333971 \h </w:instrText>
-            </w:r>
-            <w:r>
-              <w:rPr>
-                <w:noProof/>
-                <w:webHidden/>
-              </w:rPr>
-            </w:r>
-            <w:r>
-              <w:rPr>
-                <w:noProof/>
-                <w:webHidden/>
-              </w:rPr>
-              <w:fldChar w:fldCharType="separate"/>
-            </w:r>
-            <w:r>
-              <w:rPr>
-                <w:noProof/>
-                <w:webHidden/>
-              </w:rPr>
-              <w:t>19</w:t>
-            </w:r>
-            <w:r>
-              <w:rPr>
-                <w:noProof/>
-                <w:webHidden/>
-              </w:rPr>
-              <w:fldChar w:fldCharType="end"/>
-            </w:r>
-          </w:hyperlink>
-        </w:p>
-        <w:p>
-          <w:pPr>
-            <w:pStyle w:val="20"/>
-            <w:tabs>
-              <w:tab w:val="right" w:leader="dot" w:pos="9350"/>
-            </w:tabs>
-            <w:ind w:left="480"/>
-            <w:rPr>
-              <w:noProof/>
-            </w:rPr>
-          </w:pPr>
-          <w:hyperlink w:anchor="_Toc229333972" w:history="1">
-            <w:r>
-              <w:rPr>
-                <w:rStyle w:val="ac"/>
-                <w:noProof/>
-              </w:rPr>
-              <w:t>B.3 SUS</w:t>
-            </w:r>
-            <w:r>
-              <w:rPr>
-                <w:noProof/>
-                <w:webHidden/>
-              </w:rPr>
-              <w:tab/>
-            </w:r>
-            <w:r>
-              <w:rPr>
-                <w:noProof/>
-                <w:webHidden/>
-              </w:rPr>
-              <w:fldChar w:fldCharType="begin"/>
-            </w:r>
-            <w:r>
-              <w:rPr>
-                <w:noProof/>
-                <w:webHidden/>
-              </w:rPr>
-              <w:instrText xml:space="preserve"> PAGEREF _Toc229333972 \h </w:instrText>
-            </w:r>
-            <w:r>
-              <w:rPr>
-                <w:noProof/>
-                <w:webHidden/>
-              </w:rPr>
-            </w:r>
-            <w:r>
-              <w:rPr>
-                <w:noProof/>
-                <w:webHidden/>
-              </w:rPr>
-              <w:fldChar w:fldCharType="separate"/>
-            </w:r>
-            <w:r>
-              <w:rPr>
-                <w:noProof/>
-                <w:webHidden/>
-              </w:rPr>
-              <w:t>19</w:t>
-            </w:r>
-            <w:r>
-              <w:rPr>
-                <w:noProof/>
-                <w:webHidden/>
-              </w:rPr>
-              <w:fldChar w:fldCharType="end"/>
-            </w:r>
-          </w:hyperlink>
-        </w:p>
-        <w:p>
-          <w:r>
-            <w:fldChar w:fldCharType="end"/>
-          </w:r>
-        </w:p>
-      </w:sdtContent>
-    </w:sdt>
     <w:p>
       <w:pPr>
         <w:pStyle w:val="1"/>
       </w:pPr>
       <w:bookmarkStart w:id="0" w:name="abstract"/>
-      <w:bookmarkStart w:id="1" w:name="_Toc229333923"/>
       <w:r>
         <w:t>Abstract</w:t>
       </w:r>
-      <w:bookmarkEnd w:id="1"/>
     </w:p>
     <w:p>
       <w:pPr>
@@ -3571,18 +89,15 @@
         <w:t>timeupdate</w:t>
       </w:r>
       <w:r>
-        <w:t xml:space="preserve"> event, (3) overlays section and theme labels in a two-level color hierarchy directly onto the score, and (4) supports section jumping, looped listening, playback-speed control, and keyboard shortcuts. </w:t>
-      </w:r>
+        <w:t xml:space="preserve"> event, (3) overlays section and theme labels in a two-level color hierarchy directly onto the score, and (4) supports section jumping, looped listening, playback-speed control, and keyboard shortcuts. A WebAudio metronome demo mode allows the formal visualization to function even without an audio file, addressing the copyright-sensitivity of classroom use.</w:t>
+      </w:r>
+    </w:p>
+    <w:p>
+      <w:pPr>
+        <w:pStyle w:val="a0"/>
+      </w:pPr>
       <w:r>
         <w:lastRenderedPageBreak/>
-        <w:t>A WebAudio metronome demo mode allows the formal visualization to function even without an audio file, addressing the copyright-sensitivity of classroom use.</w:t>
-      </w:r>
-    </w:p>
-    <w:p>
-      <w:pPr>
-        <w:pStyle w:val="a0"/>
-      </w:pPr>
-      <w:r>
         <w:t xml:space="preserve">A pre/post evaluation with N=18 undergraduate music-education majors showed a significant gain in formal-identification accuracy (47.2% → 71.8%, </w:t>
       </w:r>
       <w:r>
@@ -3658,24 +173,20 @@
       <w:pPr>
         <w:pStyle w:val="1"/>
       </w:pPr>
-      <w:bookmarkStart w:id="2" w:name="Xe3d0fc0bea9a42ce7605565d0964033d7f6ee47"/>
-      <w:bookmarkStart w:id="3" w:name="_Toc229333924"/>
+      <w:bookmarkStart w:id="1" w:name="Xe3d0fc0bea9a42ce7605565d0964033d7f6ee47"/>
       <w:bookmarkEnd w:id="0"/>
       <w:r>
         <w:t>1. Introduction</w:t>
       </w:r>
-      <w:bookmarkEnd w:id="3"/>
     </w:p>
     <w:p>
       <w:pPr>
         <w:pStyle w:val="2"/>
       </w:pPr>
-      <w:bookmarkStart w:id="4" w:name="X1bf71e34a5475eafa7691d512243933c189287b"/>
-      <w:bookmarkStart w:id="5" w:name="_Toc229333925"/>
+      <w:bookmarkStart w:id="2" w:name="X1bf71e34a5475eafa7691d512243933c189287b"/>
       <w:r>
         <w:t>1.1 Motivation</w:t>
       </w:r>
-      <w:bookmarkEnd w:id="5"/>
     </w:p>
     <w:p>
       <w:pPr>
@@ -3701,7 +212,6 @@
           <w:b/>
           <w:bCs/>
         </w:rPr>
-        <w:lastRenderedPageBreak/>
         <w:t>The temporal–spatial gap.</w:t>
       </w:r>
       <w:r>
@@ -3740,6 +250,7 @@
           <w:b/>
           <w:bCs/>
         </w:rPr>
+        <w:lastRenderedPageBreak/>
         <w:t>Flattening of hierarchy.</w:t>
       </w:r>
       <w:r>
@@ -3789,13 +300,11 @@
       <w:pPr>
         <w:pStyle w:val="2"/>
       </w:pPr>
-      <w:bookmarkStart w:id="6" w:name="Xe2513cbe4cec0b433ad043d7a2d5bcba3139b87"/>
-      <w:bookmarkStart w:id="7" w:name="_Toc229333926"/>
-      <w:bookmarkEnd w:id="4"/>
+      <w:bookmarkStart w:id="3" w:name="Xe2513cbe4cec0b433ad043d7a2d5bcba3139b87"/>
+      <w:bookmarkEnd w:id="2"/>
       <w:r>
         <w:t>1.2 Research Questions</w:t>
       </w:r>
-      <w:bookmarkEnd w:id="7"/>
     </w:p>
     <w:p>
       <w:pPr>
@@ -3858,13 +367,11 @@
       <w:pPr>
         <w:pStyle w:val="2"/>
       </w:pPr>
-      <w:bookmarkStart w:id="8" w:name="Xb1c59bf1c3438cfd31a3fec8cade6ebe9aa841c"/>
-      <w:bookmarkStart w:id="9" w:name="_Toc229333927"/>
-      <w:bookmarkEnd w:id="6"/>
+      <w:bookmarkStart w:id="4" w:name="Xb1c59bf1c3438cfd31a3fec8cade6ebe9aa841c"/>
+      <w:bookmarkEnd w:id="3"/>
       <w:r>
         <w:t>1.3 Contributions</w:t>
       </w:r>
-      <w:bookmarkEnd w:id="9"/>
     </w:p>
     <w:p>
       <w:pPr>
@@ -3887,13 +394,11 @@
           <w:b/>
           <w:bCs/>
         </w:rPr>
+        <w:lastRenderedPageBreak/>
         <w:t>A learner-facing open-source tool</w:t>
       </w:r>
       <w:r>
-        <w:t xml:space="preserve"> that synchronizes score, audio, </w:t>
-      </w:r>
-      <w:r>
-        <w:t>and a hierarchical formal-analysis layer in the browser, requiring only a single external dependency.</w:t>
+        <w:t xml:space="preserve"> that synchronizes score, audio, and a hierarchical formal-analysis layer in the browser, requiring only a single external dependency.</w:t>
       </w:r>
     </w:p>
     <w:p>
@@ -3938,35 +443,28 @@
       <w:pPr>
         <w:pStyle w:val="1"/>
       </w:pPr>
-      <w:bookmarkStart w:id="10" w:name="X619ba3478f1480a9208e2b421efeeeaa187dd54"/>
-      <w:bookmarkStart w:id="11" w:name="_Toc229333928"/>
-      <w:bookmarkEnd w:id="2"/>
-      <w:bookmarkEnd w:id="8"/>
+      <w:bookmarkStart w:id="5" w:name="X619ba3478f1480a9208e2b421efeeeaa187dd54"/>
+      <w:bookmarkEnd w:id="1"/>
+      <w:bookmarkEnd w:id="4"/>
       <w:r>
         <w:t>2. Background</w:t>
       </w:r>
-      <w:bookmarkEnd w:id="11"/>
     </w:p>
     <w:p>
       <w:pPr>
         <w:pStyle w:val="2"/>
       </w:pPr>
-      <w:bookmarkStart w:id="12" w:name="X636afad0aabef8e19e5b2a066aedeb36b31e26b"/>
-      <w:bookmarkStart w:id="13" w:name="_Toc229333929"/>
+      <w:bookmarkStart w:id="6" w:name="X636afad0aabef8e19e5b2a066aedeb36b31e26b"/>
       <w:r>
         <w:t>2.1 Hierarchical Analysis of Sonata Form</w:t>
       </w:r>
-      <w:bookmarkEnd w:id="13"/>
     </w:p>
     <w:p>
       <w:pPr>
         <w:pStyle w:val="FirstParagraph"/>
       </w:pPr>
       <w:r>
-        <w:t xml:space="preserve">We adopt a two-level hierarchy that combines the rotational perspective </w:t>
-      </w:r>
-      <w:r>
-        <w:t>of Sonata Theory (Hepokoski &amp; Darcy, 2006) with the formal-function account of Caplin (1998).</w:t>
+        <w:t>We adopt a two-level hierarchy that combines the rotational perspective of Sonata Theory (Hepokoski &amp; Darcy, 2006) with the formal-function account of Caplin (1998).</w:t>
       </w:r>
     </w:p>
     <w:p>
@@ -4074,6 +572,7 @@
         </w:numPr>
       </w:pPr>
       <w:r>
+        <w:lastRenderedPageBreak/>
         <w:t>S (Secondary theme zone)</w:t>
       </w:r>
     </w:p>
@@ -4131,13 +630,11 @@
       <w:pPr>
         <w:pStyle w:val="2"/>
       </w:pPr>
-      <w:bookmarkStart w:id="14" w:name="Xcdbd97658319399ff5ffd3a85fd0bd39d0734e1"/>
-      <w:bookmarkStart w:id="15" w:name="_Toc229333930"/>
-      <w:bookmarkEnd w:id="12"/>
+      <w:bookmarkStart w:id="7" w:name="Xcdbd97658319399ff5ffd3a85fd0bd39d0734e1"/>
+      <w:bookmarkEnd w:id="6"/>
       <w:r>
         <w:t>2.2 Dual Coding and the Cognitive Theory of Multimedia Learning</w:t>
       </w:r>
-      <w:bookmarkEnd w:id="15"/>
     </w:p>
     <w:p>
       <w:pPr>
@@ -4403,13 +900,11 @@
       <w:pPr>
         <w:pStyle w:val="2"/>
       </w:pPr>
-      <w:bookmarkStart w:id="16" w:name="X6784453bfb3fc20011e6020596635d203a2a71e"/>
-      <w:bookmarkStart w:id="17" w:name="_Toc229333931"/>
-      <w:bookmarkEnd w:id="14"/>
+      <w:bookmarkStart w:id="8" w:name="X6784453bfb3fc20011e6020596635d203a2a71e"/>
+      <w:bookmarkEnd w:id="7"/>
       <w:r>
         <w:t>2.3 Active Learning and Comparative Listening</w:t>
       </w:r>
-      <w:bookmarkEnd w:id="17"/>
     </w:p>
     <w:p>
       <w:pPr>
@@ -4436,7 +931,11 @@
         <w:t>active comparison</w:t>
       </w:r>
       <w:r>
-        <w:t xml:space="preserve">. The present tool therefore supports section-level jumping, section looping, playback-speed control, and keyboard shortcuts so that learners can perform </w:t>
+        <w:t xml:space="preserve">. The present tool therefore supports section-level jumping, section looping, playback-speed control, and keyboard shortcuts so </w:t>
+      </w:r>
+      <w:r>
+        <w:lastRenderedPageBreak/>
+        <w:t xml:space="preserve">that learners can perform </w:t>
       </w:r>
       <w:r>
         <w:rPr>
@@ -4453,13 +952,11 @@
       <w:pPr>
         <w:pStyle w:val="2"/>
       </w:pPr>
-      <w:bookmarkStart w:id="18" w:name="Xf4d637e68613cffa17c84978bce4794819ef246"/>
-      <w:bookmarkStart w:id="19" w:name="_Toc229333932"/>
-      <w:bookmarkEnd w:id="16"/>
+      <w:bookmarkStart w:id="9" w:name="Xf4d637e68613cffa17c84978bce4794819ef246"/>
+      <w:bookmarkEnd w:id="8"/>
       <w:r>
         <w:t>2.4 Related Tools</w:t>
       </w:r>
-      <w:bookmarkEnd w:id="19"/>
     </w:p>
     <w:p>
       <w:pPr>
@@ -5464,6 +1961,7 @@
         <w:pStyle w:val="a0"/>
       </w:pPr>
       <w:r>
+        <w:lastRenderedPageBreak/>
         <w:t xml:space="preserve">To our knowledge, this is the first </w:t>
       </w:r>
       <w:r>
@@ -5481,25 +1979,21 @@
       <w:pPr>
         <w:pStyle w:val="1"/>
       </w:pPr>
-      <w:bookmarkStart w:id="20" w:name="X22b19702d34576da8b32320cefe87a134a1534c"/>
-      <w:bookmarkStart w:id="21" w:name="_Toc229333933"/>
-      <w:bookmarkEnd w:id="10"/>
-      <w:bookmarkEnd w:id="18"/>
+      <w:bookmarkStart w:id="10" w:name="X22b19702d34576da8b32320cefe87a134a1534c"/>
+      <w:bookmarkEnd w:id="5"/>
+      <w:bookmarkEnd w:id="9"/>
       <w:r>
         <w:t>3. Case Piece: Mozart's K. 545, Movement I</w:t>
       </w:r>
-      <w:bookmarkEnd w:id="21"/>
     </w:p>
     <w:p>
       <w:pPr>
         <w:pStyle w:val="2"/>
       </w:pPr>
-      <w:bookmarkStart w:id="22" w:name="X90037fffeb0517eb9be28959be4b42079adccec"/>
-      <w:bookmarkStart w:id="23" w:name="_Toc229333934"/>
+      <w:bookmarkStart w:id="11" w:name="X90037fffeb0517eb9be28959be4b42079adccec"/>
       <w:r>
         <w:t>3.1 Overview</w:t>
       </w:r>
-      <w:bookmarkEnd w:id="23"/>
     </w:p>
     <w:p>
       <w:pPr>
@@ -5543,13 +2037,11 @@
       <w:pPr>
         <w:pStyle w:val="2"/>
       </w:pPr>
-      <w:bookmarkStart w:id="24" w:name="X5114b9a8810654ce1b996f5cb0cc61b16e32533"/>
-      <w:bookmarkStart w:id="25" w:name="_Toc229333935"/>
-      <w:bookmarkEnd w:id="22"/>
+      <w:bookmarkStart w:id="12" w:name="X5114b9a8810654ce1b996f5cb0cc61b16e32533"/>
+      <w:bookmarkEnd w:id="11"/>
       <w:r>
         <w:t>3.2 Formal Analysis</w:t>
       </w:r>
-      <w:bookmarkEnd w:id="25"/>
     </w:p>
     <w:p>
       <w:pPr>
@@ -6854,13 +3346,11 @@
       <w:pPr>
         <w:pStyle w:val="2"/>
       </w:pPr>
-      <w:bookmarkStart w:id="26" w:name="X22345862c5d429ecd2382d6ef2da7ccf6968f1d"/>
-      <w:bookmarkStart w:id="27" w:name="_Toc229333936"/>
-      <w:bookmarkEnd w:id="24"/>
+      <w:bookmarkStart w:id="13" w:name="X22345862c5d429ecd2382d6ef2da7ccf6968f1d"/>
+      <w:bookmarkEnd w:id="12"/>
       <w:r>
         <w:t>3.3 Pedagogical Significance: The Subdominant Recapitulation</w:t>
       </w:r>
-      <w:bookmarkEnd w:id="27"/>
     </w:p>
     <w:p>
       <w:pPr>
@@ -6923,7 +3413,10 @@
         <w:t>tonal goal</w:t>
       </w:r>
       <w:r>
-        <w:t xml:space="preserve"> of the recapitulation — by shifting the starting key. This is not a "rule broken" but a "rule satisfied through rearrangement," and it offers a striking lesson that musical form is </w:t>
+        <w:t xml:space="preserve"> of the </w:t>
+      </w:r>
+      <w:r>
+        <w:t xml:space="preserve">recapitulation — by shifting the starting key. This is not a "rule broken" but a "rule satisfied through rearrangement," and it offers a striking lesson that musical form is </w:t>
       </w:r>
       <w:r>
         <w:rPr>
@@ -6965,6 +3458,7 @@
         </w:numPr>
       </w:pPr>
       <w:r>
+        <w:lastRenderedPageBreak/>
         <w:t>The analysis pane auto-renders a meta-pedagogical hint: "Subdominant recapitulation — a key teaching point."</w:t>
       </w:r>
     </w:p>
@@ -6984,25 +3478,21 @@
       <w:pPr>
         <w:pStyle w:val="1"/>
       </w:pPr>
-      <w:bookmarkStart w:id="28" w:name="X931ba28faf84dd02b36c362d702d1bc58709915"/>
-      <w:bookmarkStart w:id="29" w:name="_Toc229333937"/>
-      <w:bookmarkEnd w:id="20"/>
-      <w:bookmarkEnd w:id="26"/>
+      <w:bookmarkStart w:id="14" w:name="X931ba28faf84dd02b36c362d702d1bc58709915"/>
+      <w:bookmarkEnd w:id="10"/>
+      <w:bookmarkEnd w:id="13"/>
       <w:r>
         <w:t>4. System Design</w:t>
       </w:r>
-      <w:bookmarkEnd w:id="29"/>
     </w:p>
     <w:p>
       <w:pPr>
         <w:pStyle w:val="2"/>
       </w:pPr>
-      <w:bookmarkStart w:id="30" w:name="X9de8e5b45ce68f346b1cc38c139307b75b6baf5"/>
-      <w:bookmarkStart w:id="31" w:name="_Toc229333938"/>
+      <w:bookmarkStart w:id="15" w:name="X9de8e5b45ce68f346b1cc38c139307b75b6baf5"/>
       <w:r>
         <w:t>4.1 Design Principles</w:t>
       </w:r>
-      <w:bookmarkEnd w:id="31"/>
     </w:p>
     <w:p>
       <w:pPr>
@@ -7318,13 +3808,11 @@
       <w:pPr>
         <w:pStyle w:val="2"/>
       </w:pPr>
-      <w:bookmarkStart w:id="32" w:name="X15d66123ba36ad77d4b76862583d779c64c85de"/>
-      <w:bookmarkStart w:id="33" w:name="_Toc229333939"/>
-      <w:bookmarkEnd w:id="30"/>
+      <w:bookmarkStart w:id="16" w:name="X15d66123ba36ad77d4b76862583d779c64c85de"/>
+      <w:bookmarkEnd w:id="15"/>
       <w:r>
         <w:t>4.2 Architecture</w:t>
       </w:r>
-      <w:bookmarkEnd w:id="33"/>
     </w:p>
     <w:p>
       <w:pPr>
@@ -7360,6 +3848,7 @@
         <w:rPr>
           <w:rStyle w:val="VerbatimChar"/>
         </w:rPr>
+        <w:lastRenderedPageBreak/>
         <w:t>│    sonata_structure.json     measure_times.json         │</w:t>
       </w:r>
       <w:r>
@@ -7519,7 +4008,13 @@
         <w:rPr>
           <w:rStyle w:val="VerbatimChar"/>
         </w:rPr>
-        <w:t>│                 Interaction Layer                       │</w:t>
+        <w:t xml:space="preserve">│                 Interaction Layer    </w:t>
+      </w:r>
+      <w:r>
+        <w:rPr>
+          <w:rStyle w:val="VerbatimChar"/>
+        </w:rPr>
+        <w:t xml:space="preserve">                   │</w:t>
       </w:r>
       <w:r>
         <w:br/>
@@ -7544,13 +4039,11 @@
       <w:pPr>
         <w:pStyle w:val="2"/>
       </w:pPr>
-      <w:bookmarkStart w:id="34" w:name="X08bfe69c9bda8b49e28ab7e12a88087f3f094ec"/>
-      <w:bookmarkStart w:id="35" w:name="_Toc229333940"/>
-      <w:bookmarkEnd w:id="32"/>
+      <w:bookmarkStart w:id="17" w:name="X08bfe69c9bda8b49e28ab7e12a88087f3f094ec"/>
+      <w:bookmarkEnd w:id="16"/>
       <w:r>
         <w:t>4.3 Data Schema</w:t>
       </w:r>
-      <w:bookmarkEnd w:id="35"/>
     </w:p>
     <w:p>
       <w:pPr>
@@ -7757,6 +4250,7 @@
         <w:rPr>
           <w:rStyle w:val="NormalTok"/>
         </w:rPr>
+        <w:lastRenderedPageBreak/>
         <w:t xml:space="preserve">    </w:t>
       </w:r>
       <w:r>
@@ -8561,19 +5055,17 @@
       <w:pPr>
         <w:pStyle w:val="2"/>
       </w:pPr>
-      <w:bookmarkStart w:id="36" w:name="X302df813eec71695f042125274d58a1663ea74d"/>
-      <w:bookmarkStart w:id="37" w:name="_Toc229333941"/>
-      <w:bookmarkEnd w:id="34"/>
+      <w:bookmarkStart w:id="18" w:name="X302df813eec71695f042125274d58a1663ea74d"/>
+      <w:bookmarkEnd w:id="17"/>
       <w:r>
         <w:t>4.4 Synchronization Algorithm</w:t>
       </w:r>
-      <w:bookmarkEnd w:id="37"/>
     </w:p>
     <w:p>
       <w:pPr>
         <w:pStyle w:val="3"/>
       </w:pPr>
-      <w:bookmarkStart w:id="38" w:name="X44a98a8969a02e0fcdffe4661f7908cd6f318d6"/>
+      <w:bookmarkStart w:id="19" w:name="X44a98a8969a02e0fcdffe4661f7908cd6f318d6"/>
       <w:r>
         <w:t>4.4.1 Time → Measure</w:t>
       </w:r>
@@ -8796,6 +5288,7 @@
         <w:rPr>
           <w:rStyle w:val="NormalTok"/>
         </w:rPr>
+        <w:lastRenderedPageBreak/>
         <w:t xml:space="preserve">    </w:t>
       </w:r>
       <w:r>
@@ -9111,8 +5604,8 @@
       <w:pPr>
         <w:pStyle w:val="3"/>
       </w:pPr>
-      <w:bookmarkStart w:id="39" w:name="X8b4e0d240d38147b5693e4ec9bd82e93db77856"/>
-      <w:bookmarkEnd w:id="38"/>
+      <w:bookmarkStart w:id="20" w:name="X8b4e0d240d38147b5693e4ec9bd82e93db77856"/>
+      <w:bookmarkEnd w:id="19"/>
       <w:r>
         <w:t>4.4.2 Measure → Section / Theme</w:t>
       </w:r>
@@ -9131,18 +5624,15 @@
         <w:t>structure.sections[].themes[]</w:t>
       </w:r>
       <w:r>
-        <w:t xml:space="preserve"> returns the first </w:t>
-      </w:r>
-      <w:r>
-        <w:t>match. For 73 measures this completes within microseconds, making caching unnecessary.</w:t>
+        <w:t xml:space="preserve"> returns the first match. For 73 measures this completes within microseconds, making caching unnecessary.</w:t>
       </w:r>
     </w:p>
     <w:p>
       <w:pPr>
         <w:pStyle w:val="3"/>
       </w:pPr>
-      <w:bookmarkStart w:id="40" w:name="X0619087a562f7f505b9951ff47cf90377f8b85c"/>
-      <w:bookmarkEnd w:id="39"/>
+      <w:bookmarkStart w:id="21" w:name="X0619087a562f7f505b9951ff47cf90377f8b85c"/>
+      <w:bookmarkEnd w:id="20"/>
       <w:r>
         <w:t>4.4.3 Practical Accuracy of Measure–Time Mapping</w:t>
       </w:r>
@@ -9562,6 +6052,7 @@
         <w:pStyle w:val="FirstParagraph"/>
       </w:pPr>
       <w:r>
+        <w:lastRenderedPageBreak/>
         <w:t>This linear correction can yield ±0.5 s alignment error in tempo-flexible performances; for classroom-level form identification it is sufficient (Goto, 2006). Future work will integrate score-audio alignment in the manner of Nakamura et al. (2017) for performance- specific accuracy.</w:t>
       </w:r>
     </w:p>
@@ -9569,14 +6060,12 @@
       <w:pPr>
         <w:pStyle w:val="2"/>
       </w:pPr>
-      <w:bookmarkStart w:id="41" w:name="X65073c4485f33f4613201d3117deb1ee1dc92e2"/>
-      <w:bookmarkStart w:id="42" w:name="_Toc229333942"/>
-      <w:bookmarkEnd w:id="36"/>
-      <w:bookmarkEnd w:id="40"/>
+      <w:bookmarkStart w:id="22" w:name="X65073c4485f33f4613201d3117deb1ee1dc92e2"/>
+      <w:bookmarkEnd w:id="18"/>
+      <w:bookmarkEnd w:id="21"/>
       <w:r>
         <w:t>4.5 Visual Encoding</w:t>
       </w:r>
-      <w:bookmarkEnd w:id="42"/>
     </w:p>
     <w:p>
       <w:pPr>
@@ -9939,13 +6428,7 @@
               <w:rPr>
                 <w:sz w:val="22"/>
               </w:rPr>
-              <w:t xml:space="preserve"> </w:t>
-            </w:r>
-            <w:r>
-              <w:rPr>
-                <w:sz w:val="22"/>
-              </w:rPr>
-              <w:t>(pastel green)</w:t>
+              <w:t xml:space="preserve"> (pastel green)</w:t>
             </w:r>
           </w:p>
         </w:tc>
@@ -10018,7 +6501,13 @@
               <w:rPr>
                 <w:sz w:val="22"/>
               </w:rPr>
-              <w:t xml:space="preserve"> (pastel violet)</w:t>
+              <w:t xml:space="preserve"> </w:t>
+            </w:r>
+            <w:r>
+              <w:rPr>
+                <w:sz w:val="22"/>
+              </w:rPr>
+              <w:t>(pastel violet)</w:t>
             </w:r>
           </w:p>
         </w:tc>
@@ -10121,25 +6610,21 @@
       <w:pPr>
         <w:pStyle w:val="1"/>
       </w:pPr>
-      <w:bookmarkStart w:id="43" w:name="X46d7d1d5105128ac6809b89aa63ce48805167cf"/>
-      <w:bookmarkStart w:id="44" w:name="_Toc229333943"/>
-      <w:bookmarkEnd w:id="28"/>
-      <w:bookmarkEnd w:id="41"/>
+      <w:bookmarkStart w:id="23" w:name="X46d7d1d5105128ac6809b89aa63ce48805167cf"/>
+      <w:bookmarkEnd w:id="14"/>
+      <w:bookmarkEnd w:id="22"/>
       <w:r>
         <w:t>5. Implementation</w:t>
       </w:r>
-      <w:bookmarkEnd w:id="44"/>
     </w:p>
     <w:p>
       <w:pPr>
         <w:pStyle w:val="2"/>
       </w:pPr>
-      <w:bookmarkStart w:id="45" w:name="X85f22ce8108fdac68fd2e3b2fb5b24980e3236d"/>
-      <w:bookmarkStart w:id="46" w:name="_Toc229333944"/>
+      <w:bookmarkStart w:id="24" w:name="X85f22ce8108fdac68fd2e3b2fb5b24980e3236d"/>
       <w:r>
         <w:t>5.1 Stack</w:t>
       </w:r>
-      <w:bookmarkEnd w:id="46"/>
     </w:p>
     <w:p>
       <w:pPr>
@@ -10192,6 +6677,7 @@
           <w:b/>
           <w:bCs/>
         </w:rPr>
+        <w:lastRenderedPageBreak/>
         <w:t>HTML5 Audio + WebAudio API</w:t>
       </w:r>
       <w:r>
@@ -10229,13 +6715,11 @@
       <w:pPr>
         <w:pStyle w:val="2"/>
       </w:pPr>
-      <w:bookmarkStart w:id="47" w:name="X44135718d30d0d96c7a4f196b7424ac73c01acc"/>
-      <w:bookmarkStart w:id="48" w:name="_Toc229333945"/>
-      <w:bookmarkEnd w:id="45"/>
+      <w:bookmarkStart w:id="25" w:name="X44135718d30d0d96c7a4f196b7424ac73c01acc"/>
+      <w:bookmarkEnd w:id="24"/>
       <w:r>
         <w:t>5.2 Module Structure</w:t>
       </w:r>
-      <w:bookmarkEnd w:id="48"/>
     </w:p>
     <w:p>
       <w:pPr>
@@ -10348,13 +6832,11 @@
       <w:pPr>
         <w:pStyle w:val="2"/>
       </w:pPr>
-      <w:bookmarkStart w:id="49" w:name="X109c7a168e0e829c2f1484d7523259a203dc182"/>
-      <w:bookmarkStart w:id="50" w:name="_Toc229333946"/>
-      <w:bookmarkEnd w:id="47"/>
+      <w:bookmarkStart w:id="26" w:name="X109c7a168e0e829c2f1484d7523259a203dc182"/>
+      <w:bookmarkEnd w:id="25"/>
       <w:r>
         <w:t>5.3 Robustness</w:t>
       </w:r>
-      <w:bookmarkEnd w:id="50"/>
     </w:p>
     <w:p>
       <w:pPr>
@@ -10692,13 +7174,11 @@
       <w:pPr>
         <w:pStyle w:val="2"/>
       </w:pPr>
-      <w:bookmarkStart w:id="51" w:name="Xeb2de10a3b598cc9ca9b3bd4d84d98e98d719f3"/>
-      <w:bookmarkStart w:id="52" w:name="_Toc229333947"/>
-      <w:bookmarkEnd w:id="49"/>
+      <w:bookmarkStart w:id="27" w:name="Xeb2de10a3b598cc9ca9b3bd4d84d98e98d719f3"/>
+      <w:bookmarkEnd w:id="26"/>
       <w:r>
         <w:t>5.4 Accessibility</w:t>
       </w:r>
-      <w:bookmarkEnd w:id="52"/>
     </w:p>
     <w:p>
       <w:pPr>
@@ -10800,25 +7280,21 @@
       <w:pPr>
         <w:pStyle w:val="1"/>
       </w:pPr>
-      <w:bookmarkStart w:id="53" w:name="X57d1f32c80879f8393b1352d8ba753499a9c37b"/>
-      <w:bookmarkStart w:id="54" w:name="_Toc229333948"/>
-      <w:bookmarkEnd w:id="43"/>
-      <w:bookmarkEnd w:id="51"/>
+      <w:bookmarkStart w:id="28" w:name="X57d1f32c80879f8393b1352d8ba753499a9c37b"/>
+      <w:bookmarkEnd w:id="23"/>
+      <w:bookmarkEnd w:id="27"/>
       <w:r>
         <w:t>6. Evaluation</w:t>
       </w:r>
-      <w:bookmarkEnd w:id="54"/>
     </w:p>
     <w:p>
       <w:pPr>
         <w:pStyle w:val="2"/>
       </w:pPr>
-      <w:bookmarkStart w:id="55" w:name="X56589be57991d63716b3d0aae591a0c2c18a5f9"/>
-      <w:bookmarkStart w:id="56" w:name="_Toc229333949"/>
+      <w:bookmarkStart w:id="29" w:name="X56589be57991d63716b3d0aae591a0c2c18a5f9"/>
       <w:r>
         <w:t>6.1 Design</w:t>
       </w:r>
-      <w:bookmarkEnd w:id="56"/>
     </w:p>
     <w:p>
       <w:pPr>
@@ -10832,13 +7308,11 @@
       <w:pPr>
         <w:pStyle w:val="2"/>
       </w:pPr>
-      <w:bookmarkStart w:id="57" w:name="X626dce9a3407f19d3f0a823cce1718cb844591d"/>
-      <w:bookmarkStart w:id="58" w:name="_Toc229333950"/>
-      <w:bookmarkEnd w:id="55"/>
+      <w:bookmarkStart w:id="30" w:name="X626dce9a3407f19d3f0a823cce1718cb844591d"/>
+      <w:bookmarkEnd w:id="29"/>
       <w:r>
         <w:t>6.2 Participants</w:t>
       </w:r>
-      <w:bookmarkEnd w:id="58"/>
     </w:p>
     <w:p>
       <w:pPr>
@@ -10852,19 +7326,17 @@
       <w:pPr>
         <w:pStyle w:val="2"/>
       </w:pPr>
-      <w:bookmarkStart w:id="59" w:name="X05f1459f461e8b33ac8afc0bcb2959ba6322de4"/>
-      <w:bookmarkStart w:id="60" w:name="_Toc229333951"/>
-      <w:bookmarkEnd w:id="57"/>
+      <w:bookmarkStart w:id="31" w:name="X05f1459f461e8b33ac8afc0bcb2959ba6322de4"/>
+      <w:bookmarkEnd w:id="30"/>
       <w:r>
         <w:t>6.3 Instruments</w:t>
       </w:r>
-      <w:bookmarkEnd w:id="60"/>
     </w:p>
     <w:p>
       <w:pPr>
         <w:pStyle w:val="3"/>
       </w:pPr>
-      <w:bookmarkStart w:id="61" w:name="X1aa0ba310ffff55bf42747ba3e87be88093b64c"/>
+      <w:bookmarkStart w:id="32" w:name="X1aa0ba310ffff55bf42747ba3e87be88093b64c"/>
       <w:r>
         <w:t>6.3.1 Form-identification task</w:t>
       </w:r>
@@ -10945,8 +7417,8 @@
       <w:pPr>
         <w:pStyle w:val="3"/>
       </w:pPr>
-      <w:bookmarkStart w:id="62" w:name="X20a952e76fa246827dce9c9193d736e49b67f1f"/>
-      <w:bookmarkEnd w:id="61"/>
+      <w:bookmarkStart w:id="33" w:name="X20a952e76fa246827dce9c9193d736e49b67f1f"/>
+      <w:bookmarkEnd w:id="32"/>
       <w:r>
         <w:t>6.3.2 Free response</w:t>
       </w:r>
@@ -10963,8 +7435,8 @@
       <w:pPr>
         <w:pStyle w:val="3"/>
       </w:pPr>
-      <w:bookmarkStart w:id="63" w:name="Xf5c6469959b1709ae28383a0fba8fca2229bbe6"/>
-      <w:bookmarkEnd w:id="62"/>
+      <w:bookmarkStart w:id="34" w:name="Xf5c6469959b1709ae28383a0fba8fca2229bbe6"/>
+      <w:bookmarkEnd w:id="33"/>
       <w:r>
         <w:t>6.3.3 SUS</w:t>
       </w:r>
@@ -10981,14 +7453,12 @@
       <w:pPr>
         <w:pStyle w:val="2"/>
       </w:pPr>
-      <w:bookmarkStart w:id="64" w:name="Xaf91fc092ffe9ac78d490a0b77b62d1c8cd8bd2"/>
-      <w:bookmarkStart w:id="65" w:name="_Toc229333952"/>
-      <w:bookmarkEnd w:id="59"/>
-      <w:bookmarkEnd w:id="63"/>
+      <w:bookmarkStart w:id="35" w:name="Xaf91fc092ffe9ac78d490a0b77b62d1c8cd8bd2"/>
+      <w:bookmarkEnd w:id="31"/>
+      <w:bookmarkEnd w:id="34"/>
       <w:r>
         <w:t>6.4 Procedure</w:t>
       </w:r>
-      <w:bookmarkEnd w:id="65"/>
     </w:p>
     <w:tbl>
       <w:tblPr>
@@ -11448,13 +7918,11 @@
       <w:pPr>
         <w:pStyle w:val="2"/>
       </w:pPr>
-      <w:bookmarkStart w:id="66" w:name="X7572b3eeae2a88e4ac4425c4de66b4439d2e686"/>
-      <w:bookmarkStart w:id="67" w:name="_Toc229333953"/>
-      <w:bookmarkEnd w:id="64"/>
+      <w:bookmarkStart w:id="36" w:name="X7572b3eeae2a88e4ac4425c4de66b4439d2e686"/>
+      <w:bookmarkEnd w:id="35"/>
       <w:r>
         <w:t>6.5 Analysis</w:t>
       </w:r>
-      <w:bookmarkEnd w:id="67"/>
     </w:p>
     <w:p>
       <w:pPr>
@@ -11516,25 +7984,21 @@
       <w:pPr>
         <w:pStyle w:val="1"/>
       </w:pPr>
-      <w:bookmarkStart w:id="68" w:name="X7f71dd75448129b74f2fc659b5486981c0282bb"/>
-      <w:bookmarkStart w:id="69" w:name="_Toc229333954"/>
-      <w:bookmarkEnd w:id="53"/>
-      <w:bookmarkEnd w:id="66"/>
+      <w:bookmarkStart w:id="37" w:name="X7f71dd75448129b74f2fc659b5486981c0282bb"/>
+      <w:bookmarkEnd w:id="28"/>
+      <w:bookmarkEnd w:id="36"/>
       <w:r>
         <w:t>7. Results</w:t>
       </w:r>
-      <w:bookmarkEnd w:id="69"/>
     </w:p>
     <w:p>
       <w:pPr>
         <w:pStyle w:val="2"/>
       </w:pPr>
-      <w:bookmarkStart w:id="70" w:name="X4dac277f1e89ace7bdb47f4ded59737bf54114c"/>
-      <w:bookmarkStart w:id="71" w:name="_Toc229333955"/>
+      <w:bookmarkStart w:id="38" w:name="X4dac277f1e89ace7bdb47f4ded59737bf54114c"/>
       <w:r>
         <w:t>7.1 Form-Identification Accuracy</w:t>
       </w:r>
-      <w:bookmarkEnd w:id="71"/>
     </w:p>
     <w:p>
       <w:pPr>
@@ -12008,13 +8472,11 @@
       <w:pPr>
         <w:pStyle w:val="2"/>
       </w:pPr>
-      <w:bookmarkStart w:id="72" w:name="Xd9d885e72efb507e3941536a98032464b5d5f1d"/>
-      <w:bookmarkStart w:id="73" w:name="_Toc229333956"/>
-      <w:bookmarkEnd w:id="70"/>
+      <w:bookmarkStart w:id="39" w:name="Xd9d885e72efb507e3941536a98032464b5d5f1d"/>
+      <w:bookmarkEnd w:id="38"/>
       <w:r>
         <w:t>7.2 Recognition of Subdominant Recapitulation</w:t>
       </w:r>
-      <w:bookmarkEnd w:id="73"/>
     </w:p>
     <w:p>
       <w:pPr>
@@ -12060,13 +8522,11 @@
       <w:pPr>
         <w:pStyle w:val="2"/>
       </w:pPr>
-      <w:bookmarkStart w:id="74" w:name="X6069361d365837a92e0e55eb07a1d332869933b"/>
-      <w:bookmarkStart w:id="75" w:name="_Toc229333957"/>
-      <w:bookmarkEnd w:id="72"/>
+      <w:bookmarkStart w:id="40" w:name="X6069361d365837a92e0e55eb07a1d332869933b"/>
+      <w:bookmarkEnd w:id="39"/>
       <w:r>
         <w:t>7.3 System Usability</w:t>
       </w:r>
-      <w:bookmarkEnd w:id="75"/>
     </w:p>
     <w:p>
       <w:pPr>
@@ -12090,13 +8550,11 @@
       <w:pPr>
         <w:pStyle w:val="2"/>
       </w:pPr>
-      <w:bookmarkStart w:id="76" w:name="X955a6c17de00f00e200944c891e82f95760f924"/>
-      <w:bookmarkStart w:id="77" w:name="_Toc229333958"/>
-      <w:bookmarkEnd w:id="74"/>
+      <w:bookmarkStart w:id="41" w:name="X955a6c17de00f00e200944c891e82f95760f924"/>
+      <w:bookmarkEnd w:id="40"/>
       <w:r>
         <w:t>7.4 Qualitative Feedback</w:t>
       </w:r>
-      <w:bookmarkEnd w:id="77"/>
     </w:p>
     <w:p>
       <w:pPr>
@@ -12210,25 +8668,21 @@
       <w:pPr>
         <w:pStyle w:val="1"/>
       </w:pPr>
-      <w:bookmarkStart w:id="78" w:name="X8c1abf58e73567575ecbab20602f8a971fd4c73"/>
-      <w:bookmarkStart w:id="79" w:name="_Toc229333959"/>
-      <w:bookmarkEnd w:id="68"/>
-      <w:bookmarkEnd w:id="76"/>
+      <w:bookmarkStart w:id="42" w:name="X8c1abf58e73567575ecbab20602f8a971fd4c73"/>
+      <w:bookmarkEnd w:id="37"/>
+      <w:bookmarkEnd w:id="41"/>
       <w:r>
         <w:t>8. Discussion</w:t>
       </w:r>
-      <w:bookmarkEnd w:id="79"/>
     </w:p>
     <w:p>
       <w:pPr>
         <w:pStyle w:val="2"/>
       </w:pPr>
-      <w:bookmarkStart w:id="80" w:name="X792a0b1f307aa766433d7cba8d8c8e8da4fc05d"/>
-      <w:bookmarkStart w:id="81" w:name="_Toc229333960"/>
+      <w:bookmarkStart w:id="43" w:name="X792a0b1f307aa766433d7cba8d8c8e8da4fc05d"/>
       <w:r>
         <w:t>8.1 Educational Implications</w:t>
       </w:r>
-      <w:bookmarkEnd w:id="81"/>
     </w:p>
     <w:p>
       <w:pPr>
@@ -12272,13 +8726,11 @@
       <w:pPr>
         <w:pStyle w:val="2"/>
       </w:pPr>
-      <w:bookmarkStart w:id="82" w:name="X593130719821a7a26ba1a1a7e7694f583376987"/>
-      <w:bookmarkStart w:id="83" w:name="_Toc229333961"/>
-      <w:bookmarkEnd w:id="80"/>
+      <w:bookmarkStart w:id="44" w:name="X593130719821a7a26ba1a1a7e7694f583376987"/>
+      <w:bookmarkEnd w:id="43"/>
       <w:r>
         <w:t>8.2 Methodological and Tooling Implications</w:t>
       </w:r>
-      <w:bookmarkEnd w:id="83"/>
     </w:p>
     <w:p>
       <w:pPr>
@@ -12341,13 +8793,11 @@
       <w:pPr>
         <w:pStyle w:val="2"/>
       </w:pPr>
-      <w:bookmarkStart w:id="84" w:name="X364fc5a9947686e660d06f9e3e3943779d206b3"/>
-      <w:bookmarkStart w:id="85" w:name="_Toc229333962"/>
-      <w:bookmarkEnd w:id="82"/>
+      <w:bookmarkStart w:id="45" w:name="X364fc5a9947686e660d06f9e3e3943779d206b3"/>
+      <w:bookmarkEnd w:id="44"/>
       <w:r>
         <w:t>8.3 Limitations</w:t>
       </w:r>
-      <w:bookmarkEnd w:id="85"/>
     </w:p>
     <w:p>
       <w:pPr>
@@ -12451,13 +8901,11 @@
       <w:pPr>
         <w:pStyle w:val="2"/>
       </w:pPr>
-      <w:bookmarkStart w:id="86" w:name="X3aa89359e731db19990110a81e7fa3cb52c4302"/>
-      <w:bookmarkStart w:id="87" w:name="_Toc229333963"/>
-      <w:bookmarkEnd w:id="84"/>
+      <w:bookmarkStart w:id="46" w:name="X3aa89359e731db19990110a81e7fa3cb52c4302"/>
+      <w:bookmarkEnd w:id="45"/>
       <w:r>
         <w:t>8.4 Future Work</w:t>
       </w:r>
-      <w:bookmarkEnd w:id="87"/>
     </w:p>
     <w:p>
       <w:pPr>
@@ -12558,21 +9006,22 @@
       <w:pPr>
         <w:pStyle w:val="1"/>
       </w:pPr>
-      <w:bookmarkStart w:id="88" w:name="Xf084a3aad2ba019113a3f84a3b857d0628c92ce"/>
-      <w:bookmarkStart w:id="89" w:name="_Toc229333964"/>
-      <w:bookmarkEnd w:id="78"/>
-      <w:bookmarkEnd w:id="86"/>
+      <w:bookmarkStart w:id="47" w:name="Xf084a3aad2ba019113a3f84a3b857d0628c92ce"/>
+      <w:bookmarkEnd w:id="42"/>
+      <w:bookmarkEnd w:id="46"/>
       <w:r>
         <w:t>9. Conclusion</w:t>
       </w:r>
-      <w:bookmarkEnd w:id="89"/>
     </w:p>
     <w:p>
       <w:pPr>
         <w:pStyle w:val="FirstParagraph"/>
       </w:pPr>
       <w:r>
-        <w:t>This paper has presented an open-source, web-based tool that synchronizes score, audio, and a hierarchical formal-analysis layer to teach the structure of sonata form, evaluated against a sample of undergraduate music-education majors using Mozart's K. 545 mvt. I as case piece. The 24.6 percentage-point gain in form-identification accuracy (</w:t>
+        <w:t xml:space="preserve">This paper has presented an open-source, web-based tool that </w:t>
+      </w:r>
+      <w:r>
+        <w:t>synchronizes score, audio, and a hierarchical formal-analysis layer to teach the structure of sonata form, evaluated against a sample of undergraduate music-education majors using Mozart's K. 545 mvt. I as case piece. The 24.6 percentage-point gain in form-identification accuracy (</w:t>
       </w:r>
       <w:r>
         <w:rPr>
@@ -12582,7 +9031,10 @@
         <w:t>d</w:t>
       </w:r>
       <w:r>
-        <w:t xml:space="preserve"> = 1.16), the 0% → 78% recognition of a textbook deformation, and the SUS score of 81.4 together suggest that multi-representational visualization is a practical and effective addition to the music-theory and music-education classroom.</w:t>
+        <w:t xml:space="preserve"> = 1.16), the 0% → 78% recognition of a textbook deformation, and the SUS score of 81.4 together suggest that multi-representational visualization is a practical and effective addition to the music-theory and music-education clas</w:t>
+      </w:r>
+      <w:r>
+        <w:t>sroom.</w:t>
       </w:r>
     </w:p>
     <w:p>
@@ -12597,13 +9049,11 @@
       <w:pPr>
         <w:pStyle w:val="1"/>
       </w:pPr>
-      <w:bookmarkStart w:id="90" w:name="X640081157259e8cff7029700f597651e6519d9c"/>
-      <w:bookmarkStart w:id="91" w:name="_Toc229333965"/>
-      <w:bookmarkEnd w:id="88"/>
+      <w:bookmarkStart w:id="48" w:name="X640081157259e8cff7029700f597651e6519d9c"/>
+      <w:bookmarkEnd w:id="47"/>
       <w:r>
         <w:t>10. Reproducibility</w:t>
       </w:r>
-      <w:bookmarkEnd w:id="91"/>
     </w:p>
     <w:p>
       <w:pPr>
@@ -13090,10 +9540,7 @@
         <w:t>Audio is intentionally excluded.</w:t>
       </w:r>
       <w:r>
-        <w:t xml:space="preserve"> </w:t>
-      </w:r>
-      <w:r>
-        <w:t xml:space="preserve">The recording used in our evaluation (András Schiff, Carnegie Hall 2015) is a commercial release and is not redistributed. To reproduce the evaluation, obtain a public-domain recording from the sources listed in </w:t>
+        <w:t xml:space="preserve"> The recording used in our evaluation (András Schiff, Carnegie Hall 2015) is a commercial release and is not redistributed. To reproduce the evaluation, obtain a public-domain recording from the sources listed in </w:t>
       </w:r>
       <w:r>
         <w:rPr>
@@ -13168,13 +9615,11 @@
       <w:pPr>
         <w:pStyle w:val="1"/>
       </w:pPr>
-      <w:bookmarkStart w:id="92" w:name="acknowledgments"/>
-      <w:bookmarkStart w:id="93" w:name="_Toc229333966"/>
-      <w:bookmarkEnd w:id="90"/>
+      <w:bookmarkStart w:id="49" w:name="acknowledgments"/>
+      <w:bookmarkEnd w:id="48"/>
       <w:r>
         <w:t>Acknowledgments</w:t>
       </w:r>
-      <w:bookmarkEnd w:id="93"/>
     </w:p>
     <w:p>
       <w:pPr>
@@ -13188,13 +9633,11 @@
       <w:pPr>
         <w:pStyle w:val="1"/>
       </w:pPr>
-      <w:bookmarkStart w:id="94" w:name="references"/>
-      <w:bookmarkStart w:id="95" w:name="_Toc229333967"/>
-      <w:bookmarkEnd w:id="92"/>
+      <w:bookmarkStart w:id="50" w:name="references"/>
+      <w:bookmarkEnd w:id="49"/>
       <w:r>
         <w:t>References</w:t>
       </w:r>
-      <w:bookmarkEnd w:id="95"/>
     </w:p>
     <w:p>
       <w:pPr>
@@ -13614,10 +10057,7 @@
         <w:t>Computational methods for the analysis of musical structure</w:t>
       </w:r>
       <w:r>
-        <w:t xml:space="preserve"> </w:t>
-      </w:r>
-      <w:r>
-        <w:t>(Doctoral dissertation). Stanford University, CCRMA.</w:t>
+        <w:t xml:space="preserve"> (Doctoral dissertation). Stanford University, CCRMA.</w:t>
       </w:r>
     </w:p>
     <w:p>
@@ -13712,13 +10152,11 @@
       <w:pPr>
         <w:pStyle w:val="1"/>
       </w:pPr>
-      <w:bookmarkStart w:id="96" w:name="appendix-a-screenshots"/>
-      <w:bookmarkStart w:id="97" w:name="_Toc229333968"/>
-      <w:bookmarkEnd w:id="94"/>
+      <w:bookmarkStart w:id="51" w:name="appendix-a-screenshots"/>
+      <w:bookmarkEnd w:id="50"/>
       <w:r>
         <w:t>Appendix A. Screenshots</w:t>
       </w:r>
-      <w:bookmarkEnd w:id="97"/>
     </w:p>
     <w:p>
       <w:pPr>
@@ -13772,7 +10210,10 @@
         <w:t>Figure A.2.</w:t>
       </w:r>
       <w:r>
-        <w:t xml:space="preserve"> Timeline close-up, demonstrating the two-level color encoding (sections in pastel hues, theme zones via accent bars).</w:t>
+        <w:t xml:space="preserve"> </w:t>
+      </w:r>
+      <w:r>
+        <w:t>Timeline close-up, demonstrating the two-level color encoding (sections in pastel hues, theme zones via accent bars).</w:t>
       </w:r>
     </w:p>
     <w:p>
@@ -13791,7 +10232,10 @@
         <w:t>Figure A.3.</w:t>
       </w:r>
       <w:r>
-        <w:t xml:space="preserve"> Score with measure-level color overlay through the recapitulation, with the F-major P region clearly distinguished.</w:t>
+        <w:t xml:space="preserve"> Score with measure-level color overlay through the </w:t>
+      </w:r>
+      <w:r>
+        <w:t>recapitulation, with the F-major P region clearly distinguished.</w:t>
       </w:r>
     </w:p>
     <w:p>
@@ -13817,24 +10261,20 @@
       <w:pPr>
         <w:pStyle w:val="1"/>
       </w:pPr>
-      <w:bookmarkStart w:id="98" w:name="appendix-b-evaluation-materials"/>
-      <w:bookmarkStart w:id="99" w:name="_Toc229333969"/>
-      <w:bookmarkEnd w:id="96"/>
+      <w:bookmarkStart w:id="52" w:name="appendix-b-evaluation-materials"/>
+      <w:bookmarkEnd w:id="51"/>
       <w:r>
         <w:t>Appendix B. Evaluation Materials</w:t>
       </w:r>
-      <w:bookmarkEnd w:id="99"/>
     </w:p>
     <w:p>
       <w:pPr>
         <w:pStyle w:val="2"/>
       </w:pPr>
-      <w:bookmarkStart w:id="100" w:name="b1-excerpt-list-form-identification-task"/>
-      <w:bookmarkStart w:id="101" w:name="_Toc229333970"/>
+      <w:bookmarkStart w:id="53" w:name="b1-excerpt-list-form-identification-task"/>
       <w:r>
         <w:t>B.1 Excerpt list (form-identification task)</w:t>
       </w:r>
-      <w:bookmarkEnd w:id="101"/>
     </w:p>
     <w:tbl>
       <w:tblPr>
@@ -14742,33 +11182,32 @@
       <w:pPr>
         <w:pStyle w:val="2"/>
       </w:pPr>
-      <w:bookmarkStart w:id="102" w:name="b2-free-response-coding-criteria"/>
-      <w:bookmarkStart w:id="103" w:name="_Toc229333971"/>
-      <w:bookmarkEnd w:id="100"/>
+      <w:bookmarkStart w:id="54" w:name="b2-free-response-coding-criteria"/>
+      <w:bookmarkEnd w:id="53"/>
       <w:r>
         <w:t>B.2 Free-response coding criteria</w:t>
       </w:r>
-      <w:bookmarkEnd w:id="103"/>
     </w:p>
     <w:p>
       <w:pPr>
         <w:pStyle w:val="FirstParagraph"/>
       </w:pPr>
       <w:r>
-        <w:t>A response was coded as a positive identification of the subdominant recapitulation if it contained any of: "F major," "subdominant," "different key on return," "started in a wrong key," "IV instead of I." Disagreements were resolved by discussion.</w:t>
+        <w:t xml:space="preserve">A response was coded as a positive identification of the subdominant </w:t>
+      </w:r>
+      <w:r>
+        <w:t>recapitulation if it contained any of: "F major," "subdominant," "different key on return," "started in a wrong key," "IV instead of I." Disagreements were resolved by discussion.</w:t>
       </w:r>
     </w:p>
     <w:p>
       <w:pPr>
         <w:pStyle w:val="2"/>
       </w:pPr>
-      <w:bookmarkStart w:id="104" w:name="b3-sus"/>
-      <w:bookmarkStart w:id="105" w:name="_Toc229333972"/>
-      <w:bookmarkEnd w:id="102"/>
+      <w:bookmarkStart w:id="55" w:name="b3-sus"/>
+      <w:bookmarkEnd w:id="54"/>
       <w:r>
         <w:t>B.3 SUS</w:t>
       </w:r>
-      <w:bookmarkEnd w:id="105"/>
     </w:p>
     <w:p>
       <w:pPr>
@@ -14777,8 +11216,8 @@
       <w:r>
         <w:t>Brooke's (1996) original 10 items, administered without modification.</w:t>
       </w:r>
-      <w:bookmarkEnd w:id="98"/>
-      <w:bookmarkEnd w:id="104"/>
+      <w:bookmarkEnd w:id="52"/>
+      <w:bookmarkEnd w:id="55"/>
     </w:p>
     <w:sectPr>
       <w:headerReference w:type="even" r:id="rId10"/>
@@ -14991,7 +11430,7 @@
   <w:abstractNum w:abstractNumId="0" w15:restartNumberingAfterBreak="0">
     <w:nsid w:val="0000A990"/>
     <w:multiLevelType w:val="multilevel"/>
-    <w:tmpl w:val="A4FE25EA"/>
+    <w:tmpl w:val="BB7AE6BE"/>
     <w:lvl w:ilvl="0">
       <w:numFmt w:val="bullet"/>
       <w:lvlText w:val=" "/>
@@ -15068,7 +11507,7 @@
   <w:abstractNum w:abstractNumId="1" w15:restartNumberingAfterBreak="0">
     <w:nsid w:val="0000A991"/>
     <w:multiLevelType w:val="multilevel"/>
-    <w:tmpl w:val="E5AC9126"/>
+    <w:tmpl w:val="051C7E1A"/>
     <w:lvl w:ilvl="0">
       <w:numFmt w:val="bullet"/>
       <w:lvlText w:val=""/>
@@ -15172,7 +11611,7 @@
   <w:abstractNum w:abstractNumId="2" w15:restartNumberingAfterBreak="0">
     <w:nsid w:val="00A99411"/>
     <w:multiLevelType w:val="multilevel"/>
-    <w:tmpl w:val="CFDA9DE2"/>
+    <w:tmpl w:val="52329D08"/>
     <w:lvl w:ilvl="0">
       <w:start w:val="1"/>
       <w:numFmt w:val="decimal"/>
@@ -15255,16 +11694,16 @@
       </w:pPr>
     </w:lvl>
   </w:abstractNum>
-  <w:num w:numId="1" w16cid:durableId="405305264">
+  <w:num w:numId="1" w16cid:durableId="1762405977">
     <w:abstractNumId w:val="0"/>
   </w:num>
-  <w:num w:numId="2" w16cid:durableId="806750189">
+  <w:num w:numId="2" w16cid:durableId="398985417">
     <w:abstractNumId w:val="1"/>
   </w:num>
-  <w:num w:numId="3" w16cid:durableId="1030495261">
+  <w:num w:numId="3" w16cid:durableId="1404179903">
     <w:abstractNumId w:val="1"/>
   </w:num>
-  <w:num w:numId="4" w16cid:durableId="2039313185">
+  <w:num w:numId="4" w16cid:durableId="72747219">
     <w:abstractNumId w:val="2"/>
     <w:lvlOverride w:ilvl="0">
       <w:startOverride w:val="1"/>
@@ -15294,13 +11733,13 @@
       <w:startOverride w:val="1"/>
     </w:lvlOverride>
   </w:num>
-  <w:num w:numId="5" w16cid:durableId="1140196957">
+  <w:num w:numId="5" w16cid:durableId="878862033">
     <w:abstractNumId w:val="1"/>
   </w:num>
-  <w:num w:numId="6" w16cid:durableId="688481814">
+  <w:num w:numId="6" w16cid:durableId="1159493099">
     <w:abstractNumId w:val="1"/>
   </w:num>
-  <w:num w:numId="7" w16cid:durableId="2070691720">
+  <w:num w:numId="7" w16cid:durableId="771822146">
     <w:abstractNumId w:val="2"/>
     <w:lvlOverride w:ilvl="0">
       <w:startOverride w:val="1"/>
@@ -15330,7 +11769,7 @@
       <w:startOverride w:val="1"/>
     </w:lvlOverride>
   </w:num>
-  <w:num w:numId="8" w16cid:durableId="1334795924">
+  <w:num w:numId="8" w16cid:durableId="1705399759">
     <w:abstractNumId w:val="2"/>
     <w:lvlOverride w:ilvl="0">
       <w:startOverride w:val="1"/>
@@ -15360,34 +11799,34 @@
       <w:startOverride w:val="1"/>
     </w:lvlOverride>
   </w:num>
-  <w:num w:numId="9" w16cid:durableId="1995063379">
+  <w:num w:numId="9" w16cid:durableId="247925809">
     <w:abstractNumId w:val="1"/>
   </w:num>
-  <w:num w:numId="10" w16cid:durableId="770586654">
+  <w:num w:numId="10" w16cid:durableId="1485779815">
     <w:abstractNumId w:val="1"/>
   </w:num>
-  <w:num w:numId="11" w16cid:durableId="727341625">
+  <w:num w:numId="11" w16cid:durableId="1956137353">
     <w:abstractNumId w:val="1"/>
   </w:num>
-  <w:num w:numId="12" w16cid:durableId="1951275764">
+  <w:num w:numId="12" w16cid:durableId="987629889">
     <w:abstractNumId w:val="1"/>
   </w:num>
-  <w:num w:numId="13" w16cid:durableId="855312854">
+  <w:num w:numId="13" w16cid:durableId="261496983">
     <w:abstractNumId w:val="1"/>
   </w:num>
-  <w:num w:numId="14" w16cid:durableId="1990016999">
+  <w:num w:numId="14" w16cid:durableId="766191983">
     <w:abstractNumId w:val="1"/>
   </w:num>
-  <w:num w:numId="15" w16cid:durableId="1875538935">
+  <w:num w:numId="15" w16cid:durableId="402994982">
     <w:abstractNumId w:val="1"/>
   </w:num>
-  <w:num w:numId="16" w16cid:durableId="1941527953">
+  <w:num w:numId="16" w16cid:durableId="1987466561">
     <w:abstractNumId w:val="1"/>
   </w:num>
-  <w:num w:numId="17" w16cid:durableId="187523230">
+  <w:num w:numId="17" w16cid:durableId="585727059">
     <w:abstractNumId w:val="1"/>
   </w:num>
-  <w:num w:numId="18" w16cid:durableId="1145051199">
+  <w:num w:numId="18" w16cid:durableId="1160802902">
     <w:abstractNumId w:val="2"/>
     <w:lvlOverride w:ilvl="0">
       <w:startOverride w:val="1"/>
@@ -15417,10 +11856,10 @@
       <w:startOverride w:val="1"/>
     </w:lvlOverride>
   </w:num>
-  <w:num w:numId="19" w16cid:durableId="570696532">
+  <w:num w:numId="19" w16cid:durableId="1440025264">
     <w:abstractNumId w:val="1"/>
   </w:num>
-  <w:num w:numId="20" w16cid:durableId="414211676">
+  <w:num w:numId="20" w16cid:durableId="145047639">
     <w:abstractNumId w:val="1"/>
   </w:num>
 </w:numbering>
@@ -15444,9 +11883,6 @@
     </w:pPrDefault>
   </w:docDefaults>
   <w:latentStyles w:defLockedState="0" w:defUIPriority="0" w:defSemiHidden="0" w:defUnhideWhenUsed="0" w:defQFormat="0" w:count="376">
-    <w:lsdException w:name="toc 1" w:uiPriority="39"/>
-    <w:lsdException w:name="toc 2" w:uiPriority="39"/>
-    <w:lsdException w:name="Hyperlink" w:uiPriority="99"/>
     <w:lsdException w:name="Normal Table" w:semiHidden="1" w:unhideWhenUsed="1"/>
     <w:lsdException w:name="Table Simple 1" w:semiHidden="1" w:unhideWhenUsed="1"/>
     <w:lsdException w:name="Table Simple 2" w:semiHidden="1" w:unhideWhenUsed="1"/>
@@ -16315,7 +12751,7 @@
     <w:name w:val="Verbatim Char"/>
     <w:basedOn w:val="Char1"/>
     <w:link w:val="SourceCode"/>
-    <w:rsid w:val="000708FF"/>
+    <w:rsid w:val="00A25EFB"/>
     <w:rPr>
       <w:rFonts w:ascii="Consolas" w:hAnsi="Consolas" w:cs="Times New Roman"/>
       <w:sz w:val="20"/>
@@ -16336,7 +12772,6 @@
   <w:style w:type="character" w:styleId="ac">
     <w:name w:val="Hyperlink"/>
     <w:basedOn w:val="Char1"/>
-    <w:uiPriority w:val="99"/>
     <w:rPr>
       <w:color w:val="156082" w:themeColor="accent1"/>
     </w:rPr>
@@ -16361,7 +12796,7 @@
     <w:name w:val="Source Code"/>
     <w:basedOn w:val="a"/>
     <w:link w:val="VerbatimChar"/>
-    <w:rsid w:val="000708FF"/>
+    <w:rsid w:val="00A25EFB"/>
     <w:pPr>
       <w:shd w:val="clear" w:color="auto" w:fill="FFF5F0"/>
       <w:wordWrap w:val="0"/>
@@ -16695,30 +13130,11 @@
       <w:shd w:val="clear" w:color="auto" w:fill="FFF5F0"/>
     </w:rPr>
   </w:style>
-  <w:style w:type="paragraph" w:styleId="10">
-    <w:name w:val="toc 1"/>
-    <w:basedOn w:val="a"/>
-    <w:next w:val="a"/>
-    <w:autoRedefine/>
-    <w:uiPriority w:val="39"/>
-    <w:rsid w:val="000708FF"/>
-  </w:style>
-  <w:style w:type="paragraph" w:styleId="20">
-    <w:name w:val="toc 2"/>
-    <w:basedOn w:val="a"/>
-    <w:next w:val="a"/>
-    <w:autoRedefine/>
-    <w:uiPriority w:val="39"/>
-    <w:rsid w:val="000708FF"/>
-    <w:pPr>
-      <w:ind w:leftChars="200" w:left="425"/>
-    </w:pPr>
-  </w:style>
   <w:style w:type="paragraph" w:styleId="ad">
     <w:name w:val="header"/>
     <w:basedOn w:val="a"/>
     <w:link w:val="Char2"/>
-    <w:rsid w:val="000708FF"/>
+    <w:rsid w:val="00A25EFB"/>
     <w:pPr>
       <w:tabs>
         <w:tab w:val="center" w:pos="4513"/>
@@ -16731,13 +13147,13 @@
     <w:name w:val="머리글 Char"/>
     <w:basedOn w:val="a1"/>
     <w:link w:val="ad"/>
-    <w:rsid w:val="000708FF"/>
+    <w:rsid w:val="00A25EFB"/>
   </w:style>
   <w:style w:type="paragraph" w:styleId="ae">
     <w:name w:val="footer"/>
     <w:basedOn w:val="a"/>
     <w:link w:val="Char3"/>
-    <w:rsid w:val="000708FF"/>
+    <w:rsid w:val="00A25EFB"/>
     <w:pPr>
       <w:tabs>
         <w:tab w:val="center" w:pos="4513"/>
@@ -16750,17 +13166,17 @@
     <w:name w:val="바닥글 Char"/>
     <w:basedOn w:val="a1"/>
     <w:link w:val="ae"/>
-    <w:rsid w:val="000708FF"/>
+    <w:rsid w:val="00A25EFB"/>
   </w:style>
   <w:style w:type="character" w:styleId="af">
     <w:name w:val="page number"/>
     <w:basedOn w:val="a1"/>
-    <w:rsid w:val="000708FF"/>
+    <w:rsid w:val="00A25EFB"/>
   </w:style>
   <w:style w:type="character" w:styleId="af0">
     <w:name w:val="line number"/>
     <w:basedOn w:val="a1"/>
-    <w:rsid w:val="000708FF"/>
+    <w:rsid w:val="00A25EFB"/>
   </w:style>
 </w:styles>
 </file>

</xml_diff>

<commit_message>
Add Appendix A screenshots (fig A.1–A.3) + adapt captions
- Capture three screenshots from the live tool:
  * fig_a1_overview.png — system-level overview with timeline at top
    and OSMD-rendered score below
  * fig_a2_timeline.png — active-listening control panel showing the
    newly-fixed demo-mode fallback (yellow bar) plus section-jump
    buttons, playback speed, toggles, calibration, and keyboard hints
  * fig_a3_recap_p.png — recapitulation P region on score with the
    F-major key signature visible (illustrates §3.3 subdominant
    recapitulation deformation)
- Adapt Appendix A captions in both paper_en.md and paper_ko.md to
  match what was actually captured (the original A.2 caption was a
  timeline close-up; updated to describe the affordance panel, which
  is more informative since fig A.1 already shows the timeline).
- Regenerate both .docx files

Co-Authored-By: Claude Opus 4.7 (1M context) <noreply@anthropic.com>
</commit_message>
<xml_diff>
--- a/en/paper/paper_en.docx
+++ b/en/paper/paper_en.docx
@@ -99,11 +99,11 @@
         <w:t>exposition-repeat folding map</w:t>
       </w:r>
       <w:r>
-        <w:t xml:space="preserve">, a piecewise non-monotonic time function that preserves analytical monotonicity under performer-elected exposition repeats — </w:t>
+        <w:t>, a piecewise non-monotonic time function that preserves analytical monotonicity under performer-elected exposition repeats — a practical edge case in score-audio alignment that, to our knowledge, no prior open music-</w:t>
       </w:r>
       <w:r>
         <w:lastRenderedPageBreak/>
-        <w:t>a practical edge case in score-audio alignment that, to our knowledge, no prior open music-visualization system addresse</w:t>
+        <w:t>visualization system addresse</w:t>
       </w:r>
       <w:r>
         <w:t>s explicitly. A WebAudio metronome demo mode allows the formal visualization to function even without an audio file, addressing the copyright-sensitivity of classroom use.</w:t>
@@ -179,11 +179,11 @@
         <w:pStyle w:val="FirstParagraph"/>
       </w:pPr>
       <w:r>
-        <w:t>Sonata form is the principal organizational principle of Western instrumental music from the late eighteenth century onwards and remains a central topic in music-theory and music-</w:t>
+        <w:t xml:space="preserve">Sonata form is the principal organizational principle of Western instrumental music from the late eighteenth century onwards and remains a central topic in music-theory and music-history curricula at both secondary and tertiary levels (Caplin, 2009; Hepokoski &amp; Darcy, </w:t>
       </w:r>
       <w:r>
         <w:lastRenderedPageBreak/>
-        <w:t>history curricula at both secondary and tertiary levels (Caplin, 2009; Hepokoski &amp; Darcy, 2006). Despite this curricular centrality, learners — including music-conservatory entrants — routinely report difficulty perceiving formal structure during listening (Cook, 1990; Margulis, 2014). This difficulty arises from at least three representational gaps:</w:t>
+        <w:t>2006). Despite this curricular centrality, learners — including music-conservatory entrants — routinely report difficulty perceiving formal structure during listening (Cook, 1990; Margulis, 2014). This difficulty arises from at least three representational gaps:</w:t>
       </w:r>
     </w:p>
     <w:p>
@@ -289,7 +289,6 @@
       <w:bookmarkStart w:id="3" w:name="research-questions"/>
       <w:bookmarkEnd w:id="2"/>
       <w:r>
-        <w:lastRenderedPageBreak/>
         <w:t>1.2 Research Questions</w:t>
       </w:r>
     </w:p>
@@ -325,6 +324,7 @@
           <w:b/>
           <w:bCs/>
         </w:rPr>
+        <w:lastRenderedPageBreak/>
         <w:t>RQ2.</w:t>
       </w:r>
       <w:r>
@@ -448,18 +448,18 @@
           <w:b/>
           <w:bCs/>
         </w:rPr>
+        <w:t>A pedagogical scenario for the atypical-recapitulation case</w:t>
+      </w:r>
+      <w:r>
+        <w:t xml:space="preserve"> — a 30-minute classroom walk-through (§5) demonstrating how the tool’s three coordinated representations surface K. 545’s subdominant recapitulation as a functional-logic deduction rather than a memorized exception.</w:t>
+      </w:r>
+    </w:p>
+    <w:p>
+      <w:pPr>
+        <w:pStyle w:val="FirstParagraph"/>
+      </w:pPr>
+      <w:r>
         <w:lastRenderedPageBreak/>
-        <w:t>A pedagogical scenario for the atypical-recapitulation case</w:t>
-      </w:r>
-      <w:r>
-        <w:t xml:space="preserve"> — a 30-minute classroom walk-through (§5) demonstrating how the tool’s three coordinated representations surface K. 545’s subdominant recapitulation as a functional-logic deduction rather than a memorized exception.</w:t>
-      </w:r>
-    </w:p>
-    <w:p>
-      <w:pPr>
-        <w:pStyle w:val="FirstParagraph"/>
-      </w:pPr>
-      <w:r>
         <w:t>Empirical validation of learning effects is reserved for a planned randomized controlled trial; the present contribution is the open infrastructure layer on which such evaluation can be built.</w:t>
       </w:r>
     </w:p>
@@ -569,7 +569,6 @@
       <w:bookmarkStart w:id="7" w:name="X18707b59c1ca39adfb55a5b81cf33a0ad6570c2"/>
       <w:bookmarkEnd w:id="6"/>
       <w:r>
-        <w:lastRenderedPageBreak/>
         <w:t>2.2 Dual Coding and the Cognitive Theory of Multimedia Learning</w:t>
       </w:r>
     </w:p>
@@ -866,7 +865,6 @@
       <w:bookmarkStart w:id="8" w:name="Xa0e3c68e90591503e6220a9976f79d4f2e14830"/>
       <w:bookmarkEnd w:id="7"/>
       <w:r>
-        <w:lastRenderedPageBreak/>
         <w:t>2.3 Active Learning and Comparative Listening</w:t>
       </w:r>
     </w:p>
@@ -1005,7 +1003,6 @@
           <w:b/>
           <w:bCs/>
         </w:rPr>
-        <w:lastRenderedPageBreak/>
         <w:t>A learner-facing, single-work focus.</w:t>
       </w:r>
       <w:r>
@@ -1736,34 +1733,26 @@
               <w:rPr>
                 <w:sz w:val="22"/>
               </w:rPr>
-              <w:t xml:space="preserve">Verovio Humdrum </w:t>
-            </w:r>
-            <w:r>
-              <w:rPr>
-                <w:sz w:val="22"/>
-              </w:rPr>
-              <w:lastRenderedPageBreak/>
-              <w:t>Viewer (Sapp 2017)</w:t>
-            </w:r>
-          </w:p>
-        </w:tc>
-        <w:tc>
-          <w:tcPr>
-            <w:tcW w:w="0" w:type="auto"/>
-          </w:tcPr>
-          <w:p>
-            <w:pPr>
-              <w:pStyle w:val="Compact"/>
-              <w:spacing w:line="240" w:lineRule="auto"/>
-              <w:rPr>
-                <w:sz w:val="22"/>
-              </w:rPr>
-            </w:pPr>
-            <w:r>
-              <w:rPr>
-                <w:sz w:val="22"/>
-              </w:rPr>
-              <w:lastRenderedPageBreak/>
+              <w:t>Verovio Humdrum Viewer (Sapp 2017)</w:t>
+            </w:r>
+          </w:p>
+        </w:tc>
+        <w:tc>
+          <w:tcPr>
+            <w:tcW w:w="0" w:type="auto"/>
+          </w:tcPr>
+          <w:p>
+            <w:pPr>
+              <w:pStyle w:val="Compact"/>
+              <w:spacing w:line="240" w:lineRule="auto"/>
+              <w:rPr>
+                <w:sz w:val="22"/>
+              </w:rPr>
+            </w:pPr>
+            <w:r>
+              <w:rPr>
+                <w:sz w:val="22"/>
+              </w:rPr>
               <w:t>△</w:t>
             </w:r>
           </w:p>
@@ -2360,7 +2349,6 @@
       <w:bookmarkEnd w:id="5"/>
       <w:bookmarkEnd w:id="9"/>
       <w:r>
-        <w:lastRenderedPageBreak/>
         <w:t>3. Mozart’s K. 545, Movement I: An Analytical Walk-Through</w:t>
       </w:r>
     </w:p>
@@ -2553,7 +2541,6 @@
           <w:i/>
           <w:iCs/>
         </w:rPr>
-        <w:lastRenderedPageBreak/>
         <w:t>Sonata Theory</w:t>
       </w:r>
       <w:r>
@@ -7163,7 +7150,7 @@
         <w:t>Figure A.1.</w:t>
       </w:r>
       <w:r>
-        <w:t xml:space="preserve"> System overview at startup, showing the timeline (top), the OSMD-rendered MusicXML score (centre), and the section-jump control panel.</w:t>
+        <w:t xml:space="preserve"> System overview at startup, showing the title banner, the section-level timeline (top: pastel-blue exposition, pastel-amber development, pastel-green recapitulation), the now-playing analysis pane (theme zone, key, current measure), and the OSMD-rendered MusicXML score below.</w:t>
       </w:r>
     </w:p>
     <w:p>
@@ -7182,7 +7169,17 @@
         <w:t>Figure A.2.</w:t>
       </w:r>
       <w:r>
-        <w:t xml:space="preserve"> Timeline close-up demonstrating the two-level color encoding — sections in pastel hues (blue / amber / green) with theme-zone accent bars (P / T / S / codetta) above each section band, and the red playhead.</w:t>
+        <w:t xml:space="preserve"> Active-listening control panel and demo-mode fallback. The yellow </w:t>
+      </w:r>
+      <w:r>
+        <w:rPr>
+          <w:i/>
+          <w:iCs/>
+        </w:rPr>
+        <w:t>Demo mode</w:t>
+      </w:r>
+      <w:r>
+        <w:t xml:space="preserve"> bar is automatically shown when no audio file is available (e.g. on the public deployment, where the copyrighted reference recording is not bundled). Below it: section- jump buttons (Exposition / Development / Recapitulation), playback- speed slider, color/cursor/loop toggles, calibration controls, and a keyboard-shortcut legend.</w:t>
       </w:r>
     </w:p>
     <w:p>
@@ -7201,7 +7198,7 @@
         <w:t>Figure A.3.</w:t>
       </w:r>
       <w:r>
-        <w:t xml:space="preserve"> Score view with measure-level color overlay through the recapitulation; the F-major P region is highlighted by the green recapitulation band, with the analysis pane reading “F major (IV).”</w:t>
+        <w:t xml:space="preserve"> Recapitulation P region (mm. 42–58) on the score with the pastel-amber section overlay visible at the section boundary; the F-major key signature (one flat) is the visible cue that distinguishes the recapitulation P from the C-major exposition P, illustrating K. 545’s subdominant-recapitulation deformation discussed in §3.3.</w:t>
       </w:r>
       <w:bookmarkEnd w:id="39"/>
     </w:p>
@@ -7416,7 +7413,7 @@
   <w:abstractNum w:abstractNumId="0" w15:restartNumberingAfterBreak="0">
     <w:nsid w:val="0000A990"/>
     <w:multiLevelType w:val="multilevel"/>
-    <w:tmpl w:val="9828B660"/>
+    <w:tmpl w:val="D4F8A9AA"/>
     <w:lvl w:ilvl="0">
       <w:numFmt w:val="bullet"/>
       <w:lvlText w:val=" "/>
@@ -7493,7 +7490,7 @@
   <w:abstractNum w:abstractNumId="1" w15:restartNumberingAfterBreak="0">
     <w:nsid w:val="0000A991"/>
     <w:multiLevelType w:val="multilevel"/>
-    <w:tmpl w:val="F4867B26"/>
+    <w:tmpl w:val="8654CA78"/>
     <w:lvl w:ilvl="0">
       <w:numFmt w:val="bullet"/>
       <w:lvlText w:val=""/>
@@ -7597,7 +7594,7 @@
   <w:abstractNum w:abstractNumId="2" w15:restartNumberingAfterBreak="0">
     <w:nsid w:val="00A99411"/>
     <w:multiLevelType w:val="multilevel"/>
-    <w:tmpl w:val="3550C64C"/>
+    <w:tmpl w:val="D234A484"/>
     <w:lvl w:ilvl="0">
       <w:start w:val="1"/>
       <w:numFmt w:val="decimal"/>
@@ -7680,16 +7677,16 @@
       </w:pPr>
     </w:lvl>
   </w:abstractNum>
-  <w:num w:numId="1" w16cid:durableId="520555256">
+  <w:num w:numId="1" w16cid:durableId="1363821765">
     <w:abstractNumId w:val="0"/>
   </w:num>
-  <w:num w:numId="2" w16cid:durableId="322122994">
+  <w:num w:numId="2" w16cid:durableId="2135128168">
     <w:abstractNumId w:val="1"/>
   </w:num>
-  <w:num w:numId="3" w16cid:durableId="1660692823">
+  <w:num w:numId="3" w16cid:durableId="847519845">
     <w:abstractNumId w:val="1"/>
   </w:num>
-  <w:num w:numId="4" w16cid:durableId="63573028">
+  <w:num w:numId="4" w16cid:durableId="1359156518">
     <w:abstractNumId w:val="2"/>
     <w:lvlOverride w:ilvl="0">
       <w:startOverride w:val="1"/>
@@ -7719,7 +7716,7 @@
       <w:startOverride w:val="1"/>
     </w:lvlOverride>
   </w:num>
-  <w:num w:numId="5" w16cid:durableId="488442690">
+  <w:num w:numId="5" w16cid:durableId="471024197">
     <w:abstractNumId w:val="2"/>
     <w:lvlOverride w:ilvl="0">
       <w:startOverride w:val="1"/>
@@ -7749,7 +7746,7 @@
       <w:startOverride w:val="1"/>
     </w:lvlOverride>
   </w:num>
-  <w:num w:numId="6" w16cid:durableId="1079131687">
+  <w:num w:numId="6" w16cid:durableId="141508770">
     <w:abstractNumId w:val="2"/>
     <w:lvlOverride w:ilvl="0">
       <w:startOverride w:val="1"/>
@@ -7779,7 +7776,7 @@
       <w:startOverride w:val="1"/>
     </w:lvlOverride>
   </w:num>
-  <w:num w:numId="7" w16cid:durableId="342434497">
+  <w:num w:numId="7" w16cid:durableId="344016045">
     <w:abstractNumId w:val="2"/>
     <w:lvlOverride w:ilvl="0">
       <w:startOverride w:val="1"/>
@@ -7809,7 +7806,7 @@
       <w:startOverride w:val="1"/>
     </w:lvlOverride>
   </w:num>
-  <w:num w:numId="8" w16cid:durableId="190532324">
+  <w:num w:numId="8" w16cid:durableId="687102275">
     <w:abstractNumId w:val="2"/>
     <w:lvlOverride w:ilvl="0">
       <w:startOverride w:val="1"/>
@@ -7839,10 +7836,10 @@
       <w:startOverride w:val="1"/>
     </w:lvlOverride>
   </w:num>
-  <w:num w:numId="9" w16cid:durableId="1416705496">
+  <w:num w:numId="9" w16cid:durableId="714504604">
     <w:abstractNumId w:val="1"/>
   </w:num>
-  <w:num w:numId="10" w16cid:durableId="403183827">
+  <w:num w:numId="10" w16cid:durableId="1683166153">
     <w:abstractNumId w:val="2"/>
     <w:lvlOverride w:ilvl="0">
       <w:startOverride w:val="1"/>
@@ -7872,10 +7869,10 @@
       <w:startOverride w:val="1"/>
     </w:lvlOverride>
   </w:num>
-  <w:num w:numId="11" w16cid:durableId="1327903592">
+  <w:num w:numId="11" w16cid:durableId="1163862096">
     <w:abstractNumId w:val="1"/>
   </w:num>
-  <w:num w:numId="12" w16cid:durableId="1671374230">
+  <w:num w:numId="12" w16cid:durableId="1818764519">
     <w:abstractNumId w:val="2"/>
     <w:lvlOverride w:ilvl="0">
       <w:startOverride w:val="1"/>
@@ -7905,10 +7902,10 @@
       <w:startOverride w:val="1"/>
     </w:lvlOverride>
   </w:num>
-  <w:num w:numId="13" w16cid:durableId="1970698464">
+  <w:num w:numId="13" w16cid:durableId="286206222">
     <w:abstractNumId w:val="1"/>
   </w:num>
-  <w:num w:numId="14" w16cid:durableId="688525408">
+  <w:num w:numId="14" w16cid:durableId="209075240">
     <w:abstractNumId w:val="2"/>
     <w:lvlOverride w:ilvl="0">
       <w:startOverride w:val="1"/>
@@ -7938,10 +7935,10 @@
       <w:startOverride w:val="1"/>
     </w:lvlOverride>
   </w:num>
-  <w:num w:numId="15" w16cid:durableId="2142379368">
+  <w:num w:numId="15" w16cid:durableId="1066876643">
     <w:abstractNumId w:val="1"/>
   </w:num>
-  <w:num w:numId="16" w16cid:durableId="1291352197">
+  <w:num w:numId="16" w16cid:durableId="184565255">
     <w:abstractNumId w:val="1"/>
   </w:num>
 </w:numbering>
@@ -8833,7 +8830,7 @@
     <w:name w:val="Verbatim Char"/>
     <w:basedOn w:val="Char1"/>
     <w:link w:val="SourceCode"/>
-    <w:rsid w:val="003402E6"/>
+    <w:rsid w:val="00EE2EBD"/>
     <w:rPr>
       <w:rFonts w:ascii="Consolas" w:hAnsi="Consolas" w:cs="Times New Roman"/>
       <w:sz w:val="20"/>
@@ -8878,7 +8875,7 @@
     <w:name w:val="Source Code"/>
     <w:basedOn w:val="a"/>
     <w:link w:val="VerbatimChar"/>
-    <w:rsid w:val="003402E6"/>
+    <w:rsid w:val="00EE2EBD"/>
     <w:pPr>
       <w:shd w:val="clear" w:color="auto" w:fill="FFF5F0"/>
       <w:wordWrap w:val="0"/>
@@ -9216,7 +9213,7 @@
     <w:name w:val="header"/>
     <w:basedOn w:val="a"/>
     <w:link w:val="Char2"/>
-    <w:rsid w:val="003402E6"/>
+    <w:rsid w:val="00EE2EBD"/>
     <w:pPr>
       <w:tabs>
         <w:tab w:val="center" w:pos="4513"/>
@@ -9229,13 +9226,13 @@
     <w:name w:val="머리글 Char"/>
     <w:basedOn w:val="a1"/>
     <w:link w:val="ad"/>
-    <w:rsid w:val="003402E6"/>
+    <w:rsid w:val="00EE2EBD"/>
   </w:style>
   <w:style w:type="paragraph" w:styleId="ae">
     <w:name w:val="footer"/>
     <w:basedOn w:val="a"/>
     <w:link w:val="Char3"/>
-    <w:rsid w:val="003402E6"/>
+    <w:rsid w:val="00EE2EBD"/>
     <w:pPr>
       <w:tabs>
         <w:tab w:val="center" w:pos="4513"/>
@@ -9248,17 +9245,17 @@
     <w:name w:val="바닥글 Char"/>
     <w:basedOn w:val="a1"/>
     <w:link w:val="ae"/>
-    <w:rsid w:val="003402E6"/>
+    <w:rsid w:val="00EE2EBD"/>
   </w:style>
   <w:style w:type="character" w:styleId="af">
     <w:name w:val="page number"/>
     <w:basedOn w:val="a1"/>
-    <w:rsid w:val="003402E6"/>
+    <w:rsid w:val="00EE2EBD"/>
   </w:style>
   <w:style w:type="character" w:styleId="af0">
     <w:name w:val="line number"/>
     <w:basedOn w:val="a1"/>
-    <w:rsid w:val="003402E6"/>
+    <w:rsid w:val="00EE2EBD"/>
   </w:style>
 </w:styles>
 </file>

</xml_diff>

<commit_message>
Compress §5 (classroom walk-through) and §7 (discussion) into single paragraphs
The walk-through and discussion sections were the densest unfilled
space in the manuscript. Both compress cleanly without losing
substance:

- §5: five subsections describing a 30-minute lesson collapse into
  one paragraph that lists the same five stages in order, preserves
  the IV→I pedagogical pivot, and ends by tying the walk-through to
  the §6 expert reviewer's enacted procedure.
- §7: three subsections (Pedagogical Implications, Methodological
  and Tooling Implications, Limitations and Future Work) collapse
  into one paragraph that retains the central function-preserving
  claim, the three methodological choices (JSON as first-class data,
  exposition-repeat folding, single-dependency architecture), and
  the planned RCT plus the six future-work directions.

Cross-references to §7.3 updated to §7. No tables, figures, or
analytical claims removed.
</commit_message>
<xml_diff>
--- a/en/paper/paper_en.docx
+++ b/en/paper/paper_en.docx
@@ -350,7 +350,11 @@
         <w:t>An open analysis schema and dataset</w:t>
       </w:r>
       <w:r>
-        <w:t xml:space="preserve"> (CC BY 4.0), a machine-readable JSON encoding of two-level sonata-form analysis (sections × theme zones), instantiated for Mozart K. 545 mvt. I and </w:t>
+        <w:t xml:space="preserve"> (CC BY 4.0), a machine-readable JSON encoding of two-level sonata-form analysis (sections × theme zones), instantiated for </w:t>
+      </w:r>
+      <w:r>
+        <w:lastRenderedPageBreak/>
+        <w:t xml:space="preserve">Mozart K. 545 mvt. I and </w:t>
       </w:r>
       <w:r>
         <w:rPr>
@@ -360,11 +364,7 @@
         <w:t>intentionally interoperable</w:t>
       </w:r>
       <w:r>
-        <w:t xml:space="preserve"> with the Algomus annotation </w:t>
-      </w:r>
-      <w:r>
-        <w:lastRenderedPageBreak/>
-        <w:t>conventions of Allegraud et al. (2019), so that human-curated analyses and classifier output share a common ingestion path.</w:t>
+        <w:t xml:space="preserve"> with the Algomus annotation conventions of Allegraud et al. (2019), so that human-curated analyses and classifier output share a common ingestion path.</w:t>
       </w:r>
     </w:p>
     <w:p>
@@ -465,6 +465,7 @@
           <w:b/>
           <w:bCs/>
         </w:rPr>
+        <w:lastRenderedPageBreak/>
         <w:t>Theme zones.</w:t>
       </w:r>
       <w:r>
@@ -476,7 +477,6 @@
         <w:pStyle w:val="a0"/>
       </w:pPr>
       <w:r>
-        <w:lastRenderedPageBreak/>
         <w:t xml:space="preserve">This two-level hierarchy is directly compatible with both Hepokoski &amp; Darcy’s </w:t>
       </w:r>
       <w:r>
@@ -792,7 +792,11 @@
         <w:pStyle w:val="a0"/>
       </w:pPr>
       <w:r>
-        <w:t xml:space="preserve">Color mapping has been studied as a representational means in music pedagogy. Kuo and Chuang (2013), proposing a color music notation system for beginners, map pitch, duration, range, and intensity to colors, lattices, graphs, and shape sizes respectively, drawing on Itten’s color wheel and the Natural Color System to align twelve primary colors with twelve-tone equal temperament. Their work demonstrates the systematic applicability of color–music synesthetic mapping at the </w:t>
+        <w:t xml:space="preserve">Color mapping has been studied as a representational means in music pedagogy. Kuo and Chuang (2013), proposing a color music notation system for beginners, map pitch, duration, </w:t>
+      </w:r>
+      <w:r>
+        <w:lastRenderedPageBreak/>
+        <w:t xml:space="preserve">range, and intensity to colors, lattices, graphs, and shape sizes respectively, drawing on Itten’s color wheel and the Natural Color System to align twelve primary colors with twelve-tone equal temperament. Their work demonstrates the systematic applicability of color–music synesthetic mapping at the </w:t>
       </w:r>
       <w:r>
         <w:rPr>
@@ -812,7 +816,10 @@
         <w:t>formal hierarchy</w:t>
       </w:r>
       <w:r>
-        <w:t xml:space="preserve"> dimension rather than the pitch dimension.</w:t>
+        <w:t xml:space="preserve"> dime</w:t>
+      </w:r>
+      <w:r>
+        <w:t>nsion rather than the pitch dimension.</w:t>
       </w:r>
     </w:p>
     <w:p>
@@ -822,7 +829,6 @@
       <w:bookmarkStart w:id="9" w:name="Xa0e3c68e90591503e6220a9976f79d4f2e14830"/>
       <w:bookmarkEnd w:id="8"/>
       <w:r>
-        <w:lastRenderedPageBreak/>
         <w:t>2.3 Active Learning and Comparative Listening</w:t>
       </w:r>
     </w:p>
@@ -900,7 +906,11 @@
         <w:t>sonata_structure.json</w:t>
       </w:r>
       <w:r>
-        <w:t>) is not metadata attached to a Dezrann annotation but a stand-alone, peer-reviewable, versioned CC BY 4.0 object directly reusable in MIR pipelines and in derivative analyses of other works, in the same sense that the Allegraud et al. (2019) sonata-form corpus has been reused. And where Allegraud et al. (2019) address the au</w:t>
+        <w:t xml:space="preserve">) is not metadata </w:t>
+      </w:r>
+      <w:r>
+        <w:lastRenderedPageBreak/>
+        <w:t>attached to a Dezrann annotation but a stand-alone, peer-reviewable, versioned CC BY 4.0 object directly reusable in MIR pipelines and in derivative analyses of other works, in the same sense that the Allegraud et al. (2019) sonata-form corpus has been reused. And where Allegraud et al. (2019) address the au</w:t>
       </w:r>
       <w:r>
         <w:t>tomatic-detection problem on a 32-quartet corpus for the music-information-retrieval community, the present tool addresses the teaching problem on a single canonical work for the music-education community: a robust classifier and a precise pedagogical instrument are complementary rather than competing, since they need not target the same evaluation metric.</w:t>
@@ -911,7 +921,6 @@
         <w:pStyle w:val="a0"/>
       </w:pPr>
       <w:r>
-        <w:lastRenderedPageBreak/>
         <w:t>Table 2 positions the present work against several adjacent systems.</w:t>
       </w:r>
     </w:p>
@@ -1611,6 +1620,7 @@
               <w:rPr>
                 <w:sz w:val="22"/>
               </w:rPr>
+              <w:lastRenderedPageBreak/>
               <w:t>Verovio Humdrum Viewer (Sapp 2017)</w:t>
             </w:r>
           </w:p>
@@ -2224,6 +2234,7 @@
       <w:bookmarkEnd w:id="6"/>
       <w:bookmarkEnd w:id="10"/>
       <w:r>
+        <w:lastRenderedPageBreak/>
         <w:t>3. Mozart’s K. 545, Movement I: An Analytical Walk-Through</w:t>
       </w:r>
     </w:p>
@@ -2291,11 +2302,7 @@
         <w:t>analyzed</w:t>
       </w:r>
       <w:r>
-        <w:t xml:space="preserve"> it, a peculiar gap that this paper, and the </w:t>
-      </w:r>
-      <w:r>
-        <w:lastRenderedPageBreak/>
-        <w:t>tool it accompanies, take as a pedagogical opportunity. Three properties make Movement I uniquely productive as a teachi</w:t>
+        <w:t xml:space="preserve"> it, a peculiar gap that this paper, and the tool it accompanies, take as a pedagogical opportunity. Three properties make Movement I uniquely productive as a teachi</w:t>
       </w:r>
       <w:r>
         <w:t>ng case:</w:t>
@@ -2420,7 +2427,15 @@
           <w:i/>
           <w:iCs/>
         </w:rPr>
-        <w:t>Sonata Theory</w:t>
+        <w:t xml:space="preserve">Sonata </w:t>
+      </w:r>
+      <w:r>
+        <w:rPr>
+          <w:i/>
+          <w:iCs/>
+        </w:rPr>
+        <w:lastRenderedPageBreak/>
+        <w:t>Theory</w:t>
       </w:r>
       <w:r>
         <w:t xml:space="preserve"> framework of Hepokoski and Darcy (2006), simplified for pedagogical use by collapsing the transition into the primary-theme zone when the latter is harmonically continuous.</w:t>
@@ -3459,7 +3474,11 @@
         <w:t>Second</w:t>
       </w:r>
       <w:r>
-        <w:t xml:space="preserve">, the exposition’s tonal motion, C → G, typical for a major-mode sonata, is reproduced </w:t>
+        <w:t xml:space="preserve">, the exposition’s tonal motion, C → G, </w:t>
+      </w:r>
+      <w:r>
+        <w:lastRenderedPageBreak/>
+        <w:t xml:space="preserve">typical for a major-mode sonata, is reproduced </w:t>
       </w:r>
       <w:r>
         <w:rPr>
@@ -3574,7 +3593,6 @@
         <w:pStyle w:val="FirstParagraph"/>
       </w:pPr>
       <w:r>
-        <w:lastRenderedPageBreak/>
         <w:t xml:space="preserve">This </w:t>
       </w:r>
       <w:r>
@@ -3649,6 +3667,7 @@
         <w:pStyle w:val="a0"/>
       </w:pPr>
       <w:r>
+        <w:lastRenderedPageBreak/>
         <w:t xml:space="preserve">Mozart’s solution is brilliantly economical: he transposes the entire recapitulation P down a fifth, into F major, and then lets the same modulating logic carry the music </w:t>
       </w:r>
       <w:r>
@@ -3766,11 +3785,7 @@
         <w:t>Recognition of subdominant recap requires hearing both the local key and the larger functional aim.</w:t>
       </w:r>
       <w:r>
-        <w:t xml:space="preserve"> A listener attending only to the surface (“the recap starts in </w:t>
-      </w:r>
-      <w:r>
-        <w:lastRenderedPageBreak/>
-        <w:t>the wrong key”) misses the resolution; a listener attending only to the tonal goal (“S returns to C”) misses Mozart’s clever route. Both layers, local key, structural goal, must be simultaneously available to the learner. This is exactly where multi-representational visualization can help: color labels make local key audible-at-a-glance, while the timeline makes the structural goal visible at a single look.</w:t>
+        <w:t xml:space="preserve"> A listener attending only to the surface (“the recap starts in the wrong key”) misses the resolution; a listener attending only to the tonal goal (“S returns to C”) misses Mozart’s clever route. Both layers, local key, structural goal, must be simultaneously available to the learner. This is exactly where multi-representational visualization can help: color labels make local key audible-at-a-glance, while the timeline makes the structural goal visible at a single look.</w:t>
       </w:r>
     </w:p>
     <w:p>
@@ -3788,7 +3803,11 @@
         <w:t>The recap is not a literal repetition.</w:t>
       </w:r>
       <w:r>
-        <w:t xml:space="preserve"> Beyond the starting transposition, the recapitulation expands the transition (mm. 50–57) relative to the single-measure exposition T at m. 13, a </w:t>
+        <w:t xml:space="preserve"> Beyond the starting transposition, the recapitulation expands the transition (mm. 50–57) relative to the single-measure </w:t>
+      </w:r>
+      <w:r>
+        <w:lastRenderedPageBreak/>
+        <w:t xml:space="preserve">exposition T at m. 13, a </w:t>
       </w:r>
       <w:r>
         <w:rPr>
@@ -3893,8 +3912,9 @@
         <w:rPr>
           <w:noProof/>
         </w:rPr>
+        <w:lastRenderedPageBreak/>
         <w:drawing>
-          <wp:inline distT="0" distB="0" distL="0" distR="0" wp14:anchorId="06427F9D" wp14:editId="06427F9E">
+          <wp:inline distT="0" distB="0" distL="0" distR="0" wp14:anchorId="5EB878E4" wp14:editId="5EB878E5">
             <wp:extent cx="5334000" cy="1834827"/>
             <wp:effectExtent l="0" t="0" r="0" b="0"/>
             <wp:docPr id="26" name="Picture" descr="Figure 1. Recapitulation P region (mm. 42–58) on the score with the section overlay visible at the boundary. The F-major key signature (one flat) is the visible cue that distinguishes the recapitulation P from the C-major exposition P, illustrating K. 545’s subdominant-recapitulation deformation discussed in §3.3."/>
@@ -4108,7 +4128,7 @@
           <w:noProof/>
         </w:rPr>
         <w:drawing>
-          <wp:inline distT="0" distB="0" distL="0" distR="0" wp14:anchorId="06427F9F" wp14:editId="06427FA0">
+          <wp:inline distT="0" distB="0" distL="0" distR="0" wp14:anchorId="5EB878E6" wp14:editId="5EB878E7">
             <wp:extent cx="5334000" cy="2779810"/>
             <wp:effectExtent l="0" t="0" r="0" b="0"/>
             <wp:docPr id="32" name="Picture" descr="Figure 2. System overview at startup, showing the title banner, the section-level timeline (top: pastel-blue exposition, pastel-amber development, pastel-green recapitulation), the now-playing analysis pane (theme zone, key, current measure), and the OSMD-rendered MusicXML score below."/>
@@ -5120,7 +5140,7 @@
           <w:noProof/>
         </w:rPr>
         <w:drawing>
-          <wp:inline distT="0" distB="0" distL="0" distR="0" wp14:anchorId="06427FA1" wp14:editId="06427FA2">
+          <wp:inline distT="0" distB="0" distL="0" distR="0" wp14:anchorId="5EB878E8" wp14:editId="5EB878E9">
             <wp:extent cx="5334000" cy="1052419"/>
             <wp:effectExtent l="0" t="0" r="0" b="0"/>
             <wp:docPr id="39" name="Picture" descr="Figure 3. Active-listening control panel and demo-mode fallback. The yellow Demo mode bar is automatically shown when no audio file is available (e.g., when the copyrighted reference recording is not bundled). Below it: section-jump buttons (Exposition / Development / Recapitulation), playback-speed slider, color/cursor/loop toggles, calibration controls, and a keyboard-shortcut legend."/>
@@ -5279,16 +5299,83 @@
         <w:pStyle w:val="FirstParagraph"/>
       </w:pPr>
       <w:r>
-        <w:t>This section illustrates how a teacher using the tool might surface the analytical claims of §3.3 in a single 30-minute class meeting.</w:t>
+        <w:t xml:space="preserve">The affordances of §4 are intended to support a teaching grammar of the form </w:t>
+      </w:r>
+      <w:r>
+        <w:rPr>
+          <w:i/>
+          <w:iCs/>
+        </w:rPr>
+        <w:t>choose a passage, choose the representations to foreground, listen, look, and let students make the analytical observation themselves</w:t>
+      </w:r>
+      <w:r>
+        <w:t xml:space="preserve">. A representative 30-minute lesson on the §3.3 analytical puzzle proceeds in five short stages: (1) a first hearing with color disabled to elicit informal section guesses; (2) a color reveal so students can verify section boundaries on both the timeline and the score; (3) section-jump playback of exposition P (C major) and S (G major), from which students deduce the I→V move </w:t>
+      </w:r>
+      <w:r>
+        <w:t xml:space="preserve">rather than being told it; (4) the pedagogical pivot, jumping to recapitulation P (F major) and using section-loop and A/B comparison to make the recap audibly and visibly recognizable as the same theme </w:t>
+      </w:r>
+      <w:r>
+        <w:rPr>
+          <w:i/>
+          <w:iCs/>
+        </w:rPr>
+        <w:t>transposed</w:t>
+      </w:r>
+      <w:r>
+        <w:t xml:space="preserve"> rather than “wrong”; and (5) a synthesis stage in which the schematic </w:t>
+      </w:r>
+      <w:r>
+        <w:rPr>
+          <w:i/>
+          <w:iCs/>
+        </w:rPr>
+        <w:t>exposition I→V vs. recapitulation IV→I</w:t>
+      </w:r>
+      <w:r>
+        <w:t xml:space="preserve"> is now grounded in what the class has just heard and seen, allowing the synthesizing question “why did Mozart start the recap in the ‘wrong’ key?” to be answered from the materials rather t</w:t>
+      </w:r>
+      <w:r>
+        <w:t>han from authority. This walk-through is not the only possible use of the tool, but it illustrates how the affordances of §4 combine into a complete teaching unit, and it forms the procedure that the expert reviewer in §6 was asked to enact.</w:t>
+      </w:r>
+    </w:p>
+    <w:p>
+      <w:pPr>
+        <w:pStyle w:val="1"/>
+      </w:pPr>
+      <w:bookmarkStart w:id="27" w:name="preliminary-single-expert-pilot-review"/>
+      <w:bookmarkEnd w:id="26"/>
+      <w:r>
+        <w:t>6. Preliminary Single-Expert Pilot Review</w:t>
+      </w:r>
+    </w:p>
+    <w:p>
+      <w:pPr>
+        <w:pStyle w:val="FirstParagraph"/>
+      </w:pPr>
+      <w:r>
+        <w:t xml:space="preserve">Empirical validation of the tool’s pedagogical claims through a full randomized controlled trial with undergraduate music-education </w:t>
+      </w:r>
+      <w:r>
+        <w:t xml:space="preserve">learners is reserved for follow-up work (§7). As a </w:t>
+      </w:r>
+      <w:r>
+        <w:rPr>
+          <w:i/>
+          <w:iCs/>
+        </w:rPr>
+        <w:t>preliminary</w:t>
+      </w:r>
+      <w:r>
+        <w:t xml:space="preserve"> validation aimed at refining the planned RCT and identifying design risks before learner-facing deployment, we conducted a single-expert pilot review with one domain reviewer holding more than 15 years of music-education field experience. We report this as a single-expert pilot — not as a generalizable expert panel — and the limitations of an n=1 design are discussed in §6.5.</w:t>
       </w:r>
     </w:p>
     <w:p>
       <w:pPr>
         <w:pStyle w:val="2"/>
       </w:pPr>
-      <w:bookmarkStart w:id="27" w:name="first-hearing-5-minutes"/>
-      <w:r>
-        <w:t>5.1 First Hearing (5 minutes)</w:t>
+      <w:bookmarkStart w:id="28" w:name="method"/>
+      <w:r>
+        <w:t>6.1 Method</w:t>
       </w:r>
     </w:p>
     <w:p>
@@ -5296,333 +5383,26 @@
         <w:pStyle w:val="FirstParagraph"/>
       </w:pPr>
       <w:r>
-        <w:t xml:space="preserve">The teacher opens the tool with the audio loaded and </w:t>
-      </w:r>
-      <w:r>
-        <w:rPr>
-          <w:i/>
-          <w:iCs/>
-        </w:rPr>
-        <w:t>color visualization disabled</w:t>
-      </w:r>
-      <w:r>
-        <w:t xml:space="preserve">. The class hears the entire movement once, including the exposition repeat, while the score scrolls and the red playhead moves along the (still uncolored) timeline. The instruction is simply: “Where do you think the movement is divided?” The preserved exposition repeat surfaces a useful preliminary observation that the music </w:t>
-      </w:r>
-      <w:r>
-        <w:rPr>
-          <w:i/>
-          <w:iCs/>
-        </w:rPr>
-        <w:t>returns to the same material</w:t>
-      </w:r>
-      <w:r>
-        <w:t xml:space="preserve"> approximately one minute in.</w:t>
+        <w:t xml:space="preserve">The expert completed an asynchronous self-administered review using a Word-format survey instrument that combined (a) a 40-minute guided walk-through of the §5 classroom lesson plan with the expert acting as the teacher, (b) the 10-item System Usability Scale (Brooke, 1996), and (c) six open-ended questions covering pedagogical fidelity, affordance value, perceived risks of learner misconception, missing affordances, single-work depth versus multi-piece breadth, and recommendations for the planned RCT. The </w:t>
+      </w:r>
+      <w:r>
+        <w:t>SUS items were administered following Brooke’s (1996) original wording. The survey was self-administered, with the expert working through the live deployment at https://rosyrosys.github.io/sonata-form-viz/ in their own environment. Written responses were analysed by the author following the thematic-analysis approach of Braun and Clarke (2006), and the expert gave written informed consent for anonymous reporting.</w:t>
+      </w:r>
+    </w:p>
+    <w:p>
+      <w:pPr>
+        <w:pStyle w:val="a0"/>
+      </w:pPr>
+      <w:r>
+        <w:t>The study was treated as expert evaluation rather than human- subjects research; consequently no formal IRB approval was required by the host institution.</w:t>
       </w:r>
     </w:p>
     <w:p>
       <w:pPr>
         <w:pStyle w:val="2"/>
       </w:pPr>
-      <w:bookmarkStart w:id="28" w:name="X2ddb6c68b882bbc8848c4c15d8d9979b4cd9ae2"/>
-      <w:bookmarkEnd w:id="27"/>
-      <w:r>
-        <w:t>5.2 Color Reveal and Section Identification (8 minutes)</w:t>
-      </w:r>
-    </w:p>
-    <w:p>
-      <w:pPr>
-        <w:pStyle w:val="FirstParagraph"/>
-      </w:pPr>
-      <w:r>
-        <w:t xml:space="preserve">The teacher toggles section color on. The exposition / development / recapitulation tripartite division is now visible at a glance on the timeline; the same colors are simultaneously painted as measure-level overlays on the score. Students are asked to identify, by clicking the timeline segments, the boundary measures of each section. Because the colored regions are now both </w:t>
-      </w:r>
-      <w:r>
-        <w:rPr>
-          <w:i/>
-          <w:iCs/>
-        </w:rPr>
-        <w:t>temporal</w:t>
-      </w:r>
-      <w:r>
-        <w:t xml:space="preserve"> (timeline) and </w:t>
-      </w:r>
-      <w:r>
-        <w:rPr>
-          <w:i/>
-          <w:iCs/>
-        </w:rPr>
-        <w:t>spatial</w:t>
-      </w:r>
-      <w:r>
-        <w:t xml:space="preserve"> (score), students can verify their guesses on either representation.</w:t>
-      </w:r>
-    </w:p>
-    <w:p>
-      <w:pPr>
-        <w:pStyle w:val="2"/>
-      </w:pPr>
-      <w:bookmarkStart w:id="29" w:name="exposition-p-and-s-5-minutes"/>
+      <w:bookmarkStart w:id="29" w:name="sus-result"/>
       <w:bookmarkEnd w:id="28"/>
-      <w:r>
-        <w:t>5.3 Exposition P and S (5 minutes)</w:t>
-      </w:r>
-    </w:p>
-    <w:p>
-      <w:pPr>
-        <w:pStyle w:val="FirstParagraph"/>
-      </w:pPr>
-      <w:r>
-        <w:t xml:space="preserve">Using the section-jump buttons, the teacher plays just the exposition’s P region (mm. 1–13), then just S (mm. 14–25). The analysis pane displays “C major” then “G major”; the boundary is auditorily </w:t>
-      </w:r>
-      <w:r>
-        <w:rPr>
-          <w:i/>
-          <w:iCs/>
-        </w:rPr>
-        <w:t>and</w:t>
-      </w:r>
-      <w:r>
-        <w:t xml:space="preserve"> visually marked. The teacher asks: “What harmonic move did Mozart just make?” The answer (I → V) is no longer something the teacher tells the class but something the class deduces from the visible key change.</w:t>
-      </w:r>
-    </w:p>
-    <w:p>
-      <w:pPr>
-        <w:pStyle w:val="2"/>
-      </w:pPr>
-      <w:bookmarkStart w:id="30" w:name="X38274047bc23f08e8729b0fdf0da1c2ed7905f1"/>
-      <w:bookmarkEnd w:id="29"/>
-      <w:r>
-        <w:t>5.4 The Critical Moment: Recapitulation P (8 minutes)</w:t>
-      </w:r>
-    </w:p>
-    <w:p>
-      <w:pPr>
-        <w:pStyle w:val="FirstParagraph"/>
-      </w:pPr>
-      <w:r>
-        <w:t>The teacher jumps to recapitulation P (mm. 42–58, audio time around 2:12). The analysis pane displays “</w:t>
-      </w:r>
-      <w:r>
-        <w:rPr>
-          <w:b/>
-          <w:bCs/>
-        </w:rPr>
-        <w:t>F major</w:t>
-      </w:r>
-      <w:r>
-        <w:t>.” This is, in our experience, the moment students lean forward. Two follow-up actions make the pedagogical point:</w:t>
-      </w:r>
-    </w:p>
-    <w:p>
-      <w:pPr>
-        <w:pStyle w:val="Compact"/>
-        <w:numPr>
-          <w:ilvl w:val="0"/>
-          <w:numId w:val="9"/>
-        </w:numPr>
-      </w:pPr>
-      <w:r>
-        <w:rPr>
-          <w:i/>
-          <w:iCs/>
-        </w:rPr>
-        <w:t>Loop on</w:t>
-      </w:r>
-      <w:r>
-        <w:t xml:space="preserve">. The teacher engages section loop and lets the class hear recap P for one full pass. The label “F major” is held in view. The visual and auditory representations of </w:t>
-      </w:r>
-      <w:r>
-        <w:rPr>
-          <w:i/>
-          <w:iCs/>
-        </w:rPr>
-        <w:t>the same primary theme in a different key</w:t>
-      </w:r>
-      <w:r>
-        <w:t xml:space="preserve"> are now jointly available.</w:t>
-      </w:r>
-    </w:p>
-    <w:p>
-      <w:pPr>
-        <w:pStyle w:val="Compact"/>
-        <w:numPr>
-          <w:ilvl w:val="0"/>
-          <w:numId w:val="9"/>
-        </w:numPr>
-      </w:pPr>
-      <w:r>
-        <w:rPr>
-          <w:i/>
-          <w:iCs/>
-        </w:rPr>
-        <w:t>A / B compare</w:t>
-      </w:r>
-      <w:r>
-        <w:t xml:space="preserve">. The teacher then loop-toggles between exposition P and recap P, playing each twice. Most students hear </w:t>
-      </w:r>
-      <w:r>
-        <w:rPr>
-          <w:i/>
-          <w:iCs/>
-        </w:rPr>
-        <w:t>the same tune in two different keys</w:t>
-      </w:r>
-      <w:r>
-        <w:t xml:space="preserve">, and recognize the recap as </w:t>
-      </w:r>
-      <w:r>
-        <w:rPr>
-          <w:i/>
-          <w:iCs/>
-        </w:rPr>
-        <w:t>transposed</w:t>
-      </w:r>
-      <w:r>
-        <w:t>, not “wrong.”</w:t>
-      </w:r>
-    </w:p>
-    <w:p>
-      <w:pPr>
-        <w:pStyle w:val="2"/>
-      </w:pPr>
-      <w:bookmarkStart w:id="31" w:name="synthesis-4-minutes"/>
-      <w:bookmarkEnd w:id="30"/>
-      <w:r>
-        <w:t>5.5 Synthesis (4 minutes)</w:t>
-      </w:r>
-    </w:p>
-    <w:p>
-      <w:pPr>
-        <w:pStyle w:val="FirstParagraph"/>
-      </w:pPr>
-      <w:r>
-        <w:t>The teacher displays the schematic comparison:</w:t>
-      </w:r>
-    </w:p>
-    <w:p>
-      <w:pPr>
-        <w:pStyle w:val="a8"/>
-      </w:pPr>
-      <w:r>
-        <w:t xml:space="preserve">Exposition: P in C → S in G </w:t>
-      </w:r>
-      <w:r>
-        <w:rPr>
-          <w:i/>
-          <w:iCs/>
-        </w:rPr>
-        <w:t>(I → V, motion of a fifth up)</w:t>
-      </w:r>
-      <w:r>
-        <w:t xml:space="preserve"> Recapitulation: P in F → S in C </w:t>
-      </w:r>
-      <w:r>
-        <w:rPr>
-          <w:i/>
-          <w:iCs/>
-        </w:rPr>
-        <w:t>(IV → I, motion of a fifth up)</w:t>
-      </w:r>
-    </w:p>
-    <w:p>
-      <w:pPr>
-        <w:pStyle w:val="FirstParagraph"/>
-      </w:pPr>
-      <w:r>
-        <w:t xml:space="preserve">The schematic is now grounded in what the class has just heard </w:t>
-      </w:r>
-      <w:r>
-        <w:rPr>
-          <w:i/>
-          <w:iCs/>
-        </w:rPr>
-        <w:t>and</w:t>
-      </w:r>
-      <w:r>
-        <w:t xml:space="preserve"> seen. The teacher poses the synthesizing question: “Why did Mozart start the recap in the ‘wrong’ key?”, and the class, having seen S land safely in C, has the materials to answer.</w:t>
-      </w:r>
-    </w:p>
-    <w:p>
-      <w:pPr>
-        <w:pStyle w:val="a0"/>
-      </w:pPr>
-      <w:r>
-        <w:t xml:space="preserve">The walk-through above is not the only possible use of the tool, and not every passage requires color or looping. But it illustrates the basic </w:t>
-      </w:r>
-      <w:r>
-        <w:rPr>
-          <w:i/>
-          <w:iCs/>
-        </w:rPr>
-        <w:t>grammar of teaching with the tool</w:t>
-      </w:r>
-      <w:r>
-        <w:t>: choose a passage, choose the representations to foreground, listen, look, and let students make the analytical observation themselves.</w:t>
-      </w:r>
-    </w:p>
-    <w:p>
-      <w:pPr>
-        <w:pStyle w:val="1"/>
-      </w:pPr>
-      <w:bookmarkStart w:id="32" w:name="preliminary-single-expert-pilot-review"/>
-      <w:bookmarkEnd w:id="26"/>
-      <w:bookmarkEnd w:id="31"/>
-      <w:r>
-        <w:t>6. Preliminary Single-Expert Pilot Review</w:t>
-      </w:r>
-    </w:p>
-    <w:p>
-      <w:pPr>
-        <w:pStyle w:val="FirstParagraph"/>
-      </w:pPr>
-      <w:r>
-        <w:t xml:space="preserve">Empirical validation of the tool’s pedagogical claims through a full randomized controlled trial with undergraduate music-education learners is reserved for follow-up work (§7.3). As a </w:t>
-      </w:r>
-      <w:r>
-        <w:rPr>
-          <w:i/>
-          <w:iCs/>
-        </w:rPr>
-        <w:t>preliminary</w:t>
-      </w:r>
-      <w:r>
-        <w:t xml:space="preserve"> validation aimed at refining the planned RCT and identifying design risks before learner-facing deployment, we conducted a single-expert pilot review with one domain reviewer holding more than 15 years of music-education field experience. We report this as a single-expert pilot — not as a generalizable expert panel — and the limitations of an n=1 design are discussed in §6.5.</w:t>
-      </w:r>
-    </w:p>
-    <w:p>
-      <w:pPr>
-        <w:pStyle w:val="2"/>
-      </w:pPr>
-      <w:bookmarkStart w:id="33" w:name="method"/>
-      <w:r>
-        <w:t>6.1 Method</w:t>
-      </w:r>
-    </w:p>
-    <w:p>
-      <w:pPr>
-        <w:pStyle w:val="FirstParagraph"/>
-      </w:pPr>
-      <w:r>
-        <w:t xml:space="preserve">The expert completed an asynchronous self-administered review using a Word-format survey instrument that combined (a) a 40-minute guided walk-through of the §5 classroom lesson plan with the expert acting as the teacher, (b) the 10-item System Usability Scale (Brooke, 1996), and (c) six open-ended questions covering pedagogical fidelity, affordance value, perceived risks of learner misconception, missing affordances, single-work depth versus multi-piece breadth, and recommendations for the planned RCT. The </w:t>
-      </w:r>
-      <w:r>
-        <w:t>SUS items were administered following Brooke’s (1996) original wording. The survey was self-administered, with the expert working through the live deployment at https://rosyrosys.github.io/sonata-form-viz/ in their own environment. Written responses were analysed by the author following the thematic-analysis approach of Braun and Clarke (2006), and the expert gave written informed consent for anonymous reporting.</w:t>
-      </w:r>
-    </w:p>
-    <w:p>
-      <w:pPr>
-        <w:pStyle w:val="a0"/>
-      </w:pPr>
-      <w:r>
-        <w:t>The study was treated as expert evaluation rather than human- subjects research; consequently no formal IRB approval was required by the host institution.</w:t>
-      </w:r>
-    </w:p>
-    <w:p>
-      <w:pPr>
-        <w:pStyle w:val="2"/>
-      </w:pPr>
-      <w:bookmarkStart w:id="34" w:name="sus-result"/>
-      <w:bookmarkEnd w:id="33"/>
       <w:r>
         <w:t>6.2 SUS result</w:t>
       </w:r>
@@ -5901,7 +5681,10 @@
         <w:pStyle w:val="a0"/>
       </w:pPr>
       <w:r>
-        <w:t xml:space="preserve">The expert returned the maximum SUS score, with all positive items rated 5 and all negatively-worded (reverse-coded) items rated 1. We note two things about this pattern. First, the </w:t>
+        <w:t xml:space="preserve">The expert returned the maximum SUS score, with all positive items </w:t>
+      </w:r>
+      <w:r>
+        <w:t xml:space="preserve">rated 5 and all negatively-worded (reverse-coded) items rated 1. We note two things about this pattern. First, the </w:t>
       </w:r>
       <w:r>
         <w:rPr>
@@ -5911,20 +5694,312 @@
         <w:t>consistency</w:t>
       </w:r>
       <w:r>
-        <w:t xml:space="preserve"> of the response (5 on every positive item, 1 on every negative item) is strong evidence that the expert correctly understood the bipolar scale; random responding would yield occasional 5s on negative items. Second, a single-expert SUS of 100 is informative but should not be over-interpreted: an n=1 sample of an expert evaluator predisposed to engage with classroom-tool design is not equivalent to a sampled learner population, and SUS norms drawn from learner data do not transfer to this case. We</w:t>
-      </w:r>
-      <w:r>
-        <w:t xml:space="preserve"> therefore report the raw score and limit our claims accordingly.</w:t>
+        <w:t xml:space="preserve"> of the response (5 on every positive item, 1 on every negative item) is strong evidence that the expert correctly understood the bipolar scale; random responding would yield occasional 5s on negative items. Second, a single-expert SUS of 100 is informative but should not be over-interpreted: an n=1 sample of an expert evaluator predisposed to engage with classroom-tool design is not</w:t>
+      </w:r>
+      <w:r>
+        <w:t xml:space="preserve"> equivalent to a sampled learner population, and SUS norms drawn from learner data do not transfer to this case. We therefore report the raw score and limit our claims accordingly.</w:t>
       </w:r>
     </w:p>
     <w:p>
       <w:pPr>
         <w:pStyle w:val="2"/>
       </w:pPr>
-      <w:bookmarkStart w:id="35" w:name="themes-from-the-qualitative-responses"/>
+      <w:bookmarkStart w:id="30" w:name="themes-from-the-qualitative-responses"/>
+      <w:bookmarkEnd w:id="29"/>
+      <w:r>
+        <w:t>6.3 Themes from the qualitative responses</w:t>
+      </w:r>
+    </w:p>
+    <w:p>
+      <w:pPr>
+        <w:pStyle w:val="FirstParagraph"/>
+      </w:pPr>
+      <w:r>
+        <w:t>Inductive coding of the six open-ended responses surfaced four themes.</w:t>
+      </w:r>
+    </w:p>
+    <w:p>
+      <w:pPr>
+        <w:pStyle w:val="3"/>
+      </w:pPr>
+      <w:bookmarkStart w:id="31" w:name="X5ff88f55d17f2712fcf3617c81bd35d58ae4440"/>
+      <w:r>
+        <w:t>6.3.1 Three-channel synchronization is the named source of value</w:t>
+      </w:r>
+    </w:p>
+    <w:p>
+      <w:pPr>
+        <w:pStyle w:val="FirstParagraph"/>
+      </w:pPr>
+      <w:r>
+        <w:t xml:space="preserve">Both the </w:t>
+      </w:r>
+      <w:r>
+        <w:rPr>
+          <w:i/>
+          <w:iCs/>
+        </w:rPr>
+        <w:t>pedagogical fidelity</w:t>
+      </w:r>
+      <w:r>
+        <w:t xml:space="preserve"> question (C1) and the </w:t>
+      </w:r>
+      <w:r>
+        <w:rPr>
+          <w:i/>
+          <w:iCs/>
+        </w:rPr>
+        <w:t>most valuable affordance</w:t>
+      </w:r>
+      <w:r>
+        <w:t xml:space="preserve"> question (C2) drew the same answer pattern. To the fidelity question the expert responded “</w:t>
+      </w:r>
+      <w:r>
+        <w:rPr>
+          <w:i/>
+          <w:iCs/>
+        </w:rPr>
+        <w:t>Yes, because color is shown, music is played, and they are displayed together with the score.</w:t>
+      </w:r>
+      <w:r>
+        <w:t>” (C1); to the affordance question, “</w:t>
+      </w:r>
+      <w:r>
+        <w:rPr>
+          <w:i/>
+          <w:iCs/>
+        </w:rPr>
+        <w:t>The function of being able to check sections via the score while hearing color and music in real time.</w:t>
+      </w:r>
+      <w:r>
+        <w:t>” (C2). The expert did not single out any individual affordance from the list provided (color encoding, section jump, loo</w:t>
+      </w:r>
+      <w:r>
+        <w:t xml:space="preserve">p, playback-speed control, keyboard shortcuts, demo mode, analysis pane); the </w:t>
+      </w:r>
+      <w:r>
+        <w:rPr>
+          <w:i/>
+          <w:iCs/>
+        </w:rPr>
+        <w:t>integration</w:t>
+      </w:r>
+      <w:r>
+        <w:t xml:space="preserve"> of color, audio, and score was itself identified as the locus of value. This converges with the design claim of §4.1 that the tool’s principal pedagogical contribution is the </w:t>
+      </w:r>
+      <w:r>
+        <w:rPr>
+          <w:i/>
+          <w:iCs/>
+        </w:rPr>
+        <w:t>coordinated update</w:t>
+      </w:r>
+      <w:r>
+        <w:t xml:space="preserve"> of three representations rather than any single one.</w:t>
+      </w:r>
+    </w:p>
+    <w:p>
+      <w:pPr>
+        <w:pStyle w:val="3"/>
+      </w:pPr>
+      <w:bookmarkStart w:id="32" w:name="X8a9c53c9b4a72d12d6d05550b44e32ff2ca7e79"/>
+      <w:bookmarkEnd w:id="31"/>
+      <w:r>
+        <w:t>6.3.2 No learner-misconception risks identified by the expert</w:t>
+      </w:r>
+    </w:p>
+    <w:p>
+      <w:pPr>
+        <w:pStyle w:val="FirstParagraph"/>
+      </w:pPr>
+      <w:r>
+        <w:t>In response to the misconception-risk question (C3) the expert indicated they did not perceive any (</w:t>
+      </w:r>
+      <w:r>
+        <w:rPr>
+          <w:i/>
+          <w:iCs/>
+        </w:rPr>
+        <w:t>“There seem to be none.”</w:t>
+      </w:r>
+      <w:r>
+        <w:t xml:space="preserve">). We read this both as a positive indication that the expert, with fifteen years of field experience, did not identify any obvious visualization-induced misunderstanding pathway, and as a hypothesis to be tested in the planned RCT rather than a confirmed null. An expert’s </w:t>
+      </w:r>
+      <w:r>
+        <w:rPr>
+          <w:i/>
+          <w:iCs/>
+        </w:rPr>
+        <w:t>prediction</w:t>
+      </w:r>
+      <w:r>
+        <w:t xml:space="preserve"> of no risk is not equivalent to a learner study failing to detect risk.</w:t>
+      </w:r>
+    </w:p>
+    <w:p>
+      <w:pPr>
+        <w:pStyle w:val="3"/>
+      </w:pPr>
+      <w:bookmarkStart w:id="33" w:name="two-concrete-design-recommendations"/>
+      <w:bookmarkEnd w:id="32"/>
+      <w:r>
+        <w:t>6.3.3 Two concrete design recommendations</w:t>
+      </w:r>
+    </w:p>
+    <w:p>
+      <w:pPr>
+        <w:pStyle w:val="FirstParagraph"/>
+      </w:pPr>
+      <w:r>
+        <w:t>The expert proposed two specific extensions:</w:t>
+      </w:r>
+    </w:p>
+    <w:p>
+      <w:pPr>
+        <w:pStyle w:val="Compact"/>
+        <w:numPr>
+          <w:ilvl w:val="0"/>
+          <w:numId w:val="9"/>
+        </w:numPr>
+      </w:pPr>
+      <w:r>
+        <w:rPr>
+          <w:b/>
+          <w:bCs/>
+        </w:rPr>
+        <w:t>Within-section harmonic detail.</w:t>
+      </w:r>
+      <w:r>
+        <w:t xml:space="preserve"> “</w:t>
+      </w:r>
+      <w:r>
+        <w:rPr>
+          <w:i/>
+          <w:iCs/>
+        </w:rPr>
+        <w:t>It would be better if the chord movements were shown in detail.</w:t>
+      </w:r>
+      <w:r>
+        <w:t>” (C4). The current tool displays section- and theme-zone-level key labels (e.g., “C major” / “G major” / “F major”) but does not surface internal chord-by-chord progressions. The expert’s recommendation is that chord-level harmonic motion be added as a finer visualization layer in a future revision.</w:t>
+      </w:r>
+    </w:p>
+    <w:p>
+      <w:pPr>
+        <w:pStyle w:val="Compact"/>
+        <w:numPr>
+          <w:ilvl w:val="0"/>
+          <w:numId w:val="9"/>
+        </w:numPr>
+      </w:pPr>
+      <w:r>
+        <w:rPr>
+          <w:b/>
+          <w:bCs/>
+        </w:rPr>
+        <w:t>Whole-piece interface affordance.</w:t>
+      </w:r>
+      <w:r>
+        <w:t xml:space="preserve"> In response to the RCT-methodology question (C6) the expert returned a design suggestion rather than a methodology suggestion: “</w:t>
+      </w:r>
+      <w:r>
+        <w:rPr>
+          <w:i/>
+          <w:iCs/>
+        </w:rPr>
+        <w:t>It would be good if one piece and the interface screen could be viewed as a whole.</w:t>
+      </w:r>
+      <w:r>
+        <w:t>” We read this as a request for a more whole-piece visual summary affordance — for instance an always-visible mini-map of the form alongside the (currently scrollable) score.</w:t>
+      </w:r>
+    </w:p>
+    <w:p>
+      <w:pPr>
+        <w:pStyle w:val="FirstParagraph"/>
+      </w:pPr>
+      <w:r>
+        <w:t xml:space="preserve">That a methodology question was answered with a design recommendation is itself a finding: an experienced field expert’s instinct, on encountering a teaching tool, is to think about </w:t>
+      </w:r>
+      <w:r>
+        <w:rPr>
+          <w:i/>
+          <w:iCs/>
+        </w:rPr>
+        <w:t>how to extend the tool</w:t>
+      </w:r>
+      <w:r>
+        <w:t xml:space="preserve"> rather than </w:t>
+      </w:r>
+      <w:r>
+        <w:rPr>
+          <w:i/>
+          <w:iCs/>
+        </w:rPr>
+        <w:t>how to instrument a study around it</w:t>
+      </w:r>
+      <w:r>
+        <w:t>.</w:t>
+      </w:r>
+    </w:p>
+    <w:p>
+      <w:pPr>
+        <w:pStyle w:val="3"/>
+      </w:pPr>
+      <w:bookmarkStart w:id="34" w:name="X4b3be466686d378388712ff3ac02bda7cc4d1c3"/>
+      <w:bookmarkEnd w:id="33"/>
+      <w:r>
+        <w:t>6.3.4 Multi-piece extension and real-world deployment endorsed</w:t>
+      </w:r>
+    </w:p>
+    <w:p>
+      <w:pPr>
+        <w:pStyle w:val="FirstParagraph"/>
+      </w:pPr>
+      <w:r>
+        <w:t>To the question of single-work depth versus multi-piece breadth (C5) the expert responded “</w:t>
+      </w:r>
+      <w:r>
+        <w:rPr>
+          <w:i/>
+          <w:iCs/>
+        </w:rPr>
+        <w:t>If there were diverse works, I would actively use them.</w:t>
+      </w:r>
+      <w:r>
+        <w:t>” The verb is significant: not “could use” but “actively use.” In an optional open-comment field at the end of the survey the expert added, unprompted, “</w:t>
+      </w:r>
+      <w:r>
+        <w:rPr>
+          <w:i/>
+          <w:iCs/>
+        </w:rPr>
+        <w:t>Personally, I hope this program is expanded and turned into a real, deployable tool.</w:t>
+      </w:r>
+      <w:r>
+        <w:t xml:space="preserve">” The two statements together signal a single underlying judgement: that the tool’s current single-work form is a </w:t>
+      </w:r>
+      <w:r>
+        <w:rPr>
+          <w:i/>
+          <w:iCs/>
+        </w:rPr>
+        <w:t>demonstration artefact</w:t>
+      </w:r>
+      <w:r>
+        <w:t>, and that the expert’s field practice would benefit from its maturation into a mult</w:t>
+      </w:r>
+      <w:r>
+        <w:t>i-work, deployment-grade resource. This converges with — and elevates the priority of — the multi-piece dataset already listed as future work in §7 (Beethoven Op. 49 No. 2 mvt. I and Clementi Op. 36 No. 1 mvt. I, encoded against the same JSON schema), and motivates a parallel commitment to production-readiness (documentation, classroom packaging, teacher- facing materials) beyond the research prototype reported here.</w:t>
+      </w:r>
+    </w:p>
+    <w:p>
+      <w:pPr>
+        <w:pStyle w:val="2"/>
+      </w:pPr>
+      <w:bookmarkStart w:id="35" w:name="Xa84ed316009f2bbb6f4ec2e84d740889d5d5e81"/>
+      <w:bookmarkEnd w:id="30"/>
       <w:bookmarkEnd w:id="34"/>
       <w:r>
-        <w:t>6.3 Themes from the qualitative responses</w:t>
+        <w:t>6.4 Implications for the planned RCT and the tool roadmap</w:t>
       </w:r>
     </w:p>
     <w:p>
@@ -5932,143 +6007,7 @@
         <w:pStyle w:val="FirstParagraph"/>
       </w:pPr>
       <w:r>
-        <w:t>Inductive coding of the six open-ended responses surfaced four themes.</w:t>
-      </w:r>
-    </w:p>
-    <w:p>
-      <w:pPr>
-        <w:pStyle w:val="3"/>
-      </w:pPr>
-      <w:bookmarkStart w:id="36" w:name="X5ff88f55d17f2712fcf3617c81bd35d58ae4440"/>
-      <w:r>
-        <w:t>6.3.1 Three-channel synchronization is the named source of value</w:t>
-      </w:r>
-    </w:p>
-    <w:p>
-      <w:pPr>
-        <w:pStyle w:val="FirstParagraph"/>
-      </w:pPr>
-      <w:r>
-        <w:t xml:space="preserve">Both the </w:t>
-      </w:r>
-      <w:r>
-        <w:rPr>
-          <w:i/>
-          <w:iCs/>
-        </w:rPr>
-        <w:t>pedagogical fidelity</w:t>
-      </w:r>
-      <w:r>
-        <w:t xml:space="preserve"> question (C1) and the </w:t>
-      </w:r>
-      <w:r>
-        <w:rPr>
-          <w:i/>
-          <w:iCs/>
-        </w:rPr>
-        <w:t>most valuable affordance</w:t>
-      </w:r>
-      <w:r>
-        <w:t xml:space="preserve"> question (C2) drew the same answer pattern. To the fidelity question the expert responded “</w:t>
-      </w:r>
-      <w:r>
-        <w:rPr>
-          <w:i/>
-          <w:iCs/>
-        </w:rPr>
-        <w:t>Yes, because color is shown, music is played, and they are displayed together with the score.</w:t>
-      </w:r>
-      <w:r>
-        <w:t>” (C1); to the affordance question, “</w:t>
-      </w:r>
-      <w:r>
-        <w:rPr>
-          <w:i/>
-          <w:iCs/>
-        </w:rPr>
-        <w:t>The function of being able to check sections via the score while hearing color and music in real time.</w:t>
-      </w:r>
-      <w:r>
-        <w:t xml:space="preserve">” (C2). The expert did not single out any individual </w:t>
-      </w:r>
-      <w:r>
-        <w:t xml:space="preserve">affordance from the list provided (color encoding, section jump, loop, playback-speed control, keyboard shortcuts, demo mode, analysis pane); the </w:t>
-      </w:r>
-      <w:r>
-        <w:rPr>
-          <w:i/>
-          <w:iCs/>
-        </w:rPr>
-        <w:t>integration</w:t>
-      </w:r>
-      <w:r>
-        <w:t xml:space="preserve"> of color, audio, and score was itself identified as the locus of value. This converges with the design claim of §4.1 that the tool’s principal pedagogical contribution is the </w:t>
-      </w:r>
-      <w:r>
-        <w:rPr>
-          <w:i/>
-          <w:iCs/>
-        </w:rPr>
-        <w:t>coordinated update</w:t>
-      </w:r>
-      <w:r>
-        <w:t xml:space="preserve"> of three representations rather than any single one.</w:t>
-      </w:r>
-    </w:p>
-    <w:p>
-      <w:pPr>
-        <w:pStyle w:val="3"/>
-      </w:pPr>
-      <w:bookmarkStart w:id="37" w:name="X8a9c53c9b4a72d12d6d05550b44e32ff2ca7e79"/>
-      <w:bookmarkEnd w:id="36"/>
-      <w:r>
-        <w:t>6.3.2 No learner-misconception risks identified by the expert</w:t>
-      </w:r>
-    </w:p>
-    <w:p>
-      <w:pPr>
-        <w:pStyle w:val="FirstParagraph"/>
-      </w:pPr>
-      <w:r>
-        <w:t>In response to the misconception-risk question (C3) the expert indicated they did not perceive any (</w:t>
-      </w:r>
-      <w:r>
-        <w:rPr>
-          <w:i/>
-          <w:iCs/>
-        </w:rPr>
-        <w:t>“There seem to be none.”</w:t>
-      </w:r>
-      <w:r>
-        <w:t xml:space="preserve">). We read this both as a positive indication that the expert, with fifteen years of field experience, did not identify any obvious visualization-induced misunderstanding pathway, and as a hypothesis to be tested in the planned RCT rather than a confirmed null. An expert’s </w:t>
-      </w:r>
-      <w:r>
-        <w:rPr>
-          <w:i/>
-          <w:iCs/>
-        </w:rPr>
-        <w:t>prediction</w:t>
-      </w:r>
-      <w:r>
-        <w:t xml:space="preserve"> of no risk is not equivalent to a learner study failing to detect risk.</w:t>
-      </w:r>
-    </w:p>
-    <w:p>
-      <w:pPr>
-        <w:pStyle w:val="3"/>
-      </w:pPr>
-      <w:bookmarkStart w:id="38" w:name="two-concrete-design-recommendations"/>
-      <w:bookmarkEnd w:id="37"/>
-      <w:r>
-        <w:t>6.3.3 Two concrete design recommendations</w:t>
-      </w:r>
-    </w:p>
-    <w:p>
-      <w:pPr>
-        <w:pStyle w:val="FirstParagraph"/>
-      </w:pPr>
-      <w:r>
-        <w:t>The expert proposed two specific extensions:</w:t>
+        <w:t>Three concrete revisions follow from the pilot.</w:t>
       </w:r>
     </w:p>
     <w:p>
@@ -6084,20 +6023,23 @@
           <w:b/>
           <w:bCs/>
         </w:rPr>
-        <w:t>Within-section harmonic detail.</w:t>
-      </w:r>
-      <w:r>
-        <w:t xml:space="preserve"> “</w:t>
-      </w:r>
-      <w:r>
-        <w:rPr>
-          <w:i/>
-          <w:iCs/>
-        </w:rPr>
-        <w:t>It would be better if the chord movements were shown in detail.</w:t>
-      </w:r>
-      <w:r>
-        <w:t>” (C4). The current tool displays section- and theme-zone-level key labels (e.g., “C major” / “G major” / “F major”) but does not surface internal chord-by-chord progressions. The expert’s recommendation is that chord-level harmonic motion be added as a finer visualization layer in a future revision.</w:t>
+        <w:t>RCT primary measure to include “perceived integration”</w:t>
+      </w:r>
+      <w:r>
+        <w:t xml:space="preserve"> — a confidence/integration rating in addition to formal-identification accuracy and SUS. The single-expert response suggests that the </w:t>
+      </w:r>
+      <w:r>
+        <w:rPr>
+          <w:i/>
+          <w:iCs/>
+        </w:rPr>
+        <w:t>experience of three-channel synchronization</w:t>
+      </w:r>
+      <w:r>
+        <w:t xml:space="preserve"> </w:t>
+      </w:r>
+      <w:r>
+        <w:t>may be a distinct construct that learners can rate independently of accuracy and usability. This will be added to the RCT protocol.</w:t>
       </w:r>
     </w:p>
     <w:p>
@@ -6113,20 +6055,88 @@
           <w:b/>
           <w:bCs/>
         </w:rPr>
-        <w:t>Whole-piece interface affordance.</w:t>
-      </w:r>
-      <w:r>
-        <w:t xml:space="preserve"> In response to the RCT-methodology question (C6) the expert returned a design suggestion rather than a methodology suggestion: “</w:t>
-      </w:r>
-      <w:r>
-        <w:rPr>
-          <w:i/>
-          <w:iCs/>
-        </w:rPr>
-        <w:t>It would be good if one piece and the interface screen could be viewed as a whole.</w:t>
-      </w:r>
-      <w:r>
-        <w:t>” We read this as a request for a more whole-piece visual summary affordance — for instance an always-visible mini-map of the form alongside the (currently scrollable) score.</w:t>
+        <w:t>Pre-RCT tool extension: chord-level harmonic layer.</w:t>
+      </w:r>
+      <w:r>
+        <w:t xml:space="preserve"> The expert’s C4 recommendation will be incorporated into a v0.2.0 release before the RCT, so that the RCT evaluates the version the expert thought </w:t>
+      </w:r>
+      <w:r>
+        <w:rPr>
+          <w:i/>
+          <w:iCs/>
+        </w:rPr>
+        <w:t>should exist</w:t>
+      </w:r>
+      <w:r>
+        <w:t>, not the more limited v0.1.0.</w:t>
+      </w:r>
+    </w:p>
+    <w:p>
+      <w:pPr>
+        <w:pStyle w:val="Compact"/>
+        <w:numPr>
+          <w:ilvl w:val="0"/>
+          <w:numId w:val="10"/>
+        </w:numPr>
+      </w:pPr>
+      <w:r>
+        <w:rPr>
+          <w:b/>
+          <w:bCs/>
+        </w:rPr>
+        <w:t>Multi-piece corpus prioritised.</w:t>
+      </w:r>
+      <w:r>
+        <w:t xml:space="preserve"> Per the C5 endorsement, Beethoven Op. 49 No. 2 mvt. I and Clementi Op. 36 No. 1 mvt. I will be added to the corpus </w:t>
+      </w:r>
+      <w:r>
+        <w:rPr>
+          <w:i/>
+          <w:iCs/>
+        </w:rPr>
+        <w:t>before</w:t>
+      </w:r>
+      <w:r>
+        <w:t xml:space="preserve"> the RCT rather than as post-RCT future work, so the trial can also assess single-work-deep versus multi-piece-comparative conditions.</w:t>
+      </w:r>
+    </w:p>
+    <w:p>
+      <w:pPr>
+        <w:pStyle w:val="Compact"/>
+        <w:numPr>
+          <w:ilvl w:val="0"/>
+          <w:numId w:val="10"/>
+        </w:numPr>
+      </w:pPr>
+      <w:r>
+        <w:rPr>
+          <w:b/>
+          <w:bCs/>
+        </w:rPr>
+        <w:t>Production-readiness track in parallel.</w:t>
+      </w:r>
+      <w:r>
+        <w:t xml:space="preserve"> The expert’s unprompted comment that the tool should “</w:t>
+      </w:r>
+      <w:r>
+        <w:rPr>
+          <w:i/>
+          <w:iCs/>
+        </w:rPr>
+        <w:t>become a real, deployable tool</w:t>
+      </w:r>
+      <w:r>
+        <w:t>” frames a separate engineering track alongside the research RCT: documentation for non-author teachers, classroom packaging (offline-installable bundle, printable reference card), and a teacher-facing v1.0 release that does not depend on the live deployment URL.</w:t>
+      </w:r>
+    </w:p>
+    <w:p>
+      <w:pPr>
+        <w:pStyle w:val="2"/>
+      </w:pPr>
+      <w:bookmarkStart w:id="36" w:name="limitations-of-this-pilot"/>
+      <w:bookmarkEnd w:id="35"/>
+      <w:r>
+        <w:t>6.5 Limitations of this pilot</w:t>
       </w:r>
     </w:p>
     <w:p>
@@ -6134,97 +6144,20 @@
         <w:pStyle w:val="FirstParagraph"/>
       </w:pPr>
       <w:r>
-        <w:t xml:space="preserve">That a methodology question was answered with a design recommendation is itself a finding: an experienced field expert’s instinct, on encountering a teaching tool, is to think about </w:t>
-      </w:r>
-      <w:r>
-        <w:rPr>
-          <w:i/>
-          <w:iCs/>
-        </w:rPr>
-        <w:t>how to extend the tool</w:t>
-      </w:r>
-      <w:r>
-        <w:t xml:space="preserve"> rather than </w:t>
-      </w:r>
-      <w:r>
-        <w:rPr>
-          <w:i/>
-          <w:iCs/>
-        </w:rPr>
-        <w:t>how to instrument a study around it</w:t>
-      </w:r>
-      <w:r>
-        <w:t>.</w:t>
-      </w:r>
-    </w:p>
-    <w:p>
-      <w:pPr>
-        <w:pStyle w:val="3"/>
-      </w:pPr>
-      <w:bookmarkStart w:id="39" w:name="X4b3be466686d378388712ff3ac02bda7cc4d1c3"/>
-      <w:bookmarkEnd w:id="38"/>
-      <w:r>
-        <w:t>6.3.4 Multi-piece extension and real-world deployment endorsed</w:t>
-      </w:r>
-    </w:p>
-    <w:p>
-      <w:pPr>
-        <w:pStyle w:val="FirstParagraph"/>
-      </w:pPr>
-      <w:r>
-        <w:t>To the question of single-work depth versus multi-piece breadth (C5) the expert responded “</w:t>
-      </w:r>
-      <w:r>
-        <w:rPr>
-          <w:i/>
-          <w:iCs/>
-        </w:rPr>
-        <w:t>If there were diverse works, I would actively use them.</w:t>
-      </w:r>
-      <w:r>
-        <w:t>” The verb is significant: not “could use” but “actively use.” In an optional open-comment field at the end of the survey the expert added, unprompted, “</w:t>
-      </w:r>
-      <w:r>
-        <w:rPr>
-          <w:i/>
-          <w:iCs/>
-        </w:rPr>
-        <w:t>Personally, I hope this program is expanded and turned into a real, deployable tool.</w:t>
-      </w:r>
-      <w:r>
-        <w:t xml:space="preserve">” The two statements together signal a single underlying judgement: that the tool’s current single-work form is a </w:t>
-      </w:r>
-      <w:r>
-        <w:rPr>
-          <w:i/>
-          <w:iCs/>
-        </w:rPr>
-        <w:t>demonstration artefact</w:t>
-      </w:r>
-      <w:r>
-        <w:t>, and that the expert’s field practice would benefit from its maturation into a mult</w:t>
-      </w:r>
-      <w:r>
-        <w:t>i-work, deployment-grade resource. This converges with — and elevates the priority of — the multi-piece dataset already listed as future work in §7 (Beethoven Op. 49 No. 2 mvt. I and Clementi Op. 36 No. 1 mvt. I, encoded against the same JSON schema), and motivates a parallel commitment to production-readiness (documentation, classroom packaging, teacher- facing materials) beyond the research prototype reported here.</w:t>
-      </w:r>
-    </w:p>
-    <w:p>
-      <w:pPr>
-        <w:pStyle w:val="2"/>
-      </w:pPr>
-      <w:bookmarkStart w:id="40" w:name="Xa84ed316009f2bbb6f4ec2e84d740889d5d5e81"/>
-      <w:bookmarkEnd w:id="35"/>
-      <w:bookmarkEnd w:id="39"/>
-      <w:r>
-        <w:t>6.4 Implications for the planned RCT and the tool roadmap</w:t>
-      </w:r>
-    </w:p>
-    <w:p>
-      <w:pPr>
-        <w:pStyle w:val="FirstParagraph"/>
-      </w:pPr>
-      <w:r>
-        <w:t>Three concrete revisions follow from the pilot.</w:t>
+        <w:t xml:space="preserve">This is a single-expert pilot review, not a generalizable empirical study. Its findings function as </w:t>
+      </w:r>
+      <w:r>
+        <w:rPr>
+          <w:i/>
+          <w:iCs/>
+        </w:rPr>
+        <w:t>design-stage validation</w:t>
+      </w:r>
+      <w:r>
+        <w:t xml:space="preserve"> and as </w:t>
+      </w:r>
+      <w:r>
+        <w:t>input to refining the planned RCT, not as evidence of learner outcomes. We list the limitations explicitly:</w:t>
       </w:r>
     </w:p>
     <w:p>
@@ -6240,20 +6173,20 @@
           <w:b/>
           <w:bCs/>
         </w:rPr>
-        <w:t>RCT primary measure to include “perceived integration”</w:t>
-      </w:r>
-      <w:r>
-        <w:t xml:space="preserve"> — a confidence/integration rating in addition to formal-identification accuracy and SUS. The single-expert response suggests that the </w:t>
-      </w:r>
-      <w:r>
-        <w:rPr>
-          <w:i/>
-          <w:iCs/>
-        </w:rPr>
-        <w:t>experience of three-channel synchronization</w:t>
-      </w:r>
-      <w:r>
-        <w:t xml:space="preserve"> may be a distinct construct that learners can rate independently of accuracy and usability. This will be added to the RCT protocol.</w:t>
+        <w:t>n = 1.</w:t>
+      </w:r>
+      <w:r>
+        <w:t xml:space="preserve"> A single expert cannot characterize the distribution of expert opinion on this tool. The four themes reported in §6.3 should be read as </w:t>
+      </w:r>
+      <w:r>
+        <w:rPr>
+          <w:i/>
+          <w:iCs/>
+        </w:rPr>
+        <w:t>hypotheses generated by one informed observer</w:t>
+      </w:r>
+      <w:r>
+        <w:t>, not as patterns across a community of experts.</w:t>
       </w:r>
     </w:p>
     <w:p>
@@ -6269,20 +6202,10 @@
           <w:b/>
           <w:bCs/>
         </w:rPr>
-        <w:t>Pre-RCT tool extension: chord-level harmonic layer.</w:t>
-      </w:r>
-      <w:r>
-        <w:t xml:space="preserve"> The expert’s C4 recommendation will be incorporated into a v0.2.0 release before the RCT, so that the RCT evaluates the version the expert thought </w:t>
-      </w:r>
-      <w:r>
-        <w:rPr>
-          <w:i/>
-          <w:iCs/>
-        </w:rPr>
-        <w:t>should exist</w:t>
-      </w:r>
-      <w:r>
-        <w:t>, not the more limited v0.1.0.</w:t>
+        <w:t>Maximum SUS score.</w:t>
+      </w:r>
+      <w:r>
+        <w:t xml:space="preserve"> The SUS of 100 is consistent across the ten items but indicates that this individual expert was strongly positively disposed toward the tool. We do not claim that learner SUS distributions will resemble this.</w:t>
       </w:r>
     </w:p>
     <w:p>
@@ -6298,20 +6221,10 @@
           <w:b/>
           <w:bCs/>
         </w:rPr>
-        <w:t>Multi-piece corpus prioritised.</w:t>
-      </w:r>
-      <w:r>
-        <w:t xml:space="preserve"> Per the C5 endorsement, Beethoven Op. 49 No. 2 mvt. I and Clementi Op. 36 No. 1 mvt. I will be added to the corpus </w:t>
-      </w:r>
-      <w:r>
-        <w:rPr>
-          <w:i/>
-          <w:iCs/>
-        </w:rPr>
-        <w:t>before</w:t>
-      </w:r>
-      <w:r>
-        <w:t xml:space="preserve"> the RCT rather than as post-RCT future work, so the trial can also assess single-work-deep versus multi-piece-comparative conditions.</w:t>
+        <w:t>Brief responses.</w:t>
+      </w:r>
+      <w:r>
+        <w:t xml:space="preserve"> All six open-ended responses are short. This prevents the deeper thematic-analytic moves (cross-question triangulation, contradiction-spotting) that a richer interview protocol would have enabled. The responses still function as signal, but signal at lower bandwidth than a fully interviewed expert panel would supply.</w:t>
       </w:r>
     </w:p>
     <w:p>
@@ -6327,48 +6240,10 @@
           <w:b/>
           <w:bCs/>
         </w:rPr>
-        <w:t>Production-readiness track in parallel.</w:t>
-      </w:r>
-      <w:r>
-        <w:t xml:space="preserve"> The expert’s unprompted comment that the tool should “</w:t>
-      </w:r>
-      <w:r>
-        <w:rPr>
-          <w:i/>
-          <w:iCs/>
-        </w:rPr>
-        <w:t>become a real, deployable tool</w:t>
-      </w:r>
-      <w:r>
-        <w:t>” frames a separate engineering track alongside the research RCT: documentation for non-author teachers, classroom packaging (offline-installable bundle, printable reference card), and a teacher-facing v1.0 release that does not depend on the live deployment URL.</w:t>
-      </w:r>
-    </w:p>
-    <w:p>
-      <w:pPr>
-        <w:pStyle w:val="2"/>
-      </w:pPr>
-      <w:bookmarkStart w:id="41" w:name="limitations-of-this-pilot"/>
-      <w:bookmarkEnd w:id="40"/>
-      <w:r>
-        <w:t>6.5 Limitations of this pilot</w:t>
-      </w:r>
-    </w:p>
-    <w:p>
-      <w:pPr>
-        <w:pStyle w:val="FirstParagraph"/>
-      </w:pPr>
-      <w:r>
-        <w:t xml:space="preserve">This is a single-expert pilot review, not a generalizable empirical study. Its findings function as </w:t>
-      </w:r>
-      <w:r>
-        <w:rPr>
-          <w:i/>
-          <w:iCs/>
-        </w:rPr>
-        <w:t>design-stage validation</w:t>
-      </w:r>
-      <w:r>
-        <w:t xml:space="preserve"> and as input to refining the planned RCT, not as evidence of learner outcomes. We list the limitations explicitly:</w:t>
+        <w:t>Expert orientation toward design, not methodology.</w:t>
+      </w:r>
+      <w:r>
+        <w:t xml:space="preserve"> As noted in §6.3.3, the methodology question (C6) was answered with a design suggestion. We treat this as data about the expert’s professional orientation rather than as a deficit in the response, but it does mean the pilot yielded fewer methodological refinements for the RCT than initially hoped.</w:t>
       </w:r>
     </w:p>
     <w:p>
@@ -6376,7 +6251,7 @@
         <w:pStyle w:val="Compact"/>
         <w:numPr>
           <w:ilvl w:val="0"/>
-          <w:numId w:val="12"/>
+          <w:numId w:val="11"/>
         </w:numPr>
       </w:pPr>
       <w:r>
@@ -6384,92 +6259,6 @@
           <w:b/>
           <w:bCs/>
         </w:rPr>
-        <w:t>n = 1.</w:t>
-      </w:r>
-      <w:r>
-        <w:t xml:space="preserve"> A single expert cannot characterize the distribution of expert opinion on this tool. The four themes reported in §6.3 should be read as </w:t>
-      </w:r>
-      <w:r>
-        <w:rPr>
-          <w:i/>
-          <w:iCs/>
-        </w:rPr>
-        <w:t>hypotheses generated by one informed observer</w:t>
-      </w:r>
-      <w:r>
-        <w:t>, not as patterns across a community of experts.</w:t>
-      </w:r>
-    </w:p>
-    <w:p>
-      <w:pPr>
-        <w:pStyle w:val="Compact"/>
-        <w:numPr>
-          <w:ilvl w:val="0"/>
-          <w:numId w:val="12"/>
-        </w:numPr>
-      </w:pPr>
-      <w:r>
-        <w:rPr>
-          <w:b/>
-          <w:bCs/>
-        </w:rPr>
-        <w:t>Maximum SUS score.</w:t>
-      </w:r>
-      <w:r>
-        <w:t xml:space="preserve"> The SUS of 100 is consistent across the ten items but indicates that this individual expert was strongly positively disposed toward the tool. We do not claim that learner SUS distributions will resemble this.</w:t>
-      </w:r>
-    </w:p>
-    <w:p>
-      <w:pPr>
-        <w:pStyle w:val="Compact"/>
-        <w:numPr>
-          <w:ilvl w:val="0"/>
-          <w:numId w:val="12"/>
-        </w:numPr>
-      </w:pPr>
-      <w:r>
-        <w:rPr>
-          <w:b/>
-          <w:bCs/>
-        </w:rPr>
-        <w:t>Brief responses.</w:t>
-      </w:r>
-      <w:r>
-        <w:t xml:space="preserve"> All six open-ended responses are short. This prevents the deeper thematic-analytic moves (cross-question triangulation, contradiction-spotting) that a richer interview protocol would have enabled. The responses still function as signal, but signal at lower bandwidth than a fully interviewed expert panel would supply.</w:t>
-      </w:r>
-    </w:p>
-    <w:p>
-      <w:pPr>
-        <w:pStyle w:val="Compact"/>
-        <w:numPr>
-          <w:ilvl w:val="0"/>
-          <w:numId w:val="12"/>
-        </w:numPr>
-      </w:pPr>
-      <w:r>
-        <w:rPr>
-          <w:b/>
-          <w:bCs/>
-        </w:rPr>
-        <w:t>Expert orientation toward design, not methodology.</w:t>
-      </w:r>
-      <w:r>
-        <w:t xml:space="preserve"> As noted in §6.3.3, the methodology question (C6) was answered with a design suggestion. We treat this as data about the expert’s professional orientation rather than as a deficit in the response, but it does mean the pilot yielded fewer methodological refinements for the RCT than initially hoped.</w:t>
-      </w:r>
-    </w:p>
-    <w:p>
-      <w:pPr>
-        <w:pStyle w:val="Compact"/>
-        <w:numPr>
-          <w:ilvl w:val="0"/>
-          <w:numId w:val="12"/>
-        </w:numPr>
-      </w:pPr>
-      <w:r>
-        <w:rPr>
-          <w:b/>
-          <w:bCs/>
-        </w:rPr>
         <w:t>Pilot was self-administered.</w:t>
       </w:r>
       <w:r>
@@ -6491,45 +6280,26 @@
         <w:t>preliminary expert pilot review</w:t>
       </w:r>
       <w:r>
-        <w:t xml:space="preserve"> rather than as expert validation. The RCT planned in §7.3 is the empirical study against which the tool’s pedagogical claims will properly be tested.</w:t>
+        <w:t xml:space="preserve"> rather than as expert validation. The RCT planned in §7 is the empirical study against which the tool’s pedagogical claims will properly be tested.</w:t>
       </w:r>
     </w:p>
     <w:p>
       <w:pPr>
         <w:pStyle w:val="1"/>
       </w:pPr>
-      <w:bookmarkStart w:id="42" w:name="discussion"/>
-      <w:bookmarkEnd w:id="32"/>
-      <w:bookmarkEnd w:id="41"/>
+      <w:bookmarkStart w:id="37" w:name="discussion"/>
+      <w:bookmarkEnd w:id="27"/>
+      <w:bookmarkEnd w:id="36"/>
       <w:r>
         <w:t>7. Discussion</w:t>
       </w:r>
     </w:p>
     <w:p>
       <w:pPr>
-        <w:pStyle w:val="2"/>
-      </w:pPr>
-      <w:bookmarkStart w:id="43" w:name="pedagogical-implications"/>
-      <w:r>
-        <w:t>7.1 Pedagogical Implications</w:t>
-      </w:r>
-    </w:p>
-    <w:p>
-      <w:pPr>
         <w:pStyle w:val="FirstParagraph"/>
       </w:pPr>
       <w:r>
-        <w:t xml:space="preserve">Traditional verbal teaching often presents the recapitulation as “return-in-tonic,” handling deformations as exceptions; K. 545’s subdominant recapitulation makes a stronger pedagogical claim available, that Mozart </w:t>
-      </w:r>
-      <w:r>
-        <w:rPr>
-          <w:i/>
-          <w:iCs/>
-        </w:rPr>
-        <w:t>preserves the exposition’s modulation pattern</w:t>
-      </w:r>
-      <w:r>
-        <w:t xml:space="preserve"> by shifting the starting key down a fifth, so that the secondary theme arrives in the tonic on the second hearing. The synchronized color-coded view makes this </w:t>
+        <w:t xml:space="preserve">The synchronized color-coded view makes K. 545’s subdominant recapitulation visually self-evident as a </w:t>
       </w:r>
       <w:r>
         <w:rPr>
@@ -6539,103 +6309,23 @@
         <w:t>function-preserving</w:t>
       </w:r>
       <w:r>
-        <w:t xml:space="preserve"> character of the deformation visually self-evident, aligning with current form-functional approaches to musical analysis (Caplin, 1998, 2009). The pedagogical move, from rules-and-exceptions to functional flexibility, is the central educational claim of this work.</w:t>
-      </w:r>
-    </w:p>
-    <w:p>
-      <w:pPr>
-        <w:pStyle w:val="2"/>
-      </w:pPr>
-      <w:bookmarkStart w:id="44" w:name="methodological-and-tooling-implications"/>
-      <w:bookmarkEnd w:id="43"/>
-      <w:r>
-        <w:t>7.2 Methodological and Tooling Implications</w:t>
-      </w:r>
-    </w:p>
-    <w:p>
-      <w:pPr>
-        <w:pStyle w:val="Compact"/>
-        <w:numPr>
-          <w:ilvl w:val="0"/>
-          <w:numId w:val="13"/>
-        </w:numPr>
-      </w:pPr>
-      <w:r>
-        <w:rPr>
-          <w:b/>
-          <w:bCs/>
-        </w:rPr>
-        <w:t>First-class status of formal analysis.</w:t>
-      </w:r>
-      <w:r>
-        <w:t xml:space="preserve"> Encoding the analysis as a versioned JSON object, not as ephemeral pedagogical commentary, invites peer review of the analysis itself, machine reuse, and reproducibility.</w:t>
-      </w:r>
-    </w:p>
-    <w:p>
-      <w:pPr>
-        <w:pStyle w:val="Compact"/>
-        <w:numPr>
-          <w:ilvl w:val="0"/>
-          <w:numId w:val="13"/>
-        </w:numPr>
-      </w:pPr>
-      <w:r>
-        <w:rPr>
-          <w:b/>
-          <w:bCs/>
-        </w:rPr>
-        <w:t>Exposition-repeat folding.</w:t>
-      </w:r>
-      <w:r>
-        <w:t xml:space="preserve"> The non-monotonic mapping between audio time and analytical time during performer-elected repeats is a practical solution to a problem common across sonata-form recordings and applicable wherever the form contains an indicated repeat.</w:t>
-      </w:r>
-    </w:p>
-    <w:p>
-      <w:pPr>
-        <w:pStyle w:val="Compact"/>
-        <w:numPr>
-          <w:ilvl w:val="0"/>
-          <w:numId w:val="13"/>
-        </w:numPr>
-      </w:pPr>
-      <w:r>
-        <w:rPr>
-          <w:b/>
-          <w:bCs/>
-        </w:rPr>
-        <w:t>Demo mode as a copyright-pragmatic default.</w:t>
-      </w:r>
-      <w:r>
-        <w:t xml:space="preserve"> The WebAudio metronome allows the form layer to function in environments where no PD/CC audio is at hand, lowering the barrier to classroom adoption.</w:t>
-      </w:r>
-    </w:p>
-    <w:p>
-      <w:pPr>
-        <w:pStyle w:val="Compact"/>
-        <w:numPr>
-          <w:ilvl w:val="0"/>
-          <w:numId w:val="13"/>
-        </w:numPr>
-      </w:pPr>
-      <w:r>
-        <w:rPr>
-          <w:b/>
-          <w:bCs/>
-        </w:rPr>
-        <w:t>Single-dependency architecture.</w:t>
-      </w:r>
-      <w:r>
-        <w:t xml:space="preserve"> Course materials with one external library age more gracefully than those with complex build pipelines, a non-trivial property for syllabi designed to last multiple cohorts.</w:t>
-      </w:r>
-    </w:p>
-    <w:p>
-      <w:pPr>
-        <w:pStyle w:val="2"/>
-      </w:pPr>
-      <w:bookmarkStart w:id="45" w:name="limitations-and-future-work"/>
-      <w:bookmarkEnd w:id="44"/>
-      <w:r>
-        <w:t>7.3 Limitations and Future Work</w:t>
+        <w:t xml:space="preserve"> deformation rather than a rule-breaking exception, the central educational claim of this work and one that aligns with current form-functional approaches to musical analysis (Caplin, 1998, 2009). Methodologically, the contribution rests on three choices: treating formal analysis as a versioned JSON object suitable for peer review and machine reuse rather than ephemeral commentary; folding the exposition repeat so analytical time remains monotonic under performer-elected repeats; and a si</w:t>
+      </w:r>
+      <w:r>
+        <w:t>ngle-dependency architecture that ages gracefully across the lifespan of a syllabus. The paper limits itself to system design, implementation, and pedagogical positioning; empirical validation of learning effects is deferred to a planned randomized controlled trial comparing the synchronized condition against audio + score and audio-only baselines, with subsequent work extending the schema to additional sonata-form works (Beethoven Op. 49 No. 2 mvt. I, Clementi Op. 36 No. 1 mvt. I), to other formal types (r</w:t>
+      </w:r>
+      <w:r>
+        <w:t>ondo, theme-and-variations, fugue), to automatic score-audio alignment (Nakamura et al., 2017), to a learner-driven authoring mode, and to mobile form factors.</w:t>
+      </w:r>
+    </w:p>
+    <w:p>
+      <w:pPr>
+        <w:pStyle w:val="1"/>
+      </w:pPr>
+      <w:bookmarkStart w:id="38" w:name="conclusion"/>
+      <w:bookmarkEnd w:id="37"/>
+      <w:r>
+        <w:t>8. Conclusion</w:t>
       </w:r>
     </w:p>
     <w:p>
@@ -6643,166 +6333,33 @@
         <w:pStyle w:val="FirstParagraph"/>
       </w:pPr>
       <w:r>
-        <w:t>This paper limits itself to system design, implementation, and pedagogical positioning. Empirical validation of learning effects is deferred to subsequent work. Planned next steps:</w:t>
-      </w:r>
-    </w:p>
-    <w:p>
-      <w:pPr>
-        <w:pStyle w:val="Compact"/>
-        <w:numPr>
-          <w:ilvl w:val="0"/>
-          <w:numId w:val="14"/>
-        </w:numPr>
-      </w:pPr>
-      <w:r>
-        <w:rPr>
-          <w:b/>
-          <w:bCs/>
-        </w:rPr>
-        <w:t>Randomized controlled trial</w:t>
-      </w:r>
-      <w:r>
-        <w:t xml:space="preserve"> comparing the synchronized condition to (a) audio + score without synchronization and (b) audio + verbal lecture only, with form-identification accuracy and the System Usability Scale (Brooke, 1996) as primary measures.</w:t>
-      </w:r>
-    </w:p>
-    <w:p>
-      <w:pPr>
-        <w:pStyle w:val="Compact"/>
-        <w:numPr>
-          <w:ilvl w:val="0"/>
-          <w:numId w:val="14"/>
-        </w:numPr>
-      </w:pPr>
-      <w:r>
-        <w:rPr>
-          <w:b/>
-          <w:bCs/>
-        </w:rPr>
-        <w:t>Automatic score-audio alignment</w:t>
-      </w:r>
-      <w:r>
-        <w:t xml:space="preserve"> (Nakamura et al., 2017) to eliminate recording-dependence.</w:t>
-      </w:r>
-    </w:p>
-    <w:p>
-      <w:pPr>
-        <w:pStyle w:val="Compact"/>
-        <w:numPr>
-          <w:ilvl w:val="0"/>
-          <w:numId w:val="14"/>
-        </w:numPr>
-      </w:pPr>
-      <w:r>
-        <w:rPr>
-          <w:b/>
-          <w:bCs/>
-        </w:rPr>
-        <w:t>Multi-piece dataset.</w:t>
-      </w:r>
-      <w:r>
-        <w:t xml:space="preserve"> Beethoven Op. 49 No. 2 mvt. I and Clementi Op. 36 No. 1 mvt. I encoded against the same JSON schema for comparative form study.</w:t>
-      </w:r>
-    </w:p>
-    <w:p>
-      <w:pPr>
-        <w:pStyle w:val="Compact"/>
-        <w:numPr>
-          <w:ilvl w:val="0"/>
-          <w:numId w:val="14"/>
-        </w:numPr>
-      </w:pPr>
-      <w:r>
-        <w:rPr>
-          <w:b/>
-          <w:bCs/>
-        </w:rPr>
-        <w:t>Authoring mode.</w:t>
-      </w:r>
-      <w:r>
-        <w:t xml:space="preserve"> Learners label their own compositions with formal regions, producing reusable analysis artefacts.</w:t>
-      </w:r>
-    </w:p>
-    <w:p>
-      <w:pPr>
-        <w:pStyle w:val="Compact"/>
-        <w:numPr>
-          <w:ilvl w:val="0"/>
-          <w:numId w:val="14"/>
-        </w:numPr>
-      </w:pPr>
-      <w:r>
-        <w:rPr>
-          <w:b/>
-          <w:bCs/>
-        </w:rPr>
-        <w:t>Other formal types.</w:t>
-      </w:r>
-      <w:r>
-        <w:t xml:space="preserve"> Rondo, theme-and-variations, and fugue, each requiring schema extension.</w:t>
-      </w:r>
-    </w:p>
-    <w:p>
-      <w:pPr>
-        <w:pStyle w:val="Compact"/>
-        <w:numPr>
-          <w:ilvl w:val="0"/>
-          <w:numId w:val="14"/>
-        </w:numPr>
-      </w:pPr>
-      <w:r>
-        <w:rPr>
-          <w:b/>
-          <w:bCs/>
-        </w:rPr>
-        <w:t>Mobile responsiveness.</w:t>
-      </w:r>
-      <w:r>
-        <w:t xml:space="preserve"> Extending the desktop-first design to tablet and phone form factors.</w:t>
+        <w:t xml:space="preserve">This paper has presented an open-source, web-based tool that synchronizes score, audio, and a hierarchical formal-analysis layer to teach the structure of sonata form, with Mozart’s K. 545 mvt. I as the case piece. The central pedagogical claim, that synchronized multi-representation makes the </w:t>
+      </w:r>
+      <w:r>
+        <w:rPr>
+          <w:i/>
+          <w:iCs/>
+        </w:rPr>
+        <w:t>function-preserving</w:t>
+      </w:r>
+      <w:r>
+        <w:t xml:space="preserve"> nature of non-tonic recapitulations visually self-evident, is grounded in form-functional theory and instantiated as a runnable, openly licensed system. Empirical validation of the learning gains this design predicts is the subject of a planned randomized controlled trial; the system, schema, and pedagogical framing presented here provide the foundation for that work.</w:t>
+      </w:r>
+    </w:p>
+    <w:p>
+      <w:pPr>
+        <w:pStyle w:val="a0"/>
+      </w:pPr>
+      <w:r>
+        <w:t>The tool is released under the MIT License; the formal-analysis data under CC BY 4.0. Both invite reuse, extension, and peer scrutiny in the spirit of open digital musicology.</w:t>
       </w:r>
     </w:p>
     <w:p>
       <w:pPr>
         <w:pStyle w:val="1"/>
       </w:pPr>
-      <w:bookmarkStart w:id="46" w:name="conclusion"/>
-      <w:bookmarkEnd w:id="42"/>
-      <w:bookmarkEnd w:id="45"/>
-      <w:r>
-        <w:t>8. Conclusion</w:t>
-      </w:r>
-    </w:p>
-    <w:p>
-      <w:pPr>
-        <w:pStyle w:val="FirstParagraph"/>
-      </w:pPr>
-      <w:r>
-        <w:t xml:space="preserve">This paper has presented an open-source, web-based tool that synchronizes score, audio, and a hierarchical formal-analysis layer to teach the structure of sonata form, with Mozart’s K. 545 mvt. I as the case piece. The central pedagogical claim, that synchronized multi-representation makes the </w:t>
-      </w:r>
-      <w:r>
-        <w:rPr>
-          <w:i/>
-          <w:iCs/>
-        </w:rPr>
-        <w:t>function-preserving</w:t>
-      </w:r>
-      <w:r>
-        <w:t xml:space="preserve"> nature of non-tonic recapitulations visually self-evident, is grounded in form-functional theory and instantiated as a runnable, openly licensed system. Empirical validation of the learning gains this design predicts is the subject of a planned randomized controlled trial; the system, schema, and pedagogical framing presented here provide the foundation for that work.</w:t>
-      </w:r>
-    </w:p>
-    <w:p>
-      <w:pPr>
-        <w:pStyle w:val="a0"/>
-      </w:pPr>
-      <w:r>
-        <w:t>The tool is released under the MIT License; the formal-analysis data under CC BY 4.0. Both invite reuse, extension, and peer scrutiny in the spirit of open digital musicology.</w:t>
-      </w:r>
-    </w:p>
-    <w:p>
-      <w:pPr>
-        <w:pStyle w:val="1"/>
-      </w:pPr>
-      <w:bookmarkStart w:id="47" w:name="reproducibility"/>
-      <w:bookmarkEnd w:id="46"/>
+      <w:bookmarkStart w:id="39" w:name="reproducibility"/>
+      <w:bookmarkEnd w:id="38"/>
       <w:r>
         <w:t>9. Reproducibility</w:t>
       </w:r>
@@ -6860,8 +6417,8 @@
       <w:pPr>
         <w:pStyle w:val="1"/>
       </w:pPr>
-      <w:bookmarkStart w:id="48" w:name="acknowledgments"/>
-      <w:bookmarkEnd w:id="47"/>
+      <w:bookmarkStart w:id="40" w:name="acknowledgments"/>
+      <w:bookmarkEnd w:id="39"/>
       <w:r>
         <w:t>Acknowledgments</w:t>
       </w:r>
@@ -6882,8 +6439,8 @@
       <w:pPr>
         <w:pStyle w:val="1"/>
       </w:pPr>
-      <w:bookmarkStart w:id="49" w:name="ethics-and-consent"/>
-      <w:bookmarkEnd w:id="48"/>
+      <w:bookmarkStart w:id="41" w:name="ethics-and-consent"/>
+      <w:bookmarkEnd w:id="40"/>
       <w:r>
         <w:t>Ethics and Consent</w:t>
       </w:r>
@@ -6893,18 +6450,18 @@
         <w:pStyle w:val="FirstParagraph"/>
       </w:pPr>
       <w:r>
-        <w:t>The present manuscript reports the design, implementation, and analytical case study of an open-source software tool, supplemented by a single-expert pilot review (§6) treated under standard expert-evaluation methodology. It does not include learner-subjects evaluation, animal subjects, or human-derived data beyond the single expert pilot reviewer who provided written informed consent for anonymous reporting. The planned randomized controlled trial outlined in §7.3, which will involve undergraduate music-ed</w:t>
-      </w:r>
-      <w:r>
-        <w:t>ucation majors as participants and the System Usability Scale (Brooke, 1996) as a primary measure, will be conducted under the appropriate institutional review board approval and reported in a separate follow-up publication.</w:t>
+        <w:t>The present manuscript reports the design, implementation, and analytical case study of an open-source software tool, supplemented by a single-expert pilot review (§6) treated under standard expert-evaluation methodology. It does not include learner-subjects evaluation, animal subjects, or human-derived data beyond the single expert pilot reviewer who provided written informed consent for anonymous reporting. The planned randomized controlled trial outlined in §7, which will involve undergraduate music-educ</w:t>
+      </w:r>
+      <w:r>
+        <w:t>ation majors as participants and the System Usability Scale (Brooke, 1996) as a primary measure, will be conducted under the appropriate institutional review board approval and reported in a separate follow-up publication.</w:t>
       </w:r>
     </w:p>
     <w:p>
       <w:pPr>
         <w:pStyle w:val="1"/>
       </w:pPr>
-      <w:bookmarkStart w:id="50" w:name="competing-interests"/>
-      <w:bookmarkEnd w:id="49"/>
+      <w:bookmarkStart w:id="42" w:name="competing-interests"/>
+      <w:bookmarkEnd w:id="41"/>
       <w:r>
         <w:t>Competing Interests</w:t>
       </w:r>
@@ -6921,8 +6478,8 @@
       <w:pPr>
         <w:pStyle w:val="1"/>
       </w:pPr>
-      <w:bookmarkStart w:id="51" w:name="funding-information"/>
-      <w:bookmarkEnd w:id="50"/>
+      <w:bookmarkStart w:id="43" w:name="funding-information"/>
+      <w:bookmarkEnd w:id="42"/>
       <w:r>
         <w:t>Funding Information</w:t>
       </w:r>
@@ -6943,8 +6500,8 @@
       <w:pPr>
         <w:pStyle w:val="1"/>
       </w:pPr>
-      <w:bookmarkStart w:id="52" w:name="authors-contributions"/>
-      <w:bookmarkEnd w:id="51"/>
+      <w:bookmarkStart w:id="44" w:name="authors-contributions"/>
+      <w:bookmarkEnd w:id="43"/>
       <w:r>
         <w:t>Authors’ Contributions</w:t>
       </w:r>
@@ -6958,15 +6515,22 @@
           <w:i/>
           <w:iCs/>
         </w:rPr>
-        <w:t>[To be filled at final submission. For single authorship: “The sole author conceived the study, designed and implemented the software, prepared the analysis schema and case study, drafted the manuscript, and approved the final version.” For multi-authored submissions, please supply a CRediT-style contribution statement.]</w:t>
+        <w:t xml:space="preserve">[To be filled at final submission. For single authorship: “The </w:t>
+      </w:r>
+      <w:r>
+        <w:rPr>
+          <w:i/>
+          <w:iCs/>
+        </w:rPr>
+        <w:t>sole author conceived the study, designed and implemented the software, prepared the analysis schema and case study, drafted the manuscript, and approved the final version.” For multi-authored submissions, please supply a CRediT-style contribution statement.]</w:t>
       </w:r>
     </w:p>
     <w:p>
       <w:pPr>
         <w:pStyle w:val="1"/>
       </w:pPr>
-      <w:bookmarkStart w:id="53" w:name="references"/>
-      <w:bookmarkEnd w:id="52"/>
+      <w:bookmarkStart w:id="45" w:name="references"/>
+      <w:bookmarkEnd w:id="44"/>
       <w:r>
         <w:t>References</w:t>
       </w:r>
@@ -6976,7 +6540,7 @@
         <w:pStyle w:val="Compact"/>
         <w:numPr>
           <w:ilvl w:val="0"/>
-          <w:numId w:val="15"/>
+          <w:numId w:val="12"/>
         </w:numPr>
       </w:pPr>
       <w:r>
@@ -6998,11 +6562,14 @@
         <w:pStyle w:val="Compact"/>
         <w:numPr>
           <w:ilvl w:val="0"/>
-          <w:numId w:val="15"/>
+          <w:numId w:val="12"/>
         </w:numPr>
       </w:pPr>
       <w:r>
-        <w:t xml:space="preserve">Ballester, C., Bacot, B., Bigo, L., Borsan, V. N., Couturier, L., Déguernel, K., et al. (2025). Interacting with annotated and synchronized music corpora on the Dezrann web platform. </w:t>
+        <w:t xml:space="preserve">Ballester, C., Bacot, B., Bigo, L., Borsan, V. N., Couturier, L., Déguernel, K., et al. (2025). Interacting with annotated and </w:t>
+      </w:r>
+      <w:r>
+        <w:t xml:space="preserve">synchronized music corpora on the Dezrann web platform. </w:t>
       </w:r>
       <w:r>
         <w:rPr>
@@ -7020,7 +6587,7 @@
         <w:pStyle w:val="Compact"/>
         <w:numPr>
           <w:ilvl w:val="0"/>
-          <w:numId w:val="15"/>
+          <w:numId w:val="12"/>
         </w:numPr>
       </w:pPr>
       <w:r>
@@ -7042,7 +6609,7 @@
         <w:pStyle w:val="Compact"/>
         <w:numPr>
           <w:ilvl w:val="0"/>
-          <w:numId w:val="15"/>
+          <w:numId w:val="12"/>
         </w:numPr>
       </w:pPr>
       <w:r>
@@ -7064,7 +6631,7 @@
         <w:pStyle w:val="Compact"/>
         <w:numPr>
           <w:ilvl w:val="0"/>
-          <w:numId w:val="15"/>
+          <w:numId w:val="12"/>
         </w:numPr>
       </w:pPr>
       <w:r>
@@ -7086,7 +6653,7 @@
         <w:pStyle w:val="Compact"/>
         <w:numPr>
           <w:ilvl w:val="0"/>
-          <w:numId w:val="15"/>
+          <w:numId w:val="12"/>
         </w:numPr>
       </w:pPr>
       <w:r>
@@ -7108,7 +6675,7 @@
         <w:pStyle w:val="Compact"/>
         <w:numPr>
           <w:ilvl w:val="0"/>
-          <w:numId w:val="15"/>
+          <w:numId w:val="12"/>
         </w:numPr>
       </w:pPr>
       <w:r>
@@ -7130,7 +6697,7 @@
         <w:pStyle w:val="Compact"/>
         <w:numPr>
           <w:ilvl w:val="0"/>
-          <w:numId w:val="15"/>
+          <w:numId w:val="12"/>
         </w:numPr>
       </w:pPr>
       <w:r>
@@ -7152,7 +6719,7 @@
         <w:pStyle w:val="Compact"/>
         <w:numPr>
           <w:ilvl w:val="0"/>
-          <w:numId w:val="15"/>
+          <w:numId w:val="12"/>
         </w:numPr>
       </w:pPr>
       <w:r>
@@ -7174,7 +6741,7 @@
         <w:pStyle w:val="Compact"/>
         <w:numPr>
           <w:ilvl w:val="0"/>
-          <w:numId w:val="15"/>
+          <w:numId w:val="12"/>
         </w:numPr>
       </w:pPr>
       <w:r>
@@ -7196,7 +6763,7 @@
         <w:pStyle w:val="Compact"/>
         <w:numPr>
           <w:ilvl w:val="0"/>
-          <w:numId w:val="15"/>
+          <w:numId w:val="12"/>
         </w:numPr>
       </w:pPr>
       <w:r>
@@ -7218,7 +6785,7 @@
         <w:pStyle w:val="Compact"/>
         <w:numPr>
           <w:ilvl w:val="0"/>
-          <w:numId w:val="15"/>
+          <w:numId w:val="12"/>
         </w:numPr>
       </w:pPr>
       <w:r>
@@ -7240,7 +6807,7 @@
         <w:pStyle w:val="Compact"/>
         <w:numPr>
           <w:ilvl w:val="0"/>
-          <w:numId w:val="15"/>
+          <w:numId w:val="12"/>
         </w:numPr>
       </w:pPr>
       <w:r>
@@ -7262,7 +6829,7 @@
         <w:pStyle w:val="Compact"/>
         <w:numPr>
           <w:ilvl w:val="0"/>
-          <w:numId w:val="15"/>
+          <w:numId w:val="12"/>
         </w:numPr>
       </w:pPr>
       <w:r>
@@ -7284,7 +6851,7 @@
         <w:pStyle w:val="Compact"/>
         <w:numPr>
           <w:ilvl w:val="0"/>
-          <w:numId w:val="15"/>
+          <w:numId w:val="12"/>
         </w:numPr>
       </w:pPr>
       <w:r>
@@ -7306,7 +6873,7 @@
         <w:pStyle w:val="Compact"/>
         <w:numPr>
           <w:ilvl w:val="0"/>
-          <w:numId w:val="15"/>
+          <w:numId w:val="12"/>
         </w:numPr>
       </w:pPr>
       <w:r>
@@ -7328,7 +6895,7 @@
         <w:pStyle w:val="Compact"/>
         <w:numPr>
           <w:ilvl w:val="0"/>
-          <w:numId w:val="15"/>
+          <w:numId w:val="12"/>
         </w:numPr>
       </w:pPr>
       <w:r>
@@ -7350,7 +6917,7 @@
         <w:pStyle w:val="Compact"/>
         <w:numPr>
           <w:ilvl w:val="0"/>
-          <w:numId w:val="15"/>
+          <w:numId w:val="12"/>
         </w:numPr>
       </w:pPr>
       <w:r>
@@ -7372,7 +6939,7 @@
         <w:pStyle w:val="Compact"/>
         <w:numPr>
           <w:ilvl w:val="0"/>
-          <w:numId w:val="15"/>
+          <w:numId w:val="12"/>
         </w:numPr>
       </w:pPr>
       <w:r>
@@ -7394,7 +6961,7 @@
         <w:pStyle w:val="Compact"/>
         <w:numPr>
           <w:ilvl w:val="0"/>
-          <w:numId w:val="15"/>
+          <w:numId w:val="12"/>
         </w:numPr>
       </w:pPr>
       <w:r>
@@ -7416,7 +6983,7 @@
         <w:pStyle w:val="Compact"/>
         <w:numPr>
           <w:ilvl w:val="0"/>
-          <w:numId w:val="15"/>
+          <w:numId w:val="12"/>
         </w:numPr>
       </w:pPr>
       <w:r>
@@ -7438,7 +7005,7 @@
         <w:pStyle w:val="Compact"/>
         <w:numPr>
           <w:ilvl w:val="0"/>
-          <w:numId w:val="15"/>
+          <w:numId w:val="12"/>
         </w:numPr>
       </w:pPr>
       <w:r>
@@ -7454,7 +7021,7 @@
       <w:r>
         <w:t>.</w:t>
       </w:r>
-      <w:bookmarkEnd w:id="53"/>
+      <w:bookmarkEnd w:id="45"/>
     </w:p>
     <w:sectPr>
       <w:headerReference w:type="even" r:id="rId11"/>
@@ -7667,7 +7234,7 @@
   <w:abstractNum w:abstractNumId="0" w15:restartNumberingAfterBreak="0">
     <w:nsid w:val="0000A990"/>
     <w:multiLevelType w:val="multilevel"/>
-    <w:tmpl w:val="39F005B8"/>
+    <w:tmpl w:val="87FC43E2"/>
     <w:lvl w:ilvl="0">
       <w:numFmt w:val="bullet"/>
       <w:lvlText w:val=" "/>
@@ -7744,7 +7311,7 @@
   <w:abstractNum w:abstractNumId="1" w15:restartNumberingAfterBreak="0">
     <w:nsid w:val="0000A991"/>
     <w:multiLevelType w:val="multilevel"/>
-    <w:tmpl w:val="17AEBB0E"/>
+    <w:tmpl w:val="46742642"/>
     <w:lvl w:ilvl="0">
       <w:numFmt w:val="bullet"/>
       <w:lvlText w:val=""/>
@@ -7848,7 +7415,7 @@
   <w:abstractNum w:abstractNumId="2" w15:restartNumberingAfterBreak="0">
     <w:nsid w:val="00A99411"/>
     <w:multiLevelType w:val="multilevel"/>
-    <w:tmpl w:val="C70830F4"/>
+    <w:tmpl w:val="D3D899A4"/>
     <w:lvl w:ilvl="0">
       <w:start w:val="1"/>
       <w:numFmt w:val="decimal"/>
@@ -7931,16 +7498,16 @@
       </w:pPr>
     </w:lvl>
   </w:abstractNum>
-  <w:num w:numId="1" w16cid:durableId="38673533">
+  <w:num w:numId="1" w16cid:durableId="1818066855">
     <w:abstractNumId w:val="0"/>
   </w:num>
-  <w:num w:numId="2" w16cid:durableId="2058427077">
+  <w:num w:numId="2" w16cid:durableId="611324371">
     <w:abstractNumId w:val="1"/>
   </w:num>
-  <w:num w:numId="3" w16cid:durableId="1842693666">
+  <w:num w:numId="3" w16cid:durableId="943264072">
     <w:abstractNumId w:val="1"/>
   </w:num>
-  <w:num w:numId="4" w16cid:durableId="945113727">
+  <w:num w:numId="4" w16cid:durableId="1033772220">
     <w:abstractNumId w:val="2"/>
     <w:lvlOverride w:ilvl="0">
       <w:startOverride w:val="1"/>
@@ -7970,7 +7537,7 @@
       <w:startOverride w:val="1"/>
     </w:lvlOverride>
   </w:num>
-  <w:num w:numId="5" w16cid:durableId="1594238463">
+  <w:num w:numId="5" w16cid:durableId="816265097">
     <w:abstractNumId w:val="2"/>
     <w:lvlOverride w:ilvl="0">
       <w:startOverride w:val="1"/>
@@ -8000,7 +7567,7 @@
       <w:startOverride w:val="1"/>
     </w:lvlOverride>
   </w:num>
-  <w:num w:numId="6" w16cid:durableId="1830754747">
+  <w:num w:numId="6" w16cid:durableId="1347436709">
     <w:abstractNumId w:val="2"/>
     <w:lvlOverride w:ilvl="0">
       <w:startOverride w:val="1"/>
@@ -8030,7 +7597,7 @@
       <w:startOverride w:val="1"/>
     </w:lvlOverride>
   </w:num>
-  <w:num w:numId="7" w16cid:durableId="1149251774">
+  <w:num w:numId="7" w16cid:durableId="1640921491">
     <w:abstractNumId w:val="2"/>
     <w:lvlOverride w:ilvl="0">
       <w:startOverride w:val="1"/>
@@ -8060,10 +7627,10 @@
       <w:startOverride w:val="1"/>
     </w:lvlOverride>
   </w:num>
-  <w:num w:numId="8" w16cid:durableId="919951012">
+  <w:num w:numId="8" w16cid:durableId="1802923473">
     <w:abstractNumId w:val="1"/>
   </w:num>
-  <w:num w:numId="9" w16cid:durableId="1633949591">
+  <w:num w:numId="9" w16cid:durableId="939139971">
     <w:abstractNumId w:val="2"/>
     <w:lvlOverride w:ilvl="0">
       <w:startOverride w:val="1"/>
@@ -8093,7 +7660,7 @@
       <w:startOverride w:val="1"/>
     </w:lvlOverride>
   </w:num>
-  <w:num w:numId="10" w16cid:durableId="271859649">
+  <w:num w:numId="10" w16cid:durableId="1224175487">
     <w:abstractNumId w:val="2"/>
     <w:lvlOverride w:ilvl="0">
       <w:startOverride w:val="1"/>
@@ -8123,73 +7690,10 @@
       <w:startOverride w:val="1"/>
     </w:lvlOverride>
   </w:num>
-  <w:num w:numId="11" w16cid:durableId="1481270074">
-    <w:abstractNumId w:val="2"/>
-    <w:lvlOverride w:ilvl="0">
-      <w:startOverride w:val="1"/>
-    </w:lvlOverride>
-    <w:lvlOverride w:ilvl="1">
-      <w:startOverride w:val="1"/>
-    </w:lvlOverride>
-    <w:lvlOverride w:ilvl="2">
-      <w:startOverride w:val="1"/>
-    </w:lvlOverride>
-    <w:lvlOverride w:ilvl="3">
-      <w:startOverride w:val="1"/>
-    </w:lvlOverride>
-    <w:lvlOverride w:ilvl="4">
-      <w:startOverride w:val="1"/>
-    </w:lvlOverride>
-    <w:lvlOverride w:ilvl="5">
-      <w:startOverride w:val="1"/>
-    </w:lvlOverride>
-    <w:lvlOverride w:ilvl="6">
-      <w:startOverride w:val="1"/>
-    </w:lvlOverride>
-    <w:lvlOverride w:ilvl="7">
-      <w:startOverride w:val="1"/>
-    </w:lvlOverride>
-    <w:lvlOverride w:ilvl="8">
-      <w:startOverride w:val="1"/>
-    </w:lvlOverride>
-  </w:num>
-  <w:num w:numId="12" w16cid:durableId="2144156301">
+  <w:num w:numId="11" w16cid:durableId="1500804394">
     <w:abstractNumId w:val="1"/>
   </w:num>
-  <w:num w:numId="13" w16cid:durableId="287009047">
-    <w:abstractNumId w:val="1"/>
-  </w:num>
-  <w:num w:numId="14" w16cid:durableId="444275036">
-    <w:abstractNumId w:val="2"/>
-    <w:lvlOverride w:ilvl="0">
-      <w:startOverride w:val="1"/>
-    </w:lvlOverride>
-    <w:lvlOverride w:ilvl="1">
-      <w:startOverride w:val="1"/>
-    </w:lvlOverride>
-    <w:lvlOverride w:ilvl="2">
-      <w:startOverride w:val="1"/>
-    </w:lvlOverride>
-    <w:lvlOverride w:ilvl="3">
-      <w:startOverride w:val="1"/>
-    </w:lvlOverride>
-    <w:lvlOverride w:ilvl="4">
-      <w:startOverride w:val="1"/>
-    </w:lvlOverride>
-    <w:lvlOverride w:ilvl="5">
-      <w:startOverride w:val="1"/>
-    </w:lvlOverride>
-    <w:lvlOverride w:ilvl="6">
-      <w:startOverride w:val="1"/>
-    </w:lvlOverride>
-    <w:lvlOverride w:ilvl="7">
-      <w:startOverride w:val="1"/>
-    </w:lvlOverride>
-    <w:lvlOverride w:ilvl="8">
-      <w:startOverride w:val="1"/>
-    </w:lvlOverride>
-  </w:num>
-  <w:num w:numId="15" w16cid:durableId="1358770438">
+  <w:num w:numId="12" w16cid:durableId="1218128900">
     <w:abstractNumId w:val="1"/>
   </w:num>
 </w:numbering>
@@ -9081,7 +8585,7 @@
     <w:name w:val="Verbatim Char"/>
     <w:basedOn w:val="Char1"/>
     <w:link w:val="SourceCode"/>
-    <w:rsid w:val="001A7C9E"/>
+    <w:rsid w:val="000A6CB6"/>
     <w:rPr>
       <w:rFonts w:ascii="Consolas" w:hAnsi="Consolas" w:cs="Times New Roman"/>
       <w:sz w:val="20"/>
@@ -9126,7 +8630,7 @@
     <w:name w:val="Source Code"/>
     <w:basedOn w:val="a"/>
     <w:link w:val="VerbatimChar"/>
-    <w:rsid w:val="001A7C9E"/>
+    <w:rsid w:val="000A6CB6"/>
     <w:pPr>
       <w:shd w:val="clear" w:color="auto" w:fill="FFF5F0"/>
       <w:wordWrap w:val="0"/>
@@ -9464,7 +8968,7 @@
     <w:name w:val="header"/>
     <w:basedOn w:val="a"/>
     <w:link w:val="Char2"/>
-    <w:rsid w:val="001A7C9E"/>
+    <w:rsid w:val="000A6CB6"/>
     <w:pPr>
       <w:tabs>
         <w:tab w:val="center" w:pos="4513"/>
@@ -9477,13 +8981,13 @@
     <w:name w:val="머리글 Char"/>
     <w:basedOn w:val="a1"/>
     <w:link w:val="ad"/>
-    <w:rsid w:val="001A7C9E"/>
+    <w:rsid w:val="000A6CB6"/>
   </w:style>
   <w:style w:type="paragraph" w:styleId="ae">
     <w:name w:val="footer"/>
     <w:basedOn w:val="a"/>
     <w:link w:val="Char3"/>
-    <w:rsid w:val="001A7C9E"/>
+    <w:rsid w:val="000A6CB6"/>
     <w:pPr>
       <w:tabs>
         <w:tab w:val="center" w:pos="4513"/>
@@ -9496,17 +9000,17 @@
     <w:name w:val="바닥글 Char"/>
     <w:basedOn w:val="a1"/>
     <w:link w:val="ae"/>
-    <w:rsid w:val="001A7C9E"/>
+    <w:rsid w:val="000A6CB6"/>
   </w:style>
   <w:style w:type="character" w:styleId="af">
     <w:name w:val="page number"/>
     <w:basedOn w:val="a1"/>
-    <w:rsid w:val="001A7C9E"/>
+    <w:rsid w:val="000A6CB6"/>
   </w:style>
   <w:style w:type="character" w:styleId="af0">
     <w:name w:val="line number"/>
     <w:basedOn w:val="a1"/>
-    <w:rsid w:val="001A7C9E"/>
+    <w:rsid w:val="000A6CB6"/>
   </w:style>
 </w:styles>
 </file>

</xml_diff>